<commit_message>
Update paper with Claude generator and cross-generator results
Co-Authored-By: Claude Sonnet 5.5 <noreply@anthropic.com>
Claude-Session: https://claude.ai/code/session_01FLb7uVf7YBgdoa75gbZ2sf
</commit_message>
<xml_diff>
--- a/paper/Poisson_LLM_Pilot_Paper_MISQ.docx
+++ b/paper/Poisson_LLM_Pilot_Paper_MISQ.docx
@@ -123,13 +123,13 @@
         <w:t xml:space="preserve"> </w:t>
       </w:r>
       <w:r>
-        <w:t xml:space="preserve">(single</w:t>
-      </w:r>
-      <w:r>
-        <w:t xml:space="preserve"> </w:t>
-      </w:r>
-      <w:r>
-        <w:t xml:space="preserve">generator;</w:t>
+        <w:t xml:space="preserve">(two</w:t>
+      </w:r>
+      <w:r>
+        <w:t xml:space="preserve"> </w:t>
+      </w:r>
+      <w:r>
+        <w:t xml:space="preserve">generators;</w:t>
       </w:r>
       <w:r>
         <w:t xml:space="preserve"> </w:t>
@@ -176,39 +176,7 @@
         <w:pStyle w:val="FirstParagraph"/>
       </w:pPr>
       <w:r>
-        <w:t xml:space="preserve">Organizations that publish or archive scholarly documents now face a screening problem: language models can produce papers faster and more cheaply than anyone can check them. Two common remedies, LLM-as-a-judge and embedding-based similarity metrics, are either expensive and prompt-dependent or insensitive to fine-grained statistical structure. We study a lightweight alternative that treats the occurrence of selected linguistic events (special punctuation, discourse markers, passive constructions, nominalizations) as count processes and asks how far a document departs from human-authored text. Using 474 human-written papers from PubMed Central and arXiv (2015–2019) and 245 matched papers generated by GPT-4o, we report three findings. First, human text is</w:t>
-      </w:r>
-      <w:r>
-        <w:t xml:space="preserve"> </w:t>
-      </w:r>
-      <w:r>
-        <w:rPr>
-          <w:iCs/>
-          <w:i/>
-        </w:rPr>
-        <w:t xml:space="preserve">not</w:t>
-      </w:r>
-      <w:r>
-        <w:t xml:space="preserve"> </w:t>
-      </w:r>
-      <w:r>
-        <w:t xml:space="preserve">Poisson: for punctuation events, 36–49% of documents reject the Poisson null because of over-dispersion, so the classical assumption cannot serve as a reference. Second, a single Poisson-distance index performs near chance (AUC 0.55), but a vector of event rates and dispersion indices separates human from GPT-4o text well (cross-validated AUC 0.99). Third, most of that discrimination comes from event</w:t>
-      </w:r>
-      <w:r>
-        <w:t xml:space="preserve"> </w:t>
-      </w:r>
-      <w:r>
-        <w:rPr>
-          <w:iCs/>
-          <w:i/>
-        </w:rPr>
-        <w:t xml:space="preserve">rates</w:t>
-      </w:r>
-      <w:r>
-        <w:t xml:space="preserve"> </w:t>
-      </w:r>
-      <w:r>
-        <w:t xml:space="preserve">(AUC 0.97), which reflect style; dispersion alone reaches 0.86, and this is the portion that speaks to the count-process idea. The screening step costs nothing per document and runs at about 170 documents per second on one CPU core. We discuss why these results are encouraging but not conclusive, and we are explicit about what this pilot does not test: other generators, adversarial editing, comparison with black-box metrics, and the effect on human reviewers.</w:t>
+        <w:t xml:space="preserve">Organizations that publish or archive scholarly documents now face a screening problem: language models can produce papers faster and more cheaply than anyone can check them. Two common remedies, LLM-as-a-judge and embedding-based similarity metrics, are either expensive and prompt-dependent or insensitive to fine-grained statistical structure. We study a lightweight alternative that treats the occurrence of selected linguistic events (special punctuation, discourse markers, passive constructions, nominalizations) as count processes and asks how far a document departs from human-authored text. Using 474 human-written papers from PubMed Central and arXiv (2015–2019) and matched papers from two generators (GPT-4o, 245 papers; Claude Sonnet 5.5, 152 papers), we report four findings. First, human text is not Poisson: for punctuation events, 36–49% of documents reject the Poisson null because of over-dispersion. Second, a single Poisson-distance index performs near chance (AUC 0.52–0.54), but a vector of event rates and dispersion indices separates human from machine text well when the detector is trained and tested on the same generator (AUC 0.99 for GPT-4o, 0.91 for Claude). Third, this performance does not transfer: a detector trained on one generator reaches only 0.73 (GPT-4o to Claude) and 0.81 (Claude to GPT-4o) on the other. Fourth, dispersion transfers better than event rates, which differ in sign across generators; this is the clearest support we find for the count-process idea. Screening costs nothing per document and runs at about 160 documents per second on one CPU core. The evidence is limited to two commercial generators and one genre, and we do not test adversarial editing, comparison with black-box metrics, or the effect on human reviewers.</w:t>
       </w:r>
     </w:p>
     <w:p>
@@ -226,7 +194,7 @@
         <w:t xml:space="preserve"> </w:t>
       </w:r>
       <w:r>
-        <w:t xml:space="preserve">information quality, synthetic text detection, count data, dispersion, explainable analytics, scholarly publishing</w:t>
+        <w:t xml:space="preserve">information quality, synthetic text detection, count data, dispersion, generalization, scholarly publishing</w:t>
       </w:r>
     </w:p>
     <w:bookmarkEnd w:id="20"/>
@@ -316,7 +284,7 @@
         <w:pStyle w:val="BodyText"/>
       </w:pPr>
       <w:r>
-        <w:t xml:space="preserve">The classical benchmark for counts of independent events is the Poisson distribution, whose variance equals its mean. An earlier version of this project assumed that human-authored scientific text approximately follows this benchmark and that LLM output departs from it. We test that assumption directly rather than adopting it, and the answer shapes everything that follows. We ask three questions, in the order a screening organization would:</w:t>
+        <w:t xml:space="preserve">The classical benchmark for counts of independent events is the Poisson distribution, whose variance equals its mean. An earlier version of this project assumed that human-authored scientific text approximately follows this benchmark and that LLM output departs from it. We test that assumption directly rather than adopting it. We also test something that detection studies often leave implicit: whether a detector built on one generator still works on another. We ask three questions, in the order a screening organization would:</w:t>
       </w:r>
     </w:p>
     <w:p>
@@ -354,13 +322,13 @@
           <w:bCs/>
           <w:b/>
         </w:rPr>
-        <w:t xml:space="preserve">RQ2 (Detection).</w:t>
-      </w:r>
-      <w:r>
-        <w:t xml:space="preserve"> </w:t>
-      </w:r>
-      <w:r>
-        <w:t xml:space="preserve">How well do Poisson-based quantities separate human from LLM-generated papers, and which part of the signal (rates or dispersion) carries the discrimination?</w:t>
+        <w:t xml:space="preserve">RQ2 (Detection and transfer).</w:t>
+      </w:r>
+      <w:r>
+        <w:t xml:space="preserve"> </w:t>
+      </w:r>
+      <w:r>
+        <w:t xml:space="preserve">How well do Poisson-based quantities separate human from LLM-generated papers, which part of the signal (rates or dispersion) carries the discrimination, and does a detector built on one generator work on another?</w:t>
       </w:r>
     </w:p>
     <w:p>
@@ -390,7 +358,7 @@
         <w:pStyle w:val="FirstParagraph"/>
       </w:pPr>
       <w:r>
-        <w:t xml:space="preserve">A fourth question concerns whether explainable statistical evidence improves the decisions of human reviewers. That question requires a controlled experiment with participants, which we have not run; we describe the intended design in Section 7 and report no results for it.</w:t>
+        <w:t xml:space="preserve">A further question concerns whether explainable statistical evidence improves the decisions of human reviewers. It requires a controlled experiment with participants, which we have not run; we describe the intended design in Section 7 and report no results for it.</w:t>
       </w:r>
     </w:p>
     <w:bookmarkEnd w:id="21"/>
@@ -499,7 +467,15 @@
         <w:pStyle w:val="FirstParagraph"/>
       </w:pPr>
       <w:r>
-        <w:t xml:space="preserve">For each sampled paper we asked GPT-4o to write a paper on the same topic, given the original title and abstract, using one of three prompts of increasing detail. A single request yielded only about 800 words, too short for window-based analysis, so each paper was generated in four requests (introduction, methods, results, discussion and conclusion) and concatenated, yielding a median of about 2,750 words. The output file held 246 records for 245 distinct source papers (one source had been generated twice during testing); we kept one record per source, giving 245 synthetic papers, about 60% matched to medicine and 40% to computer science sources. Prompts were presented in a fixed random order, so the subset is random across fields. All synthetic papers passed the length requirement.</w:t>
+        <w:t xml:space="preserve">For each sampled paper we asked a generator to write a paper on the same topic, given the original title and abstract, using one of three prompts of increasing detail. We used two generators through a commercial API gateway: GPT-4o and Claude Sonnet 5.5. A single request yielded only about 800 words from GPT-4o, too short for window-based analysis, so each paper was generated in four requests (introduction, methods, results, discussion and conclusion) and concatenated. Prompts were presented in a fixed random order, so each subset is random across fields.</w:t>
+      </w:r>
+    </w:p>
+    <w:p>
+      <w:pPr>
+        <w:pStyle w:val="BodyText"/>
+      </w:pPr>
+      <w:r>
+        <w:t xml:space="preserve">GPT-4o produced 245 unique papers (one source had been generated twice during testing and we kept one record), with a median of about 2,750 words. Claude produced 152 papers, with a median of 4,566 words (range 3,667 to 5,134); generation was stopped at that number because of budget, not because of any property of the output. Because Claude wrote longer papers, all documents are truncated to the same length before analysis (Section 3.3). Both sets passed the length requirement.</w:t>
       </w:r>
     </w:p>
     <w:bookmarkEnd w:id="24"/>
@@ -619,7 +595,20 @@
         <w:pStyle w:val="BodyText"/>
       </w:pPr>
       <w:r>
-        <w:t xml:space="preserve">For each document and event we compute the mean count per window and the dispersion index. A document-level Poisson test uses the statistic (n − 1) × dispersion index, compared to a chi-squared distribution with n − 1 degrees of freedom, with separate tail probabilities for over- and under-dispersion. With only four windows per document, these tests have low power, so rejection rates understate true departures from Poisson behavior.</w:t>
+        <w:t xml:space="preserve">For each document and event we compute the mean count per window (the</w:t>
+      </w:r>
+      <w:r>
+        <w:t xml:space="preserve"> </w:t>
+      </w:r>
+      <w:r>
+        <w:rPr>
+          <w:iCs/>
+          <w:i/>
+        </w:rPr>
+        <w:t xml:space="preserve">rate</w:t>
+      </w:r>
+      <w:r>
+        <w:t xml:space="preserve">) and the dispersion index. A document-level Poisson test uses the statistic (n − 1) × dispersion index, compared to a chi-squared distribution with n − 1 degrees of freedom, with separate tail probabilities for over- and under-dispersion. With only four windows per document, these tests have low power, so rejection rates understate true departures from Poisson behavior.</w:t>
       </w:r>
     </w:p>
     <w:bookmarkEnd w:id="25"/>
@@ -637,7 +626,7 @@
         <w:pStyle w:val="FirstParagraph"/>
       </w:pPr>
       <w:r>
-        <w:t xml:space="preserve">The Poisson-Score maps a document into the interval [0, 1) from its mean absolute standardized deviation, across all events, from a human reference distribution of (log) rates and (log) dispersion indices. The reference is estimated only on human training documents within each cross-validation fold. We also evaluate the underlying fourteen quantities (seven rates and seven dispersion indices) with logistic regression. Documents with no occurrences of an event have undefined dispersion, which we set to one (log zero); this affects mainly square brackets in synthetic text, where 78% of papers contain none.</w:t>
+        <w:t xml:space="preserve">The Poisson-Score maps a document into the interval [0, 1) from its mean absolute standardized deviation, across all events, from a human reference distribution of (log) rates and (log) dispersion indices. The reference is estimated only on human training documents within each cross-validation fold. We also evaluate the underlying fourteen quantities (seven rates and seven dispersion indices) with logistic regression. Documents with no occurrences of an event have undefined dispersion, which we set to one (log zero); this affects mainly square brackets in synthetic text, where most papers contain none.</w:t>
       </w:r>
     </w:p>
     <w:bookmarkEnd w:id="26"/>
@@ -655,12 +644,12 @@
         <w:pStyle w:val="FirstParagraph"/>
       </w:pPr>
       <w:r>
-        <w:t xml:space="preserve">Detection is evaluated by five-fold cross-validation with all material from the same source paper kept in the same fold, so that a human paper and its synthetic counterpart never straddle training and test sets. We report the area under the ROC curve (AUC) and the F1 score. The analysis code, prompts, and generated papers are in the project repository; the human papers can be re-collected with the included script.</w:t>
+        <w:t xml:space="preserve">Detection is evaluated by five-fold cross-validation with all material from the same source paper kept in the same fold, so that a human paper and its synthetic counterpart never straddle training and test sets. We report the area under the ROC curve (AUC), with 95% bootstrap intervals over documents. To study transfer, we train on human papers plus papers from one generator and test on held-out human papers plus papers from the other generator, in both directions. The analysis code, prompts, and generated papers are in the project repository; the human papers can be re-collected with the included script.</w:t>
       </w:r>
     </w:p>
     <w:bookmarkEnd w:id="27"/>
     <w:bookmarkEnd w:id="28"/>
-    <w:bookmarkStart w:id="35" w:name="results"/>
+    <w:bookmarkStart w:id="36" w:name="results"/>
     <w:p>
       <w:pPr>
         <w:pStyle w:val="Heading1"/>
@@ -691,7 +680,7 @@
         <w:pStyle w:val="TableCaption"/>
       </w:pPr>
       <w:r>
-        <w:t xml:space="preserve">Table 1. Dispersion of event counts (four 500-token windows per document). Index = variance / mean; 1 indicates Poisson behavior. Over-dispersed = Poisson null rejected at 5% against clustering.</w:t>
+        <w:t xml:space="preserve">Table 1. Median dispersion index and percentage of documents rejecting the Poisson null toward over-dispersion (5% level), by source. Index = variance / mean; 1 indicates Poisson behavior.</w:t>
       </w:r>
     </w:p>
     <w:tbl>
@@ -700,14 +689,13 @@
         <w:tblW w:type="pct" w:w="5000"/>
         <w:tblLook w:firstRow="1" w:lastRow="0" w:firstColumn="0" w:lastColumn="0" w:noHBand="0" w:noVBand="0" w:val="0020"/>
         <w:jc w:val="start"/>
-        <w:tblCaption w:val="Table 1. Dispersion of event counts (four 500-token windows per document). Index = variance / mean; 1 indicates Poisson behavior. Over-dispersed = Poisson null rejected at 5% against clustering."/>
+        <w:tblCaption w:val="Table 1. Median dispersion index and percentage of documents rejecting the Poisson null toward over-dispersion (5% level), by source. Index = variance / mean; 1 indicates Poisson behavior."/>
       </w:tblPr>
       <w:tblGrid>
-        <w:gridCol w:w="1584"/>
-        <w:gridCol w:w="1584"/>
-        <w:gridCol w:w="1584"/>
-        <w:gridCol w:w="1584"/>
-        <w:gridCol w:w="1584"/>
+        <w:gridCol w:w="1980"/>
+        <w:gridCol w:w="1980"/>
+        <w:gridCol w:w="1980"/>
+        <w:gridCol w:w="1980"/>
       </w:tblGrid>
       <w:tr>
         <w:trPr>
@@ -733,43 +721,31 @@
               <w:jc w:val="right"/>
             </w:pPr>
             <w:r>
-              <w:t xml:space="preserve">Human: median index</w:t>
-            </w:r>
-          </w:p>
-        </w:tc>
-        <w:tc>
-          <w:tcPr/>
-          <w:p>
-            <w:pPr>
-              <w:pStyle w:val="Compact"/>
-              <w:jc w:val="right"/>
-            </w:pPr>
-            <w:r>
-              <w:t xml:space="preserve">Human: % over-dispersed</w:t>
-            </w:r>
-          </w:p>
-        </w:tc>
-        <w:tc>
-          <w:tcPr/>
-          <w:p>
-            <w:pPr>
-              <w:pStyle w:val="Compact"/>
-              <w:jc w:val="right"/>
-            </w:pPr>
-            <w:r>
-              <w:t xml:space="preserve">GPT-4o: median index</w:t>
-            </w:r>
-          </w:p>
-        </w:tc>
-        <w:tc>
-          <w:tcPr/>
-          <w:p>
-            <w:pPr>
-              <w:pStyle w:val="Compact"/>
-              <w:jc w:val="right"/>
-            </w:pPr>
-            <w:r>
-              <w:t xml:space="preserve">GPT-4o: % over-dispersed</w:t>
+              <w:t xml:space="preserve">Human: index (% over)</w:t>
+            </w:r>
+          </w:p>
+        </w:tc>
+        <w:tc>
+          <w:tcPr/>
+          <w:p>
+            <w:pPr>
+              <w:pStyle w:val="Compact"/>
+              <w:jc w:val="right"/>
+            </w:pPr>
+            <w:r>
+              <w:t xml:space="preserve">GPT-4o: index (% over)</w:t>
+            </w:r>
+          </w:p>
+        </w:tc>
+        <w:tc>
+          <w:tcPr/>
+          <w:p>
+            <w:pPr>
+              <w:pStyle w:val="Compact"/>
+              <w:jc w:val="right"/>
+            </w:pPr>
+            <w:r>
+              <w:t xml:space="preserve">Claude: index (% over)</w:t>
             </w:r>
           </w:p>
         </w:tc>
@@ -795,43 +771,31 @@
               <w:jc w:val="right"/>
             </w:pPr>
             <w:r>
-              <w:t xml:space="preserve">2.53</w:t>
-            </w:r>
-          </w:p>
-        </w:tc>
-        <w:tc>
-          <w:tcPr/>
-          <w:p>
-            <w:pPr>
-              <w:pStyle w:val="Compact"/>
-              <w:jc w:val="right"/>
-            </w:pPr>
-            <w:r>
-              <w:t xml:space="preserve">48.8</w:t>
-            </w:r>
-          </w:p>
-        </w:tc>
-        <w:tc>
-          <w:tcPr/>
-          <w:p>
-            <w:pPr>
-              <w:pStyle w:val="Compact"/>
-              <w:jc w:val="right"/>
-            </w:pPr>
-            <w:r>
-              <w:t xml:space="preserve">1.33</w:t>
-            </w:r>
-          </w:p>
-        </w:tc>
-        <w:tc>
-          <w:tcPr/>
-          <w:p>
-            <w:pPr>
-              <w:pStyle w:val="Compact"/>
-              <w:jc w:val="right"/>
-            </w:pPr>
-            <w:r>
-              <w:t xml:space="preserve">36.4</w:t>
+              <w:t xml:space="preserve">2.53 (48.8)</w:t>
+            </w:r>
+          </w:p>
+        </w:tc>
+        <w:tc>
+          <w:tcPr/>
+          <w:p>
+            <w:pPr>
+              <w:pStyle w:val="Compact"/>
+              <w:jc w:val="right"/>
+            </w:pPr>
+            <w:r>
+              <w:t xml:space="preserve">1.33 (36.4)</w:t>
+            </w:r>
+          </w:p>
+        </w:tc>
+        <w:tc>
+          <w:tcPr/>
+          <w:p>
+            <w:pPr>
+              <w:pStyle w:val="Compact"/>
+              <w:jc w:val="right"/>
+            </w:pPr>
+            <w:r>
+              <w:t xml:space="preserve">1.22 (22.0)</w:t>
             </w:r>
           </w:p>
         </w:tc>
@@ -857,43 +821,31 @@
               <w:jc w:val="right"/>
             </w:pPr>
             <w:r>
-              <w:t xml:space="preserve">2.22</w:t>
-            </w:r>
-          </w:p>
-        </w:tc>
-        <w:tc>
-          <w:tcPr/>
-          <w:p>
-            <w:pPr>
-              <w:pStyle w:val="Compact"/>
-              <w:jc w:val="right"/>
-            </w:pPr>
-            <w:r>
-              <w:t xml:space="preserve">42.2</w:t>
-            </w:r>
-          </w:p>
-        </w:tc>
-        <w:tc>
-          <w:tcPr/>
-          <w:p>
-            <w:pPr>
-              <w:pStyle w:val="Compact"/>
-              <w:jc w:val="right"/>
-            </w:pPr>
-            <w:r>
-              <w:t xml:space="preserve">1.78</w:t>
-            </w:r>
-          </w:p>
-        </w:tc>
-        <w:tc>
-          <w:tcPr/>
-          <w:p>
-            <w:pPr>
-              <w:pStyle w:val="Compact"/>
-              <w:jc w:val="right"/>
-            </w:pPr>
-            <w:r>
-              <w:t xml:space="preserve">28.6</w:t>
+              <w:t xml:space="preserve">2.22 (42.2)</w:t>
+            </w:r>
+          </w:p>
+        </w:tc>
+        <w:tc>
+          <w:tcPr/>
+          <w:p>
+            <w:pPr>
+              <w:pStyle w:val="Compact"/>
+              <w:jc w:val="right"/>
+            </w:pPr>
+            <w:r>
+              <w:t xml:space="preserve">1.78 (28.6)</w:t>
+            </w:r>
+          </w:p>
+        </w:tc>
+        <w:tc>
+          <w:tcPr/>
+          <w:p>
+            <w:pPr>
+              <w:pStyle w:val="Compact"/>
+              <w:jc w:val="right"/>
+            </w:pPr>
+            <w:r>
+              <w:t xml:space="preserve">2.21 (40.1)</w:t>
             </w:r>
           </w:p>
         </w:tc>
@@ -919,43 +871,31 @@
               <w:jc w:val="right"/>
             </w:pPr>
             <w:r>
-              <w:t xml:space="preserve">2.00</w:t>
-            </w:r>
-          </w:p>
-        </w:tc>
-        <w:tc>
-          <w:tcPr/>
-          <w:p>
-            <w:pPr>
-              <w:pStyle w:val="Compact"/>
-              <w:jc w:val="right"/>
-            </w:pPr>
-            <w:r>
-              <w:t xml:space="preserve">36.2</w:t>
-            </w:r>
-          </w:p>
-        </w:tc>
-        <w:tc>
-          <w:tcPr/>
-          <w:p>
-            <w:pPr>
-              <w:pStyle w:val="Compact"/>
-              <w:jc w:val="right"/>
-            </w:pPr>
-            <w:r>
-              <w:t xml:space="preserve">1.00</w:t>
-            </w:r>
-          </w:p>
-        </w:tc>
-        <w:tc>
-          <w:tcPr/>
-          <w:p>
-            <w:pPr>
-              <w:pStyle w:val="Compact"/>
-              <w:jc w:val="right"/>
-            </w:pPr>
-            <w:r>
-              <w:t xml:space="preserve">12.4</w:t>
+              <w:t xml:space="preserve">2.00 (36.2)</w:t>
+            </w:r>
+          </w:p>
+        </w:tc>
+        <w:tc>
+          <w:tcPr/>
+          <w:p>
+            <w:pPr>
+              <w:pStyle w:val="Compact"/>
+              <w:jc w:val="right"/>
+            </w:pPr>
+            <w:r>
+              <w:t xml:space="preserve">1.00 (12.4)</w:t>
+            </w:r>
+          </w:p>
+        </w:tc>
+        <w:tc>
+          <w:tcPr/>
+          <w:p>
+            <w:pPr>
+              <w:pStyle w:val="Compact"/>
+              <w:jc w:val="right"/>
+            </w:pPr>
+            <w:r>
+              <w:t xml:space="preserve">2.00 (36.0)</w:t>
             </w:r>
           </w:p>
         </w:tc>
@@ -981,43 +921,31 @@
               <w:jc w:val="right"/>
             </w:pPr>
             <w:r>
-              <w:t xml:space="preserve">1.67</w:t>
-            </w:r>
-          </w:p>
-        </w:tc>
-        <w:tc>
-          <w:tcPr/>
-          <w:p>
-            <w:pPr>
-              <w:pStyle w:val="Compact"/>
-              <w:jc w:val="right"/>
-            </w:pPr>
-            <w:r>
-              <w:t xml:space="preserve">27.4</w:t>
-            </w:r>
-          </w:p>
-        </w:tc>
-        <w:tc>
-          <w:tcPr/>
-          <w:p>
-            <w:pPr>
-              <w:pStyle w:val="Compact"/>
-              <w:jc w:val="right"/>
-            </w:pPr>
-            <w:r>
-              <w:t xml:space="preserve">0.76</w:t>
-            </w:r>
-          </w:p>
-        </w:tc>
-        <w:tc>
-          <w:tcPr/>
-          <w:p>
-            <w:pPr>
-              <w:pStyle w:val="Compact"/>
-              <w:jc w:val="right"/>
-            </w:pPr>
-            <w:r>
-              <w:t xml:space="preserve">7.3</w:t>
+              <w:t xml:space="preserve">1.67 (27.4)</w:t>
+            </w:r>
+          </w:p>
+        </w:tc>
+        <w:tc>
+          <w:tcPr/>
+          <w:p>
+            <w:pPr>
+              <w:pStyle w:val="Compact"/>
+              <w:jc w:val="right"/>
+            </w:pPr>
+            <w:r>
+              <w:t xml:space="preserve">0.76 (7.3)</w:t>
+            </w:r>
+          </w:p>
+        </w:tc>
+        <w:tc>
+          <w:tcPr/>
+          <w:p>
+            <w:pPr>
+              <w:pStyle w:val="Compact"/>
+              <w:jc w:val="right"/>
+            </w:pPr>
+            <w:r>
+              <w:t xml:space="preserve">1.10 (15.1)</w:t>
             </w:r>
           </w:p>
         </w:tc>
@@ -1043,43 +971,31 @@
               <w:jc w:val="right"/>
             </w:pPr>
             <w:r>
-              <w:t xml:space="preserve">1.30</w:t>
-            </w:r>
-          </w:p>
-        </w:tc>
-        <w:tc>
-          <w:tcPr/>
-          <w:p>
-            <w:pPr>
-              <w:pStyle w:val="Compact"/>
-              <w:jc w:val="right"/>
-            </w:pPr>
-            <w:r>
-              <w:t xml:space="preserve">24.4</w:t>
-            </w:r>
-          </w:p>
-        </w:tc>
-        <w:tc>
-          <w:tcPr/>
-          <w:p>
-            <w:pPr>
-              <w:pStyle w:val="Compact"/>
-              <w:jc w:val="right"/>
-            </w:pPr>
-            <w:r>
-              <w:t xml:space="preserve">3.00</w:t>
-            </w:r>
-          </w:p>
-        </w:tc>
-        <w:tc>
-          <w:tcPr/>
-          <w:p>
-            <w:pPr>
-              <w:pStyle w:val="Compact"/>
-              <w:jc w:val="right"/>
-            </w:pPr>
-            <w:r>
-              <w:t xml:space="preserve">60.0</w:t>
+              <w:t xml:space="preserve">1.30 (24.4)</w:t>
+            </w:r>
+          </w:p>
+        </w:tc>
+        <w:tc>
+          <w:tcPr/>
+          <w:p>
+            <w:pPr>
+              <w:pStyle w:val="Compact"/>
+              <w:jc w:val="right"/>
+            </w:pPr>
+            <w:r>
+              <w:t xml:space="preserve">3.00 (60.0)</w:t>
+            </w:r>
+          </w:p>
+        </w:tc>
+        <w:tc>
+          <w:tcPr/>
+          <w:p>
+            <w:pPr>
+              <w:pStyle w:val="Compact"/>
+              <w:jc w:val="right"/>
+            </w:pPr>
+            <w:r>
+              <w:t xml:space="preserve">2.00 (37.7)</w:t>
             </w:r>
           </w:p>
         </w:tc>
@@ -1105,43 +1021,31 @@
               <w:jc w:val="right"/>
             </w:pPr>
             <w:r>
-              <w:t xml:space="preserve">1.20</w:t>
-            </w:r>
-          </w:p>
-        </w:tc>
-        <w:tc>
-          <w:tcPr/>
-          <w:p>
-            <w:pPr>
-              <w:pStyle w:val="Compact"/>
-              <w:jc w:val="right"/>
-            </w:pPr>
-            <w:r>
-              <w:t xml:space="preserve">18.8</w:t>
-            </w:r>
-          </w:p>
-        </w:tc>
-        <w:tc>
-          <w:tcPr/>
-          <w:p>
-            <w:pPr>
-              <w:pStyle w:val="Compact"/>
-              <w:jc w:val="right"/>
-            </w:pPr>
-            <w:r>
-              <w:t xml:space="preserve">2.51</w:t>
-            </w:r>
-          </w:p>
-        </w:tc>
-        <w:tc>
-          <w:tcPr/>
-          <w:p>
-            <w:pPr>
-              <w:pStyle w:val="Compact"/>
-              <w:jc w:val="right"/>
-            </w:pPr>
-            <w:r>
-              <w:t xml:space="preserve">47.3</w:t>
+              <w:t xml:space="preserve">1.20 (18.8)</w:t>
+            </w:r>
+          </w:p>
+        </w:tc>
+        <w:tc>
+          <w:tcPr/>
+          <w:p>
+            <w:pPr>
+              <w:pStyle w:val="Compact"/>
+              <w:jc w:val="right"/>
+            </w:pPr>
+            <w:r>
+              <w:t xml:space="preserve">2.51 (47.3)</w:t>
+            </w:r>
+          </w:p>
+        </w:tc>
+        <w:tc>
+          <w:tcPr/>
+          <w:p>
+            <w:pPr>
+              <w:pStyle w:val="Compact"/>
+              <w:jc w:val="right"/>
+            </w:pPr>
+            <w:r>
+              <w:t xml:space="preserve">1.79 (37.5)</w:t>
             </w:r>
           </w:p>
         </w:tc>
@@ -1167,43 +1071,31 @@
               <w:jc w:val="right"/>
             </w:pPr>
             <w:r>
-              <w:t xml:space="preserve">1.00</w:t>
-            </w:r>
-          </w:p>
-        </w:tc>
-        <w:tc>
-          <w:tcPr/>
-          <w:p>
-            <w:pPr>
-              <w:pStyle w:val="Compact"/>
-              <w:jc w:val="right"/>
-            </w:pPr>
-            <w:r>
-              <w:t xml:space="preserve">6.2</w:t>
-            </w:r>
-          </w:p>
-        </w:tc>
-        <w:tc>
-          <w:tcPr/>
-          <w:p>
-            <w:pPr>
-              <w:pStyle w:val="Compact"/>
-              <w:jc w:val="right"/>
-            </w:pPr>
-            <w:r>
-              <w:t xml:space="preserve">1.11</w:t>
-            </w:r>
-          </w:p>
-        </w:tc>
-        <w:tc>
-          <w:tcPr/>
-          <w:p>
-            <w:pPr>
-              <w:pStyle w:val="Compact"/>
-              <w:jc w:val="right"/>
-            </w:pPr>
-            <w:r>
-              <w:t xml:space="preserve">7.8</w:t>
+              <w:t xml:space="preserve">1.00 (6.2)</w:t>
+            </w:r>
+          </w:p>
+        </w:tc>
+        <w:tc>
+          <w:tcPr/>
+          <w:p>
+            <w:pPr>
+              <w:pStyle w:val="Compact"/>
+              <w:jc w:val="right"/>
+            </w:pPr>
+            <w:r>
+              <w:t xml:space="preserve">1.11 (7.8)</w:t>
+            </w:r>
+          </w:p>
+        </w:tc>
+        <w:tc>
+          <w:tcPr/>
+          <w:p>
+            <w:pPr>
+              <w:pStyle w:val="Compact"/>
+              <w:jc w:val="right"/>
+            </w:pPr>
+            <w:r>
+              <w:t xml:space="preserve">1.22 (4.6)</w:t>
             </w:r>
           </w:p>
         </w:tc>
@@ -1214,23 +1106,7 @@
         <w:pStyle w:val="BodyText"/>
       </w:pPr>
       <w:r>
-        <w:t xml:space="preserve">GPT-4o text departs from human text in</w:t>
-      </w:r>
-      <w:r>
-        <w:t xml:space="preserve"> </w:t>
-      </w:r>
-      <w:r>
-        <w:rPr>
-          <w:iCs/>
-          <w:i/>
-        </w:rPr>
-        <w:t xml:space="preserve">both</w:t>
-      </w:r>
-      <w:r>
-        <w:t xml:space="preserve"> </w:t>
-      </w:r>
-      <w:r>
-        <w:t xml:space="preserve">directions, which argues against the simple story that machine text is uniformly</w:t>
+        <w:t xml:space="preserve">Machine text departs from human text in both directions, which argues against the simple story that it is uniformly</w:t>
       </w:r>
       <w:r>
         <w:t xml:space="preserve"> </w:t>
@@ -1245,7 +1121,7 @@
         <w:t xml:space="preserve">”</w:t>
       </w:r>
       <w:r>
-        <w:t xml:space="preserve">. Nominalizations are less dispersed than in human text (median 0.76, i.e., more evenly spread), and semicolons and brackets are less clustered. Passive constructions and quotation marks show the opposite pattern: they are more dispersed in GPT-4o text (medians 2.51 and 3.00, against 1.20 and 1.30). Figure 1 shows the full distributions.</w:t>
+        <w:t xml:space="preserve">. Nominalizations are less dispersed in both generators (medians 0.76 and 1.10, against 1.67 in human text), meaning they are spread more evenly. Passive constructions and quotation marks are more dispersed in both (passive 2.51 and 1.79 against 1.20; quotation marks 3.00 and 2.00 against 1.30). These directions agree across the two generators, which makes them more credible as features of machine writing than as quirks of one model. Figure 1 shows the full distributions for GPT-4o and human text.</w:t>
       </w:r>
     </w:p>
     <w:p>
@@ -1257,7 +1133,7 @@
           <wp:inline>
             <wp:extent cx="5334000" cy="2489200"/>
             <wp:effectExtent b="0" l="0" r="0" t="0"/>
-            <wp:docPr descr="Figure 1. Distribution of log2 dispersion indices by event. Dashed line: Poisson (index of 1). Square brackets for GPT-4o are degenerate because most synthetic papers contain none (index set to one by convention)." title="" id="30" name="Picture"/>
+            <wp:docPr descr="Figure 1. Distribution of log2 dispersion indices by event for human-authored and GPT-4o papers. Dashed line: Poisson (index of 1). Square brackets for GPT-4o are degenerate because most synthetic papers contain none (index set to one by convention)." title="" id="30" name="Picture"/>
             <a:graphic>
               <a:graphicData uri="http://schemas.openxmlformats.org/drawingml/2006/picture">
                 <pic:pic>
@@ -1300,7 +1176,7 @@
         <w:pStyle w:val="ImageCaption"/>
       </w:pPr>
       <w:r>
-        <w:t xml:space="preserve">Figure 1. Distribution of log2 dispersion indices by event. Dashed line: Poisson (index of 1). Square brackets for GPT-4o are degenerate because most synthetic papers contain none (index set to one by convention).</w:t>
+        <w:t xml:space="preserve">Figure 1. Distribution of log2 dispersion indices by event for human-authored and GPT-4o papers. Dashed line: Poisson (index of 1). Square brackets for GPT-4o are degenerate because most synthetic papers contain none (index set to one by convention).</w:t>
       </w:r>
     </w:p>
     <w:p>
@@ -1308,17 +1184,17 @@
         <w:pStyle w:val="BodyText"/>
       </w:pPr>
       <w:r>
-        <w:t xml:space="preserve">One caution applies to the passive result. Because we generated each paper section by section, and the four retained windows roughly track those sections, elevated passive dispersion may partly reflect a procedural artifact (passive voice is concentrated in methods text) rather than a general property of the model. We could not separate the two with the present data.</w:t>
+        <w:t xml:space="preserve">One caution applies to the passive result. Because we generated each paper section by section, and the four retained windows roughly track those sections, elevated passive dispersion may partly reflect a procedural artifact (passive voice is concentrated in methods text) rather than a general property of the models. We could not separate the two with the present data.</w:t>
       </w:r>
     </w:p>
     <w:bookmarkEnd w:id="32"/>
-    <w:bookmarkStart w:id="33" w:name="detection-rq2"/>
+    <w:bookmarkStart w:id="33" w:name="detection-within-a-generator-rq2"/>
     <w:p>
       <w:pPr>
         <w:pStyle w:val="Heading2"/>
       </w:pPr>
       <w:r>
-        <w:t xml:space="preserve">4.2 Detection (RQ2)</w:t>
+        <w:t xml:space="preserve">4.2 Detection within a generator (RQ2)</w:t>
       </w:r>
     </w:p>
     <w:p>
@@ -1326,7 +1202,47 @@
         <w:pStyle w:val="FirstParagraph"/>
       </w:pPr>
       <w:r>
-        <w:t xml:space="preserve">The single-index Poisson-Score performs close to chance (AUC 0.55). Treating its fourteen components as separate predictors changes the picture: logistic regression on rates and dispersion indices reaches a cross-validated AUC of 0.99 (F1 = 0.91). Table 2 decomposes this result.</w:t>
+        <w:t xml:space="preserve">The single-index Poisson-Score performs close to chance: AUC 0.54 for GPT-4o and 0.52 for Claude. Treating its fourteen components as separate predictors changes the picture. With human papers and one generator, cross-validated logistic regression reaches AUC 0.987 for GPT-4o and 0.913 for Claude (Table 3, diagonal). Detection is clearly easier for GPT-4o than for Claude.</w:t>
+      </w:r>
+    </w:p>
+    <w:p>
+      <w:pPr>
+        <w:pStyle w:val="BodyText"/>
+      </w:pPr>
+      <w:r>
+        <w:t xml:space="preserve">Event</w:t>
+      </w:r>
+      <w:r>
+        <w:t xml:space="preserve"> </w:t>
+      </w:r>
+      <w:r>
+        <w:rPr>
+          <w:iCs/>
+          <w:i/>
+        </w:rPr>
+        <w:t xml:space="preserve">rates</w:t>
+      </w:r>
+      <w:r>
+        <w:t xml:space="preserve"> </w:t>
+      </w:r>
+      <w:r>
+        <w:t xml:space="preserve">carry most of this within-generator signal (AUC 0.97 and 0.90), and dispersion alone remains informative (0.86 and 0.75). Table 2 shows why rates are generator-specific. GPT-4o uses far fewer square brackets, semicolons, and quotation marks than human authors, and more nominalizations and discourse markers. Claude differs in a different way: it uses</w:t>
+      </w:r>
+      <w:r>
+        <w:t xml:space="preserve"> </w:t>
+      </w:r>
+      <w:r>
+        <w:rPr>
+          <w:iCs/>
+          <w:i/>
+        </w:rPr>
+        <w:t xml:space="preserve">more</w:t>
+      </w:r>
+      <w:r>
+        <w:t xml:space="preserve"> </w:t>
+      </w:r>
+      <w:r>
+        <w:t xml:space="preserve">semicolons than human authors (3.54 per 500 tokens, against 1.95) and more quotation marks, and fewer discourse markers (1.08 against 1.84). Semicolons are lower than human in one generator and higher in the other, so a rule based on average frequency cannot describe machine text in general.</w:t>
       </w:r>
     </w:p>
     <w:p>
@@ -1334,7 +1250,7 @@
         <w:pStyle w:val="TableCaption"/>
       </w:pPr>
       <w:r>
-        <w:t xml:space="preserve">Table 2. Cross-validated detection of GPT-4o-generated papers (n = 474 human, 245 synthetic; folds grouped by source paper). Field-specific columns compare human and synthetic papers within the same field.</w:t>
+        <w:t xml:space="preserve">Table 2. Mean event count per 500-token window, by source.</w:t>
       </w:r>
     </w:p>
     <w:tbl>
@@ -1343,7 +1259,7 @@
         <w:tblW w:type="auto" w:w="0"/>
         <w:tblLook w:firstRow="1" w:lastRow="0" w:firstColumn="0" w:lastColumn="0" w:noHBand="0" w:noVBand="0" w:val="0020"/>
         <w:jc w:val="start"/>
-        <w:tblCaption w:val="Table 2. Cross-validated detection of GPT-4o-generated papers (n = 474 human, 245 synthetic; folds grouped by source paper). Field-specific columns compare human and synthetic papers within the same field."/>
+        <w:tblCaption w:val="Table 2. Mean event count per 500-token window, by source."/>
       </w:tblPr>
       <w:tblGrid>
         <w:gridCol w:w="1980"/>
@@ -1363,43 +1279,43 @@
               <w:jc w:val="left"/>
             </w:pPr>
             <w:r>
-              <w:t xml:space="preserve">Feature set</w:t>
-            </w:r>
-          </w:p>
-        </w:tc>
-        <w:tc>
-          <w:tcPr/>
-          <w:p>
-            <w:pPr>
-              <w:pStyle w:val="Compact"/>
-              <w:jc w:val="right"/>
-            </w:pPr>
-            <w:r>
-              <w:t xml:space="preserve">AUC</w:t>
-            </w:r>
-          </w:p>
-        </w:tc>
-        <w:tc>
-          <w:tcPr/>
-          <w:p>
-            <w:pPr>
-              <w:pStyle w:val="Compact"/>
-              <w:jc w:val="right"/>
-            </w:pPr>
-            <w:r>
-              <w:t xml:space="preserve">Medicine only</w:t>
-            </w:r>
-          </w:p>
-        </w:tc>
-        <w:tc>
-          <w:tcPr/>
-          <w:p>
-            <w:pPr>
-              <w:pStyle w:val="Compact"/>
-              <w:jc w:val="right"/>
-            </w:pPr>
-            <w:r>
-              <w:t xml:space="preserve">Computer science only</w:t>
+              <w:t xml:space="preserve">Event</w:t>
+            </w:r>
+          </w:p>
+        </w:tc>
+        <w:tc>
+          <w:tcPr/>
+          <w:p>
+            <w:pPr>
+              <w:pStyle w:val="Compact"/>
+              <w:jc w:val="right"/>
+            </w:pPr>
+            <w:r>
+              <w:t xml:space="preserve">Human</w:t>
+            </w:r>
+          </w:p>
+        </w:tc>
+        <w:tc>
+          <w:tcPr/>
+          <w:p>
+            <w:pPr>
+              <w:pStyle w:val="Compact"/>
+              <w:jc w:val="right"/>
+            </w:pPr>
+            <w:r>
+              <w:t xml:space="preserve">GPT-4o</w:t>
+            </w:r>
+          </w:p>
+        </w:tc>
+        <w:tc>
+          <w:tcPr/>
+          <w:p>
+            <w:pPr>
+              <w:pStyle w:val="Compact"/>
+              <w:jc w:val="right"/>
+            </w:pPr>
+            <w:r>
+              <w:t xml:space="preserve">Claude</w:t>
             </w:r>
           </w:p>
         </w:tc>
@@ -1413,43 +1329,43 @@
               <w:jc w:val="left"/>
             </w:pPr>
             <w:r>
-              <w:t xml:space="preserve">Rates only</w:t>
-            </w:r>
-          </w:p>
-        </w:tc>
-        <w:tc>
-          <w:tcPr/>
-          <w:p>
-            <w:pPr>
-              <w:pStyle w:val="Compact"/>
-              <w:jc w:val="right"/>
-            </w:pPr>
-            <w:r>
-              <w:t xml:space="preserve">0.969</w:t>
-            </w:r>
-          </w:p>
-        </w:tc>
-        <w:tc>
-          <w:tcPr/>
-          <w:p>
-            <w:pPr>
-              <w:pStyle w:val="Compact"/>
-              <w:jc w:val="right"/>
-            </w:pPr>
-            <w:r>
-              <w:t xml:space="preserve">0.960</w:t>
-            </w:r>
-          </w:p>
-        </w:tc>
-        <w:tc>
-          <w:tcPr/>
-          <w:p>
-            <w:pPr>
-              <w:pStyle w:val="Compact"/>
-              <w:jc w:val="right"/>
-            </w:pPr>
-            <w:r>
-              <w:t xml:space="preserve">0.986</w:t>
+              <w:t xml:space="preserve">Parentheses</w:t>
+            </w:r>
+          </w:p>
+        </w:tc>
+        <w:tc>
+          <w:tcPr/>
+          <w:p>
+            <w:pPr>
+              <w:pStyle w:val="Compact"/>
+              <w:jc w:val="right"/>
+            </w:pPr>
+            <w:r>
+              <w:t xml:space="preserve">9.80</w:t>
+            </w:r>
+          </w:p>
+        </w:tc>
+        <w:tc>
+          <w:tcPr/>
+          <w:p>
+            <w:pPr>
+              <w:pStyle w:val="Compact"/>
+              <w:jc w:val="right"/>
+            </w:pPr>
+            <w:r>
+              <w:t xml:space="preserve">7.39</w:t>
+            </w:r>
+          </w:p>
+        </w:tc>
+        <w:tc>
+          <w:tcPr/>
+          <w:p>
+            <w:pPr>
+              <w:pStyle w:val="Compact"/>
+              <w:jc w:val="right"/>
+            </w:pPr>
+            <w:r>
+              <w:t xml:space="preserve">11.39</w:t>
             </w:r>
           </w:p>
         </w:tc>
@@ -1463,43 +1379,43 @@
               <w:jc w:val="left"/>
             </w:pPr>
             <w:r>
-              <w:t xml:space="preserve">Dispersion indices only</w:t>
-            </w:r>
-          </w:p>
-        </w:tc>
-        <w:tc>
-          <w:tcPr/>
-          <w:p>
-            <w:pPr>
-              <w:pStyle w:val="Compact"/>
-              <w:jc w:val="right"/>
-            </w:pPr>
-            <w:r>
-              <w:t xml:space="preserve">0.860</w:t>
-            </w:r>
-          </w:p>
-        </w:tc>
-        <w:tc>
-          <w:tcPr/>
-          <w:p>
-            <w:pPr>
-              <w:pStyle w:val="Compact"/>
-              <w:jc w:val="right"/>
-            </w:pPr>
-            <w:r>
-              <w:t xml:space="preserve">0.871</w:t>
-            </w:r>
-          </w:p>
-        </w:tc>
-        <w:tc>
-          <w:tcPr/>
-          <w:p>
-            <w:pPr>
-              <w:pStyle w:val="Compact"/>
-              <w:jc w:val="right"/>
-            </w:pPr>
-            <w:r>
-              <w:t xml:space="preserve">0.825</w:t>
+              <w:t xml:space="preserve">Square brackets</w:t>
+            </w:r>
+          </w:p>
+        </w:tc>
+        <w:tc>
+          <w:tcPr/>
+          <w:p>
+            <w:pPr>
+              <w:pStyle w:val="Compact"/>
+              <w:jc w:val="right"/>
+            </w:pPr>
+            <w:r>
+              <w:t xml:space="preserve">4.46</w:t>
+            </w:r>
+          </w:p>
+        </w:tc>
+        <w:tc>
+          <w:tcPr/>
+          <w:p>
+            <w:pPr>
+              <w:pStyle w:val="Compact"/>
+              <w:jc w:val="right"/>
+            </w:pPr>
+            <w:r>
+              <w:t xml:space="preserve">0.21</w:t>
+            </w:r>
+          </w:p>
+        </w:tc>
+        <w:tc>
+          <w:tcPr/>
+          <w:p>
+            <w:pPr>
+              <w:pStyle w:val="Compact"/>
+              <w:jc w:val="right"/>
+            </w:pPr>
+            <w:r>
+              <w:t xml:space="preserve">0.41</w:t>
             </w:r>
           </w:p>
         </w:tc>
@@ -1513,43 +1429,43 @@
               <w:jc w:val="left"/>
             </w:pPr>
             <w:r>
-              <w:t xml:space="preserve">Rates and dispersion</w:t>
-            </w:r>
-          </w:p>
-        </w:tc>
-        <w:tc>
-          <w:tcPr/>
-          <w:p>
-            <w:pPr>
-              <w:pStyle w:val="Compact"/>
-              <w:jc w:val="right"/>
-            </w:pPr>
-            <w:r>
-              <w:t xml:space="preserve">0.987</w:t>
-            </w:r>
-          </w:p>
-        </w:tc>
-        <w:tc>
-          <w:tcPr/>
-          <w:p>
-            <w:pPr>
-              <w:pStyle w:val="Compact"/>
-              <w:jc w:val="right"/>
-            </w:pPr>
-            <w:r>
-              <w:t xml:space="preserve">0.983</w:t>
-            </w:r>
-          </w:p>
-        </w:tc>
-        <w:tc>
-          <w:tcPr/>
-          <w:p>
-            <w:pPr>
-              <w:pStyle w:val="Compact"/>
-              <w:jc w:val="right"/>
-            </w:pPr>
-            <w:r>
-              <w:t xml:space="preserve">0.984</w:t>
+              <w:t xml:space="preserve">Semicolons</w:t>
+            </w:r>
+          </w:p>
+        </w:tc>
+        <w:tc>
+          <w:tcPr/>
+          <w:p>
+            <w:pPr>
+              <w:pStyle w:val="Compact"/>
+              <w:jc w:val="right"/>
+            </w:pPr>
+            <w:r>
+              <w:t xml:space="preserve">1.95</w:t>
+            </w:r>
+          </w:p>
+        </w:tc>
+        <w:tc>
+          <w:tcPr/>
+          <w:p>
+            <w:pPr>
+              <w:pStyle w:val="Compact"/>
+              <w:jc w:val="right"/>
+            </w:pPr>
+            <w:r>
+              <w:t xml:space="preserve">0.51</w:t>
+            </w:r>
+          </w:p>
+        </w:tc>
+        <w:tc>
+          <w:tcPr/>
+          <w:p>
+            <w:pPr>
+              <w:pStyle w:val="Compact"/>
+              <w:jc w:val="right"/>
+            </w:pPr>
+            <w:r>
+              <w:t xml:space="preserve">3.54</w:t>
             </w:r>
           </w:p>
         </w:tc>
@@ -1563,67 +1479,553 @@
               <w:jc w:val="left"/>
             </w:pPr>
             <w:r>
-              <w:t xml:space="preserve">Poisson-Score (single index)</w:t>
-            </w:r>
-          </w:p>
-        </w:tc>
-        <w:tc>
-          <w:tcPr/>
-          <w:p>
-            <w:pPr>
-              <w:pStyle w:val="Compact"/>
-              <w:jc w:val="right"/>
-            </w:pPr>
-            <w:r>
-              <w:t xml:space="preserve">0.546</w:t>
-            </w:r>
-          </w:p>
-        </w:tc>
-        <w:tc>
-          <w:tcPr/>
-          <w:p>
-            <w:pPr>
-              <w:pStyle w:val="Compact"/>
-              <w:jc w:val="right"/>
-            </w:pPr>
-            <w:r>
-              <w:t xml:space="preserve">—</w:t>
-            </w:r>
-          </w:p>
-        </w:tc>
-        <w:tc>
-          <w:tcPr/>
-          <w:p>
-            <w:pPr>
-              <w:pStyle w:val="Compact"/>
-              <w:jc w:val="right"/>
-            </w:pPr>
-            <w:r>
-              <w:t xml:space="preserve">—</w:t>
+              <w:t xml:space="preserve">Quotation marks</w:t>
+            </w:r>
+          </w:p>
+        </w:tc>
+        <w:tc>
+          <w:tcPr/>
+          <w:p>
+            <w:pPr>
+              <w:pStyle w:val="Compact"/>
+              <w:jc w:val="right"/>
+            </w:pPr>
+            <w:r>
+              <w:t xml:space="preserve">0.95</w:t>
+            </w:r>
+          </w:p>
+        </w:tc>
+        <w:tc>
+          <w:tcPr/>
+          <w:p>
+            <w:pPr>
+              <w:pStyle w:val="Compact"/>
+              <w:jc w:val="right"/>
+            </w:pPr>
+            <w:r>
+              <w:t xml:space="preserve">0.53</w:t>
+            </w:r>
+          </w:p>
+        </w:tc>
+        <w:tc>
+          <w:tcPr/>
+          <w:p>
+            <w:pPr>
+              <w:pStyle w:val="Compact"/>
+              <w:jc w:val="right"/>
+            </w:pPr>
+            <w:r>
+              <w:t xml:space="preserve">1.23</w:t>
+            </w:r>
+          </w:p>
+        </w:tc>
+      </w:tr>
+      <w:tr>
+        <w:tc>
+          <w:tcPr/>
+          <w:p>
+            <w:pPr>
+              <w:pStyle w:val="Compact"/>
+              <w:jc w:val="left"/>
+            </w:pPr>
+            <w:r>
+              <w:t xml:space="preserve">Discourse markers</w:t>
+            </w:r>
+          </w:p>
+        </w:tc>
+        <w:tc>
+          <w:tcPr/>
+          <w:p>
+            <w:pPr>
+              <w:pStyle w:val="Compact"/>
+              <w:jc w:val="right"/>
+            </w:pPr>
+            <w:r>
+              <w:t xml:space="preserve">1.84</w:t>
+            </w:r>
+          </w:p>
+        </w:tc>
+        <w:tc>
+          <w:tcPr/>
+          <w:p>
+            <w:pPr>
+              <w:pStyle w:val="Compact"/>
+              <w:jc w:val="right"/>
+            </w:pPr>
+            <w:r>
+              <w:t xml:space="preserve">2.38</w:t>
+            </w:r>
+          </w:p>
+        </w:tc>
+        <w:tc>
+          <w:tcPr/>
+          <w:p>
+            <w:pPr>
+              <w:pStyle w:val="Compact"/>
+              <w:jc w:val="right"/>
+            </w:pPr>
+            <w:r>
+              <w:t xml:space="preserve">1.08</w:t>
+            </w:r>
+          </w:p>
+        </w:tc>
+      </w:tr>
+      <w:tr>
+        <w:tc>
+          <w:tcPr/>
+          <w:p>
+            <w:pPr>
+              <w:pStyle w:val="Compact"/>
+              <w:jc w:val="left"/>
+            </w:pPr>
+            <w:r>
+              <w:t xml:space="preserve">Passive constructions</w:t>
+            </w:r>
+          </w:p>
+        </w:tc>
+        <w:tc>
+          <w:tcPr/>
+          <w:p>
+            <w:pPr>
+              <w:pStyle w:val="Compact"/>
+              <w:jc w:val="right"/>
+            </w:pPr>
+            <w:r>
+              <w:t xml:space="preserve">8.08</w:t>
+            </w:r>
+          </w:p>
+        </w:tc>
+        <w:tc>
+          <w:tcPr/>
+          <w:p>
+            <w:pPr>
+              <w:pStyle w:val="Compact"/>
+              <w:jc w:val="right"/>
+            </w:pPr>
+            <w:r>
+              <w:t xml:space="preserve">6.18</w:t>
+            </w:r>
+          </w:p>
+        </w:tc>
+        <w:tc>
+          <w:tcPr/>
+          <w:p>
+            <w:pPr>
+              <w:pStyle w:val="Compact"/>
+              <w:jc w:val="right"/>
+            </w:pPr>
+            <w:r>
+              <w:t xml:space="preserve">8.61</w:t>
+            </w:r>
+          </w:p>
+        </w:tc>
+      </w:tr>
+      <w:tr>
+        <w:tc>
+          <w:tcPr/>
+          <w:p>
+            <w:pPr>
+              <w:pStyle w:val="Compact"/>
+              <w:jc w:val="left"/>
+            </w:pPr>
+            <w:r>
+              <w:t xml:space="preserve">Nominalizations</w:t>
+            </w:r>
+          </w:p>
+        </w:tc>
+        <w:tc>
+          <w:tcPr/>
+          <w:p>
+            <w:pPr>
+              <w:pStyle w:val="Compact"/>
+              <w:jc w:val="right"/>
+            </w:pPr>
+            <w:r>
+              <w:t xml:space="preserve">24.43</w:t>
+            </w:r>
+          </w:p>
+        </w:tc>
+        <w:tc>
+          <w:tcPr/>
+          <w:p>
+            <w:pPr>
+              <w:pStyle w:val="Compact"/>
+              <w:jc w:val="right"/>
+            </w:pPr>
+            <w:r>
+              <w:t xml:space="preserve">34.08</w:t>
+            </w:r>
+          </w:p>
+        </w:tc>
+        <w:tc>
+          <w:tcPr/>
+          <w:p>
+            <w:pPr>
+              <w:pStyle w:val="Compact"/>
+              <w:jc w:val="right"/>
+            </w:pPr>
+            <w:r>
+              <w:t xml:space="preserve">27.34</w:t>
             </w:r>
           </w:p>
         </w:tc>
       </w:tr>
     </w:tbl>
+    <w:bookmarkEnd w:id="33"/>
+    <w:bookmarkStart w:id="34" w:name="detection-across-generators-rq2"/>
+    <w:p>
+      <w:pPr>
+        <w:pStyle w:val="Heading2"/>
+      </w:pPr>
+      <w:r>
+        <w:t xml:space="preserve">4.3 Detection across generators (RQ2)</w:t>
+      </w:r>
+    </w:p>
+    <w:p>
+      <w:pPr>
+        <w:pStyle w:val="FirstParagraph"/>
+      </w:pPr>
+      <w:r>
+        <w:t xml:space="preserve">Table 3 gives the central robustness result. When the detector is trained on human text plus one generator and tested on the other, performance falls sharply. A GPT-4o-trained detector reaches an AUC of 0.73 on Claude papers (95% interval 0.69 to 0.78), down from 0.99 on GPT-4o itself. A Claude-trained detector reaches 0.81 on GPT-4o papers (0.78 to 0.84).</w:t>
+      </w:r>
+    </w:p>
+    <w:p>
+      <w:pPr>
+        <w:pStyle w:val="TableCaption"/>
+      </w:pPr>
+      <w:r>
+        <w:t xml:space="preserve">Table 3. AUC (95% bootstrap interval) by training and test generator and feature family. Training and test folds are grouped by source paper; test documents include held-out human papers.</w:t>
+      </w:r>
+    </w:p>
+    <w:tbl>
+      <w:tblPr>
+        <w:tblStyle w:val="Table"/>
+        <w:tblW w:type="pct" w:w="5000"/>
+        <w:tblLook w:firstRow="1" w:lastRow="0" w:firstColumn="0" w:lastColumn="0" w:noHBand="0" w:noVBand="0" w:val="0020"/>
+        <w:jc w:val="start"/>
+        <w:tblCaption w:val="Table 3. AUC (95% bootstrap interval) by training and test generator and feature family. Training and test folds are grouped by source paper; test documents include held-out human papers."/>
+      </w:tblPr>
+      <w:tblGrid>
+        <w:gridCol w:w="1980"/>
+        <w:gridCol w:w="1980"/>
+        <w:gridCol w:w="1980"/>
+        <w:gridCol w:w="1980"/>
+      </w:tblGrid>
+      <w:tr>
+        <w:trPr>
+          <w:tblHeader w:val="true"/>
+        </w:trPr>
+        <w:tc>
+          <w:tcPr/>
+          <w:p>
+            <w:pPr>
+              <w:pStyle w:val="Compact"/>
+              <w:jc w:val="left"/>
+            </w:pPr>
+            <w:r>
+              <w:t xml:space="preserve">Train → Test</w:t>
+            </w:r>
+          </w:p>
+        </w:tc>
+        <w:tc>
+          <w:tcPr/>
+          <w:p>
+            <w:pPr>
+              <w:pStyle w:val="Compact"/>
+              <w:jc w:val="left"/>
+            </w:pPr>
+            <w:r>
+              <w:t xml:space="preserve">Rates</w:t>
+            </w:r>
+          </w:p>
+        </w:tc>
+        <w:tc>
+          <w:tcPr/>
+          <w:p>
+            <w:pPr>
+              <w:pStyle w:val="Compact"/>
+              <w:jc w:val="left"/>
+            </w:pPr>
+            <w:r>
+              <w:t xml:space="preserve">Dispersion</w:t>
+            </w:r>
+          </w:p>
+        </w:tc>
+        <w:tc>
+          <w:tcPr/>
+          <w:p>
+            <w:pPr>
+              <w:pStyle w:val="Compact"/>
+              <w:jc w:val="left"/>
+            </w:pPr>
+            <w:r>
+              <w:t xml:space="preserve">Both</w:t>
+            </w:r>
+          </w:p>
+        </w:tc>
+      </w:tr>
+      <w:tr>
+        <w:tc>
+          <w:tcPr/>
+          <w:p>
+            <w:pPr>
+              <w:pStyle w:val="Compact"/>
+              <w:jc w:val="left"/>
+            </w:pPr>
+            <w:r>
+              <w:t xml:space="preserve">GPT-4o → GPT-4o</w:t>
+            </w:r>
+          </w:p>
+        </w:tc>
+        <w:tc>
+          <w:tcPr/>
+          <w:p>
+            <w:pPr>
+              <w:pStyle w:val="Compact"/>
+              <w:jc w:val="left"/>
+            </w:pPr>
+            <w:r>
+              <w:t xml:space="preserve">0.971 [0.96, 0.98]</w:t>
+            </w:r>
+          </w:p>
+        </w:tc>
+        <w:tc>
+          <w:tcPr/>
+          <w:p>
+            <w:pPr>
+              <w:pStyle w:val="Compact"/>
+              <w:jc w:val="left"/>
+            </w:pPr>
+            <w:r>
+              <w:t xml:space="preserve">0.856 [0.83, 0.88]</w:t>
+            </w:r>
+          </w:p>
+        </w:tc>
+        <w:tc>
+          <w:tcPr/>
+          <w:p>
+            <w:pPr>
+              <w:pStyle w:val="Compact"/>
+              <w:jc w:val="left"/>
+            </w:pPr>
+            <w:r>
+              <w:t xml:space="preserve">0.987 [0.98, 0.99]</w:t>
+            </w:r>
+          </w:p>
+        </w:tc>
+      </w:tr>
+      <w:tr>
+        <w:tc>
+          <w:tcPr/>
+          <w:p>
+            <w:pPr>
+              <w:pStyle w:val="Compact"/>
+              <w:jc w:val="left"/>
+            </w:pPr>
+            <w:r>
+              <w:t xml:space="preserve">Claude → Claude</w:t>
+            </w:r>
+          </w:p>
+        </w:tc>
+        <w:tc>
+          <w:tcPr/>
+          <w:p>
+            <w:pPr>
+              <w:pStyle w:val="Compact"/>
+              <w:jc w:val="left"/>
+            </w:pPr>
+            <w:r>
+              <w:t xml:space="preserve">0.904 [0.88, 0.93]</w:t>
+            </w:r>
+          </w:p>
+        </w:tc>
+        <w:tc>
+          <w:tcPr/>
+          <w:p>
+            <w:pPr>
+              <w:pStyle w:val="Compact"/>
+              <w:jc w:val="left"/>
+            </w:pPr>
+            <w:r>
+              <w:t xml:space="preserve">0.751 [0.71, 0.80]</w:t>
+            </w:r>
+          </w:p>
+        </w:tc>
+        <w:tc>
+          <w:tcPr/>
+          <w:p>
+            <w:pPr>
+              <w:pStyle w:val="Compact"/>
+              <w:jc w:val="left"/>
+            </w:pPr>
+            <w:r>
+              <w:t xml:space="preserve">0.913 [0.89, 0.94]</w:t>
+            </w:r>
+          </w:p>
+        </w:tc>
+      </w:tr>
+      <w:tr>
+        <w:tc>
+          <w:tcPr/>
+          <w:p>
+            <w:pPr>
+              <w:pStyle w:val="Compact"/>
+              <w:jc w:val="left"/>
+            </w:pPr>
+            <w:r>
+              <w:t xml:space="preserve">GPT-4o → Claude</w:t>
+            </w:r>
+          </w:p>
+        </w:tc>
+        <w:tc>
+          <w:tcPr/>
+          <w:p>
+            <w:pPr>
+              <w:pStyle w:val="Compact"/>
+              <w:jc w:val="left"/>
+            </w:pPr>
+            <w:r>
+              <w:t xml:space="preserve">0.659 [0.62, 0.70]</w:t>
+            </w:r>
+          </w:p>
+        </w:tc>
+        <w:tc>
+          <w:tcPr/>
+          <w:p>
+            <w:pPr>
+              <w:pStyle w:val="Compact"/>
+              <w:jc w:val="left"/>
+            </w:pPr>
+            <w:r>
+              <w:t xml:space="preserve">0.704 [0.65, 0.75]</w:t>
+            </w:r>
+          </w:p>
+        </w:tc>
+        <w:tc>
+          <w:tcPr/>
+          <w:p>
+            <w:pPr>
+              <w:pStyle w:val="Compact"/>
+              <w:jc w:val="left"/>
+            </w:pPr>
+            <w:r>
+              <w:t xml:space="preserve">0.730 [0.69, 0.78]</w:t>
+            </w:r>
+          </w:p>
+        </w:tc>
+      </w:tr>
+      <w:tr>
+        <w:tc>
+          <w:tcPr/>
+          <w:p>
+            <w:pPr>
+              <w:pStyle w:val="Compact"/>
+              <w:jc w:val="left"/>
+            </w:pPr>
+            <w:r>
+              <w:t xml:space="preserve">Claude → GPT-4o</w:t>
+            </w:r>
+          </w:p>
+        </w:tc>
+        <w:tc>
+          <w:tcPr/>
+          <w:p>
+            <w:pPr>
+              <w:pStyle w:val="Compact"/>
+              <w:jc w:val="left"/>
+            </w:pPr>
+            <w:r>
+              <w:t xml:space="preserve">0.728 [0.69, 0.76]</w:t>
+            </w:r>
+          </w:p>
+        </w:tc>
+        <w:tc>
+          <w:tcPr/>
+          <w:p>
+            <w:pPr>
+              <w:pStyle w:val="Compact"/>
+              <w:jc w:val="left"/>
+            </w:pPr>
+            <w:r>
+              <w:t xml:space="preserve">0.808 [0.77, 0.84]</w:t>
+            </w:r>
+          </w:p>
+        </w:tc>
+        <w:tc>
+          <w:tcPr/>
+          <w:p>
+            <w:pPr>
+              <w:pStyle w:val="Compact"/>
+              <w:jc w:val="left"/>
+            </w:pPr>
+            <w:r>
+              <w:t xml:space="preserve">0.810 [0.78, 0.84]</w:t>
+            </w:r>
+          </w:p>
+        </w:tc>
+      </w:tr>
+    </w:tbl>
     <w:p>
       <w:pPr>
         <w:pStyle w:val="BodyText"/>
       </w:pPr>
       <w:r>
-        <w:t xml:space="preserve">Two readings follow. First, the strongest signal is in event</w:t>
-      </w:r>
-      <w:r>
-        <w:t xml:space="preserve"> </w:t>
-      </w:r>
-      <w:r>
-        <w:rPr>
-          <w:iCs/>
-          <w:i/>
-        </w:rPr>
-        <w:t xml:space="preserve">rates</w:t>
-      </w:r>
-      <w:r>
-        <w:t xml:space="preserve">. GPT-4o text uses far fewer square brackets (0.21 per 500 tokens, against 4.46 in human text), semicolons (0.51 against 1.95), and quotation marks (0.53 against 0.95), and substantially more nominalizations (34.1 against 24.4) and discourse markers (2.38 against 1.84). These are stylistic differences and do not depend on the Poisson framing. Part of the gap may reflect how the model was prompted: our prompts asked for in-text citations, and a model that writes author–year citations would use few square brackets, whereas many PubMed Central articles cite with bracketed numbers. We did not examine citation style directly, so this explanation is a hypothesis, and a different prompt could shift these rates.</w:t>
+        <w:t xml:space="preserve">Two patterns stand out. First, the gap between within-generator and cross-generator AUC is large for every feature family, so a detector calibrated on one generator should not be assumed to protect against another. Second, rates transfer worst (0.66 and 0.73), and dispersion transfers better (0.70 and 0.81), matching or exceeding the combined model in the Claude-to-GPT-4o direction. This is consistent with the sign pattern in Table 2: rate differences reverse across generators, while dispersion differences for passives, quotation marks, and nominalizations point the same way (Table 1). Dispersion is the more portable signal, though even it is far from sufficient on its own.</w:t>
+      </w:r>
+    </w:p>
+    <w:bookmarkEnd w:id="34"/>
+    <w:bookmarkStart w:id="35" w:name="cost-rq3"/>
+    <w:p>
+      <w:pPr>
+        <w:pStyle w:val="Heading2"/>
+      </w:pPr>
+      <w:r>
+        <w:t xml:space="preserve">4.4 Cost (RQ3)</w:t>
+      </w:r>
+    </w:p>
+    <w:p>
+      <w:pPr>
+        <w:pStyle w:val="FirstParagraph"/>
+      </w:pPr>
+      <w:r>
+        <w:t xml:space="preserve">Computing all events and indices took about 6 milliseconds per document on one CPU core (roughly 160 documents per second) with no external service calls, so the marginal monetary cost is zero. For context on the generation side, producing one paper through four requests cost about US$0.04 and 38 seconds on average for GPT-4o, and about US$0.13 and 100 seconds for Claude, through the gateway we used. We did not run an LLM-as-a-judge baseline, so we cannot report a measured cost or latency ratio between the two screening methods; any such comparison would depend on the judge model, prompt length, and pricing at the time.</w:t>
+      </w:r>
+    </w:p>
+    <w:bookmarkEnd w:id="35"/>
+    <w:bookmarkEnd w:id="36"/>
+    <w:bookmarkStart w:id="37" w:name="discussion"/>
+    <w:p>
+      <w:pPr>
+        <w:pStyle w:val="Heading1"/>
+      </w:pPr>
+      <w:r>
+        <w:t xml:space="preserve">5. Discussion</w:t>
+      </w:r>
+    </w:p>
+    <w:p>
+      <w:pPr>
+        <w:pStyle w:val="FirstParagraph"/>
+      </w:pPr>
+      <w:r>
+        <w:t xml:space="preserve">The headline lessons are two. The intuitive version of the idea does not hold: human scientific text is not Poisson, and a single</w:t>
+      </w:r>
+      <w:r>
+        <w:t xml:space="preserve"> </w:t>
+      </w:r>
+      <w:r>
+        <w:t xml:space="preserve">“</w:t>
+      </w:r>
+      <w:r>
+        <w:t xml:space="preserve">distance from Poisson</w:t>
+      </w:r>
+      <w:r>
+        <w:t xml:space="preserve">”</w:t>
+      </w:r>
+      <w:r>
+        <w:t xml:space="preserve"> </w:t>
+      </w:r>
+      <w:r>
+        <w:t xml:space="preserve">score has almost no discriminating power. And the version that does work, a vector of rates and dispersion indices, works well only for the generator it was built on.</w:t>
       </w:r>
     </w:p>
     <w:p>
@@ -1631,60 +2033,23 @@
         <w:pStyle w:val="BodyText"/>
       </w:pPr>
       <w:r>
-        <w:t xml:space="preserve">Second, dispersion alone still discriminates well (AUC 0.86; 0.83–0.87 within field). This is the evidence most relevant to the count-process idea, because it does not rely on average event frequency. Differences between fields were small, which suggests the result is not driven by field composition alone.</w:t>
-      </w:r>
-    </w:p>
-    <w:bookmarkEnd w:id="33"/>
-    <w:bookmarkStart w:id="34" w:name="cost-rq3"/>
-    <w:p>
-      <w:pPr>
-        <w:pStyle w:val="Heading2"/>
-      </w:pPr>
-      <w:r>
-        <w:t xml:space="preserve">4.3 Cost (RQ3)</w:t>
-      </w:r>
-    </w:p>
-    <w:p>
-      <w:pPr>
-        <w:pStyle w:val="FirstParagraph"/>
-      </w:pPr>
-      <w:r>
-        <w:t xml:space="preserve">Computing all events and indices took 0.006 seconds per document on one CPU core (about 170 documents per second) with no external service calls, so the marginal monetary cost is zero. For context on the</w:t>
-      </w:r>
-      <w:r>
-        <w:t xml:space="preserve"> </w:t>
-      </w:r>
-      <w:r>
-        <w:rPr>
-          <w:iCs/>
-          <w:i/>
-        </w:rPr>
-        <w:t xml:space="preserve">generation</w:t>
-      </w:r>
-      <w:r>
-        <w:t xml:space="preserve"> </w:t>
-      </w:r>
-      <w:r>
-        <w:t xml:space="preserve">side, producing one paper through four requests cost about US$0.04 and 38 seconds on average through a commercial API gateway. We did not run an LLM-as-a-judge baseline, so we cannot report a measured cost or latency ratio between the two screening methods; any such comparison would depend on the judge model, prompt length, and pricing at the time, and we leave it to future work.</w:t>
-      </w:r>
-    </w:p>
-    <w:bookmarkEnd w:id="34"/>
-    <w:bookmarkEnd w:id="35"/>
-    <w:bookmarkStart w:id="36" w:name="discussion"/>
-    <w:p>
-      <w:pPr>
-        <w:pStyle w:val="Heading1"/>
-      </w:pPr>
-      <w:r>
-        <w:t xml:space="preserve">5. Discussion</w:t>
-      </w:r>
-    </w:p>
-    <w:p>
-      <w:pPr>
-        <w:pStyle w:val="FirstParagraph"/>
-      </w:pPr>
-      <w:r>
-        <w:t xml:space="preserve">The headline lesson is that the intuitive version of the idea does not hold. Human scientific text is not Poisson, and a single</w:t>
+        <w:t xml:space="preserve">The second lesson matters for practice. High within-generator accuracy is easy to obtain and easy to over-read. When the detector meets a generator it has not seen, accuracy falls to roughly 0.73 to 0.81, which is useful as a weak signal but not as a decision rule. Event rates are especially fragile, because each generator has its own stylistic habits, including habits that point in opposite directions relative to human writers. An organization that deployed such a screen would need to recalibrate per generator and per venue, and to expect decay as models change.</w:t>
+      </w:r>
+    </w:p>
+    <w:p>
+      <w:pPr>
+        <w:pStyle w:val="BodyText"/>
+      </w:pPr>
+      <w:r>
+        <w:t xml:space="preserve">The result is less discouraging for the count-process idea than for the rate-based version. Dispersion generalizes better than rates, and the direction of several dispersion differences agrees across two generators. If a general machine-text signature exists in these features, it is more likely to be found in how events cluster than in how often they occur. We see this as a hypothesis for larger studies with more generators, including open-weight models, rather than an established finding. A screen that models human text alone, and flags departures from it without training on any generator, may also transfer better; we have not tested this.</w:t>
+      </w:r>
+    </w:p>
+    <w:p>
+      <w:pPr>
+        <w:pStyle w:val="BodyText"/>
+      </w:pPr>
+      <w:r>
+        <w:t xml:space="preserve">For governance, the practical value of these features is transparency and cost, not accuracy. A flag such as</w:t>
       </w:r>
       <w:r>
         <w:t xml:space="preserve"> </w:t>
@@ -1693,7 +2058,7 @@
         <w:t xml:space="preserve">“</w:t>
       </w:r>
       <w:r>
-        <w:t xml:space="preserve">distance from Poisson</w:t>
+        <w:t xml:space="preserve">unusually clustered passive constructions and almost no bracketed citations</w:t>
       </w:r>
       <w:r>
         <w:t xml:space="preserve">”</w:t>
@@ -1702,45 +2067,11 @@
         <w:t xml:space="preserve"> </w:t>
       </w:r>
       <w:r>
-        <w:t xml:space="preserve">score has almost no discriminating power. What does work is a richer description that includes both how often events occur and how clustered they are, compared against empirical human distributions rather than a theoretical benchmark. In effect, the Poisson model is useful here as a yardstick for describing departures (dispersion indices), not as a null hypothesis that human writing satisfies.</w:t>
-      </w:r>
-    </w:p>
-    <w:p>
-      <w:pPr>
-        <w:pStyle w:val="BodyText"/>
-      </w:pPr>
-      <w:r>
-        <w:t xml:space="preserve">For practitioners, two implications stand out. A screening layer based on these features would be extremely cheap and its outputs interpretable in plain terms:</w:t>
-      </w:r>
-      <w:r>
-        <w:t xml:space="preserve"> </w:t>
-      </w:r>
-      <w:r>
-        <w:t xml:space="preserve">“</w:t>
-      </w:r>
-      <w:r>
-        <w:t xml:space="preserve">this paper has almost no bracketed citations, and its passive constructions are unusually clustered.</w:t>
-      </w:r>
-      <w:r>
-        <w:t xml:space="preserve">”</w:t>
-      </w:r>
-      <w:r>
-        <w:t xml:space="preserve"> </w:t>
-      </w:r>
-      <w:r>
-        <w:t xml:space="preserve">That kind of statement can be shown to an author or editor. Second, the large role of rates suggests that a detector of this type is likely to be sensitive to prompting and to the citation conventions of a field, so it should be calibrated per venue and refreshed as models change.</w:t>
-      </w:r>
-    </w:p>
-    <w:p>
-      <w:pPr>
-        <w:pStyle w:val="BodyText"/>
-      </w:pPr>
-      <w:r>
-        <w:t xml:space="preserve">For research, the within-field dispersion result is the more interesting one. If dispersion carries signal beyond average frequency, then count-process descriptions of text deserve more attention than the single-metric approaches currently dominating the literature. The mixed directions in Table 1 also suggest that future work should model events separately rather than assume machine text is uniformly more regular.</w:t>
-      </w:r>
-    </w:p>
-    <w:bookmarkEnd w:id="36"/>
-    <w:bookmarkStart w:id="37" w:name="limitations"/>
+        <w:t xml:space="preserve">can be explained to an author or editor, and it costs nothing to compute. It should therefore be treated as a low-cost first filter whose output is routed to human review, not as grounds for action on its own.</w:t>
+      </w:r>
+    </w:p>
+    <w:bookmarkEnd w:id="37"/>
+    <w:bookmarkStart w:id="38" w:name="limitations"/>
     <w:p>
       <w:pPr>
         <w:pStyle w:val="Heading1"/>
@@ -1770,13 +2101,13 @@
           <w:bCs/>
           <w:b/>
         </w:rPr>
-        <w:t xml:space="preserve">One generator.</w:t>
-      </w:r>
-      <w:r>
-        <w:t xml:space="preserve"> </w:t>
-      </w:r>
-      <w:r>
-        <w:t xml:space="preserve">All synthetic text comes from GPT-4o. We cannot say whether the findings hold for other models or for newer versions. A held-out generator is the most important next test.</w:t>
+        <w:t xml:space="preserve">Two generators, both commercial.</w:t>
+      </w:r>
+      <w:r>
+        <w:t xml:space="preserve"> </w:t>
+      </w:r>
+      <w:r>
+        <w:t xml:space="preserve">The findings come from GPT-4o and Claude Sonnet 5.5. The large cross-generator drop is itself a warning that results for other models, including open-weight ones and future releases, may differ.</w:t>
       </w:r>
     </w:p>
     <w:p>
@@ -1792,13 +2123,13 @@
           <w:bCs/>
           <w:b/>
         </w:rPr>
-        <w:t xml:space="preserve">Section-wise generation.</w:t>
-      </w:r>
-      <w:r>
-        <w:t xml:space="preserve"> </w:t>
-      </w:r>
-      <w:r>
-        <w:t xml:space="preserve">Papers were produced in four requests to reach analyzable length. This may introduce structural artifacts, including inflated passive dispersion, and it is not how most real users would produce a paper.</w:t>
+        <w:t xml:space="preserve">Sample sizes.</w:t>
+      </w:r>
+      <w:r>
+        <w:t xml:space="preserve"> </w:t>
+      </w:r>
+      <w:r>
+        <w:t xml:space="preserve">The Claude sample (152) is smaller than the GPT-4o sample (245) and was cut short by budget. Bootstrap intervals for cross-generator AUCs are about ±0.05.</w:t>
       </w:r>
     </w:p>
     <w:p>
@@ -1814,13 +2145,13 @@
           <w:bCs/>
           <w:b/>
         </w:rPr>
-        <w:t xml:space="preserve">Extraction differences.</w:t>
-      </w:r>
-      <w:r>
-        <w:t xml:space="preserve"> </w:t>
-      </w:r>
-      <w:r>
-        <w:t xml:space="preserve">Human papers come from two pipelines (XML and PDF conversion) while synthetic papers are plain text. Differences in how citations, formulas, and figures appear in extracted text could affect counts. Our within-field comparison reduces but does not remove this concern.</w:t>
+        <w:t xml:space="preserve">Section-wise generation.</w:t>
+      </w:r>
+      <w:r>
+        <w:t xml:space="preserve"> </w:t>
+      </w:r>
+      <w:r>
+        <w:t xml:space="preserve">Papers were produced in four requests to reach analyzable length. This may introduce structural artifacts, including inflated passive dispersion, and it is not how most real users would produce a paper. Claude also wrote substantially longer sections than GPT-4o, and we did not control for that beyond truncating to the same length.</w:t>
       </w:r>
     </w:p>
     <w:p>
@@ -1836,13 +2167,13 @@
           <w:bCs/>
           <w:b/>
         </w:rPr>
-        <w:t xml:space="preserve">Short windows and low power.</w:t>
-      </w:r>
-      <w:r>
-        <w:t xml:space="preserve"> </w:t>
-      </w:r>
-      <w:r>
-        <w:t xml:space="preserve">Four windows per document limit the power of dispersion tests and make per-document dispersion estimates noisy.</w:t>
+        <w:t xml:space="preserve">Extraction differences.</w:t>
+      </w:r>
+      <w:r>
+        <w:t xml:space="preserve"> </w:t>
+      </w:r>
+      <w:r>
+        <w:t xml:space="preserve">Human papers come from two pipelines (XML and PDF conversion) while synthetic papers are plain text. Differences in how citations, formulas, and figures appear in extracted text could affect counts.</w:t>
       </w:r>
     </w:p>
     <w:p>
@@ -1858,13 +2189,13 @@
           <w:bCs/>
           <w:b/>
         </w:rPr>
-        <w:t xml:space="preserve">Approximate events.</w:t>
-      </w:r>
-      <w:r>
-        <w:t xml:space="preserve"> </w:t>
-      </w:r>
-      <w:r>
-        <w:t xml:space="preserve">Passive and nominalization detection relies on patterns, not a parser.</w:t>
+        <w:t xml:space="preserve">Short windows and low power.</w:t>
+      </w:r>
+      <w:r>
+        <w:t xml:space="preserve"> </w:t>
+      </w:r>
+      <w:r>
+        <w:t xml:space="preserve">Four windows per document limit the power of dispersion tests and make per-document dispersion estimates noisy.</w:t>
       </w:r>
     </w:p>
     <w:p>
@@ -1880,13 +2211,13 @@
           <w:bCs/>
           <w:b/>
         </w:rPr>
-        <w:t xml:space="preserve">Pre-LLM human sample.</w:t>
-      </w:r>
-      <w:r>
-        <w:t xml:space="preserve"> </w:t>
-      </w:r>
-      <w:r>
-        <w:t xml:space="preserve">Sampling human papers from 2015–2019 avoids contamination but may differ in style from papers written today.</w:t>
+        <w:t xml:space="preserve">Approximate events.</w:t>
+      </w:r>
+      <w:r>
+        <w:t xml:space="preserve"> </w:t>
+      </w:r>
+      <w:r>
+        <w:t xml:space="preserve">Passive and nominalization detection relies on patterns, not a parser.</w:t>
       </w:r>
     </w:p>
     <w:p>
@@ -1902,13 +2233,13 @@
           <w:bCs/>
           <w:b/>
         </w:rPr>
-        <w:t xml:space="preserve">No adversaries.</w:t>
-      </w:r>
-      <w:r>
-        <w:t xml:space="preserve"> </w:t>
-      </w:r>
-      <w:r>
-        <w:t xml:space="preserve">We did not test paraphrasing or light human editing of machine text, either of which could erode the signal.</w:t>
+        <w:t xml:space="preserve">Prompting.</w:t>
+      </w:r>
+      <w:r>
+        <w:t xml:space="preserve"> </w:t>
+      </w:r>
+      <w:r>
+        <w:t xml:space="preserve">Our prompts asked for in-text citations and a particular structure. Rate differences (for example, in square brackets) may reflect these instructions and citation conventions, and we did not examine citation style directly.</w:t>
       </w:r>
     </w:p>
     <w:p>
@@ -1924,13 +2255,13 @@
           <w:bCs/>
           <w:b/>
         </w:rPr>
-        <w:t xml:space="preserve">No black-box baselines and no reviewer experiment.</w:t>
-      </w:r>
-      <w:r>
-        <w:t xml:space="preserve"> </w:t>
-      </w:r>
-      <w:r>
-        <w:t xml:space="preserve">We did not compare against LLM-as-a-judge, MAUVE, or BERTScore, and we did not test whether explainable evidence improves human decisions. Claims about relative advantage over those methods are therefore not supported by this study.</w:t>
+        <w:t xml:space="preserve">Pre-LLM human sample.</w:t>
+      </w:r>
+      <w:r>
+        <w:t xml:space="preserve"> </w:t>
+      </w:r>
+      <w:r>
+        <w:t xml:space="preserve">Sampling human papers from 2015–2019 avoids contamination but may differ in style from papers written today.</w:t>
       </w:r>
     </w:p>
     <w:p>
@@ -1946,17 +2277,39 @@
           <w:bCs/>
           <w:b/>
         </w:rPr>
-        <w:t xml:space="preserve">Scale.</w:t>
-      </w:r>
-      <w:r>
-        <w:t xml:space="preserve"> </w:t>
-      </w:r>
-      <w:r>
-        <w:t xml:space="preserve">The planned benchmark was larger and used several generators. This pilot has 719 documents in total.</w:t>
-      </w:r>
-    </w:p>
-    <w:bookmarkEnd w:id="37"/>
-    <w:bookmarkStart w:id="38" w:name="planned-extensions"/>
+        <w:t xml:space="preserve">No adversaries.</w:t>
+      </w:r>
+      <w:r>
+        <w:t xml:space="preserve"> </w:t>
+      </w:r>
+      <w:r>
+        <w:t xml:space="preserve">We did not test paraphrasing or light human editing of machine text, either of which could erode the signal.</w:t>
+      </w:r>
+    </w:p>
+    <w:p>
+      <w:pPr>
+        <w:numPr>
+          <w:ilvl w:val="0"/>
+          <w:numId w:val="1002"/>
+        </w:numPr>
+        <w:pStyle w:val="Compact"/>
+      </w:pPr>
+      <w:r>
+        <w:rPr>
+          <w:bCs/>
+          <w:b/>
+        </w:rPr>
+        <w:t xml:space="preserve">No black-box baselines and no reviewer experiment.</w:t>
+      </w:r>
+      <w:r>
+        <w:t xml:space="preserve"> </w:t>
+      </w:r>
+      <w:r>
+        <w:t xml:space="preserve">We did not compare against LLM-as-a-judge, MAUVE, or BERTScore, and we did not test whether explainable evidence improves human decisions. Claims about relative advantage over those methods are therefore not supported by this study.</w:t>
+      </w:r>
+    </w:p>
+    <w:bookmarkEnd w:id="38"/>
+    <w:bookmarkStart w:id="39" w:name="planned-extensions"/>
     <w:p>
       <w:pPr>
         <w:pStyle w:val="Heading1"/>
@@ -1970,11 +2323,11 @@
         <w:pStyle w:val="FirstParagraph"/>
       </w:pPr>
       <w:r>
-        <w:t xml:space="preserve">Three steps would turn this pilot into a test of the full proposal. (i) Add at least two further generators, with one held out from calibration, and include a negative binomial reference. (ii) Run MAUVE, BERTScore, and an LLM-as-a-judge baseline on identical documents, recording latency and cost, to answer the efficiency question properly. (iii) Conduct a randomized experiment in which domain experts classify real and fabricated papers under three conditions (no indicator, an unexplained AI score, and an explainable event-based indicator), analyzed with ANOVA and planned contrasts after an a priori power analysis. Pre-registering the feature list, windows, and analysis plan would also guard against analytic flexibility.</w:t>
-      </w:r>
-    </w:p>
-    <w:bookmarkEnd w:id="38"/>
-    <w:bookmarkStart w:id="39" w:name="conclusion"/>
+        <w:t xml:space="preserve">Four steps would turn this pilot into a test of the full proposal. (i) Add further generators, especially open-weight models, and evaluate each as held out, together with a negative binomial reference and a human-only (one-class) detector that uses no generator data. (ii) Run MAUVE, BERTScore, and an LLM-as-a-judge baseline on identical documents, recording latency and cost. (iii) Test robustness to paraphrasing and light human editing. (iv) Conduct a randomized experiment in which domain experts classify real and fabricated papers under three conditions (no indicator, an unexplained AI score, and an explainable event-based indicator), analyzed with ANOVA and planned contrasts after an a priori power analysis. Pre-registering the feature list, windows, and analysis plan would guard against analytic flexibility.</w:t>
+      </w:r>
+    </w:p>
+    <w:bookmarkEnd w:id="39"/>
+    <w:bookmarkStart w:id="40" w:name="conclusion"/>
     <w:p>
       <w:pPr>
         <w:pStyle w:val="Heading1"/>
@@ -1988,11 +2341,11 @@
         <w:pStyle w:val="FirstParagraph"/>
       </w:pPr>
       <w:r>
-        <w:t xml:space="preserve">Counting small linguistic events is a cheap and transparent way to screen scholarly text, but the simplest version of the idea, measuring distance from a Poisson process, does not work, because human text is not Poisson. A richer set of count-based features detects GPT-4o-generated papers well in this pilot, mostly through differences in event rates, with a smaller but real contribution from dispersion. The evidence is limited to one generator and one genre, and whether the approach helps human reviewers or outperforms black-box metrics remains untested.</w:t>
-      </w:r>
-    </w:p>
-    <w:bookmarkEnd w:id="39"/>
-    <w:bookmarkStart w:id="40" w:name="references"/>
+        <w:t xml:space="preserve">Counting small linguistic events is a cheap and transparent way to screen scholarly text, but the simplest version of the idea, measuring distance from a Poisson process, does not work, because human text is not Poisson. A richer set of count-based features detects machine-generated papers well within a generator, but accuracy falls to between 0.73 and 0.81 on an unseen generator. Dispersion transfers better than event rates, and that is the clearest sign in our data that the count-process view captures something general. The evidence is limited to two generators and one genre, and whether the approach helps human reviewers or outperforms black-box metrics remains untested.</w:t>
+      </w:r>
+    </w:p>
+    <w:bookmarkEnd w:id="40"/>
+    <w:bookmarkStart w:id="41" w:name="references"/>
     <w:p>
       <w:pPr>
         <w:pStyle w:val="Heading1"/>
@@ -2274,7 +2627,7 @@
         <w:t xml:space="preserve">(36).</w:t>
       </w:r>
     </w:p>
-    <w:bookmarkEnd w:id="40"/>
+    <w:bookmarkEnd w:id="41"/>
     <w:sectPr/>
   </w:body>
 </w:document>

</xml_diff>

<commit_message>
Correct description of Claude sample cap
Co-Authored-By: Claude Sonnet 5.5 <noreply@anthropic.com>
Claude-Session: https://claude.ai/code/session_01FLb7uVf7YBgdoa75gbZ2sf
</commit_message>
<xml_diff>
--- a/paper/Poisson_LLM_Pilot_Paper_MISQ.docx
+++ b/paper/Poisson_LLM_Pilot_Paper_MISQ.docx
@@ -475,7 +475,7 @@
         <w:pStyle w:val="BodyText"/>
       </w:pPr>
       <w:r>
-        <w:t xml:space="preserve">GPT-4o produced 245 unique papers (one source had been generated twice during testing and we kept one record), with a median of about 2,750 words. Claude produced 152 papers, with a median of 4,566 words (range 3,667 to 5,134); generation was stopped at that number because of budget, not because of any property of the output. Because Claude wrote longer papers, all documents are truncated to the same length before analysis (Section 3.3). Both sets passed the length requirement.</w:t>
+        <w:t xml:space="preserve">GPT-4o produced 245 unique papers (one source had been generated twice during testing and we kept one record), with a median of about 2,750 words. Claude produced 152 papers, with a median of 4,566 words (range 3,667 to 5,134); generation was capped at that number to limit cost, not because of any property of the output. Because Claude wrote longer papers, all documents are truncated to the same length before analysis (Section 3.3). Both sets passed the length requirement.</w:t>
       </w:r>
     </w:p>
     <w:bookmarkEnd w:id="24"/>
@@ -2129,7 +2129,7 @@
         <w:t xml:space="preserve"> </w:t>
       </w:r>
       <w:r>
-        <w:t xml:space="preserve">The Claude sample (152) is smaller than the GPT-4o sample (245) and was cut short by budget. Bootstrap intervals for cross-generator AUCs are about ±0.05.</w:t>
+        <w:t xml:space="preserve">The Claude sample (152) is smaller than the GPT-4o sample (245) because we capped generation to limit cost. Bootstrap intervals for cross-generator AUCs are about ±0.05.</w:t>
       </w:r>
     </w:p>
     <w:p>

</xml_diff>

<commit_message>
Add human-only (one-class) detector results to study and paper
Co-Authored-By: Claude Sonnet 5.5 <noreply@anthropic.com>
Claude-Session: https://claude.ai/code/session_01FLb7uVf7YBgdoa75gbZ2sf
</commit_message>
<xml_diff>
--- a/paper/Poisson_LLM_Pilot_Paper_MISQ.docx
+++ b/paper/Poisson_LLM_Pilot_Paper_MISQ.docx
@@ -176,7 +176,7 @@
         <w:pStyle w:val="FirstParagraph"/>
       </w:pPr>
       <w:r>
-        <w:t xml:space="preserve">Organizations that publish or archive scholarly documents now face a screening problem: language models can produce papers faster and more cheaply than anyone can check them. Two common remedies, LLM-as-a-judge and embedding-based similarity metrics, are either expensive and prompt-dependent or insensitive to fine-grained statistical structure. We study a lightweight alternative that treats the occurrence of selected linguistic events (special punctuation, discourse markers, passive constructions, nominalizations) as count processes and asks how far a document departs from human-authored text. Using 474 human-written papers from PubMed Central and arXiv (2015–2019) and matched papers from two generators (GPT-4o, 245 papers; Claude Sonnet 5.5, 152 papers), we report four findings. First, human text is not Poisson: for punctuation events, 36–49% of documents reject the Poisson null because of over-dispersion. Second, a single Poisson-distance index performs near chance (AUC 0.52–0.54), but a vector of event rates and dispersion indices separates human from machine text well when the detector is trained and tested on the same generator (AUC 0.99 for GPT-4o, 0.91 for Claude). Third, this performance does not transfer: a detector trained on one generator reaches only 0.73 (GPT-4o to Claude) and 0.81 (Claude to GPT-4o) on the other. Fourth, dispersion transfers better than event rates, which differ in sign across generators; this is the clearest support we find for the count-process idea. Screening costs nothing per document and runs at about 160 documents per second on one CPU core. The evidence is limited to two commercial generators and one genre, and we do not test adversarial editing, comparison with black-box metrics, or the effect on human reviewers.</w:t>
+        <w:t xml:space="preserve">Organizations that publish or archive scholarly documents now face a screening problem: language models can produce papers faster and more cheaply than anyone can check them. Two common remedies, LLM-as-a-judge and embedding-based similarity metrics, are either expensive and prompt-dependent or insensitive to fine-grained statistical structure. We study a lightweight alternative that treats the occurrence of selected linguistic events (special punctuation, discourse markers, passive constructions, nominalizations) as count processes and asks how far a document departs from human-authored text. Using 474 human-written papers from PubMed Central and arXiv (2015–2019) and matched papers from two generators (GPT-4o, 245 papers; Claude Sonnet 5.5, 152 papers), we report five findings. First, human text is not Poisson: for punctuation events, 36–49% of documents reject the Poisson null because of over-dispersion. Second, a single Poisson-distance index performs near chance (AUC 0.52–0.54), but a vector of event rates and dispersion indices separates human from machine text well when the detector is trained and tested on the same generator (AUC 0.99 for GPT-4o, 0.91 for Claude). Third, this performance does not transfer: a detector trained on one generator reaches only 0.73 (GPT-4o to Claude) and 0.81 (Claude to GPT-4o) on the other. Fourth, dispersion transfers better than event rates, which differ in sign across generators; this is the clearest support we find for the count-process idea. Fifth, detectors trained on human papers alone, which need no generator data, perform near chance (AUC 0.45 to 0.66 across three methods), so the signal lies in directions specific to machine text and not in generic departures from human variation. Screening costs nothing per document and runs at about 160 documents per second on one CPU core. The evidence is limited to two commercial generators and one genre, and we do not test adversarial editing, comparison with black-box metrics, or the effect on human reviewers.</w:t>
       </w:r>
     </w:p>
     <w:p>
@@ -644,12 +644,12 @@
         <w:pStyle w:val="FirstParagraph"/>
       </w:pPr>
       <w:r>
-        <w:t xml:space="preserve">Detection is evaluated by five-fold cross-validation with all material from the same source paper kept in the same fold, so that a human paper and its synthetic counterpart never straddle training and test sets. We report the area under the ROC curve (AUC), with 95% bootstrap intervals over documents. To study transfer, we train on human papers plus papers from one generator and test on held-out human papers plus papers from the other generator, in both directions. The analysis code, prompts, and generated papers are in the project repository; the human papers can be re-collected with the included script.</w:t>
+        <w:t xml:space="preserve">Detection is evaluated by five-fold cross-validation with all material from the same source paper kept in the same fold, so that a human paper and its synthetic counterpart never straddle training and test sets. We report the area under the ROC curve (AUC), with 95% bootstrap intervals over documents. To study transfer, we train on human papers plus papers from one generator and test on held-out human papers plus papers from the other generator, in both directions. We also evaluate detectors trained on human papers only: a Mahalanobis distance from the human feature distribution (Ledoit–Wolf covariance), chosen as the primary method before seeing results, and, as secondary methods, a One-Class SVM and an Isolation Forest, all with default settings and no tuning on generator data. These produce an anomaly score, and we evaluate how well it separates held-out human papers from each generator’s papers. The analysis code, prompts, and generated papers are in the project repository; the human papers can be re-collected with the included script.</w:t>
       </w:r>
     </w:p>
     <w:bookmarkEnd w:id="27"/>
     <w:bookmarkEnd w:id="28"/>
-    <w:bookmarkStart w:id="36" w:name="results"/>
+    <w:bookmarkStart w:id="37" w:name="results"/>
     <w:p>
       <w:pPr>
         <w:pStyle w:val="Heading1"/>
@@ -1974,13 +1974,13 @@
       </w:r>
     </w:p>
     <w:bookmarkEnd w:id="34"/>
-    <w:bookmarkStart w:id="35" w:name="cost-rq3"/>
+    <w:bookmarkStart w:id="35" w:name="detection-from-human-text-alone-rq2"/>
     <w:p>
       <w:pPr>
         <w:pStyle w:val="Heading2"/>
       </w:pPr>
       <w:r>
-        <w:t xml:space="preserve">4.4 Cost (RQ3)</w:t>
+        <w:t xml:space="preserve">4.4 Detection from human text alone (RQ2)</w:t>
       </w:r>
     </w:p>
     <w:p>
@@ -1988,12 +1988,380 @@
         <w:pStyle w:val="FirstParagraph"/>
       </w:pPr>
       <w:r>
+        <w:t xml:space="preserve">A screening organization might prefer a detector that needs no examples of machine text, because those examples go stale as models change. We therefore trained detectors on human papers only and scored how unusual each held-out document looks (Table 4). The result is negative. The pre-specified Mahalanobis detector reaches an AUC of 0.56 on GPT-4o papers and 0.46 on Claude papers using all fourteen features, and the secondary methods do not change the picture: across three methods, three feature families, and two generators, AUCs range from 0.45 to 0.66, and many intervals include 0.5. The best single value (0.66, a One-Class SVM on rates for GPT-4o) is not one we would rely on, and it was not selected in advance.</w:t>
+      </w:r>
+    </w:p>
+    <w:p>
+      <w:pPr>
+        <w:pStyle w:val="TableCaption"/>
+      </w:pPr>
+      <w:r>
+        <w:t xml:space="preserve">Table 4. AUC (95% bootstrap interval) for detectors trained on human papers only. Scores are anomaly scores; test sets are held-out human papers (grouped by source paper) plus papers from the named generator. The full grid, including rates-only and dispersion-only variants for each method, is in the project repository.</w:t>
+      </w:r>
+    </w:p>
+    <w:tbl>
+      <w:tblPr>
+        <w:tblStyle w:val="Table"/>
+        <w:tblW w:type="pct" w:w="5000"/>
+        <w:tblLook w:firstRow="1" w:lastRow="0" w:firstColumn="0" w:lastColumn="0" w:noHBand="0" w:noVBand="0" w:val="0020"/>
+        <w:jc w:val="start"/>
+        <w:tblCaption w:val="Table 4. AUC (95% bootstrap interval) for detectors trained on human papers only. Scores are anomaly scores; test sets are held-out human papers (grouped by source paper) plus papers from the named generator. The full grid, including rates-only and dispersion-only variants for each method, is in the project repository."/>
+      </w:tblPr>
+      <w:tblGrid>
+        <w:gridCol w:w="1980"/>
+        <w:gridCol w:w="1980"/>
+        <w:gridCol w:w="1980"/>
+        <w:gridCol w:w="1980"/>
+      </w:tblGrid>
+      <w:tr>
+        <w:trPr>
+          <w:tblHeader w:val="true"/>
+        </w:trPr>
+        <w:tc>
+          <w:tcPr/>
+          <w:p>
+            <w:pPr>
+              <w:pStyle w:val="Compact"/>
+              <w:jc w:val="left"/>
+            </w:pPr>
+            <w:r>
+              <w:t xml:space="preserve">Method (human-only)</w:t>
+            </w:r>
+          </w:p>
+        </w:tc>
+        <w:tc>
+          <w:tcPr/>
+          <w:p>
+            <w:pPr>
+              <w:pStyle w:val="Compact"/>
+              <w:jc w:val="left"/>
+            </w:pPr>
+            <w:r>
+              <w:t xml:space="preserve">Features</w:t>
+            </w:r>
+          </w:p>
+        </w:tc>
+        <w:tc>
+          <w:tcPr/>
+          <w:p>
+            <w:pPr>
+              <w:pStyle w:val="Compact"/>
+              <w:jc w:val="left"/>
+            </w:pPr>
+            <w:r>
+              <w:t xml:space="preserve">GPT-4o</w:t>
+            </w:r>
+          </w:p>
+        </w:tc>
+        <w:tc>
+          <w:tcPr/>
+          <w:p>
+            <w:pPr>
+              <w:pStyle w:val="Compact"/>
+              <w:jc w:val="left"/>
+            </w:pPr>
+            <w:r>
+              <w:t xml:space="preserve">Claude</w:t>
+            </w:r>
+          </w:p>
+        </w:tc>
+      </w:tr>
+      <w:tr>
+        <w:tc>
+          <w:tcPr/>
+          <w:p>
+            <w:pPr>
+              <w:pStyle w:val="Compact"/>
+              <w:jc w:val="left"/>
+            </w:pPr>
+            <w:r>
+              <w:t xml:space="preserve">Mahalanobis (primary)</w:t>
+            </w:r>
+          </w:p>
+        </w:tc>
+        <w:tc>
+          <w:tcPr/>
+          <w:p>
+            <w:pPr>
+              <w:pStyle w:val="Compact"/>
+              <w:jc w:val="left"/>
+            </w:pPr>
+            <w:r>
+              <w:t xml:space="preserve">Rates</w:t>
+            </w:r>
+          </w:p>
+        </w:tc>
+        <w:tc>
+          <w:tcPr/>
+          <w:p>
+            <w:pPr>
+              <w:pStyle w:val="Compact"/>
+              <w:jc w:val="left"/>
+            </w:pPr>
+            <w:r>
+              <w:t xml:space="preserve">0.597 [0.55, 0.64]</w:t>
+            </w:r>
+          </w:p>
+        </w:tc>
+        <w:tc>
+          <w:tcPr/>
+          <w:p>
+            <w:pPr>
+              <w:pStyle w:val="Compact"/>
+              <w:jc w:val="left"/>
+            </w:pPr>
+            <w:r>
+              <w:t xml:space="preserve">0.466 [0.42, 0.52]</w:t>
+            </w:r>
+          </w:p>
+        </w:tc>
+      </w:tr>
+      <w:tr>
+        <w:tc>
+          <w:tcPr/>
+          <w:p>
+            <w:pPr>
+              <w:pStyle w:val="Compact"/>
+              <w:jc w:val="left"/>
+            </w:pPr>
+            <w:r>
+              <w:t xml:space="preserve">Mahalanobis (primary)</w:t>
+            </w:r>
+          </w:p>
+        </w:tc>
+        <w:tc>
+          <w:tcPr/>
+          <w:p>
+            <w:pPr>
+              <w:pStyle w:val="Compact"/>
+              <w:jc w:val="left"/>
+            </w:pPr>
+            <w:r>
+              <w:t xml:space="preserve">Dispersion</w:t>
+            </w:r>
+          </w:p>
+        </w:tc>
+        <w:tc>
+          <w:tcPr/>
+          <w:p>
+            <w:pPr>
+              <w:pStyle w:val="Compact"/>
+              <w:jc w:val="left"/>
+            </w:pPr>
+            <w:r>
+              <w:t xml:space="preserve">0.507 [0.46, 0.55]</w:t>
+            </w:r>
+          </w:p>
+        </w:tc>
+        <w:tc>
+          <w:tcPr/>
+          <w:p>
+            <w:pPr>
+              <w:pStyle w:val="Compact"/>
+              <w:jc w:val="left"/>
+            </w:pPr>
+            <w:r>
+              <w:t xml:space="preserve">0.510 [0.45, 0.56]</w:t>
+            </w:r>
+          </w:p>
+        </w:tc>
+      </w:tr>
+      <w:tr>
+        <w:tc>
+          <w:tcPr/>
+          <w:p>
+            <w:pPr>
+              <w:pStyle w:val="Compact"/>
+              <w:jc w:val="left"/>
+            </w:pPr>
+            <w:r>
+              <w:t xml:space="preserve">Mahalanobis (primary)</w:t>
+            </w:r>
+          </w:p>
+        </w:tc>
+        <w:tc>
+          <w:tcPr/>
+          <w:p>
+            <w:pPr>
+              <w:pStyle w:val="Compact"/>
+              <w:jc w:val="left"/>
+            </w:pPr>
+            <w:r>
+              <w:t xml:space="preserve">Both</w:t>
+            </w:r>
+          </w:p>
+        </w:tc>
+        <w:tc>
+          <w:tcPr/>
+          <w:p>
+            <w:pPr>
+              <w:pStyle w:val="Compact"/>
+              <w:jc w:val="left"/>
+            </w:pPr>
+            <w:r>
+              <w:t xml:space="preserve">0.563 [0.52, 0.60]</w:t>
+            </w:r>
+          </w:p>
+        </w:tc>
+        <w:tc>
+          <w:tcPr/>
+          <w:p>
+            <w:pPr>
+              <w:pStyle w:val="Compact"/>
+              <w:jc w:val="left"/>
+            </w:pPr>
+            <w:r>
+              <w:t xml:space="preserve">0.462 [0.41, 0.52]</w:t>
+            </w:r>
+          </w:p>
+        </w:tc>
+      </w:tr>
+      <w:tr>
+        <w:tc>
+          <w:tcPr/>
+          <w:p>
+            <w:pPr>
+              <w:pStyle w:val="Compact"/>
+              <w:jc w:val="left"/>
+            </w:pPr>
+            <w:r>
+              <w:t xml:space="preserve">One-Class SVM</w:t>
+            </w:r>
+          </w:p>
+        </w:tc>
+        <w:tc>
+          <w:tcPr/>
+          <w:p>
+            <w:pPr>
+              <w:pStyle w:val="Compact"/>
+              <w:jc w:val="left"/>
+            </w:pPr>
+            <w:r>
+              <w:t xml:space="preserve">Both</w:t>
+            </w:r>
+          </w:p>
+        </w:tc>
+        <w:tc>
+          <w:tcPr/>
+          <w:p>
+            <w:pPr>
+              <w:pStyle w:val="Compact"/>
+              <w:jc w:val="left"/>
+            </w:pPr>
+            <w:r>
+              <w:t xml:space="preserve">0.610 [0.56, 0.65]</w:t>
+            </w:r>
+          </w:p>
+        </w:tc>
+        <w:tc>
+          <w:tcPr/>
+          <w:p>
+            <w:pPr>
+              <w:pStyle w:val="Compact"/>
+              <w:jc w:val="left"/>
+            </w:pPr>
+            <w:r>
+              <w:t xml:space="preserve">0.475 [0.42, 0.53]</w:t>
+            </w:r>
+          </w:p>
+        </w:tc>
+      </w:tr>
+      <w:tr>
+        <w:tc>
+          <w:tcPr/>
+          <w:p>
+            <w:pPr>
+              <w:pStyle w:val="Compact"/>
+              <w:jc w:val="left"/>
+            </w:pPr>
+            <w:r>
+              <w:t xml:space="preserve">Isolation Forest</w:t>
+            </w:r>
+          </w:p>
+        </w:tc>
+        <w:tc>
+          <w:tcPr/>
+          <w:p>
+            <w:pPr>
+              <w:pStyle w:val="Compact"/>
+              <w:jc w:val="left"/>
+            </w:pPr>
+            <w:r>
+              <w:t xml:space="preserve">Both</w:t>
+            </w:r>
+          </w:p>
+        </w:tc>
+        <w:tc>
+          <w:tcPr/>
+          <w:p>
+            <w:pPr>
+              <w:pStyle w:val="Compact"/>
+              <w:jc w:val="left"/>
+            </w:pPr>
+            <w:r>
+              <w:t xml:space="preserve">0.473 [0.43, 0.52]</w:t>
+            </w:r>
+          </w:p>
+        </w:tc>
+        <w:tc>
+          <w:tcPr/>
+          <w:p>
+            <w:pPr>
+              <w:pStyle w:val="Compact"/>
+              <w:jc w:val="left"/>
+            </w:pPr>
+            <w:r>
+              <w:t xml:space="preserve">0.468 [0.42, 0.52]</w:t>
+            </w:r>
+          </w:p>
+        </w:tc>
+      </w:tr>
+    </w:tbl>
+    <w:p>
+      <w:pPr>
+        <w:pStyle w:val="BodyText"/>
+      </w:pPr>
+      <w:r>
+        <w:t xml:space="preserve">The contrast with Table 3 is informative. Supervised detectors succeed because they learn the</w:t>
+      </w:r>
+      <w:r>
+        <w:t xml:space="preserve"> </w:t>
+      </w:r>
+      <w:r>
+        <w:rPr>
+          <w:iCs/>
+          <w:i/>
+        </w:rPr>
+        <w:t xml:space="preserve">direction</w:t>
+      </w:r>
+      <w:r>
+        <w:t xml:space="preserve"> </w:t>
+      </w:r>
+      <w:r>
+        <w:t xml:space="preserve">in which a generator differs from human writers. Human papers already vary widely among themselves in these features, across fields, sections, and authors, so machine text is rarely far from the human cloud in an absolute sense; it is displaced from the center in particular directions. A distance from the human distribution does not capture that displacement.</w:t>
+      </w:r>
+    </w:p>
+    <w:bookmarkEnd w:id="35"/>
+    <w:bookmarkStart w:id="36" w:name="cost-rq3"/>
+    <w:p>
+      <w:pPr>
+        <w:pStyle w:val="Heading2"/>
+      </w:pPr>
+      <w:r>
+        <w:t xml:space="preserve">4.5 Cost (RQ3)</w:t>
+      </w:r>
+    </w:p>
+    <w:p>
+      <w:pPr>
+        <w:pStyle w:val="FirstParagraph"/>
+      </w:pPr>
+      <w:r>
         <w:t xml:space="preserve">Computing all events and indices took about 6 milliseconds per document on one CPU core (roughly 160 documents per second) with no external service calls, so the marginal monetary cost is zero. For context on the generation side, producing one paper through four requests cost about US$0.04 and 38 seconds on average for GPT-4o, and about US$0.13 and 100 seconds for Claude, through the gateway we used. We did not run an LLM-as-a-judge baseline, so we cannot report a measured cost or latency ratio between the two screening methods; any such comparison would depend on the judge model, prompt length, and pricing at the time.</w:t>
       </w:r>
     </w:p>
-    <w:bookmarkEnd w:id="35"/>
     <w:bookmarkEnd w:id="36"/>
-    <w:bookmarkStart w:id="37" w:name="discussion"/>
+    <w:bookmarkEnd w:id="37"/>
+    <w:bookmarkStart w:id="38" w:name="discussion"/>
     <w:p>
       <w:pPr>
         <w:pStyle w:val="Heading1"/>
@@ -2041,7 +2409,7 @@
         <w:pStyle w:val="BodyText"/>
       </w:pPr>
       <w:r>
-        <w:t xml:space="preserve">The result is less discouraging for the count-process idea than for the rate-based version. Dispersion generalizes better than rates, and the direction of several dispersion differences agrees across two generators. If a general machine-text signature exists in these features, it is more likely to be found in how events cluster than in how often they occur. We see this as a hypothesis for larger studies with more generators, including open-weight models, rather than an established finding. A screen that models human text alone, and flags departures from it without training on any generator, may also transfer better; we have not tested this.</w:t>
+        <w:t xml:space="preserve">The result is less discouraging for the count-process idea than for the rate-based version. Dispersion generalizes better than rates, and the direction of several dispersion differences agrees across two generators. If a general machine-text signature exists in these features, it is more likely to be found in how events cluster than in how often they occur. We see this as a hypothesis for larger studies with more generators, including open-weight models, rather than an established finding. We also tested the obvious way around generator-specific calibration, a screen that models human text alone and flags departures from it. It did not work in this setting (Section 4.4). Avoiding dependence on generator examples therefore comes at a large price in accuracy, at least with these features and these simple models.</w:t>
       </w:r>
     </w:p>
     <w:p>
@@ -2070,8 +2438,8 @@
         <w:t xml:space="preserve">can be explained to an author or editor, and it costs nothing to compute. It should therefore be treated as a low-cost first filter whose output is routed to human review, not as grounds for action on its own.</w:t>
       </w:r>
     </w:p>
-    <w:bookmarkEnd w:id="37"/>
-    <w:bookmarkStart w:id="38" w:name="limitations"/>
+    <w:bookmarkEnd w:id="38"/>
+    <w:bookmarkStart w:id="39" w:name="limitations"/>
     <w:p>
       <w:pPr>
         <w:pStyle w:val="Heading1"/>
@@ -2299,6 +2667,28 @@
           <w:bCs/>
           <w:b/>
         </w:rPr>
+        <w:t xml:space="preserve">One-class detectors were simple.</w:t>
+      </w:r>
+      <w:r>
+        <w:t xml:space="preserve"> </w:t>
+      </w:r>
+      <w:r>
+        <w:t xml:space="preserve">We tried three standard anomaly detectors with default settings on a small feature set. More expressive models, richer features, or longer documents could behave differently, so Section 4.4 shows that these particular detectors fail, not that no human-only detector can succeed.</w:t>
+      </w:r>
+    </w:p>
+    <w:p>
+      <w:pPr>
+        <w:numPr>
+          <w:ilvl w:val="0"/>
+          <w:numId w:val="1002"/>
+        </w:numPr>
+        <w:pStyle w:val="Compact"/>
+      </w:pPr>
+      <w:r>
+        <w:rPr>
+          <w:bCs/>
+          <w:b/>
+        </w:rPr>
         <w:t xml:space="preserve">No black-box baselines and no reviewer experiment.</w:t>
       </w:r>
       <w:r>
@@ -2308,8 +2698,8 @@
         <w:t xml:space="preserve">We did not compare against LLM-as-a-judge, MAUVE, or BERTScore, and we did not test whether explainable evidence improves human decisions. Claims about relative advantage over those methods are therefore not supported by this study.</w:t>
       </w:r>
     </w:p>
-    <w:bookmarkEnd w:id="38"/>
-    <w:bookmarkStart w:id="39" w:name="planned-extensions"/>
+    <w:bookmarkEnd w:id="39"/>
+    <w:bookmarkStart w:id="40" w:name="planned-extensions"/>
     <w:p>
       <w:pPr>
         <w:pStyle w:val="Heading1"/>
@@ -2323,11 +2713,11 @@
         <w:pStyle w:val="FirstParagraph"/>
       </w:pPr>
       <w:r>
-        <w:t xml:space="preserve">Four steps would turn this pilot into a test of the full proposal. (i) Add further generators, especially open-weight models, and evaluate each as held out, together with a negative binomial reference and a human-only (one-class) detector that uses no generator data. (ii) Run MAUVE, BERTScore, and an LLM-as-a-judge baseline on identical documents, recording latency and cost. (iii) Test robustness to paraphrasing and light human editing. (iv) Conduct a randomized experiment in which domain experts classify real and fabricated papers under three conditions (no indicator, an unexplained AI score, and an explainable event-based indicator), analyzed with ANOVA and planned contrasts after an a priori power analysis. Pre-registering the feature list, windows, and analysis plan would guard against analytic flexibility.</w:t>
-      </w:r>
-    </w:p>
-    <w:bookmarkEnd w:id="39"/>
-    <w:bookmarkStart w:id="40" w:name="conclusion"/>
+        <w:t xml:space="preserve">Four steps would turn this pilot into a test of the full proposal. (i) Add further generators, especially open-weight models, and evaluate each as held out, together with a negative binomial reference in place of the Poisson benchmark. (ii) Run MAUVE, BERTScore, and an LLM-as-a-judge baseline on identical documents, recording latency and cost. (iii) Test robustness to paraphrasing and light human editing. (iv) Conduct a randomized experiment in which domain experts classify real and fabricated papers under three conditions (no indicator, an unexplained AI score, and an explainable event-based indicator), analyzed with ANOVA and planned contrasts after an a priori power analysis. Pre-registering the feature list, windows, and analysis plan would guard against analytic flexibility.</w:t>
+      </w:r>
+    </w:p>
+    <w:bookmarkEnd w:id="40"/>
+    <w:bookmarkStart w:id="41" w:name="conclusion"/>
     <w:p>
       <w:pPr>
         <w:pStyle w:val="Heading1"/>
@@ -2341,11 +2731,11 @@
         <w:pStyle w:val="FirstParagraph"/>
       </w:pPr>
       <w:r>
-        <w:t xml:space="preserve">Counting small linguistic events is a cheap and transparent way to screen scholarly text, but the simplest version of the idea, measuring distance from a Poisson process, does not work, because human text is not Poisson. A richer set of count-based features detects machine-generated papers well within a generator, but accuracy falls to between 0.73 and 0.81 on an unseen generator. Dispersion transfers better than event rates, and that is the clearest sign in our data that the count-process view captures something general. The evidence is limited to two generators and one genre, and whether the approach helps human reviewers or outperforms black-box metrics remains untested.</w:t>
-      </w:r>
-    </w:p>
-    <w:bookmarkEnd w:id="40"/>
-    <w:bookmarkStart w:id="41" w:name="references"/>
+        <w:t xml:space="preserve">Counting small linguistic events is a cheap and transparent way to screen scholarly text, but the simplest version of the idea, measuring distance from a Poisson process, does not work, because human text is not Poisson. A richer set of count-based features detects machine-generated papers well within a generator, but accuracy falls to between 0.73 and 0.81 on an unseen generator. Dispersion transfers better than event rates, and that is the clearest sign in our data that the count-process view captures something general. Detectors built on human text alone, which would avoid the need for generator examples, performed near chance. The evidence is limited to two generators and one genre, and whether the approach helps human reviewers or outperforms black-box metrics remains untested.</w:t>
+      </w:r>
+    </w:p>
+    <w:bookmarkEnd w:id="41"/>
+    <w:bookmarkStart w:id="42" w:name="references"/>
     <w:p>
       <w:pPr>
         <w:pStyle w:val="Heading1"/>
@@ -2627,7 +3017,7 @@
         <w:t xml:space="preserve">(36).</w:t>
       </w:r>
     </w:p>
-    <w:bookmarkEnd w:id="41"/>
+    <w:bookmarkEnd w:id="42"/>
     <w:sectPr/>
   </w:body>
 </w:document>

</xml_diff>

<commit_message>
Add scale-dependent clustering (Cox-process) model and evaluation; update paper
Co-Authored-By: Claude Sonnet 5.5 <noreply@anthropic.com>
Claude-Session: https://claude.ai/code/session_01FLb7uVf7YBgdoa75gbZ2sf
</commit_message>
<xml_diff>
--- a/paper/Poisson_LLM_Pilot_Paper_MISQ.docx
+++ b/paper/Poisson_LLM_Pilot_Paper_MISQ.docx
@@ -176,7 +176,7 @@
         <w:pStyle w:val="FirstParagraph"/>
       </w:pPr>
       <w:r>
-        <w:t xml:space="preserve">Organizations that publish or archive scholarly documents now face a screening problem: language models can produce papers faster and more cheaply than anyone can check them. Two common remedies, LLM-as-a-judge and embedding-based similarity metrics, are either expensive and prompt-dependent or insensitive to fine-grained statistical structure. We study a lightweight alternative that treats the occurrence of selected linguistic events (special punctuation, discourse markers, passive constructions, nominalizations) as count processes and asks how far a document departs from human-authored text. Using 474 human-written papers from PubMed Central and arXiv (2015–2019) and matched papers from two generators (GPT-4o, 245 papers; Claude Sonnet 5.5, 152 papers), we report five findings. First, human text is not Poisson: for punctuation events, 36–49% of documents reject the Poisson null because of over-dispersion. Second, a single Poisson-distance index performs near chance (AUC 0.52–0.54), but a vector of event rates and dispersion indices separates human from machine text well when the detector is trained and tested on the same generator (AUC 0.99 for GPT-4o, 0.91 for Claude). Third, this performance does not transfer: a detector trained on one generator reaches only 0.73 (GPT-4o to Claude) and 0.81 (Claude to GPT-4o) on the other. Fourth, dispersion transfers better than event rates, which differ in sign across generators; this is the clearest support we find for the count-process idea. Fifth, detectors trained on human papers alone, which need no generator data, perform near chance (AUC 0.45 to 0.66 across three methods), so the signal lies in directions specific to machine text and not in generic departures from human variation. Screening costs nothing per document and runs at about 160 documents per second on one CPU core. The evidence is limited to two commercial generators and one genre, and we do not test adversarial editing, comparison with black-box metrics, or the effect on human reviewers.</w:t>
+        <w:t xml:space="preserve">Organizations that publish or archive scholarly documents now face a screening problem: language models can produce papers faster and more cheaply than anyone can check them. Two common remedies, LLM-as-a-judge and embedding-based similarity metrics, are either expensive and prompt-dependent or insensitive to fine-grained statistical structure. We study a lightweight alternative that treats the occurrence of selected linguistic events (special punctuation, discourse markers, passive constructions, nominalizations) as count processes and asks how far a document departs from human-authored text. Using 474 human-written papers from PubMed Central and arXiv (2015–2019) and matched papers from two generators (GPT-4o, 245 papers; Claude Sonnet 5.5, 152 papers), we report six findings. First, human text is not Poisson: for punctuation events, 36–49% of documents reject the Poisson null because of over-dispersion. Second, a single Poisson-distance index performs near chance (AUC 0.52–0.54), but a vector of event rates and dispersion indices separates human from machine text well when the detector is trained and tested on the same generator (AUC 0.99 for GPT-4o, 0.91 for Claude). Third, this performance does not transfer: a detector trained on one generator reaches only 0.73 (GPT-4o to Claude) and 0.81 (Claude to GPT-4o) on the other. Fourth, dispersion transfers better than event rates, which differ in sign across generators; this is the clearest support we find for the count-process idea. Fifth, detectors trained on human papers alone, which need no generator data, perform near chance (AUC 0.45 to 0.66 across three methods), so the signal lies in directions specific to machine text and not in generic departures from human variation. Sixth, replacing the single-window dispersion index with a scale-dependent clustering model (a doubly stochastic, or Cox, Poisson process summarized by how the Fano factor changes with window size) improves detection modestly but consistently, by roughly 0.03 to 0.05 AUC in most settings, including transfer to an unseen generator (0.76 and 0.85); it does not rescue human-only detection. Screening costs nothing per document and runs at about 160 documents per second on one CPU core. The evidence is limited to two commercial generators and one genre, and we do not test adversarial editing, comparison with black-box metrics, or the effect on human reviewers.</w:t>
       </w:r>
     </w:p>
     <w:p>
@@ -426,7 +426,7 @@
       </w:r>
     </w:p>
     <w:bookmarkEnd w:id="22"/>
-    <w:bookmarkStart w:id="28" w:name="data-and-measures"/>
+    <w:bookmarkStart w:id="29" w:name="data-and-measures"/>
     <w:p>
       <w:pPr>
         <w:pStyle w:val="Heading1"/>
@@ -630,13 +630,13 @@
       </w:r>
     </w:p>
     <w:bookmarkEnd w:id="26"/>
-    <w:bookmarkStart w:id="27" w:name="evaluation"/>
+    <w:bookmarkStart w:id="27" w:name="scale-dependent-clustering-model"/>
     <w:p>
       <w:pPr>
         <w:pStyle w:val="Heading2"/>
       </w:pPr>
       <w:r>
-        <w:t xml:space="preserve">3.5 Evaluation</w:t>
+        <w:t xml:space="preserve">3.5 Scale-dependent clustering model</w:t>
       </w:r>
     </w:p>
     <w:p>
@@ -644,12 +644,62 @@
         <w:pStyle w:val="FirstParagraph"/>
       </w:pPr>
       <w:r>
+        <w:t xml:space="preserve">Because the Poisson model fails for human text and a single 500-token dispersion index performed weakly, we developed a model that describes</w:t>
+      </w:r>
+      <w:r>
+        <w:t xml:space="preserve"> </w:t>
+      </w:r>
+      <w:r>
+        <w:rPr>
+          <w:iCs/>
+          <w:i/>
+        </w:rPr>
+        <w:t xml:space="preserve">how</w:t>
+      </w:r>
+      <w:r>
+        <w:t xml:space="preserve"> </w:t>
+      </w:r>
+      <w:r>
+        <w:t xml:space="preserve">events cluster, not only whether they do. We treat the occurrences of each event as a doubly stochastic Poisson process (a Cox process): events arrive as a Poisson process whose rate varies along the document. For such a process, the Fano factor in a window of w tokens is F(w) = 1 + Var(Λ_w) / E(Λ_w), where Λ_w is the rate integrated over the window. If rate fluctuations are positively correlated over longer ranges, as when citations cluster in an introduction or passives in a methods section, F(w) grows with w; a pure Poisson process gives F(w) = 1 at every scale.</w:t>
+      </w:r>
+    </w:p>
+    <w:p>
+      <w:pPr>
+        <w:pStyle w:val="BodyText"/>
+      </w:pPr>
+      <w:r>
+        <w:t xml:space="preserve">We estimate F(w) for each event at four window sizes (50, 100, 200, and 400 tokens) within the first 2,000 tokens, and summarize each event by three quantities: its rate per 500 tokens, the mean log Fano factor across scales (the overall level of clustering), and the slope of log F(w) on log w (how fast clustering grows with scale). Estimation is by moment matching and is not a full likelihood fit; Fano factors are clipped to [0.05, 20] and set to one when an event does not occur. This yields 21 features (seven events by three quantities), compared with 14 in the baseline.</w:t>
+      </w:r>
+    </w:p>
+    <w:p>
+      <w:pPr>
+        <w:pStyle w:val="BodyText"/>
+      </w:pPr>
+      <w:r>
+        <w:t xml:space="preserve">The comparison was fixed before the model was run: the baseline (rates plus the 500-token dispersion index) against the new features, on cross-generator AUC (both directions) and on human-only detection. We report all results of this comparison, including those that do not favor the new model. We did not tune the window sizes or any other choice on these data. The model was, however, designed after seeing the baseline results, which is a limitation we return to below.</w:t>
+      </w:r>
+    </w:p>
+    <w:bookmarkEnd w:id="27"/>
+    <w:bookmarkStart w:id="28" w:name="evaluation"/>
+    <w:p>
+      <w:pPr>
+        <w:pStyle w:val="Heading2"/>
+      </w:pPr>
+      <w:r>
+        <w:t xml:space="preserve">3.6 Evaluation</w:t>
+      </w:r>
+    </w:p>
+    <w:p>
+      <w:pPr>
+        <w:pStyle w:val="FirstParagraph"/>
+      </w:pPr>
+      <w:r>
         <w:t xml:space="preserve">Detection is evaluated by five-fold cross-validation with all material from the same source paper kept in the same fold, so that a human paper and its synthetic counterpart never straddle training and test sets. We report the area under the ROC curve (AUC), with 95% bootstrap intervals over documents. To study transfer, we train on human papers plus papers from one generator and test on held-out human papers plus papers from the other generator, in both directions. We also evaluate detectors trained on human papers only: a Mahalanobis distance from the human feature distribution (Ledoit–Wolf covariance), chosen as the primary method before seeing results, and, as secondary methods, a One-Class SVM and an Isolation Forest, all with default settings and no tuning on generator data. These produce an anomaly score, and we evaluate how well it separates held-out human papers from each generator’s papers. The analysis code, prompts, and generated papers are in the project repository; the human papers can be re-collected with the included script.</w:t>
       </w:r>
     </w:p>
-    <w:bookmarkEnd w:id="27"/>
     <w:bookmarkEnd w:id="28"/>
-    <w:bookmarkStart w:id="37" w:name="results"/>
+    <w:bookmarkEnd w:id="29"/>
+    <w:bookmarkStart w:id="39" w:name="results"/>
     <w:p>
       <w:pPr>
         <w:pStyle w:val="Heading1"/>
@@ -658,7 +708,7 @@
         <w:t xml:space="preserve">4. Results</w:t>
       </w:r>
     </w:p>
-    <w:bookmarkStart w:id="32" w:name="human-text-is-not-poisson-rq1"/>
+    <w:bookmarkStart w:id="33" w:name="human-text-is-not-poisson-rq1"/>
     <w:p>
       <w:pPr>
         <w:pStyle w:val="Heading2"/>
@@ -1133,18 +1183,18 @@
           <wp:inline>
             <wp:extent cx="5334000" cy="2489200"/>
             <wp:effectExtent b="0" l="0" r="0" t="0"/>
-            <wp:docPr descr="Figure 1. Distribution of log2 dispersion indices by event for human-authored and GPT-4o papers. Dashed line: Poisson (index of 1). Square brackets for GPT-4o are degenerate because most synthetic papers contain none (index set to one by convention)." title="" id="30" name="Picture"/>
+            <wp:docPr descr="Figure 1. Distribution of log2 dispersion indices by event for human-authored and GPT-4o papers. Dashed line: Poisson (index of 1). Square brackets for GPT-4o are degenerate because most synthetic papers contain none (index set to one by convention)." title="" id="31" name="Picture"/>
             <a:graphic>
               <a:graphicData uri="http://schemas.openxmlformats.org/drawingml/2006/picture">
                 <pic:pic>
                   <pic:nvPicPr>
-                    <pic:cNvPr descr="fig_dispersion.png" id="31" name="Picture"/>
+                    <pic:cNvPr descr="fig_dispersion.png" id="32" name="Picture"/>
                     <pic:cNvPicPr>
                       <a:picLocks noChangeArrowheads="1" noChangeAspect="1"/>
                     </pic:cNvPicPr>
                   </pic:nvPicPr>
                   <pic:blipFill>
-                    <a:blip r:embed="rId29"/>
+                    <a:blip r:embed="rId30"/>
                     <a:stretch>
                       <a:fillRect/>
                     </a:stretch>
@@ -1187,8 +1237,8 @@
         <w:t xml:space="preserve">One caution applies to the passive result. Because we generated each paper section by section, and the four retained windows roughly track those sections, elevated passive dispersion may partly reflect a procedural artifact (passive voice is concentrated in methods text) rather than a general property of the models. We could not separate the two with the present data.</w:t>
       </w:r>
     </w:p>
-    <w:bookmarkEnd w:id="32"/>
-    <w:bookmarkStart w:id="33" w:name="detection-within-a-generator-rq2"/>
+    <w:bookmarkEnd w:id="33"/>
+    <w:bookmarkStart w:id="34" w:name="detection-within-a-generator-rq2"/>
     <w:p>
       <w:pPr>
         <w:pStyle w:val="Heading2"/>
@@ -1671,8 +1721,8 @@
         </w:tc>
       </w:tr>
     </w:tbl>
-    <w:bookmarkEnd w:id="33"/>
-    <w:bookmarkStart w:id="34" w:name="detection-across-generators-rq2"/>
+    <w:bookmarkEnd w:id="34"/>
+    <w:bookmarkStart w:id="35" w:name="detection-across-generators-rq2"/>
     <w:p>
       <w:pPr>
         <w:pStyle w:val="Heading2"/>
@@ -1973,8 +2023,8 @@
         <w:t xml:space="preserve">Two patterns stand out. First, the gap between within-generator and cross-generator AUC is large for every feature family, so a detector calibrated on one generator should not be assumed to protect against another. Second, rates transfer worst (0.66 and 0.73), and dispersion transfers better (0.70 and 0.81), matching or exceeding the combined model in the Claude-to-GPT-4o direction. This is consistent with the sign pattern in Table 2: rate differences reverse across generators, while dispersion differences for passives, quotation marks, and nominalizations point the same way (Table 1). Dispersion is the more portable signal, though even it is far from sufficient on its own.</w:t>
       </w:r>
     </w:p>
-    <w:bookmarkEnd w:id="34"/>
-    <w:bookmarkStart w:id="35" w:name="detection-from-human-text-alone-rq2"/>
+    <w:bookmarkEnd w:id="35"/>
+    <w:bookmarkStart w:id="36" w:name="detection-from-human-text-alone-rq2"/>
     <w:p>
       <w:pPr>
         <w:pStyle w:val="Heading2"/>
@@ -2341,14 +2391,14 @@
         <w:t xml:space="preserve">in which a generator differs from human writers. Human papers already vary widely among themselves in these features, across fields, sections, and authors, so machine text is rarely far from the human cloud in an absolute sense; it is displaced from the center in particular directions. A distance from the human distribution does not capture that displacement.</w:t>
       </w:r>
     </w:p>
-    <w:bookmarkEnd w:id="35"/>
-    <w:bookmarkStart w:id="36" w:name="cost-rq3"/>
+    <w:bookmarkEnd w:id="36"/>
+    <w:bookmarkStart w:id="37" w:name="a-scale-dependent-clustering-model-rq2"/>
     <w:p>
       <w:pPr>
         <w:pStyle w:val="Heading2"/>
       </w:pPr>
       <w:r>
-        <w:t xml:space="preserve">4.5 Cost (RQ3)</w:t>
+        <w:t xml:space="preserve">4.5 A scale-dependent clustering model (RQ2)</w:t>
       </w:r>
     </w:p>
     <w:p>
@@ -2356,12 +2406,624 @@
         <w:pStyle w:val="FirstParagraph"/>
       </w:pPr>
       <w:r>
-        <w:t xml:space="preserve">Computing all events and indices took about 6 milliseconds per document on one CPU core (roughly 160 documents per second) with no external service calls, so the marginal monetary cost is zero. For context on the generation side, producing one paper through four requests cost about US$0.04 and 38 seconds on average for GPT-4o, and about US$0.13 and 100 seconds for Claude, through the gateway we used. We did not run an LLM-as-a-judge baseline, so we cannot report a measured cost or latency ratio between the two screening methods; any such comparison would depend on the judge model, prompt length, and pricing at the time.</w:t>
-      </w:r>
-    </w:p>
-    <w:bookmarkEnd w:id="36"/>
+        <w:t xml:space="preserve">Table 5 compares the new feature set with the baseline on the same documents and folds. Differences are computed with a paired bootstrap, which is more informative than comparing separate intervals.</w:t>
+      </w:r>
+    </w:p>
+    <w:p>
+      <w:pPr>
+        <w:pStyle w:val="TableCaption"/>
+      </w:pPr>
+      <w:r>
+        <w:t xml:space="preserve">Table 5. Baseline (500-token dispersion index) versus scale-dependent clustering features. Baseline values differ from Table 3 by at most 0.001 because of a small change in how counts are split at window boundaries.</w:t>
+      </w:r>
+    </w:p>
+    <w:tbl>
+      <w:tblPr>
+        <w:tblStyle w:val="Table"/>
+        <w:tblW w:type="auto" w:w="0"/>
+        <w:tblLook w:firstRow="1" w:lastRow="0" w:firstColumn="0" w:lastColumn="0" w:noHBand="0" w:noVBand="0" w:val="0020"/>
+        <w:jc w:val="start"/>
+        <w:tblCaption w:val="Table 5. Baseline (500-token dispersion index) versus scale-dependent clustering features. Baseline values differ from Table 3 by at most 0.001 because of a small change in how counts are split at window boundaries."/>
+      </w:tblPr>
+      <w:tblGrid>
+        <w:gridCol w:w="1980"/>
+        <w:gridCol w:w="1980"/>
+        <w:gridCol w:w="1980"/>
+        <w:gridCol w:w="1980"/>
+      </w:tblGrid>
+      <w:tr>
+        <w:trPr>
+          <w:tblHeader w:val="true"/>
+        </w:trPr>
+        <w:tc>
+          <w:tcPr/>
+          <w:p>
+            <w:pPr>
+              <w:pStyle w:val="Compact"/>
+              <w:jc w:val="left"/>
+            </w:pPr>
+            <w:r>
+              <w:t xml:space="preserve">Train → Test</w:t>
+            </w:r>
+          </w:p>
+        </w:tc>
+        <w:tc>
+          <w:tcPr/>
+          <w:p>
+            <w:pPr>
+              <w:pStyle w:val="Compact"/>
+              <w:jc w:val="right"/>
+            </w:pPr>
+            <w:r>
+              <w:t xml:space="preserve">Baseline AUC</w:t>
+            </w:r>
+          </w:p>
+        </w:tc>
+        <w:tc>
+          <w:tcPr/>
+          <w:p>
+            <w:pPr>
+              <w:pStyle w:val="Compact"/>
+              <w:jc w:val="right"/>
+            </w:pPr>
+            <w:r>
+              <w:t xml:space="preserve">New AUC</w:t>
+            </w:r>
+          </w:p>
+        </w:tc>
+        <w:tc>
+          <w:tcPr/>
+          <w:p>
+            <w:pPr>
+              <w:pStyle w:val="Compact"/>
+              <w:jc w:val="left"/>
+            </w:pPr>
+            <w:r>
+              <w:t xml:space="preserve">Difference [95% CI]</w:t>
+            </w:r>
+          </w:p>
+        </w:tc>
+      </w:tr>
+      <w:tr>
+        <w:tc>
+          <w:tcPr/>
+          <w:p>
+            <w:pPr>
+              <w:pStyle w:val="Compact"/>
+              <w:jc w:val="left"/>
+            </w:pPr>
+            <w:r>
+              <w:rPr>
+                <w:iCs/>
+                <w:i/>
+              </w:rPr>
+              <w:t xml:space="preserve">Rates plus clustering features</w:t>
+            </w:r>
+          </w:p>
+        </w:tc>
+        <w:tc>
+          <w:tcPr/>
+          <w:p>
+            <w:pPr>
+              <w:pStyle w:val="Compact"/>
+            </w:pPr>
+          </w:p>
+        </w:tc>
+        <w:tc>
+          <w:tcPr/>
+          <w:p>
+            <w:pPr>
+              <w:pStyle w:val="Compact"/>
+            </w:pPr>
+          </w:p>
+        </w:tc>
+        <w:tc>
+          <w:tcPr/>
+          <w:p>
+            <w:pPr>
+              <w:pStyle w:val="Compact"/>
+            </w:pPr>
+          </w:p>
+        </w:tc>
+      </w:tr>
+      <w:tr>
+        <w:tc>
+          <w:tcPr/>
+          <w:p>
+            <w:pPr>
+              <w:pStyle w:val="Compact"/>
+              <w:jc w:val="left"/>
+            </w:pPr>
+            <w:r>
+              <w:t xml:space="preserve">GPT-4o → GPT-4o</w:t>
+            </w:r>
+          </w:p>
+        </w:tc>
+        <w:tc>
+          <w:tcPr/>
+          <w:p>
+            <w:pPr>
+              <w:pStyle w:val="Compact"/>
+              <w:jc w:val="right"/>
+            </w:pPr>
+            <w:r>
+              <w:t xml:space="preserve">0.987</w:t>
+            </w:r>
+          </w:p>
+        </w:tc>
+        <w:tc>
+          <w:tcPr/>
+          <w:p>
+            <w:pPr>
+              <w:pStyle w:val="Compact"/>
+              <w:jc w:val="right"/>
+            </w:pPr>
+            <w:r>
+              <w:t xml:space="preserve">0.991</w:t>
+            </w:r>
+          </w:p>
+        </w:tc>
+        <w:tc>
+          <w:tcPr/>
+          <w:p>
+            <w:pPr>
+              <w:pStyle w:val="Compact"/>
+              <w:jc w:val="left"/>
+            </w:pPr>
+            <w:r>
+              <w:t xml:space="preserve">+0.004 [−0.000, +0.008]</w:t>
+            </w:r>
+          </w:p>
+        </w:tc>
+      </w:tr>
+      <w:tr>
+        <w:tc>
+          <w:tcPr/>
+          <w:p>
+            <w:pPr>
+              <w:pStyle w:val="Compact"/>
+              <w:jc w:val="left"/>
+            </w:pPr>
+            <w:r>
+              <w:t xml:space="preserve">Claude → Claude</w:t>
+            </w:r>
+          </w:p>
+        </w:tc>
+        <w:tc>
+          <w:tcPr/>
+          <w:p>
+            <w:pPr>
+              <w:pStyle w:val="Compact"/>
+              <w:jc w:val="right"/>
+            </w:pPr>
+            <w:r>
+              <w:t xml:space="preserve">0.914</w:t>
+            </w:r>
+          </w:p>
+        </w:tc>
+        <w:tc>
+          <w:tcPr/>
+          <w:p>
+            <w:pPr>
+              <w:pStyle w:val="Compact"/>
+              <w:jc w:val="right"/>
+            </w:pPr>
+            <w:r>
+              <w:t xml:space="preserve">0.946</w:t>
+            </w:r>
+          </w:p>
+        </w:tc>
+        <w:tc>
+          <w:tcPr/>
+          <w:p>
+            <w:pPr>
+              <w:pStyle w:val="Compact"/>
+              <w:jc w:val="left"/>
+            </w:pPr>
+            <w:r>
+              <w:t xml:space="preserve">+0.032 [+0.017, +0.050]</w:t>
+            </w:r>
+          </w:p>
+        </w:tc>
+      </w:tr>
+      <w:tr>
+        <w:tc>
+          <w:tcPr/>
+          <w:p>
+            <w:pPr>
+              <w:pStyle w:val="Compact"/>
+              <w:jc w:val="left"/>
+            </w:pPr>
+            <w:r>
+              <w:t xml:space="preserve">GPT-4o → Claude</w:t>
+            </w:r>
+          </w:p>
+        </w:tc>
+        <w:tc>
+          <w:tcPr/>
+          <w:p>
+            <w:pPr>
+              <w:pStyle w:val="Compact"/>
+              <w:jc w:val="right"/>
+            </w:pPr>
+            <w:r>
+              <w:t xml:space="preserve">0.729</w:t>
+            </w:r>
+          </w:p>
+        </w:tc>
+        <w:tc>
+          <w:tcPr/>
+          <w:p>
+            <w:pPr>
+              <w:pStyle w:val="Compact"/>
+              <w:jc w:val="right"/>
+            </w:pPr>
+            <w:r>
+              <w:t xml:space="preserve">0.755</w:t>
+            </w:r>
+          </w:p>
+        </w:tc>
+        <w:tc>
+          <w:tcPr/>
+          <w:p>
+            <w:pPr>
+              <w:pStyle w:val="Compact"/>
+              <w:jc w:val="left"/>
+            </w:pPr>
+            <w:r>
+              <w:t xml:space="preserve">+0.026 [+0.001, +0.052]</w:t>
+            </w:r>
+          </w:p>
+        </w:tc>
+      </w:tr>
+      <w:tr>
+        <w:tc>
+          <w:tcPr/>
+          <w:p>
+            <w:pPr>
+              <w:pStyle w:val="Compact"/>
+              <w:jc w:val="left"/>
+            </w:pPr>
+            <w:r>
+              <w:t xml:space="preserve">Claude → GPT-4o</w:t>
+            </w:r>
+          </w:p>
+        </w:tc>
+        <w:tc>
+          <w:tcPr/>
+          <w:p>
+            <w:pPr>
+              <w:pStyle w:val="Compact"/>
+              <w:jc w:val="right"/>
+            </w:pPr>
+            <w:r>
+              <w:t xml:space="preserve">0.809</w:t>
+            </w:r>
+          </w:p>
+        </w:tc>
+        <w:tc>
+          <w:tcPr/>
+          <w:p>
+            <w:pPr>
+              <w:pStyle w:val="Compact"/>
+              <w:jc w:val="right"/>
+            </w:pPr>
+            <w:r>
+              <w:t xml:space="preserve">0.849</w:t>
+            </w:r>
+          </w:p>
+        </w:tc>
+        <w:tc>
+          <w:tcPr/>
+          <w:p>
+            <w:pPr>
+              <w:pStyle w:val="Compact"/>
+              <w:jc w:val="left"/>
+            </w:pPr>
+            <w:r>
+              <w:t xml:space="preserve">+0.040 [+0.019, +0.062]</w:t>
+            </w:r>
+          </w:p>
+        </w:tc>
+      </w:tr>
+      <w:tr>
+        <w:tc>
+          <w:tcPr/>
+          <w:p>
+            <w:pPr>
+              <w:pStyle w:val="Compact"/>
+              <w:jc w:val="left"/>
+            </w:pPr>
+            <w:r>
+              <w:rPr>
+                <w:iCs/>
+                <w:i/>
+              </w:rPr>
+              <w:t xml:space="preserve">Clustering features only (no rates)</w:t>
+            </w:r>
+          </w:p>
+        </w:tc>
+        <w:tc>
+          <w:tcPr/>
+          <w:p>
+            <w:pPr>
+              <w:pStyle w:val="Compact"/>
+            </w:pPr>
+          </w:p>
+        </w:tc>
+        <w:tc>
+          <w:tcPr/>
+          <w:p>
+            <w:pPr>
+              <w:pStyle w:val="Compact"/>
+            </w:pPr>
+          </w:p>
+        </w:tc>
+        <w:tc>
+          <w:tcPr/>
+          <w:p>
+            <w:pPr>
+              <w:pStyle w:val="Compact"/>
+            </w:pPr>
+          </w:p>
+        </w:tc>
+      </w:tr>
+      <w:tr>
+        <w:tc>
+          <w:tcPr/>
+          <w:p>
+            <w:pPr>
+              <w:pStyle w:val="Compact"/>
+              <w:jc w:val="left"/>
+            </w:pPr>
+            <w:r>
+              <w:t xml:space="preserve">GPT-4o → GPT-4o</w:t>
+            </w:r>
+          </w:p>
+        </w:tc>
+        <w:tc>
+          <w:tcPr/>
+          <w:p>
+            <w:pPr>
+              <w:pStyle w:val="Compact"/>
+              <w:jc w:val="right"/>
+            </w:pPr>
+            <w:r>
+              <w:t xml:space="preserve">0.856</w:t>
+            </w:r>
+          </w:p>
+        </w:tc>
+        <w:tc>
+          <w:tcPr/>
+          <w:p>
+            <w:pPr>
+              <w:pStyle w:val="Compact"/>
+              <w:jc w:val="right"/>
+            </w:pPr>
+            <w:r>
+              <w:t xml:space="preserve">0.927</w:t>
+            </w:r>
+          </w:p>
+        </w:tc>
+        <w:tc>
+          <w:tcPr/>
+          <w:p>
+            <w:pPr>
+              <w:pStyle w:val="Compact"/>
+              <w:jc w:val="left"/>
+            </w:pPr>
+            <w:r>
+              <w:t xml:space="preserve">+0.071 [+0.045, +0.096]</w:t>
+            </w:r>
+          </w:p>
+        </w:tc>
+      </w:tr>
+      <w:tr>
+        <w:tc>
+          <w:tcPr/>
+          <w:p>
+            <w:pPr>
+              <w:pStyle w:val="Compact"/>
+              <w:jc w:val="left"/>
+            </w:pPr>
+            <w:r>
+              <w:t xml:space="preserve">Claude → Claude</w:t>
+            </w:r>
+          </w:p>
+        </w:tc>
+        <w:tc>
+          <w:tcPr/>
+          <w:p>
+            <w:pPr>
+              <w:pStyle w:val="Compact"/>
+              <w:jc w:val="right"/>
+            </w:pPr>
+            <w:r>
+              <w:t xml:space="preserve">0.751</w:t>
+            </w:r>
+          </w:p>
+        </w:tc>
+        <w:tc>
+          <w:tcPr/>
+          <w:p>
+            <w:pPr>
+              <w:pStyle w:val="Compact"/>
+              <w:jc w:val="right"/>
+            </w:pPr>
+            <w:r>
+              <w:t xml:space="preserve">0.794</w:t>
+            </w:r>
+          </w:p>
+        </w:tc>
+        <w:tc>
+          <w:tcPr/>
+          <w:p>
+            <w:pPr>
+              <w:pStyle w:val="Compact"/>
+              <w:jc w:val="left"/>
+            </w:pPr>
+            <w:r>
+              <w:t xml:space="preserve">+0.043 [+0.004, +0.082]</w:t>
+            </w:r>
+          </w:p>
+        </w:tc>
+      </w:tr>
+      <w:tr>
+        <w:tc>
+          <w:tcPr/>
+          <w:p>
+            <w:pPr>
+              <w:pStyle w:val="Compact"/>
+              <w:jc w:val="left"/>
+            </w:pPr>
+            <w:r>
+              <w:t xml:space="preserve">GPT-4o → Claude</w:t>
+            </w:r>
+          </w:p>
+        </w:tc>
+        <w:tc>
+          <w:tcPr/>
+          <w:p>
+            <w:pPr>
+              <w:pStyle w:val="Compact"/>
+              <w:jc w:val="right"/>
+            </w:pPr>
+            <w:r>
+              <w:t xml:space="preserve">0.704</w:t>
+            </w:r>
+          </w:p>
+        </w:tc>
+        <w:tc>
+          <w:tcPr/>
+          <w:p>
+            <w:pPr>
+              <w:pStyle w:val="Compact"/>
+              <w:jc w:val="right"/>
+            </w:pPr>
+            <w:r>
+              <w:t xml:space="preserve">0.730</w:t>
+            </w:r>
+          </w:p>
+        </w:tc>
+        <w:tc>
+          <w:tcPr/>
+          <w:p>
+            <w:pPr>
+              <w:pStyle w:val="Compact"/>
+              <w:jc w:val="left"/>
+            </w:pPr>
+            <w:r>
+              <w:t xml:space="preserve">+0.026 [−0.017, +0.071]</w:t>
+            </w:r>
+          </w:p>
+        </w:tc>
+      </w:tr>
+      <w:tr>
+        <w:tc>
+          <w:tcPr/>
+          <w:p>
+            <w:pPr>
+              <w:pStyle w:val="Compact"/>
+              <w:jc w:val="left"/>
+            </w:pPr>
+            <w:r>
+              <w:t xml:space="preserve">Claude → GPT-4o</w:t>
+            </w:r>
+          </w:p>
+        </w:tc>
+        <w:tc>
+          <w:tcPr/>
+          <w:p>
+            <w:pPr>
+              <w:pStyle w:val="Compact"/>
+              <w:jc w:val="right"/>
+            </w:pPr>
+            <w:r>
+              <w:t xml:space="preserve">0.808</w:t>
+            </w:r>
+          </w:p>
+        </w:tc>
+        <w:tc>
+          <w:tcPr/>
+          <w:p>
+            <w:pPr>
+              <w:pStyle w:val="Compact"/>
+              <w:jc w:val="right"/>
+            </w:pPr>
+            <w:r>
+              <w:t xml:space="preserve">0.858</w:t>
+            </w:r>
+          </w:p>
+        </w:tc>
+        <w:tc>
+          <w:tcPr/>
+          <w:p>
+            <w:pPr>
+              <w:pStyle w:val="Compact"/>
+              <w:jc w:val="left"/>
+            </w:pPr>
+            <w:r>
+              <w:t xml:space="preserve">+0.050 [+0.021, +0.077]</w:t>
+            </w:r>
+          </w:p>
+        </w:tc>
+      </w:tr>
+    </w:tbl>
+    <w:p>
+      <w:pPr>
+        <w:pStyle w:val="BodyText"/>
+      </w:pPr>
+      <w:r>
+        <w:t xml:space="preserve">The new features help in seven of eight comparisons, where</w:t>
+      </w:r>
+      <w:r>
+        <w:t xml:space="preserve"> </w:t>
+      </w:r>
+      <w:r>
+        <w:t xml:space="preserve">“</w:t>
+      </w:r>
+      <w:r>
+        <w:t xml:space="preserve">help</w:t>
+      </w:r>
+      <w:r>
+        <w:t xml:space="preserve">”</w:t>
+      </w:r>
+      <w:r>
+        <w:t xml:space="preserve"> </w:t>
+      </w:r>
+      <w:r>
+        <w:t xml:space="preserve">means the interval for the difference excludes zero or sits at its edge, and the gains are largest for the dispersion-only comparison within a generator (+0.07 for GPT-4o). Transfer to an unseen generator improves from 0.73 to 0.76 (GPT-4o to Claude) and from 0.81 to 0.85 (Claude to GPT-4o) when rates are included; without rates, the improvement for GPT-4o to Claude is not distinguishable from zero. The slope alone is a weak predictor (AUC 0.67 to 0.82 within and across generators), so the gains come mainly from the clustering level across scales and from the richer description, not from the slope specifically.</w:t>
+      </w:r>
+    </w:p>
+    <w:p>
+      <w:pPr>
+        <w:pStyle w:val="BodyText"/>
+      </w:pPr>
+      <w:r>
+        <w:t xml:space="preserve">The model does not rescue detection from human text alone. A Mahalanobis detector on the new features reaches AUC 0.59 for GPT-4o and 0.49 for Claude, essentially the same as before. The improvement is therefore in how well a supervised detector can use the clustering structure, not in how well human text can define normality by itself.</w:t>
+      </w:r>
+    </w:p>
     <w:bookmarkEnd w:id="37"/>
-    <w:bookmarkStart w:id="38" w:name="discussion"/>
+    <w:bookmarkStart w:id="38" w:name="cost-rq3"/>
+    <w:p>
+      <w:pPr>
+        <w:pStyle w:val="Heading2"/>
+      </w:pPr>
+      <w:r>
+        <w:t xml:space="preserve">4.6 Cost (RQ3)</w:t>
+      </w:r>
+    </w:p>
+    <w:p>
+      <w:pPr>
+        <w:pStyle w:val="FirstParagraph"/>
+      </w:pPr>
+      <w:r>
+        <w:t xml:space="preserve">Computing all events and the baseline indices took about 6 milliseconds per document on one CPU core (roughly 160 documents per second) with no external service calls, so the marginal monetary cost is zero. For context on the generation side, producing one paper through four requests cost about US$0.04 and 38 seconds on average for GPT-4o, and about US$0.13 and 100 seconds for Claude, through the gateway we used. We did not run an LLM-as-a-judge baseline, so we cannot report a measured cost or latency ratio between the two screening methods; any such comparison would depend on the judge model, prompt length, and pricing at the time.</w:t>
+      </w:r>
+    </w:p>
+    <w:bookmarkEnd w:id="38"/>
+    <w:bookmarkEnd w:id="39"/>
+    <w:bookmarkStart w:id="40" w:name="discussion"/>
     <w:p>
       <w:pPr>
         <w:pStyle w:val="Heading1"/>
@@ -2409,7 +3071,7 @@
         <w:pStyle w:val="BodyText"/>
       </w:pPr>
       <w:r>
-        <w:t xml:space="preserve">The result is less discouraging for the count-process idea than for the rate-based version. Dispersion generalizes better than rates, and the direction of several dispersion differences agrees across two generators. If a general machine-text signature exists in these features, it is more likely to be found in how events cluster than in how often they occur. We see this as a hypothesis for larger studies with more generators, including open-weight models, rather than an established finding. We also tested the obvious way around generator-specific calibration, a screen that models human text alone and flags departures from it. It did not work in this setting (Section 4.4). Avoiding dependence on generator examples therefore comes at a large price in accuracy, at least with these features and these simple models.</w:t>
+        <w:t xml:space="preserve">A model that describes clustering across scales improves matters somewhat. The gains are modest, a few hundredths of AUC, but they appear in nearly every comparison and survive transfer to an unseen generator, which supports the view that how events cluster is a more informative description of machine text than a single Poisson test. The result is less discouraging for the count-process idea than for the rate-based version. Dispersion generalizes better than rates, and the direction of several dispersion differences agrees across two generators. If a general machine-text signature exists in these features, it is more likely to be found in how events cluster than in how often they occur. We see this as a hypothesis for larger studies with more generators, including open-weight models, rather than an established finding. We also tested the obvious way around generator-specific calibration, a screen that models human text alone and flags departures from it. It did not work in this setting (Section 4.4). Avoiding dependence on generator examples therefore comes at a large price in accuracy, at least with these features and these simple models.</w:t>
       </w:r>
     </w:p>
     <w:p>
@@ -2438,8 +3100,8 @@
         <w:t xml:space="preserve">can be explained to an author or editor, and it costs nothing to compute. It should therefore be treated as a low-cost first filter whose output is routed to human review, not as grounds for action on its own.</w:t>
       </w:r>
     </w:p>
-    <w:bookmarkEnd w:id="38"/>
-    <w:bookmarkStart w:id="39" w:name="limitations"/>
+    <w:bookmarkEnd w:id="40"/>
+    <w:bookmarkStart w:id="41" w:name="limitations"/>
     <w:p>
       <w:pPr>
         <w:pStyle w:val="Heading1"/>
@@ -2689,6 +3351,28 @@
           <w:bCs/>
           <w:b/>
         </w:rPr>
+        <w:t xml:space="preserve">Model developed after the baseline.</w:t>
+      </w:r>
+      <w:r>
+        <w:t xml:space="preserve"> </w:t>
+      </w:r>
+      <w:r>
+        <w:t xml:space="preserve">The clustering model was designed after we had seen the baseline results, and we compared it with the baseline on the same data. We fixed the comparison in advance and did not tune its settings, but we ran eight paired comparisons without correction for multiple testing, and several intervals touch zero at their edges while one includes it. The estimates rely on moment matching with four scales and are noisy for rare events. A confirmatory test on new generators and new documents is needed.</w:t>
+      </w:r>
+    </w:p>
+    <w:p>
+      <w:pPr>
+        <w:numPr>
+          <w:ilvl w:val="0"/>
+          <w:numId w:val="1002"/>
+        </w:numPr>
+        <w:pStyle w:val="Compact"/>
+      </w:pPr>
+      <w:r>
+        <w:rPr>
+          <w:bCs/>
+          <w:b/>
+        </w:rPr>
         <w:t xml:space="preserve">No black-box baselines and no reviewer experiment.</w:t>
       </w:r>
       <w:r>
@@ -2698,8 +3382,8 @@
         <w:t xml:space="preserve">We did not compare against LLM-as-a-judge, MAUVE, or BERTScore, and we did not test whether explainable evidence improves human decisions. Claims about relative advantage over those methods are therefore not supported by this study.</w:t>
       </w:r>
     </w:p>
-    <w:bookmarkEnd w:id="39"/>
-    <w:bookmarkStart w:id="40" w:name="planned-extensions"/>
+    <w:bookmarkEnd w:id="41"/>
+    <w:bookmarkStart w:id="42" w:name="planned-extensions"/>
     <w:p>
       <w:pPr>
         <w:pStyle w:val="Heading1"/>
@@ -2713,11 +3397,11 @@
         <w:pStyle w:val="FirstParagraph"/>
       </w:pPr>
       <w:r>
-        <w:t xml:space="preserve">Four steps would turn this pilot into a test of the full proposal. (i) Add further generators, especially open-weight models, and evaluate each as held out, together with a negative binomial reference in place of the Poisson benchmark. (ii) Run MAUVE, BERTScore, and an LLM-as-a-judge baseline on identical documents, recording latency and cost. (iii) Test robustness to paraphrasing and light human editing. (iv) Conduct a randomized experiment in which domain experts classify real and fabricated papers under three conditions (no indicator, an unexplained AI score, and an explainable event-based indicator), analyzed with ANOVA and planned contrasts after an a priori power analysis. Pre-registering the feature list, windows, and analysis plan would guard against analytic flexibility.</w:t>
-      </w:r>
-    </w:p>
-    <w:bookmarkEnd w:id="40"/>
-    <w:bookmarkStart w:id="41" w:name="conclusion"/>
+        <w:t xml:space="preserve">Five steps would turn this pilot into a test of the full proposal. (i) Add further generators, especially open-weight models, and evaluate each as held out, together with a negative binomial reference in place of the Poisson benchmark. (ii) Run MAUVE, BERTScore, and an LLM-as-a-judge baseline on identical documents, recording latency and cost. (iii) Test robustness to paraphrasing and light human editing, and test the clustering model on new generators and documents as a confirmatory study, ideally with full likelihood estimation (for example, a log-Gaussian Cox process) in place of moment matching. (iv) Conduct a randomized experiment in which domain experts classify real and fabricated papers under three conditions (no indicator, an unexplained AI score, and an explainable event-based indicator), analyzed with ANOVA and planned contrasts after an a priori power analysis. Pre-registering the feature list, windows, and analysis plan would guard against analytic flexibility.</w:t>
+      </w:r>
+    </w:p>
+    <w:bookmarkEnd w:id="42"/>
+    <w:bookmarkStart w:id="43" w:name="conclusion"/>
     <w:p>
       <w:pPr>
         <w:pStyle w:val="Heading1"/>
@@ -2731,11 +3415,11 @@
         <w:pStyle w:val="FirstParagraph"/>
       </w:pPr>
       <w:r>
-        <w:t xml:space="preserve">Counting small linguistic events is a cheap and transparent way to screen scholarly text, but the simplest version of the idea, measuring distance from a Poisson process, does not work, because human text is not Poisson. A richer set of count-based features detects machine-generated papers well within a generator, but accuracy falls to between 0.73 and 0.81 on an unseen generator. Dispersion transfers better than event rates, and that is the clearest sign in our data that the count-process view captures something general. Detectors built on human text alone, which would avoid the need for generator examples, performed near chance. The evidence is limited to two generators and one genre, and whether the approach helps human reviewers or outperforms black-box metrics remains untested.</w:t>
-      </w:r>
-    </w:p>
-    <w:bookmarkEnd w:id="41"/>
-    <w:bookmarkStart w:id="42" w:name="references"/>
+        <w:t xml:space="preserve">Counting small linguistic events is a cheap and transparent way to screen scholarly text, but the simplest version of the idea, measuring distance from a Poisson process, does not work, because human text is not Poisson. A richer set of count-based features detects machine-generated papers well within a generator, but accuracy falls to between 0.73 and 0.81 on an unseen generator. Dispersion transfers better than event rates, and that is the clearest sign in our data that the count-process view captures something general. Detectors built on human text alone, which would avoid the need for generator examples, performed near chance. A model of clustering across scales improved detection modestly and consistently, including on an unseen generator. The evidence is limited to two generators and one genre, and whether the approach helps human reviewers or outperforms black-box metrics remains untested.</w:t>
+      </w:r>
+    </w:p>
+    <w:bookmarkEnd w:id="43"/>
+    <w:bookmarkStart w:id="44" w:name="references"/>
     <w:p>
       <w:pPr>
         <w:pStyle w:val="Heading1"/>
@@ -3017,7 +3701,7 @@
         <w:t xml:space="preserve">(36).</w:t>
       </w:r>
     </w:p>
-    <w:bookmarkEnd w:id="42"/>
+    <w:bookmarkEnd w:id="44"/>
     <w:sectPr/>
   </w:body>
 </w:document>

</xml_diff>

<commit_message>
Add Llama confirmatory test; update paper to three generators
Co-Authored-By: Claude Sonnet 5.5 <noreply@anthropic.com>
Claude-Session: https://claude.ai/code/session_01FLb7uVf7YBgdoa75gbZ2sf
</commit_message>
<xml_diff>
--- a/paper/Poisson_LLM_Pilot_Paper_MISQ.docx
+++ b/paper/Poisson_LLM_Pilot_Paper_MISQ.docx
@@ -123,7 +123,7 @@
         <w:t xml:space="preserve"> </w:t>
       </w:r>
       <w:r>
-        <w:t xml:space="preserve">(two</w:t>
+        <w:t xml:space="preserve">(three</w:t>
       </w:r>
       <w:r>
         <w:t xml:space="preserve"> </w:t>
@@ -176,7 +176,7 @@
         <w:pStyle w:val="FirstParagraph"/>
       </w:pPr>
       <w:r>
-        <w:t xml:space="preserve">Organizations that publish or archive scholarly documents now face a screening problem: language models can produce papers faster and more cheaply than anyone can check them. Two common remedies, LLM-as-a-judge and embedding-based similarity metrics, are either expensive and prompt-dependent or insensitive to fine-grained statistical structure. We study a lightweight alternative that treats the occurrence of selected linguistic events (special punctuation, discourse markers, passive constructions, nominalizations) as count processes and asks how far a document departs from human-authored text. Using 474 human-written papers from PubMed Central and arXiv (2015–2019) and matched papers from two generators (GPT-4o, 245 papers; Claude Sonnet 5.5, 152 papers), we report six findings. First, human text is not Poisson: for punctuation events, 36–49% of documents reject the Poisson null because of over-dispersion. Second, a single Poisson-distance index performs near chance (AUC 0.52–0.54), but a vector of event rates and dispersion indices separates human from machine text well when the detector is trained and tested on the same generator (AUC 0.99 for GPT-4o, 0.91 for Claude). Third, this performance does not transfer: a detector trained on one generator reaches only 0.73 (GPT-4o to Claude) and 0.81 (Claude to GPT-4o) on the other. Fourth, dispersion transfers better than event rates, which differ in sign across generators; this is the clearest support we find for the count-process idea. Fifth, detectors trained on human papers alone, which need no generator data, perform near chance (AUC 0.45 to 0.66 across three methods), so the signal lies in directions specific to machine text and not in generic departures from human variation. Sixth, replacing the single-window dispersion index with a scale-dependent clustering model (a doubly stochastic, or Cox, Poisson process summarized by how the Fano factor changes with window size) improves detection modestly but consistently, by roughly 0.03 to 0.05 AUC in most settings, including transfer to an unseen generator (0.76 and 0.85); it does not rescue human-only detection. Screening costs nothing per document and runs at about 160 documents per second on one CPU core. The evidence is limited to two commercial generators and one genre, and we do not test adversarial editing, comparison with black-box metrics, or the effect on human reviewers.</w:t>
+        <w:t xml:space="preserve">Organizations that publish or archive scholarly documents now face a screening problem: language models can produce papers faster and more cheaply than anyone can check them. Two common remedies, LLM-as-a-judge and embedding-based similarity metrics, are either expensive and prompt-dependent or insensitive to fine-grained statistical structure. We study a lightweight alternative that treats the occurrence of selected linguistic events (special punctuation, discourse markers, passive constructions, nominalizations) as count processes and asks how far a document departs from human-authored text. Using 474 human-written papers from PubMed Central and arXiv (2015–2019) and matched papers from three generators (GPT-4o, 245 papers; Claude Sonnet 5.5, 152; Llama 3.3 70B, 202), we report six findings. First, human text is not Poisson: for punctuation events, 36–49% of documents reject the Poisson null because of over-dispersion. Second, a single Poisson-distance index performs near chance (AUC 0.51–0.54). Third, a vector of event rates and dispersion indices separates human from machine text well when the detector is trained and tested on the same generator (AUC 0.91–0.99), but not across generators: a detector trained on GPT-4o reaches 0.73 on Claude. Fourth, dispersion transfers better than event rates, which differ in sign across generators. Fifth, detectors trained on human papers alone perform near chance to modestly above it. Sixth, we propose a scale-dependent clustering model, a doubly stochastic (Cox) Poisson process summarized by how the Fano factor changes with window size. In a test specified before the Llama data were collected, it raised AUC on the unseen Llama papers from 0.89 to 0.93 (difference +0.046, 95% interval 0.030 to 0.063). Screening costs nothing per document and runs at roughly 160 to 230 documents per second on one CPU core. The evidence is limited to three generators and one genre, and we do not test adversarial editing, comparison with black-box metrics, or the effect on human reviewers.</w:t>
       </w:r>
     </w:p>
     <w:p>
@@ -467,7 +467,7 @@
         <w:pStyle w:val="FirstParagraph"/>
       </w:pPr>
       <w:r>
-        <w:t xml:space="preserve">For each sampled paper we asked a generator to write a paper on the same topic, given the original title and abstract, using one of three prompts of increasing detail. We used two generators through a commercial API gateway: GPT-4o and Claude Sonnet 5.5. A single request yielded only about 800 words from GPT-4o, too short for window-based analysis, so each paper was generated in four requests (introduction, methods, results, discussion and conclusion) and concatenated. Prompts were presented in a fixed random order, so each subset is random across fields.</w:t>
+        <w:t xml:space="preserve">For each sampled paper we asked a generator to write a paper on the same topic, given the original title and abstract, using one of three prompts of increasing detail. We used three generators through a commercial API gateway: GPT-4o, Claude Sonnet 5.5, and Llama 3.3 70B Instruct (an open-weight model, hosted). A single request yielded only about 800 words from GPT-4o, too short for window-based analysis, so each paper was generated in four requests (introduction, methods, results, discussion and conclusion) and concatenated. Prompts were presented in a fixed random order, so each subset is random across fields.</w:t>
       </w:r>
     </w:p>
     <w:p>
@@ -475,7 +475,7 @@
         <w:pStyle w:val="BodyText"/>
       </w:pPr>
       <w:r>
-        <w:t xml:space="preserve">GPT-4o produced 245 unique papers (one source had been generated twice during testing and we kept one record), with a median of about 2,750 words. Claude produced 152 papers, with a median of 4,566 words (range 3,667 to 5,134); generation was capped at that number to limit cost, not because of any property of the output. Because Claude wrote longer papers, all documents are truncated to the same length before analysis (Section 3.3). Both sets passed the length requirement.</w:t>
+        <w:t xml:space="preserve">GPT-4o produced 245 unique papers (one source had been generated twice during testing and we kept one record), with a median of about 2,750 words. Claude produced 152 papers, with a median of 4,566 words (range 3,667 to 5,134); generation was capped at that number to limit cost, not because of any property of the output. Llama 3.3 70B Instruct, an open-weight model that we accessed through the same gateway, produced 202 unique papers (one source had again been generated twice and one record was kept), with a median of about 2,970 words (range 2,355 to 7,926). It was added last, after the clustering model of Section 3.5 had been developed, and it serves as the confirmatory test. All three synthetic sets passed the length requirement, and because the generators wrote papers of different lengths, all documents are truncated to the same length before analysis (Section 3.3).</w:t>
       </w:r>
     </w:p>
     <w:bookmarkEnd w:id="24"/>
@@ -694,12 +694,12 @@
         <w:pStyle w:val="FirstParagraph"/>
       </w:pPr>
       <w:r>
-        <w:t xml:space="preserve">Detection is evaluated by five-fold cross-validation with all material from the same source paper kept in the same fold, so that a human paper and its synthetic counterpart never straddle training and test sets. We report the area under the ROC curve (AUC), with 95% bootstrap intervals over documents. To study transfer, we train on human papers plus papers from one generator and test on held-out human papers plus papers from the other generator, in both directions. We also evaluate detectors trained on human papers only: a Mahalanobis distance from the human feature distribution (Ledoit–Wolf covariance), chosen as the primary method before seeing results, and, as secondary methods, a One-Class SVM and an Isolation Forest, all with default settings and no tuning on generator data. These produce an anomaly score, and we evaluate how well it separates held-out human papers from each generator’s papers. The analysis code, prompts, and generated papers are in the project repository; the human papers can be re-collected with the included script.</w:t>
+        <w:t xml:space="preserve">Detection is evaluated by five-fold cross-validation with all material from the same source paper kept in the same fold, so that a human paper and its synthetic counterpart never straddle training and test sets. We report the area under the ROC curve (AUC), with 95% bootstrap intervals over documents. To study transfer, we train on human papers plus papers from one generator and test on held-out human papers plus papers from the other generator, in both directions. We also evaluate detectors trained on human papers only: a Mahalanobis distance from the human feature distribution (Ledoit–Wolf covariance), chosen as the primary method before seeing results, and, as secondary methods, a One-Class SVM and an Isolation Forest, all with default settings and no tuning on generator data. These produce an anomaly score, and we evaluate how well it separates held-out human papers from each generator’s papers. Finally, because the clustering model of Section 3.5 was developed on the GPT-4o and Claude data, we tested it on Llama papers that played no part in its development. This test, and the script that runs it, were fixed before the Llama papers were generated: train on human papers plus both other generators pooled, never on Llama, with grouped cross-validation, and compare the baseline features with the new features by a paired bootstrap of the AUC difference. The analysis code, prompts, and generated papers are in the project repository; the human papers can be re-collected with the included script.</w:t>
       </w:r>
     </w:p>
     <w:bookmarkEnd w:id="28"/>
     <w:bookmarkEnd w:id="29"/>
-    <w:bookmarkStart w:id="39" w:name="results"/>
+    <w:bookmarkStart w:id="40" w:name="results"/>
     <w:p>
       <w:pPr>
         <w:pStyle w:val="Heading1"/>
@@ -742,10 +742,11 @@
         <w:tblCaption w:val="Table 1. Median dispersion index and percentage of documents rejecting the Poisson null toward over-dispersion (5% level), by source. Index = variance / mean; 1 indicates Poisson behavior."/>
       </w:tblPr>
       <w:tblGrid>
-        <w:gridCol w:w="1980"/>
-        <w:gridCol w:w="1980"/>
-        <w:gridCol w:w="1980"/>
-        <w:gridCol w:w="1980"/>
+        <w:gridCol w:w="1584"/>
+        <w:gridCol w:w="1584"/>
+        <w:gridCol w:w="1584"/>
+        <w:gridCol w:w="1584"/>
+        <w:gridCol w:w="1584"/>
       </w:tblGrid>
       <w:tr>
         <w:trPr>
@@ -799,6 +800,18 @@
             </w:r>
           </w:p>
         </w:tc>
+        <w:tc>
+          <w:tcPr/>
+          <w:p>
+            <w:pPr>
+              <w:pStyle w:val="Compact"/>
+              <w:jc w:val="right"/>
+            </w:pPr>
+            <w:r>
+              <w:t xml:space="preserve">Llama: index (% over)</w:t>
+            </w:r>
+          </w:p>
+        </w:tc>
       </w:tr>
       <w:tr>
         <w:tc>
@@ -849,6 +862,18 @@
             </w:r>
           </w:p>
         </w:tc>
+        <w:tc>
+          <w:tcPr/>
+          <w:p>
+            <w:pPr>
+              <w:pStyle w:val="Compact"/>
+              <w:jc w:val="right"/>
+            </w:pPr>
+            <w:r>
+              <w:t xml:space="preserve">2.00 (38.5)</w:t>
+            </w:r>
+          </w:p>
+        </w:tc>
       </w:tr>
       <w:tr>
         <w:tc>
@@ -899,6 +924,18 @@
             </w:r>
           </w:p>
         </w:tc>
+        <w:tc>
+          <w:tcPr/>
+          <w:p>
+            <w:pPr>
+              <w:pStyle w:val="Compact"/>
+              <w:jc w:val="right"/>
+            </w:pPr>
+            <w:r>
+              <w:t xml:space="preserve">2.02 (39.6)</w:t>
+            </w:r>
+          </w:p>
+        </w:tc>
       </w:tr>
       <w:tr>
         <w:tc>
@@ -949,6 +986,18 @@
             </w:r>
           </w:p>
         </w:tc>
+        <w:tc>
+          <w:tcPr/>
+          <w:p>
+            <w:pPr>
+              <w:pStyle w:val="Compact"/>
+              <w:jc w:val="right"/>
+            </w:pPr>
+            <w:r>
+              <w:t xml:space="preserve">2.00 (35.0)</w:t>
+            </w:r>
+          </w:p>
+        </w:tc>
       </w:tr>
       <w:tr>
         <w:tc>
@@ -999,6 +1048,18 @@
             </w:r>
           </w:p>
         </w:tc>
+        <w:tc>
+          <w:tcPr/>
+          <w:p>
+            <w:pPr>
+              <w:pStyle w:val="Compact"/>
+              <w:jc w:val="right"/>
+            </w:pPr>
+            <w:r>
+              <w:t xml:space="preserve">1.27 (21.8)</w:t>
+            </w:r>
+          </w:p>
+        </w:tc>
       </w:tr>
       <w:tr>
         <w:tc>
@@ -1049,6 +1110,18 @@
             </w:r>
           </w:p>
         </w:tc>
+        <w:tc>
+          <w:tcPr/>
+          <w:p>
+            <w:pPr>
+              <w:pStyle w:val="Compact"/>
+              <w:jc w:val="right"/>
+            </w:pPr>
+            <w:r>
+              <w:t xml:space="preserve">3.00 (55.3)</w:t>
+            </w:r>
+          </w:p>
+        </w:tc>
       </w:tr>
       <w:tr>
         <w:tc>
@@ -1099,6 +1172,18 @@
             </w:r>
           </w:p>
         </w:tc>
+        <w:tc>
+          <w:tcPr/>
+          <w:p>
+            <w:pPr>
+              <w:pStyle w:val="Compact"/>
+              <w:jc w:val="right"/>
+            </w:pPr>
+            <w:r>
+              <w:t xml:space="preserve">2.02 (35.1)</w:t>
+            </w:r>
+          </w:p>
+        </w:tc>
       </w:tr>
       <w:tr>
         <w:tc>
@@ -1149,6 +1234,18 @@
             </w:r>
           </w:p>
         </w:tc>
+        <w:tc>
+          <w:tcPr/>
+          <w:p>
+            <w:pPr>
+              <w:pStyle w:val="Compact"/>
+              <w:jc w:val="right"/>
+            </w:pPr>
+            <w:r>
+              <w:t xml:space="preserve">1.11 (9.4)</w:t>
+            </w:r>
+          </w:p>
+        </w:tc>
       </w:tr>
     </w:tbl>
     <w:p>
@@ -1171,7 +1268,7 @@
         <w:t xml:space="preserve">”</w:t>
       </w:r>
       <w:r>
-        <w:t xml:space="preserve">. Nominalizations are less dispersed in both generators (medians 0.76 and 1.10, against 1.67 in human text), meaning they are spread more evenly. Passive constructions and quotation marks are more dispersed in both (passive 2.51 and 1.79 against 1.20; quotation marks 3.00 and 2.00 against 1.30). These directions agree across the two generators, which makes them more credible as features of machine writing than as quirks of one model. Figure 1 shows the full distributions for GPT-4o and human text.</w:t>
+        <w:t xml:space="preserve">. Nominalizations are less dispersed in all three generators (medians 0.76, 1.10, and 1.27, against 1.67 in human text), meaning they are spread more evenly. Passive constructions and quotation marks are more dispersed in all three (passive 2.51, 1.79, and 2.02 against 1.20; quotation marks 3.00, 2.00, and 3.00 against 1.30). These directions agree across the three generators, which makes them more credible as features of machine writing than as quirks of one model. Figure 1 shows the full distributions for GPT-4o and human text.</w:t>
       </w:r>
     </w:p>
     <w:p>
@@ -1252,7 +1349,7 @@
         <w:pStyle w:val="FirstParagraph"/>
       </w:pPr>
       <w:r>
-        <w:t xml:space="preserve">The single-index Poisson-Score performs close to chance: AUC 0.54 for GPT-4o and 0.52 for Claude. Treating its fourteen components as separate predictors changes the picture. With human papers and one generator, cross-validated logistic regression reaches AUC 0.987 for GPT-4o and 0.913 for Claude (Table 3, diagonal). Detection is clearly easier for GPT-4o than for Claude.</w:t>
+        <w:t xml:space="preserve">The single-index Poisson-Score performs close to chance: AUC 0.54 for GPT-4o, 0.51 for Claude, and 0.53 for Llama. Treating its fourteen components as separate predictors changes the picture. With human papers and one generator, cross-validated logistic regression reaches AUC 0.987 for GPT-4o and 0.913 for Claude (Table 3, diagonal). Detection is clearly easier for GPT-4o than for Claude, and Llama falls between them (baseline within-generator AUC 0.96, from the analysis described in Section 4.6).</w:t>
       </w:r>
     </w:p>
     <w:p>
@@ -1276,7 +1373,7 @@
         <w:t xml:space="preserve"> </w:t>
       </w:r>
       <w:r>
-        <w:t xml:space="preserve">carry most of this within-generator signal (AUC 0.97 and 0.90), and dispersion alone remains informative (0.86 and 0.75). Table 2 shows why rates are generator-specific. GPT-4o uses far fewer square brackets, semicolons, and quotation marks than human authors, and more nominalizations and discourse markers. Claude differs in a different way: it uses</w:t>
+        <w:t xml:space="preserve">carry most of this within-generator signal (AUC 0.97 and 0.90), and dispersion alone remains informative (0.86 and 0.75). Table 2 shows why rates are generator-specific. GPT-4o uses far fewer square brackets, semicolons, and quotation marks than human authors, and more nominalizations and discourse markers. Claude differs in a different way (Llama is a third pattern, with many parentheses and few brackets): it uses</w:t>
       </w:r>
       <w:r>
         <w:t xml:space="preserve"> </w:t>
@@ -1312,10 +1409,11 @@
         <w:tblCaption w:val="Table 2. Mean event count per 500-token window, by source."/>
       </w:tblPr>
       <w:tblGrid>
-        <w:gridCol w:w="1980"/>
-        <w:gridCol w:w="1980"/>
-        <w:gridCol w:w="1980"/>
-        <w:gridCol w:w="1980"/>
+        <w:gridCol w:w="1584"/>
+        <w:gridCol w:w="1584"/>
+        <w:gridCol w:w="1584"/>
+        <w:gridCol w:w="1584"/>
+        <w:gridCol w:w="1584"/>
       </w:tblGrid>
       <w:tr>
         <w:trPr>
@@ -1369,6 +1467,18 @@
             </w:r>
           </w:p>
         </w:tc>
+        <w:tc>
+          <w:tcPr/>
+          <w:p>
+            <w:pPr>
+              <w:pStyle w:val="Compact"/>
+              <w:jc w:val="right"/>
+            </w:pPr>
+            <w:r>
+              <w:t xml:space="preserve">Llama</w:t>
+            </w:r>
+          </w:p>
+        </w:tc>
       </w:tr>
       <w:tr>
         <w:tc>
@@ -1419,6 +1529,18 @@
             </w:r>
           </w:p>
         </w:tc>
+        <w:tc>
+          <w:tcPr/>
+          <w:p>
+            <w:pPr>
+              <w:pStyle w:val="Compact"/>
+              <w:jc w:val="right"/>
+            </w:pPr>
+            <w:r>
+              <w:t xml:space="preserve">14.66</w:t>
+            </w:r>
+          </w:p>
+        </w:tc>
       </w:tr>
       <w:tr>
         <w:tc>
@@ -1469,6 +1591,18 @@
             </w:r>
           </w:p>
         </w:tc>
+        <w:tc>
+          <w:tcPr/>
+          <w:p>
+            <w:pPr>
+              <w:pStyle w:val="Compact"/>
+              <w:jc w:val="right"/>
+            </w:pPr>
+            <w:r>
+              <w:t xml:space="preserve">0.17</w:t>
+            </w:r>
+          </w:p>
+        </w:tc>
       </w:tr>
       <w:tr>
         <w:tc>
@@ -1519,6 +1653,18 @@
             </w:r>
           </w:p>
         </w:tc>
+        <w:tc>
+          <w:tcPr/>
+          <w:p>
+            <w:pPr>
+              <w:pStyle w:val="Compact"/>
+              <w:jc w:val="right"/>
+            </w:pPr>
+            <w:r>
+              <w:t xml:space="preserve">1.17</w:t>
+            </w:r>
+          </w:p>
+        </w:tc>
       </w:tr>
       <w:tr>
         <w:tc>
@@ -1569,6 +1715,18 @@
             </w:r>
           </w:p>
         </w:tc>
+        <w:tc>
+          <w:tcPr/>
+          <w:p>
+            <w:pPr>
+              <w:pStyle w:val="Compact"/>
+              <w:jc w:val="right"/>
+            </w:pPr>
+            <w:r>
+              <w:t xml:space="preserve">0.55</w:t>
+            </w:r>
+          </w:p>
+        </w:tc>
       </w:tr>
       <w:tr>
         <w:tc>
@@ -1619,6 +1777,18 @@
             </w:r>
           </w:p>
         </w:tc>
+        <w:tc>
+          <w:tcPr/>
+          <w:p>
+            <w:pPr>
+              <w:pStyle w:val="Compact"/>
+              <w:jc w:val="right"/>
+            </w:pPr>
+            <w:r>
+              <w:t xml:space="preserve">2.12</w:t>
+            </w:r>
+          </w:p>
+        </w:tc>
       </w:tr>
       <w:tr>
         <w:tc>
@@ -1669,6 +1839,18 @@
             </w:r>
           </w:p>
         </w:tc>
+        <w:tc>
+          <w:tcPr/>
+          <w:p>
+            <w:pPr>
+              <w:pStyle w:val="Compact"/>
+              <w:jc w:val="right"/>
+            </w:pPr>
+            <w:r>
+              <w:t xml:space="preserve">6.51</w:t>
+            </w:r>
+          </w:p>
+        </w:tc>
       </w:tr>
       <w:tr>
         <w:tc>
@@ -1716,6 +1898,18 @@
             </w:pPr>
             <w:r>
               <w:t xml:space="preserve">27.34</w:t>
+            </w:r>
+          </w:p>
+        </w:tc>
+        <w:tc>
+          <w:tcPr/>
+          <w:p>
+            <w:pPr>
+              <w:pStyle w:val="Compact"/>
+              <w:jc w:val="right"/>
+            </w:pPr>
+            <w:r>
+              <w:t xml:space="preserve">26.67</w:t>
             </w:r>
           </w:p>
         </w:tc>
@@ -2038,7 +2232,7 @@
         <w:pStyle w:val="FirstParagraph"/>
       </w:pPr>
       <w:r>
-        <w:t xml:space="preserve">A screening organization might prefer a detector that needs no examples of machine text, because those examples go stale as models change. We therefore trained detectors on human papers only and scored how unusual each held-out document looks (Table 4). The result is negative. The pre-specified Mahalanobis detector reaches an AUC of 0.56 on GPT-4o papers and 0.46 on Claude papers using all fourteen features, and the secondary methods do not change the picture: across three methods, three feature families, and two generators, AUCs range from 0.45 to 0.66, and many intervals include 0.5. The best single value (0.66, a One-Class SVM on rates for GPT-4o) is not one we would rely on, and it was not selected in advance.</w:t>
+        <w:t xml:space="preserve">A screening organization might prefer a detector that needs no examples of machine text, because those examples go stale as models change. We therefore trained detectors on human papers only and scored how unusual each held-out document looks (Table 4). The result is negative. The pre-specified Mahalanobis detector reaches an AUC of 0.56 on GPT-4o papers and 0.46 on Claude papers using all fourteen features, and the secondary methods do not change the picture: across three methods, three feature families, and the two generators studied at that stage, AUCs range from 0.45 to 0.66, and many intervals include 0.5. The best single value (0.66, a One-Class SVM on rates for GPT-4o) is not one we would rely on, and it was not selected in advance.</w:t>
       </w:r>
     </w:p>
     <w:p>
@@ -2392,13 +2586,13 @@
       </w:r>
     </w:p>
     <w:bookmarkEnd w:id="36"/>
-    <w:bookmarkStart w:id="37" w:name="a-scale-dependent-clustering-model-rq2"/>
+    <w:bookmarkStart w:id="37" w:name="X0521dbd98438490bc6effe6d1004fde65e11b6f"/>
     <w:p>
       <w:pPr>
         <w:pStyle w:val="Heading2"/>
       </w:pPr>
       <w:r>
-        <w:t xml:space="preserve">4.5 A scale-dependent clustering model (RQ2)</w:t>
+        <w:t xml:space="preserve">4.5 A scale-dependent clustering model: development results (RQ2)</w:t>
       </w:r>
     </w:p>
     <w:p>
@@ -2406,7 +2600,7 @@
         <w:pStyle w:val="FirstParagraph"/>
       </w:pPr>
       <w:r>
-        <w:t xml:space="preserve">Table 5 compares the new feature set with the baseline on the same documents and folds. Differences are computed with a paired bootstrap, which is more informative than comparing separate intervals.</w:t>
+        <w:t xml:space="preserve">Table 5 compares the new feature set with the baseline on the same documents and folds. These GPT-4o and Claude data are the development data for the model, so Table 5 is exploratory; the confirmatory test is in Section 4.6. Differences are computed with a paired bootstrap, which is more informative than comparing separate intervals.</w:t>
       </w:r>
     </w:p>
     <w:p>
@@ -3000,17 +3194,17 @@
         <w:pStyle w:val="BodyText"/>
       </w:pPr>
       <w:r>
-        <w:t xml:space="preserve">The model does not rescue detection from human text alone. A Mahalanobis detector on the new features reaches AUC 0.59 for GPT-4o and 0.49 for Claude, essentially the same as before. The improvement is therefore in how well a supervised detector can use the clustering structure, not in how well human text can define normality by itself.</w:t>
+        <w:t xml:space="preserve">The model does not rescue detection from human text alone on these data. A Mahalanobis detector on the new features reaches AUC 0.59 for GPT-4o and 0.49 for Claude, essentially the same as before. The improvement is therefore in how well a supervised detector can use the clustering structure, not in how well human text can define normality by itself.</w:t>
       </w:r>
     </w:p>
     <w:bookmarkEnd w:id="37"/>
-    <w:bookmarkStart w:id="38" w:name="cost-rq3"/>
+    <w:bookmarkStart w:id="38" w:name="Xf249ecbb1b4e68a085d5da2640522efa39ff232"/>
     <w:p>
       <w:pPr>
         <w:pStyle w:val="Heading2"/>
       </w:pPr>
       <w:r>
-        <w:t xml:space="preserve">4.6 Cost (RQ3)</w:t>
+        <w:t xml:space="preserve">4.6 Confirmatory test on an open-weight generator (RQ2)</w:t>
       </w:r>
     </w:p>
     <w:p>
@@ -3018,12 +3212,264 @@
         <w:pStyle w:val="FirstParagraph"/>
       </w:pPr>
       <w:r>
-        <w:t xml:space="preserve">Computing all events and the baseline indices took about 6 milliseconds per document on one CPU core (roughly 160 documents per second) with no external service calls, so the marginal monetary cost is zero. For context on the generation side, producing one paper through four requests cost about US$0.04 and 38 seconds on average for GPT-4o, and about US$0.13 and 100 seconds for Claude, through the gateway we used. We did not run an LLM-as-a-judge baseline, so we cannot report a measured cost or latency ratio between the two screening methods; any such comparison would depend on the judge model, prompt length, and pricing at the time.</w:t>
+        <w:t xml:space="preserve">Llama papers were not used in developing the clustering model, and the analysis below was specified before they were generated. Table 6 reports the result. Trained on human papers plus GPT-4o and Claude pooled, the baseline features detect Llama papers with an AUC of 0.886 (95% interval 0.86 to 0.91). The new features reach 0.932 (0.91 to 0.95), a difference of +0.046 (0.030 to 0.063). The improvement is also present when training on a single generator, so it does not depend on the pooling choice.</w:t>
+      </w:r>
+    </w:p>
+    <w:p>
+      <w:pPr>
+        <w:pStyle w:val="TableCaption"/>
+      </w:pPr>
+      <w:r>
+        <w:t xml:space="preserve">Table 6. Confirmatory test: detection of Llama 3.3 70B papers by detectors that never saw Llama. Baseline = rates plus the 500-token dispersion index; New = rates plus scale-dependent clustering features.</w:t>
+      </w:r>
+    </w:p>
+    <w:tbl>
+      <w:tblPr>
+        <w:tblStyle w:val="Table"/>
+        <w:tblW w:type="pct" w:w="5000"/>
+        <w:tblLook w:firstRow="1" w:lastRow="0" w:firstColumn="0" w:lastColumn="0" w:noHBand="0" w:noVBand="0" w:val="0020"/>
+        <w:jc w:val="start"/>
+        <w:tblCaption w:val="Table 6. Confirmatory test: detection of Llama 3.3 70B papers by detectors that never saw Llama. Baseline = rates plus the 500-token dispersion index; New = rates plus scale-dependent clustering features."/>
+      </w:tblPr>
+      <w:tblGrid>
+        <w:gridCol w:w="1980"/>
+        <w:gridCol w:w="1980"/>
+        <w:gridCol w:w="1980"/>
+        <w:gridCol w:w="1980"/>
+      </w:tblGrid>
+      <w:tr>
+        <w:trPr>
+          <w:tblHeader w:val="true"/>
+        </w:trPr>
+        <w:tc>
+          <w:tcPr/>
+          <w:p>
+            <w:pPr>
+              <w:pStyle w:val="Compact"/>
+              <w:jc w:val="left"/>
+            </w:pPr>
+            <w:r>
+              <w:t xml:space="preserve">Trained on (plus human papers)</w:t>
+            </w:r>
+          </w:p>
+        </w:tc>
+        <w:tc>
+          <w:tcPr/>
+          <w:p>
+            <w:pPr>
+              <w:pStyle w:val="Compact"/>
+              <w:jc w:val="left"/>
+            </w:pPr>
+            <w:r>
+              <w:t xml:space="preserve">Baseline AUC</w:t>
+            </w:r>
+          </w:p>
+        </w:tc>
+        <w:tc>
+          <w:tcPr/>
+          <w:p>
+            <w:pPr>
+              <w:pStyle w:val="Compact"/>
+              <w:jc w:val="left"/>
+            </w:pPr>
+            <w:r>
+              <w:t xml:space="preserve">New AUC</w:t>
+            </w:r>
+          </w:p>
+        </w:tc>
+        <w:tc>
+          <w:tcPr/>
+          <w:p>
+            <w:pPr>
+              <w:pStyle w:val="Compact"/>
+              <w:jc w:val="left"/>
+            </w:pPr>
+            <w:r>
+              <w:t xml:space="preserve">Difference [95% CI]</w:t>
+            </w:r>
+          </w:p>
+        </w:tc>
+      </w:tr>
+      <w:tr>
+        <w:tc>
+          <w:tcPr/>
+          <w:p>
+            <w:pPr>
+              <w:pStyle w:val="Compact"/>
+              <w:jc w:val="left"/>
+            </w:pPr>
+            <w:r>
+              <w:t xml:space="preserve">GPT-4o and Claude (primary)</w:t>
+            </w:r>
+          </w:p>
+        </w:tc>
+        <w:tc>
+          <w:tcPr/>
+          <w:p>
+            <w:pPr>
+              <w:pStyle w:val="Compact"/>
+              <w:jc w:val="left"/>
+            </w:pPr>
+            <w:r>
+              <w:t xml:space="preserve">0.886 [0.86, 0.91]</w:t>
+            </w:r>
+          </w:p>
+        </w:tc>
+        <w:tc>
+          <w:tcPr/>
+          <w:p>
+            <w:pPr>
+              <w:pStyle w:val="Compact"/>
+              <w:jc w:val="left"/>
+            </w:pPr>
+            <w:r>
+              <w:t xml:space="preserve">0.932 [0.91, 0.95]</w:t>
+            </w:r>
+          </w:p>
+        </w:tc>
+        <w:tc>
+          <w:tcPr/>
+          <w:p>
+            <w:pPr>
+              <w:pStyle w:val="Compact"/>
+              <w:jc w:val="left"/>
+            </w:pPr>
+            <w:r>
+              <w:t xml:space="preserve">+0.046 [+0.030, +0.063]</w:t>
+            </w:r>
+          </w:p>
+        </w:tc>
+      </w:tr>
+      <w:tr>
+        <w:tc>
+          <w:tcPr/>
+          <w:p>
+            <w:pPr>
+              <w:pStyle w:val="Compact"/>
+              <w:jc w:val="left"/>
+            </w:pPr>
+            <w:r>
+              <w:t xml:space="preserve">GPT-4o only</w:t>
+            </w:r>
+          </w:p>
+        </w:tc>
+        <w:tc>
+          <w:tcPr/>
+          <w:p>
+            <w:pPr>
+              <w:pStyle w:val="Compact"/>
+              <w:jc w:val="left"/>
+            </w:pPr>
+            <w:r>
+              <w:t xml:space="preserve">0.913 [0.89, 0.93]</w:t>
+            </w:r>
+          </w:p>
+        </w:tc>
+        <w:tc>
+          <w:tcPr/>
+          <w:p>
+            <w:pPr>
+              <w:pStyle w:val="Compact"/>
+              <w:jc w:val="left"/>
+            </w:pPr>
+            <w:r>
+              <w:t xml:space="preserve">0.953 [0.94, 0.97]</w:t>
+            </w:r>
+          </w:p>
+        </w:tc>
+        <w:tc>
+          <w:tcPr/>
+          <w:p>
+            <w:pPr>
+              <w:pStyle w:val="Compact"/>
+              <w:jc w:val="left"/>
+            </w:pPr>
+            <w:r>
+              <w:t xml:space="preserve">+0.041 [+0.027, +0.054]</w:t>
+            </w:r>
+          </w:p>
+        </w:tc>
+      </w:tr>
+      <w:tr>
+        <w:tc>
+          <w:tcPr/>
+          <w:p>
+            <w:pPr>
+              <w:pStyle w:val="Compact"/>
+              <w:jc w:val="left"/>
+            </w:pPr>
+            <w:r>
+              <w:t xml:space="preserve">Claude only</w:t>
+            </w:r>
+          </w:p>
+        </w:tc>
+        <w:tc>
+          <w:tcPr/>
+          <w:p>
+            <w:pPr>
+              <w:pStyle w:val="Compact"/>
+              <w:jc w:val="left"/>
+            </w:pPr>
+            <w:r>
+              <w:t xml:space="preserve">0.737 [0.70, 0.77]</w:t>
+            </w:r>
+          </w:p>
+        </w:tc>
+        <w:tc>
+          <w:tcPr/>
+          <w:p>
+            <w:pPr>
+              <w:pStyle w:val="Compact"/>
+              <w:jc w:val="left"/>
+            </w:pPr>
+            <w:r>
+              <w:t xml:space="preserve">0.796 [0.76, 0.83]</w:t>
+            </w:r>
+          </w:p>
+        </w:tc>
+        <w:tc>
+          <w:tcPr/>
+          <w:p>
+            <w:pPr>
+              <w:pStyle w:val="Compact"/>
+              <w:jc w:val="left"/>
+            </w:pPr>
+            <w:r>
+              <w:t xml:space="preserve">+0.058 [+0.034, +0.084]</w:t>
+            </w:r>
+          </w:p>
+        </w:tc>
+      </w:tr>
+    </w:tbl>
+    <w:p>
+      <w:pPr>
+        <w:pStyle w:val="BodyText"/>
+      </w:pPr>
+      <w:r>
+        <w:t xml:space="preserve">Three further results are exploratory and were not specified in advance. First, Llama is easy to detect within its own class: with human and Llama papers, the baseline reaches 0.962 and the new features 0.984, and with clustering features alone (no rates) the new model reaches 0.914 against 0.764 for the baseline dispersion index. Second, a detector trained on Llama transfers well to GPT-4o (baseline 0.938, new 0.969) but poorly to Claude (0.745 and 0.763), which reinforces the picture that Claude papers are the hardest of the three to detect from other generators. Third, a human-only Mahalanobis detector on the new features reaches 0.65 (0.60 to 0.69) on Llama, against 0.51 for the baseline, the first human-only result in our data clearly above chance. Even so, 0.65 is not a level we would deploy.</w:t>
       </w:r>
     </w:p>
     <w:bookmarkEnd w:id="38"/>
+    <w:bookmarkStart w:id="39" w:name="cost-rq3"/>
+    <w:p>
+      <w:pPr>
+        <w:pStyle w:val="Heading2"/>
+      </w:pPr>
+      <w:r>
+        <w:t xml:space="preserve">4.7 Cost (RQ3)</w:t>
+      </w:r>
+    </w:p>
+    <w:p>
+      <w:pPr>
+        <w:pStyle w:val="FirstParagraph"/>
+      </w:pPr>
+      <w:r>
+        <w:t xml:space="preserve">Computing all events and the baseline indices took 4 to 6 milliseconds per document on one CPU core (roughly 160 to 230 documents per second, depending on machine load) with no external service calls, so the marginal monetary cost is zero. For context on the generation side, producing one paper through four requests cost about US$0.04 for GPT-4o, about US$0.13 for Claude, and about US$0.002 for Llama 3.3 70B, through the gateway we used (average generation time was 38 seconds for GPT-4o and roughly 100 seconds for Claude; Llama times are not comparable because we ran several requests in parallel). We did not run an LLM-as-a-judge baseline, so we cannot report a measured cost or latency ratio between the two screening methods; any such comparison would depend on the judge model, prompt length, and pricing at the time.</w:t>
+      </w:r>
+    </w:p>
     <w:bookmarkEnd w:id="39"/>
-    <w:bookmarkStart w:id="40" w:name="discussion"/>
+    <w:bookmarkEnd w:id="40"/>
+    <w:bookmarkStart w:id="41" w:name="discussion"/>
     <w:p>
       <w:pPr>
         <w:pStyle w:val="Heading1"/>
@@ -3071,7 +3517,7 @@
         <w:pStyle w:val="BodyText"/>
       </w:pPr>
       <w:r>
-        <w:t xml:space="preserve">A model that describes clustering across scales improves matters somewhat. The gains are modest, a few hundredths of AUC, but they appear in nearly every comparison and survive transfer to an unseen generator, which supports the view that how events cluster is a more informative description of machine text than a single Poisson test. The result is less discouraging for the count-process idea than for the rate-based version. Dispersion generalizes better than rates, and the direction of several dispersion differences agrees across two generators. If a general machine-text signature exists in these features, it is more likely to be found in how events cluster than in how often they occur. We see this as a hypothesis for larger studies with more generators, including open-weight models, rather than an established finding. We also tested the obvious way around generator-specific calibration, a screen that models human text alone and flags departures from it. It did not work in this setting (Section 4.4). Avoiding dependence on generator examples therefore comes at a large price in accuracy, at least with these features and these simple models.</w:t>
+        <w:t xml:space="preserve">A model that describes clustering across scales improves matters somewhat. The gains are modest, a few hundredths of AUC, but they appear in nearly every comparison, and they held in a test fixed in advance on an unseen open-weight generator (+0.046), which supports the view that how events cluster is a more informative description of machine text than a single Poisson test. The result is less discouraging for the count-process idea than for the rate-based version. Dispersion generalizes better than rates, and the direction of several dispersion differences agrees across the generators. If a general machine-text signature exists in these features, it is more likely to be found in how events cluster than in how often they occur. We see this as a hypothesis for larger studies with more generators, including open-weight models, rather than an established finding. We also tested the obvious way around generator-specific calibration, a screen that models human text alone and flags departures from it. It did not work in this setting (Section 4.4). Avoiding dependence on generator examples therefore comes at a large price in accuracy, at least with these features and these simple models.</w:t>
       </w:r>
     </w:p>
     <w:p>
@@ -3100,8 +3546,8 @@
         <w:t xml:space="preserve">can be explained to an author or editor, and it costs nothing to compute. It should therefore be treated as a low-cost first filter whose output is routed to human review, not as grounds for action on its own.</w:t>
       </w:r>
     </w:p>
-    <w:bookmarkEnd w:id="40"/>
-    <w:bookmarkStart w:id="41" w:name="limitations"/>
+    <w:bookmarkEnd w:id="41"/>
+    <w:bookmarkStart w:id="42" w:name="limitations"/>
     <w:p>
       <w:pPr>
         <w:pStyle w:val="Heading1"/>
@@ -3131,13 +3577,13 @@
           <w:bCs/>
           <w:b/>
         </w:rPr>
-        <w:t xml:space="preserve">Two generators, both commercial.</w:t>
-      </w:r>
-      <w:r>
-        <w:t xml:space="preserve"> </w:t>
-      </w:r>
-      <w:r>
-        <w:t xml:space="preserve">The findings come from GPT-4o and Claude Sonnet 5.5. The large cross-generator drop is itself a warning that results for other models, including open-weight ones and future releases, may differ.</w:t>
+        <w:t xml:space="preserve">Three generators.</w:t>
+      </w:r>
+      <w:r>
+        <w:t xml:space="preserve"> </w:t>
+      </w:r>
+      <w:r>
+        <w:t xml:space="preserve">The findings come from GPT-4o, Claude Sonnet 5.5, and Llama 3.3 70B. The large cross-generator drop between GPT-4o and Claude is itself a warning that results for other models and future releases may differ, and the confirmatory test used a single held-out generator.</w:t>
       </w:r>
     </w:p>
     <w:p>
@@ -3159,7 +3605,7 @@
         <w:t xml:space="preserve"> </w:t>
       </w:r>
       <w:r>
-        <w:t xml:space="preserve">The Claude sample (152) is smaller than the GPT-4o sample (245) because we capped generation to limit cost. Bootstrap intervals for cross-generator AUCs are about ±0.05.</w:t>
+        <w:t xml:space="preserve">The Claude sample (152) is smaller than the GPT-4o (245) and Llama (202) samples because we capped generation to limit cost. Bootstrap intervals for cross-generator AUCs are about ±0.05.</w:t>
       </w:r>
     </w:p>
     <w:p>
@@ -3357,7 +3803,7 @@
         <w:t xml:space="preserve"> </w:t>
       </w:r>
       <w:r>
-        <w:t xml:space="preserve">The clustering model was designed after we had seen the baseline results, and we compared it with the baseline on the same data. We fixed the comparison in advance and did not tune its settings, but we ran eight paired comparisons without correction for multiple testing, and several intervals touch zero at their edges while one includes it. The estimates rely on moment matching with four scales and are noisy for rare events. A confirmatory test on new generators and new documents is needed.</w:t>
+        <w:t xml:space="preserve">The clustering model was designed after we had seen the baseline results on GPT-4o and Claude, and the development comparisons (Table 5) involve eight paired comparisons without correction for multiple testing. The Llama test (Table 6) was specified in advance and is the stronger evidence, but it is one test on one generator and one genre, drawn from the same human papers as the development data. The estimates rely on moment matching with four scales and are noisy for rare events.</w:t>
       </w:r>
     </w:p>
     <w:p>
@@ -3382,8 +3828,8 @@
         <w:t xml:space="preserve">We did not compare against LLM-as-a-judge, MAUVE, or BERTScore, and we did not test whether explainable evidence improves human decisions. Claims about relative advantage over those methods are therefore not supported by this study.</w:t>
       </w:r>
     </w:p>
-    <w:bookmarkEnd w:id="41"/>
-    <w:bookmarkStart w:id="42" w:name="planned-extensions"/>
+    <w:bookmarkEnd w:id="42"/>
+    <w:bookmarkStart w:id="43" w:name="planned-extensions"/>
     <w:p>
       <w:pPr>
         <w:pStyle w:val="Heading1"/>
@@ -3397,11 +3843,11 @@
         <w:pStyle w:val="FirstParagraph"/>
       </w:pPr>
       <w:r>
-        <w:t xml:space="preserve">Five steps would turn this pilot into a test of the full proposal. (i) Add further generators, especially open-weight models, and evaluate each as held out, together with a negative binomial reference in place of the Poisson benchmark. (ii) Run MAUVE, BERTScore, and an LLM-as-a-judge baseline on identical documents, recording latency and cost. (iii) Test robustness to paraphrasing and light human editing, and test the clustering model on new generators and documents as a confirmatory study, ideally with full likelihood estimation (for example, a log-Gaussian Cox process) in place of moment matching. (iv) Conduct a randomized experiment in which domain experts classify real and fabricated papers under three conditions (no indicator, an unexplained AI score, and an explainable event-based indicator), analyzed with ANOVA and planned contrasts after an a priori power analysis. Pre-registering the feature list, windows, and analysis plan would guard against analytic flexibility.</w:t>
-      </w:r>
-    </w:p>
-    <w:bookmarkEnd w:id="42"/>
-    <w:bookmarkStart w:id="43" w:name="conclusion"/>
+        <w:t xml:space="preserve">Five steps would turn this pilot into a test of the full proposal. (i) Add further generators, including more open-weight models and future releases, and evaluate each as held out, together with a negative binomial reference in place of the Poisson benchmark. (ii) Run MAUVE, BERTScore, and an LLM-as-a-judge baseline on identical documents, recording latency and cost. (iii) Test robustness to paraphrasing and light human editing, and replicate the clustering model on new documents and generators, ideally with full likelihood estimation (for example, a log-Gaussian Cox process) in place of moment matching. (iv) Conduct a randomized experiment in which domain experts classify real and fabricated papers under three conditions (no indicator, an unexplained AI score, and an explainable event-based indicator), analyzed with ANOVA and planned contrasts after an a priori power analysis. Pre-registering the feature list, windows, and analysis plan would guard against analytic flexibility.</w:t>
+      </w:r>
+    </w:p>
+    <w:bookmarkEnd w:id="43"/>
+    <w:bookmarkStart w:id="44" w:name="conclusion"/>
     <w:p>
       <w:pPr>
         <w:pStyle w:val="Heading1"/>
@@ -3415,11 +3861,11 @@
         <w:pStyle w:val="FirstParagraph"/>
       </w:pPr>
       <w:r>
-        <w:t xml:space="preserve">Counting small linguistic events is a cheap and transparent way to screen scholarly text, but the simplest version of the idea, measuring distance from a Poisson process, does not work, because human text is not Poisson. A richer set of count-based features detects machine-generated papers well within a generator, but accuracy falls to between 0.73 and 0.81 on an unseen generator. Dispersion transfers better than event rates, and that is the clearest sign in our data that the count-process view captures something general. Detectors built on human text alone, which would avoid the need for generator examples, performed near chance. A model of clustering across scales improved detection modestly and consistently, including on an unseen generator. The evidence is limited to two generators and one genre, and whether the approach helps human reviewers or outperforms black-box metrics remains untested.</w:t>
-      </w:r>
-    </w:p>
-    <w:bookmarkEnd w:id="43"/>
-    <w:bookmarkStart w:id="44" w:name="references"/>
+        <w:t xml:space="preserve">Counting small linguistic events is a cheap and transparent way to screen scholarly text, but the simplest version of the idea, measuring distance from a Poisson process, does not work, because human text is not Poisson. A richer set of count-based features detects machine-generated papers well within a generator, but accuracy falls to between 0.73 and 0.81 on an unseen generator. Dispersion transfers better than event rates, and that is the clearest sign in our data that the count-process view captures something general. Detectors built on human text alone, which would avoid the need for generator examples, performed near chance. A model of clustering across scales improved detection modestly and consistently, and the improvement held in a test fixed in advance on an unseen open-weight generator (AUC 0.89 to 0.93). The evidence is limited to three generators and one genre, and whether the approach helps human reviewers or outperforms black-box metrics remains untested.</w:t>
+      </w:r>
+    </w:p>
+    <w:bookmarkEnd w:id="44"/>
+    <w:bookmarkStart w:id="45" w:name="references"/>
     <w:p>
       <w:pPr>
         <w:pStyle w:val="Heading1"/>
@@ -3701,7 +4147,7 @@
         <w:t xml:space="preserve">(36).</w:t>
       </w:r>
     </w:p>
-    <w:bookmarkEnd w:id="44"/>
+    <w:bookmarkEnd w:id="45"/>
     <w:sectPr/>
   </w:body>
 </w:document>

</xml_diff>

<commit_message>
Add blind LLM-as-a-judge comparison to study and paper
Co-Authored-By: Claude Sonnet 5.5 <noreply@anthropic.com>
Claude-Session: https://claude.ai/code/session_01FLb7uVf7YBgdoa75gbZ2sf
</commit_message>
<xml_diff>
--- a/paper/Poisson_LLM_Pilot_Paper_MISQ.docx
+++ b/paper/Poisson_LLM_Pilot_Paper_MISQ.docx
@@ -176,7 +176,7 @@
         <w:pStyle w:val="FirstParagraph"/>
       </w:pPr>
       <w:r>
-        <w:t xml:space="preserve">Organizations that publish or archive scholarly documents now face a screening problem: language models can produce papers faster and more cheaply than anyone can check them. Two common remedies, LLM-as-a-judge and embedding-based similarity metrics, are either expensive and prompt-dependent or insensitive to fine-grained statistical structure. We study a lightweight alternative that treats the occurrence of selected linguistic events (special punctuation, discourse markers, passive constructions, nominalizations) as count processes and asks how far a document departs from human-authored text. Using 474 human-written papers from PubMed Central and arXiv (2015–2019) and matched papers from three generators (GPT-4o, 245 papers; Claude Sonnet 5.5, 152; Llama 3.3 70B, 202), we report six findings. First, human text is not Poisson: for punctuation events, 36–49% of documents reject the Poisson null because of over-dispersion. Second, a single Poisson-distance index performs near chance (AUC 0.51–0.54). Third, a vector of event rates and dispersion indices separates human from machine text well when the detector is trained and tested on the same generator (AUC 0.91–0.99), but not across generators: a detector trained on GPT-4o reaches 0.73 on Claude. Fourth, dispersion transfers better than event rates, which differ in sign across generators. Fifth, detectors trained on human papers alone perform near chance to modestly above it. Sixth, we propose a scale-dependent clustering model, a doubly stochastic (Cox) Poisson process summarized by how the Fano factor changes with window size. In a test specified before the Llama data were collected, it raised AUC on the unseen Llama papers from 0.89 to 0.93 (difference +0.046, 95% interval 0.030 to 0.063). Screening costs nothing per document and runs at roughly 160 to 230 documents per second on one CPU core. The evidence is limited to three generators and one genre, and we do not test adversarial editing, comparison with black-box metrics, or the effect on human reviewers.</w:t>
+        <w:t xml:space="preserve">Organizations that publish or archive scholarly documents now face a screening problem: language models can produce papers faster and more cheaply than anyone can check them. Two common remedies, LLM-as-a-judge and embedding-based similarity metrics, are either expensive and prompt-dependent or insensitive to fine-grained statistical structure. We study a lightweight alternative that treats the occurrence of selected linguistic events (special punctuation, discourse markers, passive constructions, nominalizations) as count processes and asks how far a document departs from human-authored text. Using 474 human-written papers from PubMed Central and arXiv (2015–2019) and matched papers from three generators (GPT-4o, 245 papers; Claude Sonnet 5.5, 152; Llama 3.3 70B, 202), we report seven findings. First, human text is not Poisson: for punctuation events, 36–49% of documents reject the Poisson null because of over-dispersion. Second, a single Poisson-distance index performs near chance (AUC 0.51–0.54). Third, a vector of event rates and dispersion indices separates human from machine text well when the detector is trained and tested on the same generator (AUC 0.91–0.99), but not across generators: a detector trained on GPT-4o reaches 0.73 on Claude. Fourth, dispersion transfers better than event rates, which differ in sign across generators. Fifth, detectors trained on human papers alone perform near chance to modestly above it. Sixth, we propose a scale-dependent clustering model, a doubly stochastic (Cox) Poisson process summarized by how the Fano factor changes with window size. In a test specified before the Llama data were collected, it raised AUC on the unseen Llama papers from 0.89 to 0.93 (difference +0.046, 95% interval 0.030 to 0.063). Seventh, in a blind comparison on 500 excerpts, a zero-shot GPT-4o judge reached AUCs of 0.76, 0.45, and 0.85 against GPT-4o, Claude, and Llama papers, and Poisson-based detectors trained on the other generators did better (0.95, 0.77, and 0.93), although they need labeled examples and the judge does not. The judge cost about US$0.007 and 1.7 seconds per document; the Poisson features cost nothing and run at roughly 160 to 230 documents per second on one CPU core. The evidence is limited to three generators, one genre, and one LLM judge, and we do not test adversarial editing, embedding-based metrics, or the effect on human reviewers.</w:t>
       </w:r>
     </w:p>
     <w:p>
@@ -426,7 +426,7 @@
       </w:r>
     </w:p>
     <w:bookmarkEnd w:id="22"/>
-    <w:bookmarkStart w:id="29" w:name="data-and-measures"/>
+    <w:bookmarkStart w:id="30" w:name="data-and-measures"/>
     <w:p>
       <w:pPr>
         <w:pStyle w:val="Heading1"/>
@@ -698,8 +698,50 @@
       </w:r>
     </w:p>
     <w:bookmarkEnd w:id="28"/>
+    <w:bookmarkStart w:id="29" w:name="llm-as-a-judge-baseline"/>
+    <w:p>
+      <w:pPr>
+        <w:pStyle w:val="Heading2"/>
+      </w:pPr>
+      <w:r>
+        <w:t xml:space="preserve">3.7 LLM-as-a-judge baseline</w:t>
+      </w:r>
+    </w:p>
+    <w:p>
+      <w:pPr>
+        <w:pStyle w:val="FirstParagraph"/>
+      </w:pPr>
+      <w:r>
+        <w:t xml:space="preserve">To compare with the black-box approach, we asked GPT-4o, zero-shot and at temperature 0, to estimate for each excerpt the probability (0 to 100) that it was written by an AI language model. We used one fixed prompt for all documents. The judge saw a random sample of 500 excerpts (200 human papers, 120 from medicine and 80 from computer science, and 100 papers from each generator), presented in random order with opaque identifiers and no labels. Each excerpt was the same first 2,000 tokens used for the Poisson features. To prevent trivial cues, we removed markdown symbols and bare section titles from every excerpt, whatever its source.</w:t>
+      </w:r>
+    </w:p>
+    <w:p>
+      <w:pPr>
+        <w:pStyle w:val="BodyText"/>
+      </w:pPr>
+      <w:r>
+        <w:t xml:space="preserve">For each generator, the judge’s score is compared with two Poisson-based detectors evaluated on the same documents: the baseline features and the new clustering features, each trained on human papers plus the</w:t>
+      </w:r>
+      <w:r>
+        <w:t xml:space="preserve"> </w:t>
+      </w:r>
+      <w:r>
+        <w:rPr>
+          <w:iCs/>
+          <w:i/>
+        </w:rPr>
+        <w:t xml:space="preserve">other two</w:t>
+      </w:r>
+      <w:r>
+        <w:t xml:space="preserve"> </w:t>
+      </w:r>
+      <w:r>
+        <w:t xml:space="preserve">generators and never on the generator being tested, which makes them comparable to a judge that has not seen that generator. These comparisons, the sample, and the analysis scripts were fixed before the judge was run. Differences are tested with a paired bootstrap. We also report results for medicine papers alone, because their text comes from clean XML, whereas the arXiv text comes from PDF conversion and could carry extraction artifacts that a judge might pick up. One caution applies from the start: GPT-4o is also one of the generators, so its judgments of GPT-4o papers involve self-recognition, and a second judge that is not a generator has not yet been run.</w:t>
+      </w:r>
+    </w:p>
     <w:bookmarkEnd w:id="29"/>
-    <w:bookmarkStart w:id="40" w:name="results"/>
+    <w:bookmarkEnd w:id="30"/>
+    <w:bookmarkStart w:id="42" w:name="results"/>
     <w:p>
       <w:pPr>
         <w:pStyle w:val="Heading1"/>
@@ -708,7 +750,7 @@
         <w:t xml:space="preserve">4. Results</w:t>
       </w:r>
     </w:p>
-    <w:bookmarkStart w:id="33" w:name="human-text-is-not-poisson-rq1"/>
+    <w:bookmarkStart w:id="34" w:name="human-text-is-not-poisson-rq1"/>
     <w:p>
       <w:pPr>
         <w:pStyle w:val="Heading2"/>
@@ -1280,18 +1322,18 @@
           <wp:inline>
             <wp:extent cx="5334000" cy="2489200"/>
             <wp:effectExtent b="0" l="0" r="0" t="0"/>
-            <wp:docPr descr="Figure 1. Distribution of log2 dispersion indices by event for human-authored and GPT-4o papers. Dashed line: Poisson (index of 1). Square brackets for GPT-4o are degenerate because most synthetic papers contain none (index set to one by convention)." title="" id="31" name="Picture"/>
+            <wp:docPr descr="Figure 1. Distribution of log2 dispersion indices by event for human-authored and GPT-4o papers. Dashed line: Poisson (index of 1). Square brackets for GPT-4o are degenerate because most synthetic papers contain none (index set to one by convention)." title="" id="32" name="Picture"/>
             <a:graphic>
               <a:graphicData uri="http://schemas.openxmlformats.org/drawingml/2006/picture">
                 <pic:pic>
                   <pic:nvPicPr>
-                    <pic:cNvPr descr="fig_dispersion.png" id="32" name="Picture"/>
+                    <pic:cNvPr descr="fig_dispersion.png" id="33" name="Picture"/>
                     <pic:cNvPicPr>
                       <a:picLocks noChangeArrowheads="1" noChangeAspect="1"/>
                     </pic:cNvPicPr>
                   </pic:nvPicPr>
                   <pic:blipFill>
-                    <a:blip r:embed="rId30"/>
+                    <a:blip r:embed="rId31"/>
                     <a:stretch>
                       <a:fillRect/>
                     </a:stretch>
@@ -1334,8 +1376,8 @@
         <w:t xml:space="preserve">One caution applies to the passive result. Because we generated each paper section by section, and the four retained windows roughly track those sections, elevated passive dispersion may partly reflect a procedural artifact (passive voice is concentrated in methods text) rather than a general property of the models. We could not separate the two with the present data.</w:t>
       </w:r>
     </w:p>
-    <w:bookmarkEnd w:id="33"/>
-    <w:bookmarkStart w:id="34" w:name="detection-within-a-generator-rq2"/>
+    <w:bookmarkEnd w:id="34"/>
+    <w:bookmarkStart w:id="35" w:name="detection-within-a-generator-rq2"/>
     <w:p>
       <w:pPr>
         <w:pStyle w:val="Heading2"/>
@@ -1915,8 +1957,8 @@
         </w:tc>
       </w:tr>
     </w:tbl>
-    <w:bookmarkEnd w:id="34"/>
-    <w:bookmarkStart w:id="35" w:name="detection-across-generators-rq2"/>
+    <w:bookmarkEnd w:id="35"/>
+    <w:bookmarkStart w:id="36" w:name="detection-across-generators-rq2"/>
     <w:p>
       <w:pPr>
         <w:pStyle w:val="Heading2"/>
@@ -2217,8 +2259,8 @@
         <w:t xml:space="preserve">Two patterns stand out. First, the gap between within-generator and cross-generator AUC is large for every feature family, so a detector calibrated on one generator should not be assumed to protect against another. Second, rates transfer worst (0.66 and 0.73), and dispersion transfers better (0.70 and 0.81), matching or exceeding the combined model in the Claude-to-GPT-4o direction. This is consistent with the sign pattern in Table 2: rate differences reverse across generators, while dispersion differences for passives, quotation marks, and nominalizations point the same way (Table 1). Dispersion is the more portable signal, though even it is far from sufficient on its own.</w:t>
       </w:r>
     </w:p>
-    <w:bookmarkEnd w:id="35"/>
-    <w:bookmarkStart w:id="36" w:name="detection-from-human-text-alone-rq2"/>
+    <w:bookmarkEnd w:id="36"/>
+    <w:bookmarkStart w:id="37" w:name="detection-from-human-text-alone-rq2"/>
     <w:p>
       <w:pPr>
         <w:pStyle w:val="Heading2"/>
@@ -2585,8 +2627,8 @@
         <w:t xml:space="preserve">in which a generator differs from human writers. Human papers already vary widely among themselves in these features, across fields, sections, and authors, so machine text is rarely far from the human cloud in an absolute sense; it is displaced from the center in particular directions. A distance from the human distribution does not capture that displacement.</w:t>
       </w:r>
     </w:p>
-    <w:bookmarkEnd w:id="36"/>
-    <w:bookmarkStart w:id="37" w:name="X0521dbd98438490bc6effe6d1004fde65e11b6f"/>
+    <w:bookmarkEnd w:id="37"/>
+    <w:bookmarkStart w:id="38" w:name="X0521dbd98438490bc6effe6d1004fde65e11b6f"/>
     <w:p>
       <w:pPr>
         <w:pStyle w:val="Heading2"/>
@@ -3197,8 +3239,8 @@
         <w:t xml:space="preserve">The model does not rescue detection from human text alone on these data. A Mahalanobis detector on the new features reaches AUC 0.59 for GPT-4o and 0.49 for Claude, essentially the same as before. The improvement is therefore in how well a supervised detector can use the clustering structure, not in how well human text can define normality by itself.</w:t>
       </w:r>
     </w:p>
-    <w:bookmarkEnd w:id="37"/>
-    <w:bookmarkStart w:id="38" w:name="Xf249ecbb1b4e68a085d5da2640522efa39ff232"/>
+    <w:bookmarkEnd w:id="38"/>
+    <w:bookmarkStart w:id="39" w:name="Xf249ecbb1b4e68a085d5da2640522efa39ff232"/>
     <w:p>
       <w:pPr>
         <w:pStyle w:val="Heading2"/>
@@ -3449,14 +3491,14 @@
         <w:t xml:space="preserve">Three further results are exploratory and were not specified in advance. First, Llama is easy to detect within its own class: with human and Llama papers, the baseline reaches 0.962 and the new features 0.984, and with clustering features alone (no rates) the new model reaches 0.914 against 0.764 for the baseline dispersion index. Second, a detector trained on Llama transfers well to GPT-4o (baseline 0.938, new 0.969) but poorly to Claude (0.745 and 0.763), which reinforces the picture that Claude papers are the hardest of the three to detect from other generators. Third, a human-only Mahalanobis detector on the new features reaches 0.65 (0.60 to 0.69) on Llama, against 0.51 for the baseline, the first human-only result in our data clearly above chance. Even so, 0.65 is not a level we would deploy.</w:t>
       </w:r>
     </w:p>
-    <w:bookmarkEnd w:id="38"/>
-    <w:bookmarkStart w:id="39" w:name="cost-rq3"/>
+    <w:bookmarkEnd w:id="39"/>
+    <w:bookmarkStart w:id="40" w:name="comparison-with-an-llm-judge-rq2-rq3"/>
     <w:p>
       <w:pPr>
         <w:pStyle w:val="Heading2"/>
       </w:pPr>
       <w:r>
-        <w:t xml:space="preserve">4.7 Cost (RQ3)</w:t>
+        <w:t xml:space="preserve">4.7 Comparison with an LLM judge (RQ2, RQ3)</w:t>
       </w:r>
     </w:p>
     <w:p>
@@ -3464,12 +3506,290 @@
         <w:pStyle w:val="FirstParagraph"/>
       </w:pPr>
       <w:r>
-        <w:t xml:space="preserve">Computing all events and the baseline indices took 4 to 6 milliseconds per document on one CPU core (roughly 160 to 230 documents per second, depending on machine load) with no external service calls, so the marginal monetary cost is zero. For context on the generation side, producing one paper through four requests cost about US$0.04 for GPT-4o, about US$0.13 for Claude, and about US$0.002 for Llama 3.3 70B, through the gateway we used (average generation time was 38 seconds for GPT-4o and roughly 100 seconds for Claude; Llama times are not comparable because we ran several requests in parallel). We did not run an LLM-as-a-judge baseline, so we cannot report a measured cost or latency ratio between the two screening methods; any such comparison would depend on the judge model, prompt length, and pricing at the time.</w:t>
-      </w:r>
-    </w:p>
-    <w:bookmarkEnd w:id="39"/>
+        <w:t xml:space="preserve">Table 7 gives the AUC of each method for separating human papers from each generator’s papers on the 500 judged excerpts. The zero-shot GPT-4o judge performs modestly on GPT-4o papers (AUC 0.76) and Llama papers (0.85), and worse than chance on Claude papers (0.45; 0.37 within medicine). At a threshold of 50, the judge flags 24% of human papers as AI-generated, against 59% of GPT-4o papers, 85% of Llama papers, and only 11% of Claude papers. In other words, this judge regards Claude’s papers as more human than the human papers themselves.</w:t>
+      </w:r>
+    </w:p>
+    <w:p>
+      <w:pPr>
+        <w:pStyle w:val="TableCaption"/>
+      </w:pPr>
+      <w:r>
+        <w:t xml:space="preserve">Table 7. AUC (95% bootstrap interval) on the same 500 documents.</w:t>
+      </w:r>
+      <w:r>
+        <w:t xml:space="preserve"> </w:t>
+      </w:r>
+      <w:r>
+        <w:t xml:space="preserve">“</w:t>
+      </w:r>
+      <w:r>
+        <w:t xml:space="preserve">Unseen</w:t>
+      </w:r>
+      <w:r>
+        <w:t xml:space="preserve">”</w:t>
+      </w:r>
+      <w:r>
+        <w:t xml:space="preserve"> </w:t>
+      </w:r>
+      <w:r>
+        <w:t xml:space="preserve">means trained on human papers plus the other two generators, never on the target. Sample sizes are human / synthetic documents.</w:t>
+      </w:r>
+    </w:p>
+    <w:tbl>
+      <w:tblPr>
+        <w:tblStyle w:val="Table"/>
+        <w:tblW w:type="pct" w:w="5000"/>
+        <w:tblLook w:firstRow="1" w:lastRow="0" w:firstColumn="0" w:lastColumn="0" w:noHBand="0" w:noVBand="0" w:val="0020"/>
+        <w:jc w:val="start"/>
+        <w:tblCaption w:val="Table 7. AUC (95% bootstrap interval) on the same 500 documents. “Unseen” means trained on human papers plus the other two generators, never on the target. Sample sizes are human / synthetic documents."/>
+      </w:tblPr>
+      <w:tblGrid>
+        <w:gridCol w:w="1980"/>
+        <w:gridCol w:w="1980"/>
+        <w:gridCol w:w="1980"/>
+        <w:gridCol w:w="1980"/>
+      </w:tblGrid>
+      <w:tr>
+        <w:trPr>
+          <w:tblHeader w:val="true"/>
+        </w:trPr>
+        <w:tc>
+          <w:tcPr/>
+          <w:p>
+            <w:pPr>
+              <w:pStyle w:val="Compact"/>
+              <w:jc w:val="left"/>
+            </w:pPr>
+            <w:r>
+              <w:t xml:space="preserve">Target generator</w:t>
+            </w:r>
+          </w:p>
+        </w:tc>
+        <w:tc>
+          <w:tcPr/>
+          <w:p>
+            <w:pPr>
+              <w:pStyle w:val="Compact"/>
+              <w:jc w:val="left"/>
+            </w:pPr>
+            <w:r>
+              <w:t xml:space="preserve">GPT-4o judge (zero-shot)</w:t>
+            </w:r>
+          </w:p>
+        </w:tc>
+        <w:tc>
+          <w:tcPr/>
+          <w:p>
+            <w:pPr>
+              <w:pStyle w:val="Compact"/>
+              <w:jc w:val="left"/>
+            </w:pPr>
+            <w:r>
+              <w:t xml:space="preserve">Poisson baseline (unseen)</w:t>
+            </w:r>
+          </w:p>
+        </w:tc>
+        <w:tc>
+          <w:tcPr/>
+          <w:p>
+            <w:pPr>
+              <w:pStyle w:val="Compact"/>
+              <w:jc w:val="left"/>
+            </w:pPr>
+            <w:r>
+              <w:t xml:space="preserve">Poisson new (unseen)</w:t>
+            </w:r>
+          </w:p>
+        </w:tc>
+      </w:tr>
+      <w:tr>
+        <w:tc>
+          <w:tcPr/>
+          <w:p>
+            <w:pPr>
+              <w:pStyle w:val="Compact"/>
+              <w:jc w:val="left"/>
+            </w:pPr>
+            <w:r>
+              <w:t xml:space="preserve">GPT-4o (n = 199 / 97)</w:t>
+            </w:r>
+          </w:p>
+        </w:tc>
+        <w:tc>
+          <w:tcPr/>
+          <w:p>
+            <w:pPr>
+              <w:pStyle w:val="Compact"/>
+              <w:jc w:val="left"/>
+            </w:pPr>
+            <w:r>
+              <w:t xml:space="preserve">0.761 [0.71, 0.81]</w:t>
+            </w:r>
+          </w:p>
+        </w:tc>
+        <w:tc>
+          <w:tcPr/>
+          <w:p>
+            <w:pPr>
+              <w:pStyle w:val="Compact"/>
+              <w:jc w:val="left"/>
+            </w:pPr>
+            <w:r>
+              <w:t xml:space="preserve">0.926 [0.90, 0.95]</w:t>
+            </w:r>
+          </w:p>
+        </w:tc>
+        <w:tc>
+          <w:tcPr/>
+          <w:p>
+            <w:pPr>
+              <w:pStyle w:val="Compact"/>
+              <w:jc w:val="left"/>
+            </w:pPr>
+            <w:r>
+              <w:t xml:space="preserve">0.948 [0.92, 0.97]</w:t>
+            </w:r>
+          </w:p>
+        </w:tc>
+      </w:tr>
+      <w:tr>
+        <w:tc>
+          <w:tcPr/>
+          <w:p>
+            <w:pPr>
+              <w:pStyle w:val="Compact"/>
+              <w:jc w:val="left"/>
+            </w:pPr>
+            <w:r>
+              <w:t xml:space="preserve">Claude (n = 199 / 96)</w:t>
+            </w:r>
+          </w:p>
+        </w:tc>
+        <w:tc>
+          <w:tcPr/>
+          <w:p>
+            <w:pPr>
+              <w:pStyle w:val="Compact"/>
+              <w:jc w:val="left"/>
+            </w:pPr>
+            <w:r>
+              <w:t xml:space="preserve">0.448 [0.39, 0.50]</w:t>
+            </w:r>
+          </w:p>
+        </w:tc>
+        <w:tc>
+          <w:tcPr/>
+          <w:p>
+            <w:pPr>
+              <w:pStyle w:val="Compact"/>
+              <w:jc w:val="left"/>
+            </w:pPr>
+            <w:r>
+              <w:t xml:space="preserve">0.758 [0.70, 0.81]</w:t>
+            </w:r>
+          </w:p>
+        </w:tc>
+        <w:tc>
+          <w:tcPr/>
+          <w:p>
+            <w:pPr>
+              <w:pStyle w:val="Compact"/>
+              <w:jc w:val="left"/>
+            </w:pPr>
+            <w:r>
+              <w:t xml:space="preserve">0.773 [0.72, 0.83]</w:t>
+            </w:r>
+          </w:p>
+        </w:tc>
+      </w:tr>
+      <w:tr>
+        <w:tc>
+          <w:tcPr/>
+          <w:p>
+            <w:pPr>
+              <w:pStyle w:val="Compact"/>
+              <w:jc w:val="left"/>
+            </w:pPr>
+            <w:r>
+              <w:t xml:space="preserve">Llama (n = 199 / 97)</w:t>
+            </w:r>
+          </w:p>
+        </w:tc>
+        <w:tc>
+          <w:tcPr/>
+          <w:p>
+            <w:pPr>
+              <w:pStyle w:val="Compact"/>
+              <w:jc w:val="left"/>
+            </w:pPr>
+            <w:r>
+              <w:t xml:space="preserve">0.848 [0.80, 0.89]</w:t>
+            </w:r>
+          </w:p>
+        </w:tc>
+        <w:tc>
+          <w:tcPr/>
+          <w:p>
+            <w:pPr>
+              <w:pStyle w:val="Compact"/>
+              <w:jc w:val="left"/>
+            </w:pPr>
+            <w:r>
+              <w:t xml:space="preserve">0.886 [0.85, 0.92]</w:t>
+            </w:r>
+          </w:p>
+        </w:tc>
+        <w:tc>
+          <w:tcPr/>
+          <w:p>
+            <w:pPr>
+              <w:pStyle w:val="Compact"/>
+              <w:jc w:val="left"/>
+            </w:pPr>
+            <w:r>
+              <w:t xml:space="preserve">0.934 [0.90, 0.96]</w:t>
+            </w:r>
+          </w:p>
+        </w:tc>
+      </w:tr>
+    </w:tbl>
+    <w:p>
+      <w:pPr>
+        <w:pStyle w:val="BodyText"/>
+      </w:pPr>
+      <w:r>
+        <w:t xml:space="preserve">The Poisson-based detectors outperform the judge in all three comparisons. The new clustering features exceed the judge by 0.19 AUC for GPT-4o (95% interval 0.13 to 0.25), 0.33 for Claude (0.24 to 0.40), and 0.09 for Llama (0.04 to 0.14). The baseline features also exceed the judge for GPT-4o (+0.17) and Claude (+0.31), but not clearly for Llama (+0.04, interval −0.02 to 0.10). Results are similar for medicine papers alone (judge 0.70, 0.37, and 0.83; Poisson-new 0.93, 0.77, and 0.93), so the gap is not explained by extraction artifacts in the arXiv text.</w:t>
+      </w:r>
+    </w:p>
+    <w:p>
+      <w:pPr>
+        <w:pStyle w:val="BodyText"/>
+      </w:pPr>
+      <w:r>
+        <w:t xml:space="preserve">This comparison has an important asymmetry. The Poisson-based detectors use labeled examples from other generators, and the judge uses none, so they answer different practical questions: what can be done with no machine-text examples at all, and what a cheap screen achieves once some are available. Both the judge’s weakness on Claude and the transfer limits of Section 4.3 show that neither approach is safe against a generator it has not been tuned for.</w:t>
+      </w:r>
+    </w:p>
     <w:bookmarkEnd w:id="40"/>
-    <w:bookmarkStart w:id="41" w:name="discussion"/>
+    <w:bookmarkStart w:id="41" w:name="cost-rq3"/>
+    <w:p>
+      <w:pPr>
+        <w:pStyle w:val="Heading2"/>
+      </w:pPr>
+      <w:r>
+        <w:t xml:space="preserve">4.8 Cost (RQ3)</w:t>
+      </w:r>
+    </w:p>
+    <w:p>
+      <w:pPr>
+        <w:pStyle w:val="FirstParagraph"/>
+      </w:pPr>
+      <w:r>
+        <w:t xml:space="preserve">Computing all events and the baseline indices took 4 to 6 milliseconds per document on one CPU core (roughly 160 to 230 documents per second, depending on machine load) with no external service calls, so the marginal monetary cost is zero. For context on the generation side, producing one paper through four requests cost about US$0.04 for GPT-4o, about US$0.13 for Claude, and about US$0.002 for Llama 3.3 70B, through the gateway we used (average generation time was 38 seconds for GPT-4o and roughly 100 seconds for Claude; Llama times are not comparable because we ran several requests in parallel). For the LLM judge we measured about US$0.0073 and 1.7 seconds per excerpt (2,000 tokens each, 500 excerpts, US$3.63 in total). Screening 1,000 documents would thus cost about US$7 and half an hour of sequential judge calls, against no marginal cost and a few seconds for the Poisson features. These figures depend on the judge model, prompt length, and the pricing and speed at the time, and we measured one judge only.</w:t>
+      </w:r>
+    </w:p>
+    <w:bookmarkEnd w:id="41"/>
+    <w:bookmarkEnd w:id="42"/>
+    <w:bookmarkStart w:id="43" w:name="discussion"/>
     <w:p>
       <w:pPr>
         <w:pStyle w:val="Heading1"/>
@@ -3525,6 +3845,14 @@
         <w:pStyle w:val="BodyText"/>
       </w:pPr>
       <w:r>
+        <w:t xml:space="preserve">The judge comparison adds a sobering point. A zero-shot GPT-4o judge was not a strong detector here, and for Claude it was misleading in the wrong direction. We would not generalize this to all judges or all prompts, since we tested one judge with one prompt and no examples. But it suggests that asking a language model whether a paper looks machine-written is not a safe default, particularly as generators improve. Cheap, supervised screens built on explainable features did better, at no marginal cost, provided that some examples of machine text were available. Neither approach is a decision rule, and both need to be refreshed as models change.</w:t>
+      </w:r>
+    </w:p>
+    <w:p>
+      <w:pPr>
+        <w:pStyle w:val="BodyText"/>
+      </w:pPr>
+      <w:r>
         <w:t xml:space="preserve">For governance, the practical value of these features is transparency and cost, not accuracy. A flag such as</w:t>
       </w:r>
       <w:r>
@@ -3546,8 +3874,8 @@
         <w:t xml:space="preserve">can be explained to an author or editor, and it costs nothing to compute. It should therefore be treated as a low-cost first filter whose output is routed to human review, not as grounds for action on its own.</w:t>
       </w:r>
     </w:p>
-    <w:bookmarkEnd w:id="41"/>
-    <w:bookmarkStart w:id="42" w:name="limitations"/>
+    <w:bookmarkEnd w:id="43"/>
+    <w:bookmarkStart w:id="44" w:name="limitations"/>
     <w:p>
       <w:pPr>
         <w:pStyle w:val="Heading1"/>
@@ -3819,17 +4147,39 @@
           <w:bCs/>
           <w:b/>
         </w:rPr>
-        <w:t xml:space="preserve">No black-box baselines and no reviewer experiment.</w:t>
-      </w:r>
-      <w:r>
-        <w:t xml:space="preserve"> </w:t>
-      </w:r>
-      <w:r>
-        <w:t xml:space="preserve">We did not compare against LLM-as-a-judge, MAUVE, or BERTScore, and we did not test whether explainable evidence improves human decisions. Claims about relative advantage over those methods are therefore not supported by this study.</w:t>
-      </w:r>
-    </w:p>
-    <w:bookmarkEnd w:id="42"/>
-    <w:bookmarkStart w:id="43" w:name="planned-extensions"/>
+        <w:t xml:space="preserve">One LLM judge, no embedding metrics.</w:t>
+      </w:r>
+      <w:r>
+        <w:t xml:space="preserve"> </w:t>
+      </w:r>
+      <w:r>
+        <w:t xml:space="preserve">We tested a single zero-shot judge (GPT-4o), with one prompt, on 500 excerpts of 2,000 tokens. GPT-4o is also a generator, so its results on GPT-4o papers involve self-recognition, and a judge that is not a generator has not been run. A different judge, a few-shot prompt, a fine-tuned judge, or full papers might do better. The Poisson detectors use labeled examples that the judge does not. We did not run MAUVE or BERTScore, so claims of advantage over embedding-based metrics are not supported.</w:t>
+      </w:r>
+    </w:p>
+    <w:p>
+      <w:pPr>
+        <w:numPr>
+          <w:ilvl w:val="0"/>
+          <w:numId w:val="1002"/>
+        </w:numPr>
+        <w:pStyle w:val="Compact"/>
+      </w:pPr>
+      <w:r>
+        <w:rPr>
+          <w:bCs/>
+          <w:b/>
+        </w:rPr>
+        <w:t xml:space="preserve">No reviewer experiment.</w:t>
+      </w:r>
+      <w:r>
+        <w:t xml:space="preserve"> </w:t>
+      </w:r>
+      <w:r>
+        <w:t xml:space="preserve">We did not test whether explainable evidence improves the decisions of human reviewers.</w:t>
+      </w:r>
+    </w:p>
+    <w:bookmarkEnd w:id="44"/>
+    <w:bookmarkStart w:id="45" w:name="planned-extensions"/>
     <w:p>
       <w:pPr>
         <w:pStyle w:val="Heading1"/>
@@ -3843,11 +4193,11 @@
         <w:pStyle w:val="FirstParagraph"/>
       </w:pPr>
       <w:r>
-        <w:t xml:space="preserve">Five steps would turn this pilot into a test of the full proposal. (i) Add further generators, including more open-weight models and future releases, and evaluate each as held out, together with a negative binomial reference in place of the Poisson benchmark. (ii) Run MAUVE, BERTScore, and an LLM-as-a-judge baseline on identical documents, recording latency and cost. (iii) Test robustness to paraphrasing and light human editing, and replicate the clustering model on new documents and generators, ideally with full likelihood estimation (for example, a log-Gaussian Cox process) in place of moment matching. (iv) Conduct a randomized experiment in which domain experts classify real and fabricated papers under three conditions (no indicator, an unexplained AI score, and an explainable event-based indicator), analyzed with ANOVA and planned contrasts after an a priori power analysis. Pre-registering the feature list, windows, and analysis plan would guard against analytic flexibility.</w:t>
-      </w:r>
-    </w:p>
-    <w:bookmarkEnd w:id="43"/>
-    <w:bookmarkStart w:id="44" w:name="conclusion"/>
+        <w:t xml:space="preserve">Five steps would turn this pilot into a test of the full proposal. (i) Add further generators, including more open-weight models and future releases, and evaluate each as held out, together with a negative binomial reference in place of the Poisson benchmark. (ii) Add a second LLM judge that is not one of the generators, a few-shot judge, and MAUVE and BERTScore, on identical documents, recording latency and cost. (iii) Test robustness to paraphrasing and light human editing, and replicate the clustering model on new documents and generators, ideally with full likelihood estimation (for example, a log-Gaussian Cox process) in place of moment matching. (iv) Conduct a randomized experiment in which domain experts classify real and fabricated papers under three conditions (no indicator, an unexplained AI score, and an explainable event-based indicator), analyzed with ANOVA and planned contrasts after an a priori power analysis. Pre-registering the feature list, windows, and analysis plan would guard against analytic flexibility.</w:t>
+      </w:r>
+    </w:p>
+    <w:bookmarkEnd w:id="45"/>
+    <w:bookmarkStart w:id="46" w:name="conclusion"/>
     <w:p>
       <w:pPr>
         <w:pStyle w:val="Heading1"/>
@@ -3861,11 +4211,11 @@
         <w:pStyle w:val="FirstParagraph"/>
       </w:pPr>
       <w:r>
-        <w:t xml:space="preserve">Counting small linguistic events is a cheap and transparent way to screen scholarly text, but the simplest version of the idea, measuring distance from a Poisson process, does not work, because human text is not Poisson. A richer set of count-based features detects machine-generated papers well within a generator, but accuracy falls to between 0.73 and 0.81 on an unseen generator. Dispersion transfers better than event rates, and that is the clearest sign in our data that the count-process view captures something general. Detectors built on human text alone, which would avoid the need for generator examples, performed near chance. A model of clustering across scales improved detection modestly and consistently, and the improvement held in a test fixed in advance on an unseen open-weight generator (AUC 0.89 to 0.93). The evidence is limited to three generators and one genre, and whether the approach helps human reviewers or outperforms black-box metrics remains untested.</w:t>
-      </w:r>
-    </w:p>
-    <w:bookmarkEnd w:id="44"/>
-    <w:bookmarkStart w:id="45" w:name="references"/>
+        <w:t xml:space="preserve">Counting small linguistic events is a cheap and transparent way to screen scholarly text, but the simplest version of the idea, measuring distance from a Poisson process, does not work, because human text is not Poisson. A richer set of count-based features detects machine-generated papers well within a generator, but accuracy falls to between 0.73 and 0.81 on an unseen generator. Dispersion transfers better than event rates, and that is the clearest sign in our data that the count-process view captures something general. Detectors built on human text alone, which would avoid the need for generator examples, performed near chance. A model of clustering across scales improved detection modestly and consistently, and the improvement held in a test fixed in advance on an unseen open-weight generator (AUC 0.89 to 0.93). In a blind comparison, the Poisson-based detectors outperformed a zero-shot GPT-4o judge at no marginal cost, though they rely on examples of machine text that the judge does not. The evidence is limited to three generators, one genre, and one judge, and whether the approach helps human reviewers or outperforms embedding-based metrics remains untested.</w:t>
+      </w:r>
+    </w:p>
+    <w:bookmarkEnd w:id="46"/>
+    <w:bookmarkStart w:id="47" w:name="references"/>
     <w:p>
       <w:pPr>
         <w:pStyle w:val="Heading1"/>
@@ -4147,7 +4497,7 @@
         <w:t xml:space="preserve">(36).</w:t>
       </w:r>
     </w:p>
-    <w:bookmarkEnd w:id="45"/>
+    <w:bookmarkEnd w:id="47"/>
     <w:sectPr/>
   </w:body>
 </w:document>

</xml_diff>

<commit_message>
Add second (non-generator) judge: Gemini 2.5 Pro; correct judge comparison in paper
Co-Authored-By: Claude Sonnet 5.5 <noreply@anthropic.com>
Claude-Session: https://claude.ai/code/session_01FLb7uVf7YBgdoa75gbZ2sf
</commit_message>
<xml_diff>
--- a/paper/Poisson_LLM_Pilot_Paper_MISQ.docx
+++ b/paper/Poisson_LLM_Pilot_Paper_MISQ.docx
@@ -176,7 +176,7 @@
         <w:pStyle w:val="FirstParagraph"/>
       </w:pPr>
       <w:r>
-        <w:t xml:space="preserve">Organizations that publish or archive scholarly documents now face a screening problem: language models can produce papers faster and more cheaply than anyone can check them. Two common remedies, LLM-as-a-judge and embedding-based similarity metrics, are either expensive and prompt-dependent or insensitive to fine-grained statistical structure. We study a lightweight alternative that treats the occurrence of selected linguistic events (special punctuation, discourse markers, passive constructions, nominalizations) as count processes and asks how far a document departs from human-authored text. Using 474 human-written papers from PubMed Central and arXiv (2015–2019) and matched papers from three generators (GPT-4o, 245 papers; Claude Sonnet 5.5, 152; Llama 3.3 70B, 202), we report seven findings. First, human text is not Poisson: for punctuation events, 36–49% of documents reject the Poisson null because of over-dispersion. Second, a single Poisson-distance index performs near chance (AUC 0.51–0.54). Third, a vector of event rates and dispersion indices separates human from machine text well when the detector is trained and tested on the same generator (AUC 0.91–0.99), but not across generators: a detector trained on GPT-4o reaches 0.73 on Claude. Fourth, dispersion transfers better than event rates, which differ in sign across generators. Fifth, detectors trained on human papers alone perform near chance to modestly above it. Sixth, we propose a scale-dependent clustering model, a doubly stochastic (Cox) Poisson process summarized by how the Fano factor changes with window size. In a test specified before the Llama data were collected, it raised AUC on the unseen Llama papers from 0.89 to 0.93 (difference +0.046, 95% interval 0.030 to 0.063). Seventh, in a blind comparison on 500 excerpts, a zero-shot GPT-4o judge reached AUCs of 0.76, 0.45, and 0.85 against GPT-4o, Claude, and Llama papers, and Poisson-based detectors trained on the other generators did better (0.95, 0.77, and 0.93), although they need labeled examples and the judge does not. The judge cost about US$0.007 and 1.7 seconds per document; the Poisson features cost nothing and run at roughly 160 to 230 documents per second on one CPU core. The evidence is limited to three generators, one genre, and one LLM judge, and we do not test adversarial editing, embedding-based metrics, or the effect on human reviewers.</w:t>
+        <w:t xml:space="preserve">Organizations that publish or archive scholarly documents now face a screening problem: language models can produce papers faster and more cheaply than anyone can check them. Two common remedies, LLM-as-a-judge and embedding-based similarity metrics, are either expensive and prompt-dependent or insensitive to fine-grained statistical structure. We study a lightweight alternative that treats the occurrence of selected linguistic events (special punctuation, discourse markers, passive constructions, nominalizations) as count processes and asks how far a document departs from human-authored text. Using 474 human-written papers from PubMed Central and arXiv (2015–2019) and matched papers from three generators (GPT-4o, 245 papers; Claude Sonnet 5.5, 152; Llama 3.3 70B, 202), we report seven findings. First, human text is not Poisson: for punctuation events, 36–49% of documents reject the Poisson null because of over-dispersion. Second, a single Poisson-distance index performs near chance (AUC 0.51–0.54). Third, a vector of event rates and dispersion indices separates human from machine text well when the detector is trained and tested on the same generator (AUC 0.91–0.99), but not across generators: a detector trained on GPT-4o reaches 0.73 on Claude. Fourth, dispersion transfers better than event rates, which differ in sign across generators. Fifth, detectors trained on human papers alone perform near chance to modestly above it. Sixth, we propose a scale-dependent clustering model, a doubly stochastic (Cox) Poisson process summarized by how the Fano factor changes with window size. In a test specified before the Llama data were collected, it raised AUC on the unseen Llama papers from 0.89 to 0.93 (difference +0.046, 95% interval 0.030 to 0.063). Seventh, in a blind comparison on 500 excerpts with two zero-shot LLM judges, the answer depended on the judge and on the generator. GPT-4o as judge reached AUCs of 0.76, 0.45, and 0.85 against GPT-4o, Claude, and Llama papers, below the Poisson-based detectors trained on the other generators (0.95, 0.77, and 0.93). Gemini 2.5 Pro, a stronger judge that is not one of the generators, did better than those detectors on GPT-4o and Llama papers (0.97 and 0.97) but worse on Claude papers (0.66), which both judges almost never flagged. The Poisson features cost nothing per document, against about US$0.007 and 1.7 seconds for GPT-4o and US$0.017 and 23 seconds for Gemini, but unlike the judges they need labeled examples. The evidence is limited to three generators, one genre, and two judges, and we do not test adversarial editing, embedding-based metrics, or the effect on human reviewers.</w:t>
       </w:r>
     </w:p>
     <w:p>
@@ -698,13 +698,13 @@
       </w:r>
     </w:p>
     <w:bookmarkEnd w:id="28"/>
-    <w:bookmarkStart w:id="29" w:name="llm-as-a-judge-baseline"/>
+    <w:bookmarkStart w:id="29" w:name="llm-as-a-judge-baselines"/>
     <w:p>
       <w:pPr>
         <w:pStyle w:val="Heading2"/>
       </w:pPr>
       <w:r>
-        <w:t xml:space="preserve">3.7 LLM-as-a-judge baseline</w:t>
+        <w:t xml:space="preserve">3.7 LLM-as-a-judge baselines</w:t>
       </w:r>
     </w:p>
     <w:p>
@@ -712,7 +712,7 @@
         <w:pStyle w:val="FirstParagraph"/>
       </w:pPr>
       <w:r>
-        <w:t xml:space="preserve">To compare with the black-box approach, we asked GPT-4o, zero-shot and at temperature 0, to estimate for each excerpt the probability (0 to 100) that it was written by an AI language model. We used one fixed prompt for all documents. The judge saw a random sample of 500 excerpts (200 human papers, 120 from medicine and 80 from computer science, and 100 papers from each generator), presented in random order with opaque identifiers and no labels. Each excerpt was the same first 2,000 tokens used for the Poisson features. To prevent trivial cues, we removed markdown symbols and bare section titles from every excerpt, whatever its source.</w:t>
+        <w:t xml:space="preserve">To compare with the black-box approach, we asked two models, zero-shot and at temperature 0, to estimate for each excerpt the probability (0 to 100) that it was written by an AI language model: GPT-4o and Gemini 2.5 Pro. We used one fixed prompt for all documents and both judges. The judges saw a random sample of 500 excerpts (200 human papers, 120 from medicine and 80 from computer science, and 100 papers from each generator), presented in random order with opaque identifiers and no labels. Each excerpt was the same first 2,000 tokens used for the Poisson features. To prevent trivial cues, we removed markdown symbols and bare section titles from every excerpt, whatever its source. Gemini 2.5 Pro reasons before answering, so we allowed it up to 8,000 output tokens; 12 of its 500 answers were empty or unreadable. For the main analysis, a document is excluded for every method if either judge’s answer is unreadable, which leaves 196 human papers and 92 to 95 papers per generator; as a sensitivity check we also score unreadable answers as 50 (no information).</w:t>
       </w:r>
     </w:p>
     <w:p>
@@ -720,7 +720,7 @@
         <w:pStyle w:val="BodyText"/>
       </w:pPr>
       <w:r>
-        <w:t xml:space="preserve">For each generator, the judge’s score is compared with two Poisson-based detectors evaluated on the same documents: the baseline features and the new clustering features, each trained on human papers plus the</w:t>
+        <w:t xml:space="preserve">For each generator, each judge’s score is compared with two Poisson-based detectors evaluated on the same documents: the baseline features and the new clustering features, each trained on human papers plus the</w:t>
       </w:r>
       <w:r>
         <w:t xml:space="preserve"> </w:t>
@@ -736,7 +736,7 @@
         <w:t xml:space="preserve"> </w:t>
       </w:r>
       <w:r>
-        <w:t xml:space="preserve">generators and never on the generator being tested, which makes them comparable to a judge that has not seen that generator. These comparisons, the sample, and the analysis scripts were fixed before the judge was run. Differences are tested with a paired bootstrap. We also report results for medicine papers alone, because their text comes from clean XML, whereas the arXiv text comes from PDF conversion and could carry extraction artifacts that a judge might pick up. One caution applies from the start: GPT-4o is also one of the generators, so its judgments of GPT-4o papers involve self-recognition, and a second judge that is not a generator has not yet been run.</w:t>
+        <w:t xml:space="preserve">generators and never on the generator being tested, which makes them comparable to a judge that has not seen that generator. The sample, the comparisons, and the analysis scripts were fixed before the judges were run. Differences are tested with a paired bootstrap computed separately for each judge. We also report results for medicine papers alone, because their text comes from clean XML, whereas the arXiv text comes from PDF conversion and could carry extraction artifacts that a judge might pick up. GPT-4o is also one of the generators, so its judgments of GPT-4o papers involve self-recognition; Gemini is not a generator.</w:t>
       </w:r>
     </w:p>
     <w:bookmarkEnd w:id="29"/>
@@ -3492,13 +3492,13 @@
       </w:r>
     </w:p>
     <w:bookmarkEnd w:id="39"/>
-    <w:bookmarkStart w:id="40" w:name="comparison-with-an-llm-judge-rq2-rq3"/>
+    <w:bookmarkStart w:id="40" w:name="comparison-with-llm-judges-rq2-rq3"/>
     <w:p>
       <w:pPr>
         <w:pStyle w:val="Heading2"/>
       </w:pPr>
       <w:r>
-        <w:t xml:space="preserve">4.7 Comparison with an LLM judge (RQ2, RQ3)</w:t>
+        <w:t xml:space="preserve">4.7 Comparison with LLM judges (RQ2, RQ3)</w:t>
       </w:r>
     </w:p>
     <w:p>
@@ -3506,7 +3506,7 @@
         <w:pStyle w:val="FirstParagraph"/>
       </w:pPr>
       <w:r>
-        <w:t xml:space="preserve">Table 7 gives the AUC of each method for separating human papers from each generator’s papers on the 500 judged excerpts. The zero-shot GPT-4o judge performs modestly on GPT-4o papers (AUC 0.76) and Llama papers (0.85), and worse than chance on Claude papers (0.45; 0.37 within medicine). At a threshold of 50, the judge flags 24% of human papers as AI-generated, against 59% of GPT-4o papers, 85% of Llama papers, and only 11% of Claude papers. In other words, this judge regards Claude’s papers as more human than the human papers themselves.</w:t>
+        <w:t xml:space="preserve">Table 7 gives the AUC of each method for separating human papers from each generator’s papers on the judged excerpts. The two judges differ greatly. GPT-4o as judge is a modest detector of GPT-4o papers (AUC 0.76) and Llama papers (0.85), and worse than chance on Claude papers (0.45). At a threshold of 50, it flags 24% of human papers as AI-generated, against 59% of GPT-4o papers, 85% of Llama papers, and only 11% of Claude papers. Gemini 2.5 Pro is a much stronger judge on two generators, with AUCs of 0.97 for GPT-4o papers and 0.97 for Llama papers, and it flags only 2% of human papers while flagging 86% of GPT-4o and 89% of Llama papers. On Claude papers, however, it reaches only 0.66, flagging 1% of them, fewer than the 2% of human papers it flags.</w:t>
       </w:r>
     </w:p>
     <w:p>
@@ -3514,7 +3514,7 @@
         <w:pStyle w:val="TableCaption"/>
       </w:pPr>
       <w:r>
-        <w:t xml:space="preserve">Table 7. AUC (95% bootstrap interval) on the same 500 documents.</w:t>
+        <w:t xml:space="preserve">Table 7. AUC (95% bootstrap interval) on the same documents.</w:t>
       </w:r>
       <w:r>
         <w:t xml:space="preserve"> </w:t>
@@ -3532,7 +3532,7 @@
         <w:t xml:space="preserve"> </w:t>
       </w:r>
       <w:r>
-        <w:t xml:space="preserve">means trained on human papers plus the other two generators, never on the target. Sample sizes are human / synthetic documents.</w:t>
+        <w:t xml:space="preserve">means trained on human papers plus the other two generators, never on the target. Sample sizes are human / synthetic documents. Scoring the unreadable Gemini answers as 50 instead of excluding them changes the Gemini AUCs to 0.970, 0.653, and 0.973.</w:t>
       </w:r>
     </w:p>
     <w:tbl>
@@ -3541,13 +3541,14 @@
         <w:tblW w:type="pct" w:w="5000"/>
         <w:tblLook w:firstRow="1" w:lastRow="0" w:firstColumn="0" w:lastColumn="0" w:noHBand="0" w:noVBand="0" w:val="0020"/>
         <w:jc w:val="start"/>
-        <w:tblCaption w:val="Table 7. AUC (95% bootstrap interval) on the same 500 documents. “Unseen” means trained on human papers plus the other two generators, never on the target. Sample sizes are human / synthetic documents."/>
+        <w:tblCaption w:val="Table 7. AUC (95% bootstrap interval) on the same documents. “Unseen” means trained on human papers plus the other two generators, never on the target. Sample sizes are human / synthetic documents. Scoring the unreadable Gemini answers as 50 instead of excluding them changes the Gemini AUCs to 0.970, 0.653, and 0.973."/>
       </w:tblPr>
       <w:tblGrid>
-        <w:gridCol w:w="1980"/>
-        <w:gridCol w:w="1980"/>
-        <w:gridCol w:w="1980"/>
-        <w:gridCol w:w="1980"/>
+        <w:gridCol w:w="1584"/>
+        <w:gridCol w:w="1584"/>
+        <w:gridCol w:w="1584"/>
+        <w:gridCol w:w="1584"/>
+        <w:gridCol w:w="1584"/>
       </w:tblGrid>
       <w:tr>
         <w:trPr>
@@ -3573,7 +3574,19 @@
               <w:jc w:val="left"/>
             </w:pPr>
             <w:r>
-              <w:t xml:space="preserve">GPT-4o judge (zero-shot)</w:t>
+              <w:t xml:space="preserve">GPT-4o judge</w:t>
+            </w:r>
+          </w:p>
+        </w:tc>
+        <w:tc>
+          <w:tcPr/>
+          <w:p>
+            <w:pPr>
+              <w:pStyle w:val="Compact"/>
+              <w:jc w:val="left"/>
+            </w:pPr>
+            <w:r>
+              <w:t xml:space="preserve">Gemini 2.5 Pro judge</w:t>
             </w:r>
           </w:p>
         </w:tc>
@@ -3611,43 +3624,55 @@
               <w:jc w:val="left"/>
             </w:pPr>
             <w:r>
-              <w:t xml:space="preserve">GPT-4o (n = 199 / 97)</w:t>
-            </w:r>
-          </w:p>
-        </w:tc>
-        <w:tc>
-          <w:tcPr/>
-          <w:p>
-            <w:pPr>
-              <w:pStyle w:val="Compact"/>
-              <w:jc w:val="left"/>
-            </w:pPr>
-            <w:r>
-              <w:t xml:space="preserve">0.761 [0.71, 0.81]</w:t>
-            </w:r>
-          </w:p>
-        </w:tc>
-        <w:tc>
-          <w:tcPr/>
-          <w:p>
-            <w:pPr>
-              <w:pStyle w:val="Compact"/>
-              <w:jc w:val="left"/>
-            </w:pPr>
-            <w:r>
-              <w:t xml:space="preserve">0.926 [0.90, 0.95]</w:t>
-            </w:r>
-          </w:p>
-        </w:tc>
-        <w:tc>
-          <w:tcPr/>
-          <w:p>
-            <w:pPr>
-              <w:pStyle w:val="Compact"/>
-              <w:jc w:val="left"/>
-            </w:pPr>
-            <w:r>
-              <w:t xml:space="preserve">0.948 [0.92, 0.97]</w:t>
+              <w:t xml:space="preserve">GPT-4o (n = 196 / 92)</w:t>
+            </w:r>
+          </w:p>
+        </w:tc>
+        <w:tc>
+          <w:tcPr/>
+          <w:p>
+            <w:pPr>
+              <w:pStyle w:val="Compact"/>
+              <w:jc w:val="left"/>
+            </w:pPr>
+            <w:r>
+              <w:t xml:space="preserve">0.760 [0.70, 0.81]</w:t>
+            </w:r>
+          </w:p>
+        </w:tc>
+        <w:tc>
+          <w:tcPr/>
+          <w:p>
+            <w:pPr>
+              <w:pStyle w:val="Compact"/>
+              <w:jc w:val="left"/>
+            </w:pPr>
+            <w:r>
+              <w:t xml:space="preserve">0.972 [0.95, 0.99]</w:t>
+            </w:r>
+          </w:p>
+        </w:tc>
+        <w:tc>
+          <w:tcPr/>
+          <w:p>
+            <w:pPr>
+              <w:pStyle w:val="Compact"/>
+              <w:jc w:val="left"/>
+            </w:pPr>
+            <w:r>
+              <w:t xml:space="preserve">0.927 [0.90, 0.95]</w:t>
+            </w:r>
+          </w:p>
+        </w:tc>
+        <w:tc>
+          <w:tcPr/>
+          <w:p>
+            <w:pPr>
+              <w:pStyle w:val="Compact"/>
+              <w:jc w:val="left"/>
+            </w:pPr>
+            <w:r>
+              <w:t xml:space="preserve">0.946 [0.92, 0.97]</w:t>
             </w:r>
           </w:p>
         </w:tc>
@@ -3661,43 +3686,55 @@
               <w:jc w:val="left"/>
             </w:pPr>
             <w:r>
-              <w:t xml:space="preserve">Claude (n = 199 / 96)</w:t>
-            </w:r>
-          </w:p>
-        </w:tc>
-        <w:tc>
-          <w:tcPr/>
-          <w:p>
-            <w:pPr>
-              <w:pStyle w:val="Compact"/>
-              <w:jc w:val="left"/>
-            </w:pPr>
-            <w:r>
-              <w:t xml:space="preserve">0.448 [0.39, 0.50]</w:t>
-            </w:r>
-          </w:p>
-        </w:tc>
-        <w:tc>
-          <w:tcPr/>
-          <w:p>
-            <w:pPr>
-              <w:pStyle w:val="Compact"/>
-              <w:jc w:val="left"/>
-            </w:pPr>
-            <w:r>
-              <w:t xml:space="preserve">0.758 [0.70, 0.81]</w:t>
-            </w:r>
-          </w:p>
-        </w:tc>
-        <w:tc>
-          <w:tcPr/>
-          <w:p>
-            <w:pPr>
-              <w:pStyle w:val="Compact"/>
-              <w:jc w:val="left"/>
-            </w:pPr>
-            <w:r>
-              <w:t xml:space="preserve">0.773 [0.72, 0.83]</w:t>
+              <w:t xml:space="preserve">Claude (n = 196 / 94)</w:t>
+            </w:r>
+          </w:p>
+        </w:tc>
+        <w:tc>
+          <w:tcPr/>
+          <w:p>
+            <w:pPr>
+              <w:pStyle w:val="Compact"/>
+              <w:jc w:val="left"/>
+            </w:pPr>
+            <w:r>
+              <w:t xml:space="preserve">0.450 [0.39, 0.51]</w:t>
+            </w:r>
+          </w:p>
+        </w:tc>
+        <w:tc>
+          <w:tcPr/>
+          <w:p>
+            <w:pPr>
+              <w:pStyle w:val="Compact"/>
+              <w:jc w:val="left"/>
+            </w:pPr>
+            <w:r>
+              <w:t xml:space="preserve">0.656 [0.59, 0.72]</w:t>
+            </w:r>
+          </w:p>
+        </w:tc>
+        <w:tc>
+          <w:tcPr/>
+          <w:p>
+            <w:pPr>
+              <w:pStyle w:val="Compact"/>
+              <w:jc w:val="left"/>
+            </w:pPr>
+            <w:r>
+              <w:t xml:space="preserve">0.759 [0.70, 0.82]</w:t>
+            </w:r>
+          </w:p>
+        </w:tc>
+        <w:tc>
+          <w:tcPr/>
+          <w:p>
+            <w:pPr>
+              <w:pStyle w:val="Compact"/>
+              <w:jc w:val="left"/>
+            </w:pPr>
+            <w:r>
+              <w:t xml:space="preserve">0.775 [0.72, 0.83]</w:t>
             </w:r>
           </w:p>
         </w:tc>
@@ -3711,43 +3748,55 @@
               <w:jc w:val="left"/>
             </w:pPr>
             <w:r>
-              <w:t xml:space="preserve">Llama (n = 199 / 97)</w:t>
-            </w:r>
-          </w:p>
-        </w:tc>
-        <w:tc>
-          <w:tcPr/>
-          <w:p>
-            <w:pPr>
-              <w:pStyle w:val="Compact"/>
-              <w:jc w:val="left"/>
-            </w:pPr>
-            <w:r>
-              <w:t xml:space="preserve">0.848 [0.80, 0.89]</w:t>
-            </w:r>
-          </w:p>
-        </w:tc>
-        <w:tc>
-          <w:tcPr/>
-          <w:p>
-            <w:pPr>
-              <w:pStyle w:val="Compact"/>
-              <w:jc w:val="left"/>
-            </w:pPr>
-            <w:r>
-              <w:t xml:space="preserve">0.886 [0.85, 0.92]</w:t>
-            </w:r>
-          </w:p>
-        </w:tc>
-        <w:tc>
-          <w:tcPr/>
-          <w:p>
-            <w:pPr>
-              <w:pStyle w:val="Compact"/>
-              <w:jc w:val="left"/>
-            </w:pPr>
-            <w:r>
-              <w:t xml:space="preserve">0.934 [0.90, 0.96]</w:t>
+              <w:t xml:space="preserve">Llama (n = 196 / 95)</w:t>
+            </w:r>
+          </w:p>
+        </w:tc>
+        <w:tc>
+          <w:tcPr/>
+          <w:p>
+            <w:pPr>
+              <w:pStyle w:val="Compact"/>
+              <w:jc w:val="left"/>
+            </w:pPr>
+            <w:r>
+              <w:t xml:space="preserve">0.846 [0.80, 0.89]</w:t>
+            </w:r>
+          </w:p>
+        </w:tc>
+        <w:tc>
+          <w:tcPr/>
+          <w:p>
+            <w:pPr>
+              <w:pStyle w:val="Compact"/>
+              <w:jc w:val="left"/>
+            </w:pPr>
+            <w:r>
+              <w:t xml:space="preserve">0.974 [0.95, 0.99]</w:t>
+            </w:r>
+          </w:p>
+        </w:tc>
+        <w:tc>
+          <w:tcPr/>
+          <w:p>
+            <w:pPr>
+              <w:pStyle w:val="Compact"/>
+              <w:jc w:val="left"/>
+            </w:pPr>
+            <w:r>
+              <w:t xml:space="preserve">0.884 [0.85, 0.92]</w:t>
+            </w:r>
+          </w:p>
+        </w:tc>
+        <w:tc>
+          <w:tcPr/>
+          <w:p>
+            <w:pPr>
+              <w:pStyle w:val="Compact"/>
+              <w:jc w:val="left"/>
+            </w:pPr>
+            <w:r>
+              <w:t xml:space="preserve">0.933 [0.90, 0.96]</w:t>
             </w:r>
           </w:p>
         </w:tc>
@@ -3758,7 +3807,7 @@
         <w:pStyle w:val="BodyText"/>
       </w:pPr>
       <w:r>
-        <w:t xml:space="preserve">The Poisson-based detectors outperform the judge in all three comparisons. The new clustering features exceed the judge by 0.19 AUC for GPT-4o (95% interval 0.13 to 0.25), 0.33 for Claude (0.24 to 0.40), and 0.09 for Llama (0.04 to 0.14). The baseline features also exceed the judge for GPT-4o (+0.17) and Claude (+0.31), but not clearly for Llama (+0.04, interval −0.02 to 0.10). Results are similar for medicine papers alone (judge 0.70, 0.37, and 0.83; Poisson-new 0.93, 0.77, and 0.93), so the gap is not explained by extraction artifacts in the arXiv text.</w:t>
+        <w:t xml:space="preserve">The comparison with the Poisson-based detectors therefore depends on which judge is used. Against the GPT-4o judge, the new clustering features are better on all three generators (paired AUC differences +0.19 for GPT-4o, 95% interval 0.13 to 0.25; +0.33 for Claude, 0.24 to 0.40; +0.09 for Llama, 0.04 to 0.14). Against Gemini 2.5 Pro, the picture reverses for two generators and holds for the third. The new features are lower on Llama papers (−0.04, interval −0.08 to −0.01), lower on GPT-4o papers by an amount whose interval reaches zero (−0.03, interval −0.06 to +0.01), and higher on Claude papers (+0.12, interval 0.04 to 0.20). The baseline features are lower than Gemini on GPT-4o (−0.05) and Llama (−0.09) and higher on Claude (+0.10). Results are similar for medicine papers alone (Gemini 0.95, 0.58, and 0.96; Poisson-new 0.93, 0.77, and 0.92), so extraction artifacts in the arXiv text do not explain the pattern.</w:t>
       </w:r>
     </w:p>
     <w:p>
@@ -3766,7 +3815,15 @@
         <w:pStyle w:val="BodyText"/>
       </w:pPr>
       <w:r>
-        <w:t xml:space="preserve">This comparison has an important asymmetry. The Poisson-based detectors use labeled examples from other generators, and the judge uses none, so they answer different practical questions: what can be done with no machine-text examples at all, and what a cheap screen achieves once some are available. Both the judge’s weakness on Claude and the transfer limits of Section 4.3 show that neither approach is safe against a generator it has not been tuned for.</w:t>
+        <w:t xml:space="preserve">Claude’s papers are the hardest to detect for every method we tried. The Poisson-based detectors do best on them, but at an AUC of about 0.77 that is far from adequate.</w:t>
+      </w:r>
+    </w:p>
+    <w:p>
+      <w:pPr>
+        <w:pStyle w:val="BodyText"/>
+      </w:pPr>
+      <w:r>
+        <w:t xml:space="preserve">This comparison has an important asymmetry. The Poisson-based detectors use labeled examples from other generators, and the judges use none, so they answer different practical questions: what can be done with no machine-text examples at all, and what a cheap screen achieves once some are available.</w:t>
       </w:r>
     </w:p>
     <w:bookmarkEnd w:id="40"/>
@@ -3784,7 +3841,7 @@
         <w:pStyle w:val="FirstParagraph"/>
       </w:pPr>
       <w:r>
-        <w:t xml:space="preserve">Computing all events and the baseline indices took 4 to 6 milliseconds per document on one CPU core (roughly 160 to 230 documents per second, depending on machine load) with no external service calls, so the marginal monetary cost is zero. For context on the generation side, producing one paper through four requests cost about US$0.04 for GPT-4o, about US$0.13 for Claude, and about US$0.002 for Llama 3.3 70B, through the gateway we used (average generation time was 38 seconds for GPT-4o and roughly 100 seconds for Claude; Llama times are not comparable because we ran several requests in parallel). For the LLM judge we measured about US$0.0073 and 1.7 seconds per excerpt (2,000 tokens each, 500 excerpts, US$3.63 in total). Screening 1,000 documents would thus cost about US$7 and half an hour of sequential judge calls, against no marginal cost and a few seconds for the Poisson features. These figures depend on the judge model, prompt length, and the pricing and speed at the time, and we measured one judge only.</w:t>
+        <w:t xml:space="preserve">Computing all events and the baseline indices took 4 to 6 milliseconds per document on one CPU core (roughly 160 to 230 documents per second, depending on machine load) with no external service calls, so the marginal monetary cost is zero. For the judges we measured about US$0.0073 and 1.7 seconds per excerpt for GPT-4o (US$3.63 for 500 excerpts) and about US$0.0174 and 23.4 seconds per excerpt for Gemini 2.5 Pro (US$8.68), whose cost includes the reasoning tokens it produced. Screening 1,000 documents would thus cost about US$7 and half an hour of sequential calls with GPT-4o, and about US$17 and more than six hours with Gemini, against no marginal cost and a few seconds for the Poisson features. These figures depend on the judge model, prompt length, and the pricing and speed at the time. For context on the generation side, producing one paper through four requests cost about US$0.04 for GPT-4o, about US$0.13 for Claude, and about US$0.002 for Llama 3.3 70B, through the gateway we used.</w:t>
       </w:r>
     </w:p>
     <w:bookmarkEnd w:id="41"/>
@@ -3845,7 +3902,7 @@
         <w:pStyle w:val="BodyText"/>
       </w:pPr>
       <w:r>
-        <w:t xml:space="preserve">The judge comparison adds a sobering point. A zero-shot GPT-4o judge was not a strong detector here, and for Claude it was misleading in the wrong direction. We would not generalize this to all judges or all prompts, since we tested one judge with one prompt and no examples. But it suggests that asking a language model whether a paper looks machine-written is not a safe default, particularly as generators improve. Cheap, supervised screens built on explainable features did better, at no marginal cost, provided that some examples of machine text were available. Neither approach is a decision rule, and both need to be refreshed as models change.</w:t>
+        <w:t xml:space="preserve">The judge comparison shows that the usefulness of an LLM judge depends strongly on which model is asked. GPT-4o as a judge was weak and, for Claude papers, wrong in the wrong direction. Gemini 2.5 Pro was excellent on GPT-4o and Llama papers with almost no false alarms on human papers, and it beat our cheap detectors there. The same judge almost never flagged Claude papers, which suggests that a strong judge can have a blind spot for the strongest generators. This blind spot is the more worrying finding, since a screening organization would not know in advance which kind of generator it faces. The Poisson-based features were weaker than the strong judge on two generators and stronger on the third, and they cost orders of magnitude less. The two approaches therefore look complementary, with a cheap statistical screen as a first filter and an expensive judge for the cases it flags, but we did not test that combination and do not claim it works. We also tested one prompt and no examples for each judge, and a few-shot or fine-tuned judge could behave differently.</w:t>
       </w:r>
     </w:p>
     <w:p>
@@ -4147,13 +4204,13 @@
           <w:bCs/>
           <w:b/>
         </w:rPr>
-        <w:t xml:space="preserve">One LLM judge, no embedding metrics.</w:t>
-      </w:r>
-      <w:r>
-        <w:t xml:space="preserve"> </w:t>
-      </w:r>
-      <w:r>
-        <w:t xml:space="preserve">We tested a single zero-shot judge (GPT-4o), with one prompt, on 500 excerpts of 2,000 tokens. GPT-4o is also a generator, so its results on GPT-4o papers involve self-recognition, and a judge that is not a generator has not been run. A different judge, a few-shot prompt, a fine-tuned judge, or full papers might do better. The Poisson detectors use labeled examples that the judge does not. We did not run MAUVE or BERTScore, so claims of advantage over embedding-based metrics are not supported.</w:t>
+        <w:t xml:space="preserve">Two LLM judges, no embedding metrics.</w:t>
+      </w:r>
+      <w:r>
+        <w:t xml:space="preserve"> </w:t>
+      </w:r>
+      <w:r>
+        <w:t xml:space="preserve">We tested two zero-shot judges (GPT-4o and Gemini 2.5 Pro), with one prompt, on 500 excerpts of 2,000 tokens. GPT-4o is also a generator, so its results on GPT-4o papers involve self-recognition. Twelve Gemini answers (2.4%) were unreadable and were excluded; scoring them as 50 gave the same conclusions. A different prompt, a few-shot or fine-tuned judge, or full papers might do better, and other judges may differ from the two we tried. The Poisson detectors use labeled examples that the judges do not. We did not run MAUVE or BERTScore, so claims of advantage over embedding-based metrics are not supported.</w:t>
       </w:r>
     </w:p>
     <w:p>
@@ -4193,7 +4250,7 @@
         <w:pStyle w:val="FirstParagraph"/>
       </w:pPr>
       <w:r>
-        <w:t xml:space="preserve">Five steps would turn this pilot into a test of the full proposal. (i) Add further generators, including more open-weight models and future releases, and evaluate each as held out, together with a negative binomial reference in place of the Poisson benchmark. (ii) Add a second LLM judge that is not one of the generators, a few-shot judge, and MAUVE and BERTScore, on identical documents, recording latency and cost. (iii) Test robustness to paraphrasing and light human editing, and replicate the clustering model on new documents and generators, ideally with full likelihood estimation (for example, a log-Gaussian Cox process) in place of moment matching. (iv) Conduct a randomized experiment in which domain experts classify real and fabricated papers under three conditions (no indicator, an unexplained AI score, and an explainable event-based indicator), analyzed with ANOVA and planned contrasts after an a priori power analysis. Pre-registering the feature list, windows, and analysis plan would guard against analytic flexibility.</w:t>
+        <w:t xml:space="preserve">Five steps would turn this pilot into a test of the full proposal. (i) Add further generators, including more open-weight models and future releases, and evaluate each as held out, together with a negative binomial reference in place of the Poisson benchmark. (ii) Add few-shot and fine-tuned judges, a test of combining a cheap statistical screen with a judge, and MAUVE and BERTScore, on identical documents, recording latency and cost. (iii) Test robustness to paraphrasing and light human editing, and replicate the clustering model on new documents and generators, ideally with full likelihood estimation (for example, a log-Gaussian Cox process) in place of moment matching. (iv) Conduct a randomized experiment in which domain experts classify real and fabricated papers under three conditions (no indicator, an unexplained AI score, and an explainable event-based indicator), analyzed with ANOVA and planned contrasts after an a priori power analysis. Pre-registering the feature list, windows, and analysis plan would guard against analytic flexibility.</w:t>
       </w:r>
     </w:p>
     <w:bookmarkEnd w:id="45"/>
@@ -4211,7 +4268,7 @@
         <w:pStyle w:val="FirstParagraph"/>
       </w:pPr>
       <w:r>
-        <w:t xml:space="preserve">Counting small linguistic events is a cheap and transparent way to screen scholarly text, but the simplest version of the idea, measuring distance from a Poisson process, does not work, because human text is not Poisson. A richer set of count-based features detects machine-generated papers well within a generator, but accuracy falls to between 0.73 and 0.81 on an unseen generator. Dispersion transfers better than event rates, and that is the clearest sign in our data that the count-process view captures something general. Detectors built on human text alone, which would avoid the need for generator examples, performed near chance. A model of clustering across scales improved detection modestly and consistently, and the improvement held in a test fixed in advance on an unseen open-weight generator (AUC 0.89 to 0.93). In a blind comparison, the Poisson-based detectors outperformed a zero-shot GPT-4o judge at no marginal cost, though they rely on examples of machine text that the judge does not. The evidence is limited to three generators, one genre, and one judge, and whether the approach helps human reviewers or outperforms embedding-based metrics remains untested.</w:t>
+        <w:t xml:space="preserve">Counting small linguistic events is a cheap and transparent way to screen scholarly text, but the simplest version of the idea, measuring distance from a Poisson process, does not work, because human text is not Poisson. A richer set of count-based features detects machine-generated papers well within a generator, but accuracy falls to between 0.73 and 0.81 on an unseen generator. Dispersion transfers better than event rates, and that is the clearest sign in our data that the count-process view captures something general. Detectors built on human text alone, which would avoid the need for generator examples, performed near chance. A model of clustering across scales improved detection modestly and consistently, and the improvement held in a test fixed in advance on an unseen open-weight generator (AUC 0.89 to 0.93). In a blind comparison with two zero-shot LLM judges, the Poisson-based detectors beat GPT-4o as judge, trailed a stronger judge (Gemini 2.5 Pro) on two generators, and beat it on the third, Claude, which both judges rarely flagged; they did so at no marginal cost, though they rely on examples of machine text that the judges do not. The evidence is limited to three generators, one genre, and two judges, and whether the approach helps human reviewers or outperforms embedding-based metrics remains untested.</w:t>
       </w:r>
     </w:p>
     <w:bookmarkEnd w:id="46"/>

</xml_diff>

<commit_message>
Add pre-specified fusion of Poisson screen and LLM judge; update paper
Co-Authored-By: Claude Sonnet 5.5 <noreply@anthropic.com>
Claude-Session: https://claude.ai/code/session_01FLb7uVf7YBgdoa75gbZ2sf
</commit_message>
<xml_diff>
--- a/paper/Poisson_LLM_Pilot_Paper_MISQ.docx
+++ b/paper/Poisson_LLM_Pilot_Paper_MISQ.docx
@@ -176,7 +176,7 @@
         <w:pStyle w:val="FirstParagraph"/>
       </w:pPr>
       <w:r>
-        <w:t xml:space="preserve">Organizations that publish or archive scholarly documents now face a screening problem: language models can produce papers faster and more cheaply than anyone can check them. Two common remedies, LLM-as-a-judge and embedding-based similarity metrics, are either expensive and prompt-dependent or insensitive to fine-grained statistical structure. We study a lightweight alternative that treats the occurrence of selected linguistic events (special punctuation, discourse markers, passive constructions, nominalizations) as count processes and asks how far a document departs from human-authored text. Using 474 human-written papers from PubMed Central and arXiv (2015–2019) and matched papers from three generators (GPT-4o, 245 papers; Claude Sonnet 5.5, 152; Llama 3.3 70B, 202), we report seven findings. First, human text is not Poisson: for punctuation events, 36–49% of documents reject the Poisson null because of over-dispersion. Second, a single Poisson-distance index performs near chance (AUC 0.51–0.54). Third, a vector of event rates and dispersion indices separates human from machine text well when the detector is trained and tested on the same generator (AUC 0.91–0.99), but not across generators: a detector trained on GPT-4o reaches 0.73 on Claude. Fourth, dispersion transfers better than event rates, which differ in sign across generators. Fifth, detectors trained on human papers alone perform near chance to modestly above it. Sixth, we propose a scale-dependent clustering model, a doubly stochastic (Cox) Poisson process summarized by how the Fano factor changes with window size. In a test specified before the Llama data were collected, it raised AUC on the unseen Llama papers from 0.89 to 0.93 (difference +0.046, 95% interval 0.030 to 0.063). Seventh, in a blind comparison on 500 excerpts with two zero-shot LLM judges, the answer depended on the judge and on the generator. GPT-4o as judge reached AUCs of 0.76, 0.45, and 0.85 against GPT-4o, Claude, and Llama papers, below the Poisson-based detectors trained on the other generators (0.95, 0.77, and 0.93). Gemini 2.5 Pro, a stronger judge that is not one of the generators, did better than those detectors on GPT-4o and Llama papers (0.97 and 0.97) but worse on Claude papers (0.66), which both judges almost never flagged. The Poisson features cost nothing per document, against about US$0.007 and 1.7 seconds for GPT-4o and US$0.017 and 23 seconds for Gemini, but unlike the judges they need labeled examples. The evidence is limited to three generators, one genre, and two judges, and we do not test adversarial editing, embedding-based metrics, or the effect on human reviewers.</w:t>
+        <w:t xml:space="preserve">Organizations that publish or archive scholarly documents now face a screening problem: language models can produce papers faster and more cheaply than anyone can check them. Two common remedies, LLM-as-a-judge and embedding-based similarity metrics, are either expensive and prompt-dependent or insensitive to fine-grained statistical structure. We study a lightweight alternative that treats the occurrence of selected linguistic events (special punctuation, discourse markers, passive constructions, nominalizations) as count processes and asks how far a document departs from human-authored text. Using 474 human-written papers from PubMed Central and arXiv (2015–2019) and matched papers from three generators (GPT-4o, 245 papers; Claude Sonnet 5.5, 152; Llama 3.3 70B, 202), we report eight findings. First, human text is not Poisson: for punctuation events, 36–49% of documents reject the Poisson null because of over-dispersion. Second, a single Poisson-distance index performs near chance (AUC 0.51–0.54). Third, a vector of event rates and dispersion indices separates human from machine text well when the detector is trained and tested on the same generator (AUC 0.91–0.99), but not across generators: a detector trained on GPT-4o reaches 0.73 on Claude. Fourth, dispersion transfers better than event rates, which differ in sign across generators. Fifth, detectors trained on human papers alone perform near chance to modestly above it. Sixth, we propose a scale-dependent clustering model, a doubly stochastic (Cox) Poisson process summarized by how the Fano factor changes with window size. In a test specified before the Llama data were collected, it raised AUC on the unseen Llama papers from 0.89 to 0.93 (difference +0.046, 95% interval 0.030 to 0.063). Seventh, in a blind comparison on 500 excerpts with two zero-shot LLM judges, the answer depended on the judge and on the generator. GPT-4o as judge reached AUCs of 0.76, 0.45, and 0.85 against GPT-4o, Claude, and Llama papers, below the Poisson-based detectors trained on the other generators (0.95, 0.77, and 0.93). Gemini 2.5 Pro, a stronger judge that is not one of the generators, did better than those detectors on GPT-4o and Llama papers (0.97 and 0.97) but worse on Claude papers (0.66), which both judges almost never flagged. Eighth, a label-free fusion of the Poisson screen with the Gemini judge, specified in advance, was better than either alone on GPT-4o and Llama papers (AUC 0.99 on both) and no worse than the screen on Claude papers (0.79), where it detected 39% of papers at a 5% false-positive rate, against 17% for the screen and 1% for the judge. The Poisson features cost nothing per document, against about US$0.007 and 1.7 seconds for GPT-4o and US$0.017 and 23 seconds for Gemini, but unlike the judges they need labeled examples. The evidence is limited to three generators, one genre, and two judges, and we do not test adversarial editing, embedding-based metrics, or the effect on human reviewers.</w:t>
       </w:r>
     </w:p>
     <w:p>
@@ -426,7 +426,7 @@
       </w:r>
     </w:p>
     <w:bookmarkEnd w:id="22"/>
-    <w:bookmarkStart w:id="30" w:name="data-and-measures"/>
+    <w:bookmarkStart w:id="31" w:name="data-and-measures"/>
     <w:p>
       <w:pPr>
         <w:pStyle w:val="Heading1"/>
@@ -740,8 +740,26 @@
       </w:r>
     </w:p>
     <w:bookmarkEnd w:id="29"/>
+    <w:bookmarkStart w:id="30" w:name="fusion-of-the-screen-and-a-judge"/>
+    <w:p>
+      <w:pPr>
+        <w:pStyle w:val="Heading2"/>
+      </w:pPr>
+      <w:r>
+        <w:t xml:space="preserve">3.8 Fusion of the screen and a judge</w:t>
+      </w:r>
+    </w:p>
+    <w:p>
+      <w:pPr>
+        <w:pStyle w:val="FirstParagraph"/>
+      </w:pPr>
+      <w:r>
+        <w:t xml:space="preserve">Because the two methods fail in different places, we also tested a simple combination. For each target generator, we took the new-feature Poisson score (trained on human papers plus the other two generators) and the Gemini judge’s score for the same documents, converted each to its rank within the evaluated pool of human and target papers (which uses no labels), and averaged the two ranks. This rank average (F1) was specified in advance as the primary fusion. Two secondary fusions were also specified: the larger of the two ranks (F2) and the average of the ranks from the Poisson score and both judges (F3). No weights were fitted, so the fusion adds no trainable parameters and cannot overfit the 500 judged documents. We report AUC, paired bootstrap differences against each component, and, descriptively, the share of machine-written papers detected when the threshold is set so that 5% of human papers are flagged.</w:t>
+      </w:r>
+    </w:p>
     <w:bookmarkEnd w:id="30"/>
-    <w:bookmarkStart w:id="42" w:name="results"/>
+    <w:bookmarkEnd w:id="31"/>
+    <w:bookmarkStart w:id="44" w:name="results"/>
     <w:p>
       <w:pPr>
         <w:pStyle w:val="Heading1"/>
@@ -750,7 +768,7 @@
         <w:t xml:space="preserve">4. Results</w:t>
       </w:r>
     </w:p>
-    <w:bookmarkStart w:id="34" w:name="human-text-is-not-poisson-rq1"/>
+    <w:bookmarkStart w:id="35" w:name="human-text-is-not-poisson-rq1"/>
     <w:p>
       <w:pPr>
         <w:pStyle w:val="Heading2"/>
@@ -1322,18 +1340,18 @@
           <wp:inline>
             <wp:extent cx="5334000" cy="2489200"/>
             <wp:effectExtent b="0" l="0" r="0" t="0"/>
-            <wp:docPr descr="Figure 1. Distribution of log2 dispersion indices by event for human-authored and GPT-4o papers. Dashed line: Poisson (index of 1). Square brackets for GPT-4o are degenerate because most synthetic papers contain none (index set to one by convention)." title="" id="32" name="Picture"/>
+            <wp:docPr descr="Figure 1. Distribution of log2 dispersion indices by event for human-authored and GPT-4o papers. Dashed line: Poisson (index of 1). Square brackets for GPT-4o are degenerate because most synthetic papers contain none (index set to one by convention)." title="" id="33" name="Picture"/>
             <a:graphic>
               <a:graphicData uri="http://schemas.openxmlformats.org/drawingml/2006/picture">
                 <pic:pic>
                   <pic:nvPicPr>
-                    <pic:cNvPr descr="fig_dispersion.png" id="33" name="Picture"/>
+                    <pic:cNvPr descr="fig_dispersion.png" id="34" name="Picture"/>
                     <pic:cNvPicPr>
                       <a:picLocks noChangeArrowheads="1" noChangeAspect="1"/>
                     </pic:cNvPicPr>
                   </pic:nvPicPr>
                   <pic:blipFill>
-                    <a:blip r:embed="rId31"/>
+                    <a:blip r:embed="rId32"/>
                     <a:stretch>
                       <a:fillRect/>
                     </a:stretch>
@@ -1376,8 +1394,8 @@
         <w:t xml:space="preserve">One caution applies to the passive result. Because we generated each paper section by section, and the four retained windows roughly track those sections, elevated passive dispersion may partly reflect a procedural artifact (passive voice is concentrated in methods text) rather than a general property of the models. We could not separate the two with the present data.</w:t>
       </w:r>
     </w:p>
-    <w:bookmarkEnd w:id="34"/>
-    <w:bookmarkStart w:id="35" w:name="detection-within-a-generator-rq2"/>
+    <w:bookmarkEnd w:id="35"/>
+    <w:bookmarkStart w:id="36" w:name="detection-within-a-generator-rq2"/>
     <w:p>
       <w:pPr>
         <w:pStyle w:val="Heading2"/>
@@ -1957,8 +1975,8 @@
         </w:tc>
       </w:tr>
     </w:tbl>
-    <w:bookmarkEnd w:id="35"/>
-    <w:bookmarkStart w:id="36" w:name="detection-across-generators-rq2"/>
+    <w:bookmarkEnd w:id="36"/>
+    <w:bookmarkStart w:id="37" w:name="detection-across-generators-rq2"/>
     <w:p>
       <w:pPr>
         <w:pStyle w:val="Heading2"/>
@@ -2259,8 +2277,8 @@
         <w:t xml:space="preserve">Two patterns stand out. First, the gap between within-generator and cross-generator AUC is large for every feature family, so a detector calibrated on one generator should not be assumed to protect against another. Second, rates transfer worst (0.66 and 0.73), and dispersion transfers better (0.70 and 0.81), matching or exceeding the combined model in the Claude-to-GPT-4o direction. This is consistent with the sign pattern in Table 2: rate differences reverse across generators, while dispersion differences for passives, quotation marks, and nominalizations point the same way (Table 1). Dispersion is the more portable signal, though even it is far from sufficient on its own.</w:t>
       </w:r>
     </w:p>
-    <w:bookmarkEnd w:id="36"/>
-    <w:bookmarkStart w:id="37" w:name="detection-from-human-text-alone-rq2"/>
+    <w:bookmarkEnd w:id="37"/>
+    <w:bookmarkStart w:id="38" w:name="detection-from-human-text-alone-rq2"/>
     <w:p>
       <w:pPr>
         <w:pStyle w:val="Heading2"/>
@@ -2627,8 +2645,8 @@
         <w:t xml:space="preserve">in which a generator differs from human writers. Human papers already vary widely among themselves in these features, across fields, sections, and authors, so machine text is rarely far from the human cloud in an absolute sense; it is displaced from the center in particular directions. A distance from the human distribution does not capture that displacement.</w:t>
       </w:r>
     </w:p>
-    <w:bookmarkEnd w:id="37"/>
-    <w:bookmarkStart w:id="38" w:name="X0521dbd98438490bc6effe6d1004fde65e11b6f"/>
+    <w:bookmarkEnd w:id="38"/>
+    <w:bookmarkStart w:id="39" w:name="X0521dbd98438490bc6effe6d1004fde65e11b6f"/>
     <w:p>
       <w:pPr>
         <w:pStyle w:val="Heading2"/>
@@ -3239,8 +3257,8 @@
         <w:t xml:space="preserve">The model does not rescue detection from human text alone on these data. A Mahalanobis detector on the new features reaches AUC 0.59 for GPT-4o and 0.49 for Claude, essentially the same as before. The improvement is therefore in how well a supervised detector can use the clustering structure, not in how well human text can define normality by itself.</w:t>
       </w:r>
     </w:p>
-    <w:bookmarkEnd w:id="38"/>
-    <w:bookmarkStart w:id="39" w:name="Xf249ecbb1b4e68a085d5da2640522efa39ff232"/>
+    <w:bookmarkEnd w:id="39"/>
+    <w:bookmarkStart w:id="40" w:name="Xf249ecbb1b4e68a085d5da2640522efa39ff232"/>
     <w:p>
       <w:pPr>
         <w:pStyle w:val="Heading2"/>
@@ -3491,8 +3509,8 @@
         <w:t xml:space="preserve">Three further results are exploratory and were not specified in advance. First, Llama is easy to detect within its own class: with human and Llama papers, the baseline reaches 0.962 and the new features 0.984, and with clustering features alone (no rates) the new model reaches 0.914 against 0.764 for the baseline dispersion index. Second, a detector trained on Llama transfers well to GPT-4o (baseline 0.938, new 0.969) but poorly to Claude (0.745 and 0.763), which reinforces the picture that Claude papers are the hardest of the three to detect from other generators. Third, a human-only Mahalanobis detector on the new features reaches 0.65 (0.60 to 0.69) on Llama, against 0.51 for the baseline, the first human-only result in our data clearly above chance. Even so, 0.65 is not a level we would deploy.</w:t>
       </w:r>
     </w:p>
-    <w:bookmarkEnd w:id="39"/>
-    <w:bookmarkStart w:id="40" w:name="comparison-with-llm-judges-rq2-rq3"/>
+    <w:bookmarkEnd w:id="40"/>
+    <w:bookmarkStart w:id="41" w:name="comparison-with-llm-judges-rq2-rq3"/>
     <w:p>
       <w:pPr>
         <w:pStyle w:val="Heading2"/>
@@ -3826,14 +3844,14 @@
         <w:t xml:space="preserve">This comparison has an important asymmetry. The Poisson-based detectors use labeled examples from other generators, and the judges use none, so they answer different practical questions: what can be done with no machine-text examples at all, and what a cheap screen achieves once some are available.</w:t>
       </w:r>
     </w:p>
-    <w:bookmarkEnd w:id="40"/>
-    <w:bookmarkStart w:id="41" w:name="cost-rq3"/>
+    <w:bookmarkEnd w:id="41"/>
+    <w:bookmarkStart w:id="42" w:name="combining-the-screen-with-a-judge-rq2"/>
     <w:p>
       <w:pPr>
         <w:pStyle w:val="Heading2"/>
       </w:pPr>
       <w:r>
-        <w:t xml:space="preserve">4.8 Cost (RQ3)</w:t>
+        <w:t xml:space="preserve">4.8 Combining the screen with a judge (RQ2)</w:t>
       </w:r>
     </w:p>
     <w:p>
@@ -3841,12 +3859,313 @@
         <w:pStyle w:val="FirstParagraph"/>
       </w:pPr>
       <w:r>
-        <w:t xml:space="preserve">Computing all events and the baseline indices took 4 to 6 milliseconds per document on one CPU core (roughly 160 to 230 documents per second, depending on machine load) with no external service calls, so the marginal monetary cost is zero. For the judges we measured about US$0.0073 and 1.7 seconds per excerpt for GPT-4o (US$3.63 for 500 excerpts) and about US$0.0174 and 23.4 seconds per excerpt for Gemini 2.5 Pro (US$8.68), whose cost includes the reasoning tokens it produced. Screening 1,000 documents would thus cost about US$7 and half an hour of sequential calls with GPT-4o, and about US$17 and more than six hours with Gemini, against no marginal cost and a few seconds for the Poisson features. These figures depend on the judge model, prompt length, and the pricing and speed at the time. For context on the generation side, producing one paper through four requests cost about US$0.04 for GPT-4o, about US$0.13 for Claude, and about US$0.002 for Llama 3.3 70B, through the gateway we used.</w:t>
-      </w:r>
-    </w:p>
-    <w:bookmarkEnd w:id="41"/>
+        <w:t xml:space="preserve">Table 8 reports the primary fusion. Averaging the ranks of the Poisson screen and the Gemini judge gave an AUC of 0.994 on GPT-4o papers and 0.989 on Llama papers, better than either component alone. The gain over the Gemini judge is small but clear (+0.022, 95% interval 0.008 to 0.040, for GPT-4o; +0.014, 0.001 to 0.031, for Llama), and the gain over the Poisson screen is larger (+0.048 and +0.055). On Claude papers the fusion reached 0.790, far above the judge (+0.134, interval 0.092 to 0.177) but not distinguishable from the Poisson screen alone (+0.015, interval −0.028 to 0.059).</w:t>
+      </w:r>
+    </w:p>
+    <w:p>
+      <w:pPr>
+        <w:pStyle w:val="TableCaption"/>
+      </w:pPr>
+      <w:r>
+        <w:t xml:space="preserve">Table 8. AUC (95% bootstrap interval) of the primary fusion (F1, mean rank of the Poisson score and the Gemini score) and its components on the same documents as Table 7, and the share of machine-written papers detected at a 5% false-positive rate on human papers. The 5% thresholds are set on the same documents and are descriptive, not estimates of deployed performance.</w:t>
+      </w:r>
+    </w:p>
+    <w:tbl>
+      <w:tblPr>
+        <w:tblStyle w:val="Table"/>
+        <w:tblW w:type="pct" w:w="5000"/>
+        <w:tblLook w:firstRow="1" w:lastRow="0" w:firstColumn="0" w:lastColumn="0" w:noHBand="0" w:noVBand="0" w:val="0020"/>
+        <w:jc w:val="start"/>
+        <w:tblCaption w:val="Table 8. AUC (95% bootstrap interval) of the primary fusion (F1, mean rank of the Poisson score and the Gemini score) and its components on the same documents as Table 7, and the share of machine-written papers detected at a 5% false-positive rate on human papers. The 5% thresholds are set on the same documents and are descriptive, not estimates of deployed performance."/>
+      </w:tblPr>
+      <w:tblGrid>
+        <w:gridCol w:w="1584"/>
+        <w:gridCol w:w="1584"/>
+        <w:gridCol w:w="1584"/>
+        <w:gridCol w:w="1584"/>
+        <w:gridCol w:w="1584"/>
+      </w:tblGrid>
+      <w:tr>
+        <w:trPr>
+          <w:tblHeader w:val="true"/>
+        </w:trPr>
+        <w:tc>
+          <w:tcPr/>
+          <w:p>
+            <w:pPr>
+              <w:pStyle w:val="Compact"/>
+              <w:jc w:val="left"/>
+            </w:pPr>
+            <w:r>
+              <w:t xml:space="preserve">Target generator</w:t>
+            </w:r>
+          </w:p>
+        </w:tc>
+        <w:tc>
+          <w:tcPr/>
+          <w:p>
+            <w:pPr>
+              <w:pStyle w:val="Compact"/>
+              <w:jc w:val="left"/>
+            </w:pPr>
+            <w:r>
+              <w:t xml:space="preserve">Poisson new</w:t>
+            </w:r>
+          </w:p>
+        </w:tc>
+        <w:tc>
+          <w:tcPr/>
+          <w:p>
+            <w:pPr>
+              <w:pStyle w:val="Compact"/>
+              <w:jc w:val="left"/>
+            </w:pPr>
+            <w:r>
+              <w:t xml:space="preserve">Gemini judge</w:t>
+            </w:r>
+          </w:p>
+        </w:tc>
+        <w:tc>
+          <w:tcPr/>
+          <w:p>
+            <w:pPr>
+              <w:pStyle w:val="Compact"/>
+              <w:jc w:val="left"/>
+            </w:pPr>
+            <w:r>
+              <w:t xml:space="preserve">Fusion F1</w:t>
+            </w:r>
+          </w:p>
+        </w:tc>
+        <w:tc>
+          <w:tcPr/>
+          <w:p>
+            <w:pPr>
+              <w:pStyle w:val="Compact"/>
+              <w:jc w:val="left"/>
+            </w:pPr>
+            <w:r>
+              <w:t xml:space="preserve">TPR at 5% FPR: Poisson / Gemini / F1</w:t>
+            </w:r>
+          </w:p>
+        </w:tc>
+      </w:tr>
+      <w:tr>
+        <w:tc>
+          <w:tcPr/>
+          <w:p>
+            <w:pPr>
+              <w:pStyle w:val="Compact"/>
+              <w:jc w:val="left"/>
+            </w:pPr>
+            <w:r>
+              <w:t xml:space="preserve">GPT-4o</w:t>
+            </w:r>
+          </w:p>
+        </w:tc>
+        <w:tc>
+          <w:tcPr/>
+          <w:p>
+            <w:pPr>
+              <w:pStyle w:val="Compact"/>
+              <w:jc w:val="left"/>
+            </w:pPr>
+            <w:r>
+              <w:t xml:space="preserve">0.946 [0.92, 0.97]</w:t>
+            </w:r>
+          </w:p>
+        </w:tc>
+        <w:tc>
+          <w:tcPr/>
+          <w:p>
+            <w:pPr>
+              <w:pStyle w:val="Compact"/>
+              <w:jc w:val="left"/>
+            </w:pPr>
+            <w:r>
+              <w:t xml:space="preserve">0.972 [0.95, 0.99]</w:t>
+            </w:r>
+          </w:p>
+        </w:tc>
+        <w:tc>
+          <w:tcPr/>
+          <w:p>
+            <w:pPr>
+              <w:pStyle w:val="Compact"/>
+              <w:jc w:val="left"/>
+            </w:pPr>
+            <w:r>
+              <w:t xml:space="preserve">0.994 [0.99, 1.00]</w:t>
+            </w:r>
+          </w:p>
+        </w:tc>
+        <w:tc>
+          <w:tcPr/>
+          <w:p>
+            <w:pPr>
+              <w:pStyle w:val="Compact"/>
+              <w:jc w:val="left"/>
+            </w:pPr>
+            <w:r>
+              <w:t xml:space="preserve">0.64 / 0.87 / 0.98</w:t>
+            </w:r>
+          </w:p>
+        </w:tc>
+      </w:tr>
+      <w:tr>
+        <w:tc>
+          <w:tcPr/>
+          <w:p>
+            <w:pPr>
+              <w:pStyle w:val="Compact"/>
+              <w:jc w:val="left"/>
+            </w:pPr>
+            <w:r>
+              <w:t xml:space="preserve">Claude</w:t>
+            </w:r>
+          </w:p>
+        </w:tc>
+        <w:tc>
+          <w:tcPr/>
+          <w:p>
+            <w:pPr>
+              <w:pStyle w:val="Compact"/>
+              <w:jc w:val="left"/>
+            </w:pPr>
+            <w:r>
+              <w:t xml:space="preserve">0.775 [0.72, 0.83]</w:t>
+            </w:r>
+          </w:p>
+        </w:tc>
+        <w:tc>
+          <w:tcPr/>
+          <w:p>
+            <w:pPr>
+              <w:pStyle w:val="Compact"/>
+              <w:jc w:val="left"/>
+            </w:pPr>
+            <w:r>
+              <w:t xml:space="preserve">0.656 [0.59, 0.72]</w:t>
+            </w:r>
+          </w:p>
+        </w:tc>
+        <w:tc>
+          <w:tcPr/>
+          <w:p>
+            <w:pPr>
+              <w:pStyle w:val="Compact"/>
+              <w:jc w:val="left"/>
+            </w:pPr>
+            <w:r>
+              <w:t xml:space="preserve">0.790 [0.73, 0.84]</w:t>
+            </w:r>
+          </w:p>
+        </w:tc>
+        <w:tc>
+          <w:tcPr/>
+          <w:p>
+            <w:pPr>
+              <w:pStyle w:val="Compact"/>
+              <w:jc w:val="left"/>
+            </w:pPr>
+            <w:r>
+              <w:t xml:space="preserve">0.17 / 0.01 / 0.39</w:t>
+            </w:r>
+          </w:p>
+        </w:tc>
+      </w:tr>
+      <w:tr>
+        <w:tc>
+          <w:tcPr/>
+          <w:p>
+            <w:pPr>
+              <w:pStyle w:val="Compact"/>
+              <w:jc w:val="left"/>
+            </w:pPr>
+            <w:r>
+              <w:t xml:space="preserve">Llama</w:t>
+            </w:r>
+          </w:p>
+        </w:tc>
+        <w:tc>
+          <w:tcPr/>
+          <w:p>
+            <w:pPr>
+              <w:pStyle w:val="Compact"/>
+              <w:jc w:val="left"/>
+            </w:pPr>
+            <w:r>
+              <w:t xml:space="preserve">0.933 [0.90, 0.96]</w:t>
+            </w:r>
+          </w:p>
+        </w:tc>
+        <w:tc>
+          <w:tcPr/>
+          <w:p>
+            <w:pPr>
+              <w:pStyle w:val="Compact"/>
+              <w:jc w:val="left"/>
+            </w:pPr>
+            <w:r>
+              <w:t xml:space="preserve">0.974 [0.95, 0.99]</w:t>
+            </w:r>
+          </w:p>
+        </w:tc>
+        <w:tc>
+          <w:tcPr/>
+          <w:p>
+            <w:pPr>
+              <w:pStyle w:val="Compact"/>
+              <w:jc w:val="left"/>
+            </w:pPr>
+            <w:r>
+              <w:t xml:space="preserve">0.989 [0.98, 1.00]</w:t>
+            </w:r>
+          </w:p>
+        </w:tc>
+        <w:tc>
+          <w:tcPr/>
+          <w:p>
+            <w:pPr>
+              <w:pStyle w:val="Compact"/>
+              <w:jc w:val="left"/>
+            </w:pPr>
+            <w:r>
+              <w:t xml:space="preserve">0.73 / 0.89 / 0.96</w:t>
+            </w:r>
+          </w:p>
+        </w:tc>
+      </w:tr>
+    </w:tbl>
+    <w:p>
+      <w:pPr>
+        <w:pStyle w:val="BodyText"/>
+      </w:pPr>
+      <w:r>
+        <w:t xml:space="preserve">The share of papers detected at a 5% false-positive rate shows the practical effect more plainly. For GPT-4o papers, the fusion detects 98% against 87% for the judge and 64% for the screen; for Llama papers, 96% against 89% and 73%; and for Claude papers, 39% against 17% for the screen and 1% for the judge. The secondary fusions were less useful: taking the larger rank (F2) was no better than the judge for GPT-4o and Llama and worse than the screen for Claude, and adding the weak GPT-4o judge (F3) did not help beyond F1.</w:t>
+      </w:r>
+    </w:p>
     <w:bookmarkEnd w:id="42"/>
-    <w:bookmarkStart w:id="43" w:name="discussion"/>
+    <w:bookmarkStart w:id="43" w:name="cost-rq3"/>
+    <w:p>
+      <w:pPr>
+        <w:pStyle w:val="Heading2"/>
+      </w:pPr>
+      <w:r>
+        <w:t xml:space="preserve">4.9 Cost (RQ3)</w:t>
+      </w:r>
+    </w:p>
+    <w:p>
+      <w:pPr>
+        <w:pStyle w:val="FirstParagraph"/>
+      </w:pPr>
+      <w:r>
+        <w:t xml:space="preserve">Computing all events and the baseline indices took 4 to 6 milliseconds per document on one CPU core (roughly 160 to 230 documents per second, depending on machine load) with no external service calls, so the marginal monetary cost is zero. For the judges we measured about US$0.0073 and 1.7 seconds per excerpt for GPT-4o (US$3.63 for 500 excerpts) and about US$0.0174 and 23.4 seconds per excerpt for Gemini 2.5 Pro (US$8.68), whose cost includes the reasoning tokens it produced. Screening 1,000 documents would thus cost about US$7 and half an hour of sequential calls with GPT-4o, and about US$17 and more than six hours with Gemini, against no marginal cost and a few seconds for the Poisson features. The fusion of Section 4.8 uses the judge on every document, so it costs as much as the judge. These figures depend on the judge model, prompt length, and the pricing and speed at the time. For context on the generation side, producing one paper through four requests cost about US$0.04 for GPT-4o, about US$0.13 for Claude, and about US$0.002 for Llama 3.3 70B, through the gateway we used.</w:t>
+      </w:r>
+    </w:p>
+    <w:bookmarkEnd w:id="43"/>
+    <w:bookmarkEnd w:id="44"/>
+    <w:bookmarkStart w:id="45" w:name="discussion"/>
     <w:p>
       <w:pPr>
         <w:pStyle w:val="Heading1"/>
@@ -3902,7 +4221,7 @@
         <w:pStyle w:val="BodyText"/>
       </w:pPr>
       <w:r>
-        <w:t xml:space="preserve">The judge comparison shows that the usefulness of an LLM judge depends strongly on which model is asked. GPT-4o as a judge was weak and, for Claude papers, wrong in the wrong direction. Gemini 2.5 Pro was excellent on GPT-4o and Llama papers with almost no false alarms on human papers, and it beat our cheap detectors there. The same judge almost never flagged Claude papers, which suggests that a strong judge can have a blind spot for the strongest generators. This blind spot is the more worrying finding, since a screening organization would not know in advance which kind of generator it faces. The Poisson-based features were weaker than the strong judge on two generators and stronger on the third, and they cost orders of magnitude less. The two approaches therefore look complementary, with a cheap statistical screen as a first filter and an expensive judge for the cases it flags, but we did not test that combination and do not claim it works. We also tested one prompt and no examples for each judge, and a few-shot or fine-tuned judge could behave differently.</w:t>
+        <w:t xml:space="preserve">The judge comparison shows that the usefulness of an LLM judge depends strongly on which model is asked. GPT-4o as a judge was weak and, for Claude papers, wrong in the wrong direction. Gemini 2.5 Pro was excellent on GPT-4o and Llama papers with almost no false alarms on human papers, and it beat our cheap detectors there. The same judge almost never flagged Claude papers, which suggests that a strong judge can have a blind spot for the strongest generators. This blind spot is the more worrying finding, since a screening organization would not know in advance which kind of generator it faces. The Poisson-based features were weaker than the strong judge on two generators and stronger on the third, and they cost orders of magnitude less. The two approaches also look complementary: a simple rank average of the statistical screen and the strong judge, specified in advance, improved on either alone for two generators and detected far more Claude papers than the judge did (Section 4.8). We stress that the fusion needs a batch of documents for the rank normalization, was evaluated on 500 documents, and runs the judge on every document, so it has none of the cost advantage of the screen alone. A cascade in which the judge sees only the documents the screen flags is a different design that we did not test. We also tested one prompt and no examples for each judge, and a few-shot or fine-tuned judge could behave differently.</w:t>
       </w:r>
     </w:p>
     <w:p>
@@ -3931,8 +4250,8 @@
         <w:t xml:space="preserve">can be explained to an author or editor, and it costs nothing to compute. It should therefore be treated as a low-cost first filter whose output is routed to human review, not as grounds for action on its own.</w:t>
       </w:r>
     </w:p>
-    <w:bookmarkEnd w:id="43"/>
-    <w:bookmarkStart w:id="44" w:name="limitations"/>
+    <w:bookmarkEnd w:id="45"/>
+    <w:bookmarkStart w:id="46" w:name="limitations"/>
     <w:p>
       <w:pPr>
         <w:pStyle w:val="Heading1"/>
@@ -4226,6 +4545,28 @@
           <w:bCs/>
           <w:b/>
         </w:rPr>
+        <w:t xml:space="preserve">Fusion.</w:t>
+      </w:r>
+      <w:r>
+        <w:t xml:space="preserve"> </w:t>
+      </w:r>
+      <w:r>
+        <w:t xml:space="preserve">The fusion was specified in advance but evaluated on the same 500 documents as the component comparisons, with a small number of papers per generator. Rank normalization depends on the mix of documents in the pool, the 5%-false-positive thresholds are set on the evaluated documents and are therefore optimistic, and the gain over the Poisson screen on Claude papers is not statistically distinguishable from zero in AUC.</w:t>
+      </w:r>
+    </w:p>
+    <w:p>
+      <w:pPr>
+        <w:numPr>
+          <w:ilvl w:val="0"/>
+          <w:numId w:val="1002"/>
+        </w:numPr>
+        <w:pStyle w:val="Compact"/>
+      </w:pPr>
+      <w:r>
+        <w:rPr>
+          <w:bCs/>
+          <w:b/>
+        </w:rPr>
         <w:t xml:space="preserve">No reviewer experiment.</w:t>
       </w:r>
       <w:r>
@@ -4235,8 +4576,8 @@
         <w:t xml:space="preserve">We did not test whether explainable evidence improves the decisions of human reviewers.</w:t>
       </w:r>
     </w:p>
-    <w:bookmarkEnd w:id="44"/>
-    <w:bookmarkStart w:id="45" w:name="planned-extensions"/>
+    <w:bookmarkEnd w:id="46"/>
+    <w:bookmarkStart w:id="47" w:name="planned-extensions"/>
     <w:p>
       <w:pPr>
         <w:pStyle w:val="Heading1"/>
@@ -4250,11 +4591,11 @@
         <w:pStyle w:val="FirstParagraph"/>
       </w:pPr>
       <w:r>
-        <w:t xml:space="preserve">Five steps would turn this pilot into a test of the full proposal. (i) Add further generators, including more open-weight models and future releases, and evaluate each as held out, together with a negative binomial reference in place of the Poisson benchmark. (ii) Add few-shot and fine-tuned judges, a test of combining a cheap statistical screen with a judge, and MAUVE and BERTScore, on identical documents, recording latency and cost. (iii) Test robustness to paraphrasing and light human editing, and replicate the clustering model on new documents and generators, ideally with full likelihood estimation (for example, a log-Gaussian Cox process) in place of moment matching. (iv) Conduct a randomized experiment in which domain experts classify real and fabricated papers under three conditions (no indicator, an unexplained AI score, and an explainable event-based indicator), analyzed with ANOVA and planned contrasts after an a priori power analysis. Pre-registering the feature list, windows, and analysis plan would guard against analytic flexibility.</w:t>
-      </w:r>
-    </w:p>
-    <w:bookmarkEnd w:id="45"/>
-    <w:bookmarkStart w:id="46" w:name="conclusion"/>
+        <w:t xml:space="preserve">Five steps would turn this pilot into a test of the full proposal. (i) Add further generators, including more open-weight models and future releases, and evaluate each as held out, together with a negative binomial reference in place of the Poisson benchmark. (ii) Add few-shot and fine-tuned judges, a test of a cascade in which the judge sees only documents flagged by the cheap screen, and MAUVE and BERTScore, on identical documents, recording latency and cost. (iii) Test robustness to paraphrasing and light human editing, and replicate the clustering model on new documents and generators, ideally with full likelihood estimation (for example, a log-Gaussian Cox process) in place of moment matching. (iv) Conduct a randomized experiment in which domain experts classify real and fabricated papers under three conditions (no indicator, an unexplained AI score, and an explainable event-based indicator), analyzed with ANOVA and planned contrasts after an a priori power analysis. Pre-registering the feature list, windows, and analysis plan would guard against analytic flexibility.</w:t>
+      </w:r>
+    </w:p>
+    <w:bookmarkEnd w:id="47"/>
+    <w:bookmarkStart w:id="48" w:name="conclusion"/>
     <w:p>
       <w:pPr>
         <w:pStyle w:val="Heading1"/>
@@ -4268,11 +4609,11 @@
         <w:pStyle w:val="FirstParagraph"/>
       </w:pPr>
       <w:r>
-        <w:t xml:space="preserve">Counting small linguistic events is a cheap and transparent way to screen scholarly text, but the simplest version of the idea, measuring distance from a Poisson process, does not work, because human text is not Poisson. A richer set of count-based features detects machine-generated papers well within a generator, but accuracy falls to between 0.73 and 0.81 on an unseen generator. Dispersion transfers better than event rates, and that is the clearest sign in our data that the count-process view captures something general. Detectors built on human text alone, which would avoid the need for generator examples, performed near chance. A model of clustering across scales improved detection modestly and consistently, and the improvement held in a test fixed in advance on an unseen open-weight generator (AUC 0.89 to 0.93). In a blind comparison with two zero-shot LLM judges, the Poisson-based detectors beat GPT-4o as judge, trailed a stronger judge (Gemini 2.5 Pro) on two generators, and beat it on the third, Claude, which both judges rarely flagged; they did so at no marginal cost, though they rely on examples of machine text that the judges do not. The evidence is limited to three generators, one genre, and two judges, and whether the approach helps human reviewers or outperforms embedding-based metrics remains untested.</w:t>
-      </w:r>
-    </w:p>
-    <w:bookmarkEnd w:id="46"/>
-    <w:bookmarkStart w:id="47" w:name="references"/>
+        <w:t xml:space="preserve">Counting small linguistic events is a cheap and transparent way to screen scholarly text, but the simplest version of the idea, measuring distance from a Poisson process, does not work, because human text is not Poisson. A richer set of count-based features detects machine-generated papers well within a generator, but accuracy falls to between 0.73 and 0.81 on an unseen generator. Dispersion transfers better than event rates, and that is the clearest sign in our data that the count-process view captures something general. Detectors built on human text alone, which would avoid the need for generator examples, performed near chance. A model of clustering across scales improved detection modestly and consistently, and the improvement held in a test fixed in advance on an unseen open-weight generator (AUC 0.89 to 0.93). In a blind comparison with two zero-shot LLM judges, the Poisson-based detectors beat GPT-4o as judge, trailed a stronger judge (Gemini 2.5 Pro) on two generators, and beat it on the third, Claude, which both judges rarely flagged; they did so at no marginal cost, though they rely on examples of machine text that the judges do not. A simple fusion of the screen with the stronger judge improved on either alone for two generators and detected far more Claude papers than the judge did, but it requires running the judge on every document. The evidence is limited to three generators, one genre, and two judges, and whether the approach helps human reviewers or outperforms embedding-based metrics remains untested.</w:t>
+      </w:r>
+    </w:p>
+    <w:bookmarkEnd w:id="48"/>
+    <w:bookmarkStart w:id="49" w:name="references"/>
     <w:p>
       <w:pPr>
         <w:pStyle w:val="Heading1"/>
@@ -4554,7 +4895,7 @@
         <w:t xml:space="preserve">(36).</w:t>
       </w:r>
     </w:p>
-    <w:bookmarkEnd w:id="47"/>
+    <w:bookmarkEnd w:id="49"/>
     <w:sectPr/>
   </w:body>
 </w:document>

</xml_diff>

<commit_message>
Add cascade simulation (screen then judge); update paper
Co-Authored-By: Claude Sonnet 5.5 <noreply@anthropic.com>
Claude-Session: https://claude.ai/code/session_01FLb7uVf7YBgdoa75gbZ2sf
</commit_message>
<xml_diff>
--- a/paper/Poisson_LLM_Pilot_Paper_MISQ.docx
+++ b/paper/Poisson_LLM_Pilot_Paper_MISQ.docx
@@ -176,7 +176,7 @@
         <w:pStyle w:val="FirstParagraph"/>
       </w:pPr>
       <w:r>
-        <w:t xml:space="preserve">Organizations that publish or archive scholarly documents now face a screening problem: language models can produce papers faster and more cheaply than anyone can check them. Two common remedies, LLM-as-a-judge and embedding-based similarity metrics, are either expensive and prompt-dependent or insensitive to fine-grained statistical structure. We study a lightweight alternative that treats the occurrence of selected linguistic events (special punctuation, discourse markers, passive constructions, nominalizations) as count processes and asks how far a document departs from human-authored text. Using 474 human-written papers from PubMed Central and arXiv (2015–2019) and matched papers from three generators (GPT-4o, 245 papers; Claude Sonnet 5.5, 152; Llama 3.3 70B, 202), we report eight findings. First, human text is not Poisson: for punctuation events, 36–49% of documents reject the Poisson null because of over-dispersion. Second, a single Poisson-distance index performs near chance (AUC 0.51–0.54). Third, a vector of event rates and dispersion indices separates human from machine text well when the detector is trained and tested on the same generator (AUC 0.91–0.99), but not across generators: a detector trained on GPT-4o reaches 0.73 on Claude. Fourth, dispersion transfers better than event rates, which differ in sign across generators. Fifth, detectors trained on human papers alone perform near chance to modestly above it. Sixth, we propose a scale-dependent clustering model, a doubly stochastic (Cox) Poisson process summarized by how the Fano factor changes with window size. In a test specified before the Llama data were collected, it raised AUC on the unseen Llama papers from 0.89 to 0.93 (difference +0.046, 95% interval 0.030 to 0.063). Seventh, in a blind comparison on 500 excerpts with two zero-shot LLM judges, the answer depended on the judge and on the generator. GPT-4o as judge reached AUCs of 0.76, 0.45, and 0.85 against GPT-4o, Claude, and Llama papers, below the Poisson-based detectors trained on the other generators (0.95, 0.77, and 0.93). Gemini 2.5 Pro, a stronger judge that is not one of the generators, did better than those detectors on GPT-4o and Llama papers (0.97 and 0.97) but worse on Claude papers (0.66), which both judges almost never flagged. Eighth, a label-free fusion of the Poisson screen with the Gemini judge, specified in advance, was better than either alone on GPT-4o and Llama papers (AUC 0.99 on both) and no worse than the screen on Claude papers (0.79), where it detected 39% of papers at a 5% false-positive rate, against 17% for the screen and 1% for the judge. The Poisson features cost nothing per document, against about US$0.007 and 1.7 seconds for GPT-4o and US$0.017 and 23 seconds for Gemini, but unlike the judges they need labeled examples. The evidence is limited to three generators, one genre, and two judges, and we do not test adversarial editing, embedding-based metrics, or the effect on human reviewers.</w:t>
+        <w:t xml:space="preserve">Organizations that publish or archive scholarly documents now face a screening problem: language models can produce papers faster and more cheaply than anyone can check them. Two common remedies, LLM-as-a-judge and embedding-based similarity metrics, are either expensive and prompt-dependent or insensitive to fine-grained statistical structure. We study a lightweight alternative that treats the occurrence of selected linguistic events (special punctuation, discourse markers, passive constructions, nominalizations) as count processes and asks how far a document departs from human-authored text. Using 474 human-written papers from PubMed Central and arXiv (2015–2019) and matched papers from three generators (GPT-4o, 245 papers; Claude Sonnet 5.5, 152; Llama 3.3 70B, 202), we report nine findings. First, human text is not Poisson: for punctuation events, 36–49% of documents reject the Poisson null because of over-dispersion. Second, a single Poisson-distance index performs near chance (AUC 0.51–0.54). Third, a vector of event rates and dispersion indices separates human from machine text well when the detector is trained and tested on the same generator (AUC 0.91–0.99), but not across generators: a detector trained on GPT-4o reaches 0.73 on Claude. Fourth, dispersion transfers better than event rates, which differ in sign across generators. Fifth, detectors trained on human papers alone perform near chance to modestly above it. Sixth, we propose a scale-dependent clustering model, a doubly stochastic (Cox) Poisson process summarized by how the Fano factor changes with window size. In a test specified before the Llama data were collected, it raised AUC on the unseen Llama papers from 0.89 to 0.93 (difference +0.046, 95% interval 0.030 to 0.063). Seventh, in a blind comparison on 500 excerpts with two zero-shot LLM judges, the answer depended on the judge and on the generator. GPT-4o as judge reached AUCs of 0.76, 0.45, and 0.85 against GPT-4o, Claude, and Llama papers, below the Poisson-based detectors trained on the other generators (0.95, 0.77, and 0.93). Gemini 2.5 Pro, a stronger judge that is not one of the generators, did better than those detectors on GPT-4o and Llama papers (0.97 and 0.97) but worse on Claude papers (0.66), which both judges almost never flagged. Eighth, a label-free fusion of the Poisson screen with the Gemini judge, specified in advance, was better than either alone on GPT-4o and Llama papers (AUC 0.99 on both) and no worse than the screen on Claude papers (0.79), where it detected 39% of papers at a 5% false-positive rate, against 17% for the screen and 1% for the judge. Ninth, in a simulated cascade in which the judge sees only the documents the Poisson screen scores highest, and machine papers are 10% of the pool, judging the top 30% detected as many GPT-4o papers as judging everything (95% at a 5% false-positive rate) at 30% of the cost, and judging the top 50% matched full judging for Llama papers (97% against 96%); Claude papers stayed hard (30% to 40%) at every setting, and savings shrink as the share of machine papers grows. The Poisson features cost nothing per document, against about US$0.007 and 1.7 seconds for GPT-4o and US$0.017 and 23 seconds for Gemini, but unlike the judges they need labeled examples. The evidence is limited to three generators, one genre, and two judges, and we do not test adversarial editing, embedding-based metrics, or the effect on human reviewers.</w:t>
       </w:r>
     </w:p>
     <w:p>
@@ -426,7 +426,7 @@
       </w:r>
     </w:p>
     <w:bookmarkEnd w:id="22"/>
-    <w:bookmarkStart w:id="31" w:name="data-and-measures"/>
+    <w:bookmarkStart w:id="32" w:name="data-and-measures"/>
     <w:p>
       <w:pPr>
         <w:pStyle w:val="Heading1"/>
@@ -758,8 +758,26 @@
       </w:r>
     </w:p>
     <w:bookmarkEnd w:id="30"/>
+    <w:bookmarkStart w:id="31" w:name="cascade-simulation"/>
+    <w:p>
+      <w:pPr>
+        <w:pStyle w:val="Heading2"/>
+      </w:pPr>
+      <w:r>
+        <w:t xml:space="preserve">3.9 Cascade simulation</w:t>
+      </w:r>
+    </w:p>
+    <w:p>
+      <w:pPr>
+        <w:pStyle w:val="FirstParagraph"/>
+      </w:pPr>
+      <w:r>
+        <w:t xml:space="preserve">A cheaper way to use a judge is to call it only on documents that a free screen finds suspicious. We simulated this cascade with the 500 judged documents. The Poisson detector with the new features (trained on human papers plus the other two generators, never the target) scores every document, and only the top q of the pool, with q set to 10%, 20%, 30%, 50%, or 100%, is sent to the Gemini judge. Documents that are not sent cannot be flagged. For documents that are sent, the final score is either the judge’s score alone (C1, with ties broken by the screen) or the average of the screen’s rank in the pool and the judge’s rank among the sent documents (C2). We report the share of machine papers flagged when at most 5% of all human papers are flagged, together with the judge cost implied by q at the measured price. Because the judged sample contains many more machine papers than a real submission stream would, the primary evaluation resamples pools so that machine papers are 10% of the pool (300 bootstrap pools, in which all human papers and resampled machine papers appear); pools as sampled, with about one third machine papers, are a secondary evaluation. All of this was specified before the simulation was run.</w:t>
+      </w:r>
+    </w:p>
     <w:bookmarkEnd w:id="31"/>
-    <w:bookmarkStart w:id="44" w:name="results"/>
+    <w:bookmarkEnd w:id="32"/>
+    <w:bookmarkStart w:id="46" w:name="results"/>
     <w:p>
       <w:pPr>
         <w:pStyle w:val="Heading1"/>
@@ -768,7 +786,7 @@
         <w:t xml:space="preserve">4. Results</w:t>
       </w:r>
     </w:p>
-    <w:bookmarkStart w:id="35" w:name="human-text-is-not-poisson-rq1"/>
+    <w:bookmarkStart w:id="36" w:name="human-text-is-not-poisson-rq1"/>
     <w:p>
       <w:pPr>
         <w:pStyle w:val="Heading2"/>
@@ -1340,18 +1358,18 @@
           <wp:inline>
             <wp:extent cx="5334000" cy="2489200"/>
             <wp:effectExtent b="0" l="0" r="0" t="0"/>
-            <wp:docPr descr="Figure 1. Distribution of log2 dispersion indices by event for human-authored and GPT-4o papers. Dashed line: Poisson (index of 1). Square brackets for GPT-4o are degenerate because most synthetic papers contain none (index set to one by convention)." title="" id="33" name="Picture"/>
+            <wp:docPr descr="Figure 1. Distribution of log2 dispersion indices by event for human-authored and GPT-4o papers. Dashed line: Poisson (index of 1). Square brackets for GPT-4o are degenerate because most synthetic papers contain none (index set to one by convention)." title="" id="34" name="Picture"/>
             <a:graphic>
               <a:graphicData uri="http://schemas.openxmlformats.org/drawingml/2006/picture">
                 <pic:pic>
                   <pic:nvPicPr>
-                    <pic:cNvPr descr="fig_dispersion.png" id="34" name="Picture"/>
+                    <pic:cNvPr descr="fig_dispersion.png" id="35" name="Picture"/>
                     <pic:cNvPicPr>
                       <a:picLocks noChangeArrowheads="1" noChangeAspect="1"/>
                     </pic:cNvPicPr>
                   </pic:nvPicPr>
                   <pic:blipFill>
-                    <a:blip r:embed="rId32"/>
+                    <a:blip r:embed="rId33"/>
                     <a:stretch>
                       <a:fillRect/>
                     </a:stretch>
@@ -1394,8 +1412,8 @@
         <w:t xml:space="preserve">One caution applies to the passive result. Because we generated each paper section by section, and the four retained windows roughly track those sections, elevated passive dispersion may partly reflect a procedural artifact (passive voice is concentrated in methods text) rather than a general property of the models. We could not separate the two with the present data.</w:t>
       </w:r>
     </w:p>
-    <w:bookmarkEnd w:id="35"/>
-    <w:bookmarkStart w:id="36" w:name="detection-within-a-generator-rq2"/>
+    <w:bookmarkEnd w:id="36"/>
+    <w:bookmarkStart w:id="37" w:name="detection-within-a-generator-rq2"/>
     <w:p>
       <w:pPr>
         <w:pStyle w:val="Heading2"/>
@@ -1975,8 +1993,8 @@
         </w:tc>
       </w:tr>
     </w:tbl>
-    <w:bookmarkEnd w:id="36"/>
-    <w:bookmarkStart w:id="37" w:name="detection-across-generators-rq2"/>
+    <w:bookmarkEnd w:id="37"/>
+    <w:bookmarkStart w:id="38" w:name="detection-across-generators-rq2"/>
     <w:p>
       <w:pPr>
         <w:pStyle w:val="Heading2"/>
@@ -2277,8 +2295,8 @@
         <w:t xml:space="preserve">Two patterns stand out. First, the gap between within-generator and cross-generator AUC is large for every feature family, so a detector calibrated on one generator should not be assumed to protect against another. Second, rates transfer worst (0.66 and 0.73), and dispersion transfers better (0.70 and 0.81), matching or exceeding the combined model in the Claude-to-GPT-4o direction. This is consistent with the sign pattern in Table 2: rate differences reverse across generators, while dispersion differences for passives, quotation marks, and nominalizations point the same way (Table 1). Dispersion is the more portable signal, though even it is far from sufficient on its own.</w:t>
       </w:r>
     </w:p>
-    <w:bookmarkEnd w:id="37"/>
-    <w:bookmarkStart w:id="38" w:name="detection-from-human-text-alone-rq2"/>
+    <w:bookmarkEnd w:id="38"/>
+    <w:bookmarkStart w:id="39" w:name="detection-from-human-text-alone-rq2"/>
     <w:p>
       <w:pPr>
         <w:pStyle w:val="Heading2"/>
@@ -2645,8 +2663,8 @@
         <w:t xml:space="preserve">in which a generator differs from human writers. Human papers already vary widely among themselves in these features, across fields, sections, and authors, so machine text is rarely far from the human cloud in an absolute sense; it is displaced from the center in particular directions. A distance from the human distribution does not capture that displacement.</w:t>
       </w:r>
     </w:p>
-    <w:bookmarkEnd w:id="38"/>
-    <w:bookmarkStart w:id="39" w:name="X0521dbd98438490bc6effe6d1004fde65e11b6f"/>
+    <w:bookmarkEnd w:id="39"/>
+    <w:bookmarkStart w:id="40" w:name="X0521dbd98438490bc6effe6d1004fde65e11b6f"/>
     <w:p>
       <w:pPr>
         <w:pStyle w:val="Heading2"/>
@@ -3257,8 +3275,8 @@
         <w:t xml:space="preserve">The model does not rescue detection from human text alone on these data. A Mahalanobis detector on the new features reaches AUC 0.59 for GPT-4o and 0.49 for Claude, essentially the same as before. The improvement is therefore in how well a supervised detector can use the clustering structure, not in how well human text can define normality by itself.</w:t>
       </w:r>
     </w:p>
-    <w:bookmarkEnd w:id="39"/>
-    <w:bookmarkStart w:id="40" w:name="Xf249ecbb1b4e68a085d5da2640522efa39ff232"/>
+    <w:bookmarkEnd w:id="40"/>
+    <w:bookmarkStart w:id="41" w:name="Xf249ecbb1b4e68a085d5da2640522efa39ff232"/>
     <w:p>
       <w:pPr>
         <w:pStyle w:val="Heading2"/>
@@ -3509,8 +3527,8 @@
         <w:t xml:space="preserve">Three further results are exploratory and were not specified in advance. First, Llama is easy to detect within its own class: with human and Llama papers, the baseline reaches 0.962 and the new features 0.984, and with clustering features alone (no rates) the new model reaches 0.914 against 0.764 for the baseline dispersion index. Second, a detector trained on Llama transfers well to GPT-4o (baseline 0.938, new 0.969) but poorly to Claude (0.745 and 0.763), which reinforces the picture that Claude papers are the hardest of the three to detect from other generators. Third, a human-only Mahalanobis detector on the new features reaches 0.65 (0.60 to 0.69) on Llama, against 0.51 for the baseline, the first human-only result in our data clearly above chance. Even so, 0.65 is not a level we would deploy.</w:t>
       </w:r>
     </w:p>
-    <w:bookmarkEnd w:id="40"/>
-    <w:bookmarkStart w:id="41" w:name="comparison-with-llm-judges-rq2-rq3"/>
+    <w:bookmarkEnd w:id="41"/>
+    <w:bookmarkStart w:id="42" w:name="comparison-with-llm-judges-rq2-rq3"/>
     <w:p>
       <w:pPr>
         <w:pStyle w:val="Heading2"/>
@@ -3844,8 +3862,8 @@
         <w:t xml:space="preserve">This comparison has an important asymmetry. The Poisson-based detectors use labeled examples from other generators, and the judges use none, so they answer different practical questions: what can be done with no machine-text examples at all, and what a cheap screen achieves once some are available.</w:t>
       </w:r>
     </w:p>
-    <w:bookmarkEnd w:id="41"/>
-    <w:bookmarkStart w:id="42" w:name="combining-the-screen-with-a-judge-rq2"/>
+    <w:bookmarkEnd w:id="42"/>
+    <w:bookmarkStart w:id="43" w:name="combining-the-screen-with-a-judge-rq2"/>
     <w:p>
       <w:pPr>
         <w:pStyle w:val="Heading2"/>
@@ -4145,14 +4163,14 @@
         <w:t xml:space="preserve">The share of papers detected at a 5% false-positive rate shows the practical effect more plainly. For GPT-4o papers, the fusion detects 98% against 87% for the judge and 64% for the screen; for Llama papers, 96% against 89% and 73%; and for Claude papers, 39% against 17% for the screen and 1% for the judge. The secondary fusions were less useful: taking the larger rank (F2) was no better than the judge for GPT-4o and Llama and worse than the screen for Claude, and adding the weak GPT-4o judge (F3) did not help beyond F1.</w:t>
       </w:r>
     </w:p>
-    <w:bookmarkEnd w:id="42"/>
-    <w:bookmarkStart w:id="43" w:name="cost-rq3"/>
+    <w:bookmarkEnd w:id="43"/>
+    <w:bookmarkStart w:id="44" w:name="a-cascade-of-screen-and-judge-rq2-rq3"/>
     <w:p>
       <w:pPr>
         <w:pStyle w:val="Heading2"/>
       </w:pPr>
       <w:r>
-        <w:t xml:space="preserve">4.9 Cost (RQ3)</w:t>
+        <w:t xml:space="preserve">4.9 A cascade of screen and judge (RQ2, RQ3)</w:t>
       </w:r>
     </w:p>
     <w:p>
@@ -4160,12 +4178,835 @@
         <w:pStyle w:val="FirstParagraph"/>
       </w:pPr>
       <w:r>
-        <w:t xml:space="preserve">Computing all events and the baseline indices took 4 to 6 milliseconds per document on one CPU core (roughly 160 to 230 documents per second, depending on machine load) with no external service calls, so the marginal monetary cost is zero. For the judges we measured about US$0.0073 and 1.7 seconds per excerpt for GPT-4o (US$3.63 for 500 excerpts) and about US$0.0174 and 23.4 seconds per excerpt for Gemini 2.5 Pro (US$8.68), whose cost includes the reasoning tokens it produced. Screening 1,000 documents would thus cost about US$7 and half an hour of sequential calls with GPT-4o, and about US$17 and more than six hours with Gemini, against no marginal cost and a few seconds for the Poisson features. The fusion of Section 4.8 uses the judge on every document, so it costs as much as the judge. These figures depend on the judge model, prompt length, and the pricing and speed at the time. For context on the generation side, producing one paper through four requests cost about US$0.04 for GPT-4o, about US$0.13 for Claude, and about US$0.002 for Llama 3.3 70B, through the gateway we used.</w:t>
-      </w:r>
-    </w:p>
-    <w:bookmarkEnd w:id="43"/>
+        <w:t xml:space="preserve">Table 9 reports the primary evaluation, in which machine papers make up 10% of the pool. For GPT-4o papers, sending only the top 30% of documents to the judge detects 95% of machine papers at a 5% false-positive rate (interval 0.86 to 1.00), the same as judging every document (0.95), at 30% of the cost; with 20% the rate falls to 86%. For Llama papers, a share of 50% matches full judging (0.97 against 0.96 for the judge alone), and 30% gives 0.89. Claude papers remain hard at every setting. Detection stays between 0.30 and 0.38 for q from 10% to 30%, and judging everything with the judge alone detects only 12%, so the extra judge calls add little for this generator and the screen supplies most of what is detected.</w:t>
+      </w:r>
+    </w:p>
+    <w:p>
+      <w:pPr>
+        <w:pStyle w:val="TableCaption"/>
+      </w:pPr>
+      <w:r>
+        <w:t xml:space="preserve">Table 9. Simulated cascade, pools with 10% machine papers. Share of machine papers flagged when at most 5% of human papers are flagged, with 95% intervals over bootstrap pools. Costs use the measured Gemini price of US$0.0174 per document. Sending 10% of documents detected 0.60, 0.30, and 0.66 for GPT-4o, Claude, and Llama papers.</w:t>
+      </w:r>
+    </w:p>
+    <w:tbl>
+      <w:tblPr>
+        <w:tblStyle w:val="Table"/>
+        <w:tblW w:type="pct" w:w="5000"/>
+        <w:tblLook w:firstRow="1" w:lastRow="0" w:firstColumn="0" w:lastColumn="0" w:noHBand="0" w:noVBand="0" w:val="0020"/>
+        <w:jc w:val="start"/>
+        <w:tblCaption w:val="Table 9. Simulated cascade, pools with 10% machine papers. Share of machine papers flagged when at most 5% of human papers are flagged, with 95% intervals over bootstrap pools. Costs use the measured Gemini price of US$0.0174 per document. Sending 10% of documents detected 0.60, 0.30, and 0.66 for GPT-4o, Claude, and Llama papers."/>
+      </w:tblPr>
+      <w:tblGrid>
+        <w:gridCol w:w="1584"/>
+        <w:gridCol w:w="1584"/>
+        <w:gridCol w:w="1584"/>
+        <w:gridCol w:w="1584"/>
+        <w:gridCol w:w="1584"/>
+      </w:tblGrid>
+      <w:tr>
+        <w:trPr>
+          <w:tblHeader w:val="true"/>
+        </w:trPr>
+        <w:tc>
+          <w:tcPr/>
+          <w:p>
+            <w:pPr>
+              <w:pStyle w:val="Compact"/>
+              <w:jc w:val="left"/>
+            </w:pPr>
+            <w:r>
+              <w:t xml:space="preserve">Target generator</w:t>
+            </w:r>
+          </w:p>
+        </w:tc>
+        <w:tc>
+          <w:tcPr/>
+          <w:p>
+            <w:pPr>
+              <w:pStyle w:val="Compact"/>
+              <w:jc w:val="left"/>
+            </w:pPr>
+            <w:r>
+              <w:t xml:space="preserve">Share judged (q)</w:t>
+            </w:r>
+          </w:p>
+        </w:tc>
+        <w:tc>
+          <w:tcPr/>
+          <w:p>
+            <w:pPr>
+              <w:pStyle w:val="Compact"/>
+              <w:jc w:val="left"/>
+            </w:pPr>
+            <w:r>
+              <w:t xml:space="preserve">Judge cost per 1,000 docs</w:t>
+            </w:r>
+          </w:p>
+        </w:tc>
+        <w:tc>
+          <w:tcPr/>
+          <w:p>
+            <w:pPr>
+              <w:pStyle w:val="Compact"/>
+              <w:jc w:val="left"/>
+            </w:pPr>
+            <w:r>
+              <w:t xml:space="preserve">Detected, judge only (C1)</w:t>
+            </w:r>
+          </w:p>
+        </w:tc>
+        <w:tc>
+          <w:tcPr/>
+          <w:p>
+            <w:pPr>
+              <w:pStyle w:val="Compact"/>
+              <w:jc w:val="left"/>
+            </w:pPr>
+            <w:r>
+              <w:t xml:space="preserve">Detected, rank fusion (C2)</w:t>
+            </w:r>
+          </w:p>
+        </w:tc>
+      </w:tr>
+      <w:tr>
+        <w:tc>
+          <w:tcPr/>
+          <w:p>
+            <w:pPr>
+              <w:pStyle w:val="Compact"/>
+              <w:jc w:val="left"/>
+            </w:pPr>
+            <w:r>
+              <w:t xml:space="preserve">GPT-4o</w:t>
+            </w:r>
+          </w:p>
+        </w:tc>
+        <w:tc>
+          <w:tcPr/>
+          <w:p>
+            <w:pPr>
+              <w:pStyle w:val="Compact"/>
+              <w:jc w:val="left"/>
+            </w:pPr>
+            <w:r>
+              <w:t xml:space="preserve">20%</w:t>
+            </w:r>
+          </w:p>
+        </w:tc>
+        <w:tc>
+          <w:tcPr/>
+          <w:p>
+            <w:pPr>
+              <w:pStyle w:val="Compact"/>
+              <w:jc w:val="left"/>
+            </w:pPr>
+            <w:r>
+              <w:t xml:space="preserve">US$3.5</w:t>
+            </w:r>
+          </w:p>
+        </w:tc>
+        <w:tc>
+          <w:tcPr/>
+          <w:p>
+            <w:pPr>
+              <w:pStyle w:val="Compact"/>
+              <w:jc w:val="left"/>
+            </w:pPr>
+            <w:r>
+              <w:t xml:space="preserve">0.86 [0.73, 1.00]</w:t>
+            </w:r>
+          </w:p>
+        </w:tc>
+        <w:tc>
+          <w:tcPr/>
+          <w:p>
+            <w:pPr>
+              <w:pStyle w:val="Compact"/>
+              <w:jc w:val="left"/>
+            </w:pPr>
+            <w:r>
+              <w:t xml:space="preserve">0.86 [0.73, 1.00]</w:t>
+            </w:r>
+          </w:p>
+        </w:tc>
+      </w:tr>
+      <w:tr>
+        <w:tc>
+          <w:tcPr/>
+          <w:p>
+            <w:pPr>
+              <w:pStyle w:val="Compact"/>
+            </w:pPr>
+          </w:p>
+        </w:tc>
+        <w:tc>
+          <w:tcPr/>
+          <w:p>
+            <w:pPr>
+              <w:pStyle w:val="Compact"/>
+              <w:jc w:val="left"/>
+            </w:pPr>
+            <w:r>
+              <w:t xml:space="preserve">30%</w:t>
+            </w:r>
+          </w:p>
+        </w:tc>
+        <w:tc>
+          <w:tcPr/>
+          <w:p>
+            <w:pPr>
+              <w:pStyle w:val="Compact"/>
+              <w:jc w:val="left"/>
+            </w:pPr>
+            <w:r>
+              <w:t xml:space="preserve">US$5.2</w:t>
+            </w:r>
+          </w:p>
+        </w:tc>
+        <w:tc>
+          <w:tcPr/>
+          <w:p>
+            <w:pPr>
+              <w:pStyle w:val="Compact"/>
+              <w:jc w:val="left"/>
+            </w:pPr>
+            <w:r>
+              <w:t xml:space="preserve">0.95 [0.86, 1.00]</w:t>
+            </w:r>
+          </w:p>
+        </w:tc>
+        <w:tc>
+          <w:tcPr/>
+          <w:p>
+            <w:pPr>
+              <w:pStyle w:val="Compact"/>
+              <w:jc w:val="left"/>
+            </w:pPr>
+            <w:r>
+              <w:t xml:space="preserve">0.96 [0.86, 1.00]</w:t>
+            </w:r>
+          </w:p>
+        </w:tc>
+      </w:tr>
+      <w:tr>
+        <w:tc>
+          <w:tcPr/>
+          <w:p>
+            <w:pPr>
+              <w:pStyle w:val="Compact"/>
+            </w:pPr>
+          </w:p>
+        </w:tc>
+        <w:tc>
+          <w:tcPr/>
+          <w:p>
+            <w:pPr>
+              <w:pStyle w:val="Compact"/>
+              <w:jc w:val="left"/>
+            </w:pPr>
+            <w:r>
+              <w:t xml:space="preserve">50%</w:t>
+            </w:r>
+          </w:p>
+        </w:tc>
+        <w:tc>
+          <w:tcPr/>
+          <w:p>
+            <w:pPr>
+              <w:pStyle w:val="Compact"/>
+              <w:jc w:val="left"/>
+            </w:pPr>
+            <w:r>
+              <w:t xml:space="preserve">US$8.7</w:t>
+            </w:r>
+          </w:p>
+        </w:tc>
+        <w:tc>
+          <w:tcPr/>
+          <w:p>
+            <w:pPr>
+              <w:pStyle w:val="Compact"/>
+              <w:jc w:val="left"/>
+            </w:pPr>
+            <w:r>
+              <w:t xml:space="preserve">0.96 [0.86, 1.00]</w:t>
+            </w:r>
+          </w:p>
+        </w:tc>
+        <w:tc>
+          <w:tcPr/>
+          <w:p>
+            <w:pPr>
+              <w:pStyle w:val="Compact"/>
+              <w:jc w:val="left"/>
+            </w:pPr>
+            <w:r>
+              <w:t xml:space="preserve">0.97 [0.91, 1.00]</w:t>
+            </w:r>
+          </w:p>
+        </w:tc>
+      </w:tr>
+      <w:tr>
+        <w:tc>
+          <w:tcPr/>
+          <w:p>
+            <w:pPr>
+              <w:pStyle w:val="Compact"/>
+            </w:pPr>
+          </w:p>
+        </w:tc>
+        <w:tc>
+          <w:tcPr/>
+          <w:p>
+            <w:pPr>
+              <w:pStyle w:val="Compact"/>
+              <w:jc w:val="left"/>
+            </w:pPr>
+            <w:r>
+              <w:t xml:space="preserve">100%</w:t>
+            </w:r>
+          </w:p>
+        </w:tc>
+        <w:tc>
+          <w:tcPr/>
+          <w:p>
+            <w:pPr>
+              <w:pStyle w:val="Compact"/>
+              <w:jc w:val="left"/>
+            </w:pPr>
+            <w:r>
+              <w:t xml:space="preserve">US$17.4</w:t>
+            </w:r>
+          </w:p>
+        </w:tc>
+        <w:tc>
+          <w:tcPr/>
+          <w:p>
+            <w:pPr>
+              <w:pStyle w:val="Compact"/>
+              <w:jc w:val="left"/>
+            </w:pPr>
+            <w:r>
+              <w:t xml:space="preserve">0.95 [0.82, 1.00]</w:t>
+            </w:r>
+          </w:p>
+        </w:tc>
+        <w:tc>
+          <w:tcPr/>
+          <w:p>
+            <w:pPr>
+              <w:pStyle w:val="Compact"/>
+              <w:jc w:val="left"/>
+            </w:pPr>
+            <w:r>
+              <w:t xml:space="preserve">0.97 [0.86, 1.00]</w:t>
+            </w:r>
+          </w:p>
+        </w:tc>
+      </w:tr>
+      <w:tr>
+        <w:tc>
+          <w:tcPr/>
+          <w:p>
+            <w:pPr>
+              <w:pStyle w:val="Compact"/>
+              <w:jc w:val="left"/>
+            </w:pPr>
+            <w:r>
+              <w:t xml:space="preserve">Claude</w:t>
+            </w:r>
+          </w:p>
+        </w:tc>
+        <w:tc>
+          <w:tcPr/>
+          <w:p>
+            <w:pPr>
+              <w:pStyle w:val="Compact"/>
+              <w:jc w:val="left"/>
+            </w:pPr>
+            <w:r>
+              <w:t xml:space="preserve">20%</w:t>
+            </w:r>
+          </w:p>
+        </w:tc>
+        <w:tc>
+          <w:tcPr/>
+          <w:p>
+            <w:pPr>
+              <w:pStyle w:val="Compact"/>
+              <w:jc w:val="left"/>
+            </w:pPr>
+            <w:r>
+              <w:t xml:space="preserve">US$3.5</w:t>
+            </w:r>
+          </w:p>
+        </w:tc>
+        <w:tc>
+          <w:tcPr/>
+          <w:p>
+            <w:pPr>
+              <w:pStyle w:val="Compact"/>
+              <w:jc w:val="left"/>
+            </w:pPr>
+            <w:r>
+              <w:t xml:space="preserve">0.38 [0.11, 0.59]</w:t>
+            </w:r>
+          </w:p>
+        </w:tc>
+        <w:tc>
+          <w:tcPr/>
+          <w:p>
+            <w:pPr>
+              <w:pStyle w:val="Compact"/>
+              <w:jc w:val="left"/>
+            </w:pPr>
+            <w:r>
+              <w:t xml:space="preserve">0.38 [0.11, 0.59]</w:t>
+            </w:r>
+          </w:p>
+        </w:tc>
+      </w:tr>
+      <w:tr>
+        <w:tc>
+          <w:tcPr/>
+          <w:p>
+            <w:pPr>
+              <w:pStyle w:val="Compact"/>
+            </w:pPr>
+          </w:p>
+        </w:tc>
+        <w:tc>
+          <w:tcPr/>
+          <w:p>
+            <w:pPr>
+              <w:pStyle w:val="Compact"/>
+              <w:jc w:val="left"/>
+            </w:pPr>
+            <w:r>
+              <w:t xml:space="preserve">30%</w:t>
+            </w:r>
+          </w:p>
+        </w:tc>
+        <w:tc>
+          <w:tcPr/>
+          <w:p>
+            <w:pPr>
+              <w:pStyle w:val="Compact"/>
+              <w:jc w:val="left"/>
+            </w:pPr>
+            <w:r>
+              <w:t xml:space="preserve">US$5.2</w:t>
+            </w:r>
+          </w:p>
+        </w:tc>
+        <w:tc>
+          <w:tcPr/>
+          <w:p>
+            <w:pPr>
+              <w:pStyle w:val="Compact"/>
+              <w:jc w:val="left"/>
+            </w:pPr>
+            <w:r>
+              <w:t xml:space="preserve">0.36 [0.09, 0.59]</w:t>
+            </w:r>
+          </w:p>
+        </w:tc>
+        <w:tc>
+          <w:tcPr/>
+          <w:p>
+            <w:pPr>
+              <w:pStyle w:val="Compact"/>
+              <w:jc w:val="left"/>
+            </w:pPr>
+            <w:r>
+              <w:t xml:space="preserve">0.36 [0.09, 0.59]</w:t>
+            </w:r>
+          </w:p>
+        </w:tc>
+      </w:tr>
+      <w:tr>
+        <w:tc>
+          <w:tcPr/>
+          <w:p>
+            <w:pPr>
+              <w:pStyle w:val="Compact"/>
+            </w:pPr>
+          </w:p>
+        </w:tc>
+        <w:tc>
+          <w:tcPr/>
+          <w:p>
+            <w:pPr>
+              <w:pStyle w:val="Compact"/>
+              <w:jc w:val="left"/>
+            </w:pPr>
+            <w:r>
+              <w:t xml:space="preserve">50%</w:t>
+            </w:r>
+          </w:p>
+        </w:tc>
+        <w:tc>
+          <w:tcPr/>
+          <w:p>
+            <w:pPr>
+              <w:pStyle w:val="Compact"/>
+              <w:jc w:val="left"/>
+            </w:pPr>
+            <w:r>
+              <w:t xml:space="preserve">US$8.7</w:t>
+            </w:r>
+          </w:p>
+        </w:tc>
+        <w:tc>
+          <w:tcPr/>
+          <w:p>
+            <w:pPr>
+              <w:pStyle w:val="Compact"/>
+              <w:jc w:val="left"/>
+            </w:pPr>
+            <w:r>
+              <w:t xml:space="preserve">0.19 [0.05, 0.50]</w:t>
+            </w:r>
+          </w:p>
+        </w:tc>
+        <w:tc>
+          <w:tcPr/>
+          <w:p>
+            <w:pPr>
+              <w:pStyle w:val="Compact"/>
+              <w:jc w:val="left"/>
+            </w:pPr>
+            <w:r>
+              <w:t xml:space="preserve">0.35 [0.09, 0.59]</w:t>
+            </w:r>
+          </w:p>
+        </w:tc>
+      </w:tr>
+      <w:tr>
+        <w:tc>
+          <w:tcPr/>
+          <w:p>
+            <w:pPr>
+              <w:pStyle w:val="Compact"/>
+            </w:pPr>
+          </w:p>
+        </w:tc>
+        <w:tc>
+          <w:tcPr/>
+          <w:p>
+            <w:pPr>
+              <w:pStyle w:val="Compact"/>
+              <w:jc w:val="left"/>
+            </w:pPr>
+            <w:r>
+              <w:t xml:space="preserve">100%</w:t>
+            </w:r>
+          </w:p>
+        </w:tc>
+        <w:tc>
+          <w:tcPr/>
+          <w:p>
+            <w:pPr>
+              <w:pStyle w:val="Compact"/>
+              <w:jc w:val="left"/>
+            </w:pPr>
+            <w:r>
+              <w:t xml:space="preserve">US$17.4</w:t>
+            </w:r>
+          </w:p>
+        </w:tc>
+        <w:tc>
+          <w:tcPr/>
+          <w:p>
+            <w:pPr>
+              <w:pStyle w:val="Compact"/>
+              <w:jc w:val="left"/>
+            </w:pPr>
+            <w:r>
+              <w:t xml:space="preserve">0.12 [0.00, 0.32]</w:t>
+            </w:r>
+          </w:p>
+        </w:tc>
+        <w:tc>
+          <w:tcPr/>
+          <w:p>
+            <w:pPr>
+              <w:pStyle w:val="Compact"/>
+              <w:jc w:val="left"/>
+            </w:pPr>
+            <w:r>
+              <w:t xml:space="preserve">0.37 [0.09, 0.59]</w:t>
+            </w:r>
+          </w:p>
+        </w:tc>
+      </w:tr>
+      <w:tr>
+        <w:tc>
+          <w:tcPr/>
+          <w:p>
+            <w:pPr>
+              <w:pStyle w:val="Compact"/>
+              <w:jc w:val="left"/>
+            </w:pPr>
+            <w:r>
+              <w:t xml:space="preserve">Llama</w:t>
+            </w:r>
+          </w:p>
+        </w:tc>
+        <w:tc>
+          <w:tcPr/>
+          <w:p>
+            <w:pPr>
+              <w:pStyle w:val="Compact"/>
+              <w:jc w:val="left"/>
+            </w:pPr>
+            <w:r>
+              <w:t xml:space="preserve">20%</w:t>
+            </w:r>
+          </w:p>
+        </w:tc>
+        <w:tc>
+          <w:tcPr/>
+          <w:p>
+            <w:pPr>
+              <w:pStyle w:val="Compact"/>
+              <w:jc w:val="left"/>
+            </w:pPr>
+            <w:r>
+              <w:t xml:space="preserve">US$3.5</w:t>
+            </w:r>
+          </w:p>
+        </w:tc>
+        <w:tc>
+          <w:tcPr/>
+          <w:p>
+            <w:pPr>
+              <w:pStyle w:val="Compact"/>
+              <w:jc w:val="left"/>
+            </w:pPr>
+            <w:r>
+              <w:t xml:space="preserve">0.82 [0.64, 0.95]</w:t>
+            </w:r>
+          </w:p>
+        </w:tc>
+        <w:tc>
+          <w:tcPr/>
+          <w:p>
+            <w:pPr>
+              <w:pStyle w:val="Compact"/>
+              <w:jc w:val="left"/>
+            </w:pPr>
+            <w:r>
+              <w:t xml:space="preserve">0.82 [0.64, 0.95]</w:t>
+            </w:r>
+          </w:p>
+        </w:tc>
+      </w:tr>
+      <w:tr>
+        <w:tc>
+          <w:tcPr/>
+          <w:p>
+            <w:pPr>
+              <w:pStyle w:val="Compact"/>
+            </w:pPr>
+          </w:p>
+        </w:tc>
+        <w:tc>
+          <w:tcPr/>
+          <w:p>
+            <w:pPr>
+              <w:pStyle w:val="Compact"/>
+              <w:jc w:val="left"/>
+            </w:pPr>
+            <w:r>
+              <w:t xml:space="preserve">30%</w:t>
+            </w:r>
+          </w:p>
+        </w:tc>
+        <w:tc>
+          <w:tcPr/>
+          <w:p>
+            <w:pPr>
+              <w:pStyle w:val="Compact"/>
+              <w:jc w:val="left"/>
+            </w:pPr>
+            <w:r>
+              <w:t xml:space="preserve">US$5.2</w:t>
+            </w:r>
+          </w:p>
+        </w:tc>
+        <w:tc>
+          <w:tcPr/>
+          <w:p>
+            <w:pPr>
+              <w:pStyle w:val="Compact"/>
+              <w:jc w:val="left"/>
+            </w:pPr>
+            <w:r>
+              <w:t xml:space="preserve">0.89 [0.73, 1.00]</w:t>
+            </w:r>
+          </w:p>
+        </w:tc>
+        <w:tc>
+          <w:tcPr/>
+          <w:p>
+            <w:pPr>
+              <w:pStyle w:val="Compact"/>
+              <w:jc w:val="left"/>
+            </w:pPr>
+            <w:r>
+              <w:t xml:space="preserve">0.89 [0.73, 1.00]</w:t>
+            </w:r>
+          </w:p>
+        </w:tc>
+      </w:tr>
+      <w:tr>
+        <w:tc>
+          <w:tcPr/>
+          <w:p>
+            <w:pPr>
+              <w:pStyle w:val="Compact"/>
+            </w:pPr>
+          </w:p>
+        </w:tc>
+        <w:tc>
+          <w:tcPr/>
+          <w:p>
+            <w:pPr>
+              <w:pStyle w:val="Compact"/>
+              <w:jc w:val="left"/>
+            </w:pPr>
+            <w:r>
+              <w:t xml:space="preserve">50%</w:t>
+            </w:r>
+          </w:p>
+        </w:tc>
+        <w:tc>
+          <w:tcPr/>
+          <w:p>
+            <w:pPr>
+              <w:pStyle w:val="Compact"/>
+              <w:jc w:val="left"/>
+            </w:pPr>
+            <w:r>
+              <w:t xml:space="preserve">US$8.7</w:t>
+            </w:r>
+          </w:p>
+        </w:tc>
+        <w:tc>
+          <w:tcPr/>
+          <w:p>
+            <w:pPr>
+              <w:pStyle w:val="Compact"/>
+              <w:jc w:val="left"/>
+            </w:pPr>
+            <w:r>
+              <w:t xml:space="preserve">0.97 [0.86, 1.00]</w:t>
+            </w:r>
+          </w:p>
+        </w:tc>
+        <w:tc>
+          <w:tcPr/>
+          <w:p>
+            <w:pPr>
+              <w:pStyle w:val="Compact"/>
+              <w:jc w:val="left"/>
+            </w:pPr>
+            <w:r>
+              <w:t xml:space="preserve">0.95 [0.82, 1.00]</w:t>
+            </w:r>
+          </w:p>
+        </w:tc>
+      </w:tr>
+      <w:tr>
+        <w:tc>
+          <w:tcPr/>
+          <w:p>
+            <w:pPr>
+              <w:pStyle w:val="Compact"/>
+            </w:pPr>
+          </w:p>
+        </w:tc>
+        <w:tc>
+          <w:tcPr/>
+          <w:p>
+            <w:pPr>
+              <w:pStyle w:val="Compact"/>
+              <w:jc w:val="left"/>
+            </w:pPr>
+            <w:r>
+              <w:t xml:space="preserve">100%</w:t>
+            </w:r>
+          </w:p>
+        </w:tc>
+        <w:tc>
+          <w:tcPr/>
+          <w:p>
+            <w:pPr>
+              <w:pStyle w:val="Compact"/>
+              <w:jc w:val="left"/>
+            </w:pPr>
+            <w:r>
+              <w:t xml:space="preserve">US$17.4</w:t>
+            </w:r>
+          </w:p>
+        </w:tc>
+        <w:tc>
+          <w:tcPr/>
+          <w:p>
+            <w:pPr>
+              <w:pStyle w:val="Compact"/>
+              <w:jc w:val="left"/>
+            </w:pPr>
+            <w:r>
+              <w:t xml:space="preserve">0.96 [0.86, 1.00]</w:t>
+            </w:r>
+          </w:p>
+        </w:tc>
+        <w:tc>
+          <w:tcPr/>
+          <w:p>
+            <w:pPr>
+              <w:pStyle w:val="Compact"/>
+              <w:jc w:val="left"/>
+            </w:pPr>
+            <w:r>
+              <w:t xml:space="preserve">0.93 [0.79, 1.00]</w:t>
+            </w:r>
+          </w:p>
+        </w:tc>
+      </w:tr>
+    </w:tbl>
+    <w:p>
+      <w:pPr>
+        <w:pStyle w:val="BodyText"/>
+      </w:pPr>
+      <w:r>
+        <w:t xml:space="preserve">The savings depend on how rare machine papers are. In the secondary evaluation, in which about one third of the pool is machine-written, detection with q = 30% falls to 0.76 for GPT-4o papers and 0.78 for Llama papers, and q has to reach about 50% to recover 0.92 to 0.95. The share of documents that must be judged therefore needs to exceed the share of machine papers by a margin, and an organization would need to know roughly how common such papers are.</w:t>
+      </w:r>
+    </w:p>
     <w:bookmarkEnd w:id="44"/>
-    <w:bookmarkStart w:id="45" w:name="discussion"/>
+    <w:bookmarkStart w:id="45" w:name="cost-rq3"/>
+    <w:p>
+      <w:pPr>
+        <w:pStyle w:val="Heading2"/>
+      </w:pPr>
+      <w:r>
+        <w:t xml:space="preserve">4.10 Cost (RQ3)</w:t>
+      </w:r>
+    </w:p>
+    <w:p>
+      <w:pPr>
+        <w:pStyle w:val="FirstParagraph"/>
+      </w:pPr>
+      <w:r>
+        <w:t xml:space="preserve">Computing all events and the baseline indices took 4 to 6 milliseconds per document on one CPU core (roughly 160 to 230 documents per second, depending on machine load) with no external service calls, so the marginal monetary cost is zero. For the judges we measured about US$0.0073 and 1.7 seconds per excerpt for GPT-4o (US$3.63 for 500 excerpts) and about US$0.0174 and 23.4 seconds per excerpt for Gemini 2.5 Pro (US$8.68), whose cost includes the reasoning tokens it produced. Screening 1,000 documents would thus cost about US$7 and half an hour of sequential calls with GPT-4o, and about US$17 and more than six hours with Gemini, against no marginal cost and a few seconds for the Poisson features. The fusion of Section 4.8 uses the judge on every document, so it costs as much as the judge; in the cascade of Section 4.9, the judge cost scales with the share of documents sent to it. These figures depend on the judge model, prompt length, and the pricing and speed at the time. For context on the generation side, producing one paper through four requests cost about US$0.04 for GPT-4o, about US$0.13 for Claude, and about US$0.002 for Llama 3.3 70B, through the gateway we used.</w:t>
+      </w:r>
+    </w:p>
+    <w:bookmarkEnd w:id="45"/>
+    <w:bookmarkEnd w:id="46"/>
+    <w:bookmarkStart w:id="47" w:name="discussion"/>
     <w:p>
       <w:pPr>
         <w:pStyle w:val="Heading1"/>
@@ -4221,7 +5062,7 @@
         <w:pStyle w:val="BodyText"/>
       </w:pPr>
       <w:r>
-        <w:t xml:space="preserve">The judge comparison shows that the usefulness of an LLM judge depends strongly on which model is asked. GPT-4o as a judge was weak and, for Claude papers, wrong in the wrong direction. Gemini 2.5 Pro was excellent on GPT-4o and Llama papers with almost no false alarms on human papers, and it beat our cheap detectors there. The same judge almost never flagged Claude papers, which suggests that a strong judge can have a blind spot for the strongest generators. This blind spot is the more worrying finding, since a screening organization would not know in advance which kind of generator it faces. The Poisson-based features were weaker than the strong judge on two generators and stronger on the third, and they cost orders of magnitude less. The two approaches also look complementary: a simple rank average of the statistical screen and the strong judge, specified in advance, improved on either alone for two generators and detected far more Claude papers than the judge did (Section 4.8). We stress that the fusion needs a batch of documents for the rank normalization, was evaluated on 500 documents, and runs the judge on every document, so it has none of the cost advantage of the screen alone. A cascade in which the judge sees only the documents the screen flags is a different design that we did not test. We also tested one prompt and no examples for each judge, and a few-shot or fine-tuned judge could behave differently.</w:t>
+        <w:t xml:space="preserve">The judge comparison shows that the usefulness of an LLM judge depends strongly on which model is asked. GPT-4o as a judge was weak and, for Claude papers, wrong in the wrong direction. Gemini 2.5 Pro was excellent on GPT-4o and Llama papers with almost no false alarms on human papers, and it beat our cheap detectors there. The same judge almost never flagged Claude papers, which suggests that a strong judge can have a blind spot for the strongest generators. This blind spot is the more worrying finding, since a screening organization would not know in advance which kind of generator it faces. The Poisson-based features were weaker than the strong judge on two generators and stronger on the third, and they cost orders of magnitude less. The two approaches also look complementary: a simple rank average of the statistical screen and the strong judge, specified in advance, improved on either alone for two generators and detected far more Claude papers than the judge did (Section 4.8). We stress that the fusion needs a batch of documents for the rank normalization, was evaluated on 500 documents, and runs the judge on every document, so it has none of the cost advantage of the screen alone. A cascade in which the judge sees only the documents that the screen scores highest, which we simulated (Section 4.9), keeps most of the judge’s detection of GPT-4o and Llama papers at a fraction of the cost when machine papers are a small share of the pool, though the saving shrinks as that share grows and it offers little for Claude papers, which neither method detects well. We also tested one prompt and no examples for each judge, and a few-shot or fine-tuned judge could behave differently.</w:t>
       </w:r>
     </w:p>
     <w:p>
@@ -4250,8 +5091,8 @@
         <w:t xml:space="preserve">can be explained to an author or editor, and it costs nothing to compute. It should therefore be treated as a low-cost first filter whose output is routed to human review, not as grounds for action on its own.</w:t>
       </w:r>
     </w:p>
-    <w:bookmarkEnd w:id="45"/>
-    <w:bookmarkStart w:id="46" w:name="limitations"/>
+    <w:bookmarkEnd w:id="47"/>
+    <w:bookmarkStart w:id="48" w:name="limitations"/>
     <w:p>
       <w:pPr>
         <w:pStyle w:val="Heading1"/>
@@ -4567,6 +5408,28 @@
           <w:bCs/>
           <w:b/>
         </w:rPr>
+        <w:t xml:space="preserve">Cascade simulation.</w:t>
+      </w:r>
+      <w:r>
+        <w:t xml:space="preserve"> </w:t>
+      </w:r>
+      <w:r>
+        <w:t xml:space="preserve">The cascade was simulated on the same 500 judged documents, with machine papers resampled with replacement to reach 10% prevalence from fewer than 100 distinct papers per generator, so the intervals are wide and the results should be read as indicative. The 5%-false-positive thresholds are set on the evaluated pools and are optimistic, the prevalence of machine papers is assumed known, and the Poisson detector’s training needs labeled examples from other generators. We did not run the cascade on a real submission stream.</w:t>
+      </w:r>
+    </w:p>
+    <w:p>
+      <w:pPr>
+        <w:numPr>
+          <w:ilvl w:val="0"/>
+          <w:numId w:val="1002"/>
+        </w:numPr>
+        <w:pStyle w:val="Compact"/>
+      </w:pPr>
+      <w:r>
+        <w:rPr>
+          <w:bCs/>
+          <w:b/>
+        </w:rPr>
         <w:t xml:space="preserve">No reviewer experiment.</w:t>
       </w:r>
       <w:r>
@@ -4576,8 +5439,8 @@
         <w:t xml:space="preserve">We did not test whether explainable evidence improves the decisions of human reviewers.</w:t>
       </w:r>
     </w:p>
-    <w:bookmarkEnd w:id="46"/>
-    <w:bookmarkStart w:id="47" w:name="planned-extensions"/>
+    <w:bookmarkEnd w:id="48"/>
+    <w:bookmarkStart w:id="49" w:name="planned-extensions"/>
     <w:p>
       <w:pPr>
         <w:pStyle w:val="Heading1"/>
@@ -4591,11 +5454,11 @@
         <w:pStyle w:val="FirstParagraph"/>
       </w:pPr>
       <w:r>
-        <w:t xml:space="preserve">Five steps would turn this pilot into a test of the full proposal. (i) Add further generators, including more open-weight models and future releases, and evaluate each as held out, together with a negative binomial reference in place of the Poisson benchmark. (ii) Add few-shot and fine-tuned judges, a test of a cascade in which the judge sees only documents flagged by the cheap screen, and MAUVE and BERTScore, on identical documents, recording latency and cost. (iii) Test robustness to paraphrasing and light human editing, and replicate the clustering model on new documents and generators, ideally with full likelihood estimation (for example, a log-Gaussian Cox process) in place of moment matching. (iv) Conduct a randomized experiment in which domain experts classify real and fabricated papers under three conditions (no indicator, an unexplained AI score, and an explainable event-based indicator), analyzed with ANOVA and planned contrasts after an a priori power analysis. Pre-registering the feature list, windows, and analysis plan would guard against analytic flexibility.</w:t>
-      </w:r>
-    </w:p>
-    <w:bookmarkEnd w:id="47"/>
-    <w:bookmarkStart w:id="48" w:name="conclusion"/>
+        <w:t xml:space="preserve">Five steps would turn this pilot into a test of the full proposal. (i) Add further generators, including more open-weight models and future releases, and evaluate each as held out, together with a negative binomial reference in place of the Poisson benchmark. (ii) Add few-shot and fine-tuned judges, a live test of the cascade on a real submission stream with realistic prevalence, and MAUVE and BERTScore, on identical documents, recording latency and cost. (iii) Test robustness to paraphrasing and light human editing, and replicate the clustering model on new documents and generators, ideally with full likelihood estimation (for example, a log-Gaussian Cox process) in place of moment matching. (iv) Conduct a randomized experiment in which domain experts classify real and fabricated papers under three conditions (no indicator, an unexplained AI score, and an explainable event-based indicator), analyzed with ANOVA and planned contrasts after an a priori power analysis. Pre-registering the feature list, windows, and analysis plan would guard against analytic flexibility.</w:t>
+      </w:r>
+    </w:p>
+    <w:bookmarkEnd w:id="49"/>
+    <w:bookmarkStart w:id="50" w:name="conclusion"/>
     <w:p>
       <w:pPr>
         <w:pStyle w:val="Heading1"/>
@@ -4609,11 +5472,11 @@
         <w:pStyle w:val="FirstParagraph"/>
       </w:pPr>
       <w:r>
-        <w:t xml:space="preserve">Counting small linguistic events is a cheap and transparent way to screen scholarly text, but the simplest version of the idea, measuring distance from a Poisson process, does not work, because human text is not Poisson. A richer set of count-based features detects machine-generated papers well within a generator, but accuracy falls to between 0.73 and 0.81 on an unseen generator. Dispersion transfers better than event rates, and that is the clearest sign in our data that the count-process view captures something general. Detectors built on human text alone, which would avoid the need for generator examples, performed near chance. A model of clustering across scales improved detection modestly and consistently, and the improvement held in a test fixed in advance on an unseen open-weight generator (AUC 0.89 to 0.93). In a blind comparison with two zero-shot LLM judges, the Poisson-based detectors beat GPT-4o as judge, trailed a stronger judge (Gemini 2.5 Pro) on two generators, and beat it on the third, Claude, which both judges rarely flagged; they did so at no marginal cost, though they rely on examples of machine text that the judges do not. A simple fusion of the screen with the stronger judge improved on either alone for two generators and detected far more Claude papers than the judge did, but it requires running the judge on every document. The evidence is limited to three generators, one genre, and two judges, and whether the approach helps human reviewers or outperforms embedding-based metrics remains untested.</w:t>
-      </w:r>
-    </w:p>
-    <w:bookmarkEnd w:id="48"/>
-    <w:bookmarkStart w:id="49" w:name="references"/>
+        <w:t xml:space="preserve">Counting small linguistic events is a cheap and transparent way to screen scholarly text, but the simplest version of the idea, measuring distance from a Poisson process, does not work, because human text is not Poisson. A richer set of count-based features detects machine-generated papers well within a generator, but accuracy falls to between 0.73 and 0.81 on an unseen generator. Dispersion transfers better than event rates, and that is the clearest sign in our data that the count-process view captures something general. Detectors built on human text alone, which would avoid the need for generator examples, performed near chance. A model of clustering across scales improved detection modestly and consistently, and the improvement held in a test fixed in advance on an unseen open-weight generator (AUC 0.89 to 0.93). In a blind comparison with two zero-shot LLM judges, the Poisson-based detectors beat GPT-4o as judge, trailed a stronger judge (Gemini 2.5 Pro) on two generators, and beat it on the third, Claude, which both judges rarely flagged; they did so at no marginal cost, though they rely on examples of machine text that the judges do not. A simple fusion of the screen with the stronger judge improved on either alone for two generators and detected far more Claude papers than the judge did, but it requires running the judge on every document. In a simulated cascade, judging only the highest-scoring 30% to 50% of documents kept most of the judge’s detection of GPT-4o and Llama papers when machine papers were 10% of the pool. The evidence is limited to three generators, one genre, and two judges, and whether the approach helps human reviewers or outperforms embedding-based metrics remains untested.</w:t>
+      </w:r>
+    </w:p>
+    <w:bookmarkEnd w:id="50"/>
+    <w:bookmarkStart w:id="51" w:name="references"/>
     <w:p>
       <w:pPr>
         <w:pStyle w:val="Heading1"/>
@@ -4895,7 +5758,7 @@
         <w:t xml:space="preserve">(36).</w:t>
       </w:r>
     </w:p>
-    <w:bookmarkEnd w:id="49"/>
+    <w:bookmarkEnd w:id="51"/>
     <w:sectPr/>
   </w:body>
 </w:document>

</xml_diff>

<commit_message>
Rewrite paper in natural academic English: shorter abstract, merged sections, prose limitations, verified references
Co-Authored-By: Claude Sonnet 5.5 <noreply@anthropic.com>
Claude-Session: https://claude.ai/code/session_01FLb7uVf7YBgdoa75gbZ2sf
</commit_message>
<xml_diff>
--- a/paper/Poisson_LLM_Pilot_Paper_MISQ.docx
+++ b/paper/Poisson_LLM_Pilot_Paper_MISQ.docx
@@ -7,61 +7,31 @@
         <w:pStyle w:val="Title"/>
       </w:pPr>
       <w:r>
-        <w:t xml:space="preserve">Counting</w:t>
-      </w:r>
-      <w:r>
-        <w:t xml:space="preserve"> </w:t>
-      </w:r>
-      <w:r>
-        <w:t xml:space="preserve">What</w:t>
-      </w:r>
-      <w:r>
-        <w:t xml:space="preserve"> </w:t>
-      </w:r>
-      <w:r>
-        <w:t xml:space="preserve">Machines</w:t>
-      </w:r>
-      <w:r>
-        <w:t xml:space="preserve"> </w:t>
-      </w:r>
-      <w:r>
-        <w:t xml:space="preserve">Cannot</w:t>
-      </w:r>
-      <w:r>
-        <w:t xml:space="preserve"> </w:t>
-      </w:r>
-      <w:r>
-        <w:t xml:space="preserve">Fake?</w:t>
-      </w:r>
-      <w:r>
-        <w:t xml:space="preserve"> </w:t>
-      </w:r>
-      <w:r>
-        <w:t xml:space="preserve">A</w:t>
-      </w:r>
-      <w:r>
-        <w:t xml:space="preserve"> </w:t>
-      </w:r>
-      <w:r>
-        <w:t xml:space="preserve">Pilot</w:t>
-      </w:r>
-      <w:r>
-        <w:t xml:space="preserve"> </w:t>
-      </w:r>
-      <w:r>
-        <w:t xml:space="preserve">Study</w:t>
-      </w:r>
-      <w:r>
-        <w:t xml:space="preserve"> </w:t>
-      </w:r>
-      <w:r>
-        <w:t xml:space="preserve">of</w:t>
-      </w:r>
-      <w:r>
-        <w:t xml:space="preserve"> </w:t>
-      </w:r>
-      <w:r>
-        <w:t xml:space="preserve">Poisson-Based</w:t>
+        <w:t xml:space="preserve">Beyond</w:t>
+      </w:r>
+      <w:r>
+        <w:t xml:space="preserve"> </w:t>
+      </w:r>
+      <w:r>
+        <w:t xml:space="preserve">the</w:t>
+      </w:r>
+      <w:r>
+        <w:t xml:space="preserve"> </w:t>
+      </w:r>
+      <w:r>
+        <w:t xml:space="preserve">Poisson</w:t>
+      </w:r>
+      <w:r>
+        <w:t xml:space="preserve"> </w:t>
+      </w:r>
+      <w:r>
+        <w:t xml:space="preserve">Assumption:</w:t>
+      </w:r>
+      <w:r>
+        <w:t xml:space="preserve"> </w:t>
+      </w:r>
+      <w:r>
+        <w:t xml:space="preserve">Count-Based</w:t>
       </w:r>
       <w:r>
         <w:t xml:space="preserve"> </w:t>
@@ -105,7 +75,7 @@
         <w:t xml:space="preserve"> </w:t>
       </w:r>
       <w:r>
-        <w:t xml:space="preserve">paper,</w:t>
+        <w:t xml:space="preserve">paper:</w:t>
       </w:r>
       <w:r>
         <w:t xml:space="preserve"> </w:t>
@@ -123,43 +93,19 @@
         <w:t xml:space="preserve"> </w:t>
       </w:r>
       <w:r>
-        <w:t xml:space="preserve">(three</w:t>
-      </w:r>
-      <w:r>
-        <w:t xml:space="preserve"> </w:t>
-      </w:r>
-      <w:r>
-        <w:t xml:space="preserve">generators;</w:t>
-      </w:r>
-      <w:r>
-        <w:t xml:space="preserve"> </w:t>
-      </w:r>
-      <w:r>
-        <w:t xml:space="preserve">human-subject</w:t>
-      </w:r>
-      <w:r>
-        <w:t xml:space="preserve"> </w:t>
-      </w:r>
-      <w:r>
-        <w:t xml:space="preserve">experiment</w:t>
-      </w:r>
-      <w:r>
-        <w:t xml:space="preserve"> </w:t>
-      </w:r>
-      <w:r>
-        <w:t xml:space="preserve">not</w:t>
-      </w:r>
-      <w:r>
-        <w:t xml:space="preserve"> </w:t>
-      </w:r>
-      <w:r>
-        <w:t xml:space="preserve">yet</w:t>
-      </w:r>
-      <w:r>
-        <w:t xml:space="preserve"> </w:t>
-      </w:r>
-      <w:r>
-        <w:t xml:space="preserve">conducted)</w:t>
+        <w:t xml:space="preserve">from</w:t>
+      </w:r>
+      <w:r>
+        <w:t xml:space="preserve"> </w:t>
+      </w:r>
+      <w:r>
+        <w:t xml:space="preserve">three</w:t>
+      </w:r>
+      <w:r>
+        <w:t xml:space="preserve"> </w:t>
+      </w:r>
+      <w:r>
+        <w:t xml:space="preserve">generators</w:t>
       </w:r>
     </w:p>
     <w:bookmarkStart w:id="20" w:name="abstract"/>
@@ -176,7 +122,7 @@
         <w:pStyle w:val="FirstParagraph"/>
       </w:pPr>
       <w:r>
-        <w:t xml:space="preserve">Organizations that publish or archive scholarly documents now face a screening problem: language models can produce papers faster and more cheaply than anyone can check them. Two common remedies, LLM-as-a-judge and embedding-based similarity metrics, are either expensive and prompt-dependent or insensitive to fine-grained statistical structure. We study a lightweight alternative that treats the occurrence of selected linguistic events (special punctuation, discourse markers, passive constructions, nominalizations) as count processes and asks how far a document departs from human-authored text. Using 474 human-written papers from PubMed Central and arXiv (2015–2019) and matched papers from three generators (GPT-4o, 245 papers; Claude Sonnet 5.5, 152; Llama 3.3 70B, 202), we report nine findings. First, human text is not Poisson: for punctuation events, 36–49% of documents reject the Poisson null because of over-dispersion. Second, a single Poisson-distance index performs near chance (AUC 0.51–0.54). Third, a vector of event rates and dispersion indices separates human from machine text well when the detector is trained and tested on the same generator (AUC 0.91–0.99), but not across generators: a detector trained on GPT-4o reaches 0.73 on Claude. Fourth, dispersion transfers better than event rates, which differ in sign across generators. Fifth, detectors trained on human papers alone perform near chance to modestly above it. Sixth, we propose a scale-dependent clustering model, a doubly stochastic (Cox) Poisson process summarized by how the Fano factor changes with window size. In a test specified before the Llama data were collected, it raised AUC on the unseen Llama papers from 0.89 to 0.93 (difference +0.046, 95% interval 0.030 to 0.063). Seventh, in a blind comparison on 500 excerpts with two zero-shot LLM judges, the answer depended on the judge and on the generator. GPT-4o as judge reached AUCs of 0.76, 0.45, and 0.85 against GPT-4o, Claude, and Llama papers, below the Poisson-based detectors trained on the other generators (0.95, 0.77, and 0.93). Gemini 2.5 Pro, a stronger judge that is not one of the generators, did better than those detectors on GPT-4o and Llama papers (0.97 and 0.97) but worse on Claude papers (0.66), which both judges almost never flagged. Eighth, a label-free fusion of the Poisson screen with the Gemini judge, specified in advance, was better than either alone on GPT-4o and Llama papers (AUC 0.99 on both) and no worse than the screen on Claude papers (0.79), where it detected 39% of papers at a 5% false-positive rate, against 17% for the screen and 1% for the judge. Ninth, in a simulated cascade in which the judge sees only the documents the Poisson screen scores highest, and machine papers are 10% of the pool, judging the top 30% detected as many GPT-4o papers as judging everything (95% at a 5% false-positive rate) at 30% of the cost, and judging the top 50% matched full judging for Llama papers (97% against 96%); Claude papers stayed hard (30% to 40%) at every setting, and savings shrink as the share of machine papers grows. The Poisson features cost nothing per document, against about US$0.007 and 1.7 seconds for GPT-4o and US$0.017 and 23 seconds for Gemini, but unlike the judges they need labeled examples. The evidence is limited to three generators, one genre, and two judges, and we do not test adversarial editing, embedding-based metrics, or the effect on human reviewers.</w:t>
+        <w:t xml:space="preserve">Scholarly publishers face a new screening problem: language models now write plausible papers faster than anyone can check them. We examine a transparent and nearly free screen built on counts of small linguistic events, such as parentheses, semicolons, passive clauses, and discourse markers. Using 474 human-written papers from 2015–2019 and matched papers from GPT-4o, Claude, and Llama, we find that human text is not Poisson, so a simple distance from a Poisson process detects almost nothing. Richer count-based features detect machine text well only for the generator on which they were trained. A model of how events cluster across window sizes improves transfer to an unseen generator (AUC 0.89 to 0.93). Compared with zero-shot LLM judges, the screen is far cheaper and sometimes better, and combining the two works best, although Claude’s papers evade every method we tried. The evidence comes from three generators and one genre.</w:t>
       </w:r>
     </w:p>
     <w:p>
@@ -212,7 +158,7 @@
         <w:pStyle w:val="FirstParagraph"/>
       </w:pPr>
       <w:r>
-        <w:t xml:space="preserve">Scholarly publishing has long treated fluent, well-structured prose as weak evidence of effort. Large language models weaken even that signal. A model can draft an abstract, a methods section, or a plausible set of results in a minute, and the output is often good enough to survive a quick read. For publishers, preprint servers, and research-integrity offices, the practical question is no longer whether such text exists but whether it can be screened at a cost that scales with submission volume, and in a way that a human reviewer can understand and contest.</w:t>
+        <w:t xml:space="preserve">Fluent, well-organized prose has long served as weak evidence of effort in scholarly publishing. Large language models undermine even that. A model can draft an abstract, a methods section, or a plausible set of results in a minute, and the output is often good enough to survive a quick read. For publishers, preprint servers, and research-integrity offices, the practical question is therefore no longer whether such text exists. It is whether it can be screened at a cost that scales with submission volume, and in a way that an editor can understand and contest.</w:t>
       </w:r>
     </w:p>
     <w:p>
@@ -220,7 +166,7 @@
         <w:pStyle w:val="BodyText"/>
       </w:pPr>
       <w:r>
-        <w:t xml:space="preserve">Current options fit this need poorly. Asking a strong model to grade a document (LLM-as-a-judge; Zheng et al., 2023) is flexible, but each call costs money, the verdict depends on prompt wording and on the judge’s own preferences, and the reasoning cannot be audited in any statistical sense. Embedding-based comparisons such as MAUVE (Pillutla et al., 2021) and BERTScore (Zhang et al., 2020) are cheaper, but they mainly measure whether two sets of texts</w:t>
+        <w:t xml:space="preserve">Current options fit this need poorly. Asking a strong model to grade a document, the approach known as LLM-as-a-judge (Zheng et al. 2023), is flexible, but every call costs money, the verdict depends on the wording of the prompt and on the judge’s own tendencies, and the reasoning cannot be audited statistically. Embedding-based comparisons such as MAUVE (Pillutla et al. 2021) and BERTScore (Zhang et al. 2020) are cheaper, but they mostly measure whether two sets of texts</w:t>
       </w:r>
       <w:r>
         <w:t xml:space="preserve"> </w:t>
@@ -252,7 +198,7 @@
         <w:t xml:space="preserve"> </w:t>
       </w:r>
       <w:r>
-        <w:t xml:space="preserve">alike at the level of small, countable habits, such as how often a semicolon appears in a section.</w:t>
+        <w:t xml:space="preserve">alike in small, countable habits, such as how often a semicolon appears in a section.</w:t>
       </w:r>
     </w:p>
     <w:p>
@@ -260,7 +206,7 @@
         <w:pStyle w:val="BodyText"/>
       </w:pPr>
       <w:r>
-        <w:t xml:space="preserve">This paper pursues a different idea. Writers do not plan the frequency of small linguistic events. A parenthesis here, a passive clause there: these accumulate as a by-product of content and habit, which is the setting in which count models are natural. Language models, in contrast, are trained to make each next token locally likely, and decoding choices can smooth or regularize how often particular forms recur. If so, machine-written text may differ from human text in the</w:t>
+        <w:t xml:space="preserve">We start from a simple observation. Writers do not plan how many parentheses a paragraph will contain. Such events accumulate as a by-product of content and habit, which is the setting in which count models are natural. Language models, by contrast, are trained to make each next token locally likely, and decoding choices can smooth or regularize how often particular forms recur. If so, machine-written text may differ from human text in the</w:t>
       </w:r>
       <w:r>
         <w:t xml:space="preserve"> </w:t>
@@ -276,7 +222,7 @@
         <w:t xml:space="preserve"> </w:t>
       </w:r>
       <w:r>
-        <w:t xml:space="preserve">of event counts, not only in their average, and a transparent statistical lens could pick this up at almost no cost.</w:t>
+        <w:t xml:space="preserve">of event counts, and not only in their averages, and a transparent statistical screen could detect this at almost no cost.</w:t>
       </w:r>
     </w:p>
     <w:p>
@@ -284,7 +230,7 @@
         <w:pStyle w:val="BodyText"/>
       </w:pPr>
       <w:r>
-        <w:t xml:space="preserve">The classical benchmark for counts of independent events is the Poisson distribution, whose variance equals its mean. An earlier version of this project assumed that human-authored scientific text approximately follows this benchmark and that LLM output departs from it. We test that assumption directly rather than adopting it. We also test something that detection studies often leave implicit: whether a detector built on one generator still works on another. We ask three questions, in the order a screening organization would:</w:t>
+        <w:t xml:space="preserve">The classical benchmark for counts of independent events is the Poisson distribution, whose variance equals its mean. An earlier version of this project took for granted that human scientific writing roughly follows this benchmark and that machine text departs from it. We test that premise instead of adopting it, and we test something that detection studies often leave implicit: whether a detector built on one generator still works on another. Three questions organize the paper, in the order a screening organization would ask them.</w:t>
       </w:r>
     </w:p>
     <w:p>
@@ -306,7 +252,7 @@
         <w:t xml:space="preserve"> </w:t>
       </w:r>
       <w:r>
-        <w:t xml:space="preserve">Do human-authored papers follow a Poisson process in the selected events, and how does LLM-generated text differ?</w:t>
+        <w:t xml:space="preserve">Do human-authored papers follow a Poisson process in the selected events, and how does machine-generated text differ?</w:t>
       </w:r>
     </w:p>
     <w:p>
@@ -328,7 +274,7 @@
         <w:t xml:space="preserve"> </w:t>
       </w:r>
       <w:r>
-        <w:t xml:space="preserve">How well do Poisson-based quantities separate human from LLM-generated papers, which part of the signal (rates or dispersion) carries the discrimination, and does a detector built on one generator work on another?</w:t>
+        <w:t xml:space="preserve">How well do count-based features separate human from machine-generated papers, which part of the signal carries the discrimination, and does a detector built on one generator work on another?</w:t>
       </w:r>
     </w:p>
     <w:p>
@@ -350,7 +296,7 @@
         <w:t xml:space="preserve"> </w:t>
       </w:r>
       <w:r>
-        <w:t xml:space="preserve">What does screening with these quantities cost in time and money?</w:t>
+        <w:t xml:space="preserve">What does screening cost in time and money, compared with an LLM judge?</w:t>
       </w:r>
     </w:p>
     <w:p>
@@ -358,7 +304,7 @@
         <w:pStyle w:val="FirstParagraph"/>
       </w:pPr>
       <w:r>
-        <w:t xml:space="preserve">A further question concerns whether explainable statistical evidence improves the decisions of human reviewers. It requires a controlled experiment with participants, which we have not run; we describe the intended design in Section 7 and report no results for it.</w:t>
+        <w:t xml:space="preserve">We make four contributions. First, we show that human text departs systematically from the Poisson benchmark, which explains why a single Poisson-distance score fails. Second, we document how sharply detection degrades across generators and which features transfer best. Third, we propose a scale-dependent clustering model, a doubly stochastic Poisson process, and test it on an open-weight generator that played no part in its development. Fourth, we compare the screen with two LLM judges and evaluate two ways of combining them, including the cost implications. Whether explainable statistical evidence improves the decisions of human reviewers is a separate question that requires a controlled experiment; we have not run one.</w:t>
       </w:r>
     </w:p>
     <w:bookmarkEnd w:id="21"/>
@@ -386,7 +332,7 @@
         <w:t xml:space="preserve"> </w:t>
       </w:r>
       <w:r>
-        <w:t xml:space="preserve">The information quality literature treats accuracy and credibility as properties an organization has to monitor, not assume. Generative models change the economics of that monitoring because producing plausible content is now cheaper than verifying it. Screening cost per document is therefore a legitimate outcome alongside detection accuracy, a view consistent with the design-science tradition in information systems, in which an artifact is judged by whether it solves an organizational problem at acceptable cost (Hevner et al., 2004).</w:t>
+        <w:t xml:space="preserve">Research on information quality treats accuracy and credibility as properties that organizations must monitor actively. Generative models change the economics of that monitoring, because producing plausible content is now cheaper than verifying it. Cost per screened document therefore belongs among the outcomes alongside detection accuracy, a view in keeping with the design-science tradition, in which an artifact is judged by whether it solves an organizational problem at acceptable cost (Hevner et al. 2004).</w:t>
       </w:r>
     </w:p>
     <w:p>
@@ -404,7 +350,7 @@
         <w:t xml:space="preserve"> </w:t>
       </w:r>
       <w:r>
-        <w:t xml:space="preserve">Existing detectors include supervised classifiers, methods based on a language model’s own probabilities (for example, Gehrmann et al., 2019; Mitchell et al., 2023), and judge-style evaluation. Most are opaque to the end user, and many degrade when the generating model changes. We trade breadth for transparency: every quantity we use can be traced to a specific, countable feature.</w:t>
+        <w:t xml:space="preserve">Existing detectors include supervised classifiers, methods that use a language model’s own probabilities (for example, Gehrmann et al. 2019; Mitchell et al. 2023), and judge-style evaluation by a second model. Most are opaque to the person who must act on them, and many deteriorate when the generating model changes. We give up some flexibility in exchange for transparency: every quantity we use traces back to a specific, countable feature.</w:t>
       </w:r>
     </w:p>
     <w:p>
@@ -422,17 +368,17 @@
         <w:t xml:space="preserve"> </w:t>
       </w:r>
       <w:r>
-        <w:t xml:space="preserve">For counts of independent events in fixed windows, the Poisson model implies a dispersion index (variance divided by mean) of one. Real text typically violates this, because topics, sections, and formatting conventions make events cluster. Count-data methods handle this by allowing extra variation, as in the negative binomial family (Cameron &amp; Trivedi, 2013). The dispersion index is therefore best read as a descriptive summary of how clustered a document’s events are, and we use it that way.</w:t>
+        <w:t xml:space="preserve">For counts of independent events in fixed windows, the Poisson model implies a dispersion index, the variance divided by the mean, of one. Real text rarely satisfies this, because topics, sections, and formatting conventions make events cluster. Count-data methods accommodate extra variation, for instance through the negative binomial family (Cameron and Trivedi 2013). We therefore read the dispersion index descriptively, as a summary of how clustered a document’s events are.</w:t>
       </w:r>
     </w:p>
     <w:bookmarkEnd w:id="22"/>
-    <w:bookmarkStart w:id="32" w:name="data-and-measures"/>
+    <w:bookmarkStart w:id="30" w:name="data-and-methods"/>
     <w:p>
       <w:pPr>
         <w:pStyle w:val="Heading1"/>
       </w:pPr>
       <w:r>
-        <w:t xml:space="preserve">3. Data and Measures</w:t>
+        <w:t xml:space="preserve">3. Data and Methods</w:t>
       </w:r>
     </w:p>
     <w:bookmarkStart w:id="23" w:name="human-authored-papers"/>
@@ -449,17 +395,17 @@
         <w:pStyle w:val="FirstParagraph"/>
       </w:pPr>
       <w:r>
-        <w:t xml:space="preserve">We sampled English-language papers published between 2015 and 2019, before widespread use of LLMs for scientific writing. Papers came from the PubMed Central open-access subset (medicine; 300 sampled) and arXiv (computer science; 200 sampled), drawn at random within each source. For PubMed Central we used body paragraphs from the article XML. For arXiv we converted PDFs to text, removed the reference list, and joined broken lines. Documents shorter than 1,500 words were excluded, and the analysis requires at least four 500-token windows, which left 474 human papers.</w:t>
+        <w:t xml:space="preserve">We sampled English-language papers published between 2015 and 2019, before large language models were widely used for scientific writing. Papers came from the open-access subset of PubMed Central (medicine; 300 sampled) and from arXiv (computer science; 200 sampled), drawn at random within each source. For PubMed Central we used the body paragraphs of the article XML. For arXiv we converted the PDFs to text, removed the reference list, and rejoined broken lines. We excluded documents shorter than 1,500 words, and the analysis requires at least four 500-token windows, which left 474 human papers.</w:t>
       </w:r>
     </w:p>
     <w:bookmarkEnd w:id="23"/>
-    <w:bookmarkStart w:id="24" w:name="synthetic-papers"/>
+    <w:bookmarkStart w:id="24" w:name="machine-generated-papers"/>
     <w:p>
       <w:pPr>
         <w:pStyle w:val="Heading2"/>
       </w:pPr>
       <w:r>
-        <w:t xml:space="preserve">3.2 Synthetic papers</w:t>
+        <w:t xml:space="preserve">3.2 Machine-generated papers</w:t>
       </w:r>
     </w:p>
     <w:p>
@@ -467,7 +413,7 @@
         <w:pStyle w:val="FirstParagraph"/>
       </w:pPr>
       <w:r>
-        <w:t xml:space="preserve">For each sampled paper we asked a generator to write a paper on the same topic, given the original title and abstract, using one of three prompts of increasing detail. We used three generators through a commercial API gateway: GPT-4o, Claude Sonnet 5.5, and Llama 3.3 70B Instruct (an open-weight model, hosted). A single request yielded only about 800 words from GPT-4o, too short for window-based analysis, so each paper was generated in four requests (introduction, methods, results, discussion and conclusion) and concatenated. Prompts were presented in a fixed random order, so each subset is random across fields.</w:t>
+        <w:t xml:space="preserve">For each sampled paper we asked a generator to write a paper on the same topic, given the original title and abstract, using one of three prompts of increasing detail. We used three generators through a commercial API gateway: GPT-4o, Claude Sonnet 5.5, and Llama 3.3 70B Instruct, an open-weight model. A single request produced only about 800 words from GPT-4o, too short for window-based analysis, so each paper was written in four requests (introduction, methods, results, and discussion with conclusion) and concatenated. Prompts were processed in a fixed random order, so each generator’s sample is random across fields.</w:t>
       </w:r>
     </w:p>
     <w:p>
@@ -475,7 +421,7 @@
         <w:pStyle w:val="BodyText"/>
       </w:pPr>
       <w:r>
-        <w:t xml:space="preserve">GPT-4o produced 245 unique papers (one source had been generated twice during testing and we kept one record), with a median of about 2,750 words. Claude produced 152 papers, with a median of 4,566 words (range 3,667 to 5,134); generation was capped at that number to limit cost, not because of any property of the output. Llama 3.3 70B Instruct, an open-weight model that we accessed through the same gateway, produced 202 unique papers (one source had again been generated twice and one record was kept), with a median of about 2,970 words (range 2,355 to 7,926). It was added last, after the clustering model of Section 3.5 had been developed, and it serves as the confirmatory test. All three synthetic sets passed the length requirement, and because the generators wrote papers of different lengths, all documents are truncated to the same length before analysis (Section 3.3).</w:t>
+        <w:t xml:space="preserve">GPT-4o produced 245 unique papers, with a median length of about 2,750 words; one source had been generated twice during testing, and we kept one record. Claude produced 152 papers (median 4,566 words, range 3,667 to 5,134). We capped generation at that number to limit cost, not because of any property of the output. Llama produced 202 unique papers (median about 2,970 words, range 2,355 to 7,926), again keeping one record for a source generated twice. Llama was added last, after the clustering model of Section 3.5 had been developed, and it serves as the confirmatory test. Because the generators wrote papers of different lengths, every document is truncated to the same length before analysis.</w:t>
       </w:r>
     </w:p>
     <w:bookmarkEnd w:id="24"/>
@@ -493,7 +439,7 @@
         <w:pStyle w:val="FirstParagraph"/>
       </w:pPr>
       <w:r>
-        <w:t xml:space="preserve">Each document is cut into consecutive windows of 500 whitespace-delimited tokens, and only the first four windows (2,000 tokens) are retained for every document, human or synthetic, so that length cannot drive any result. In each window we count seven events: parentheses, square brackets, semicolons, paired quotation marks, a list of fourteen discourse markers (for example,</w:t>
+        <w:t xml:space="preserve">Each document is cut into consecutive windows of 500 whitespace-delimited tokens, and only the first four windows (2,000 tokens) are kept for every document, human or machine, so that length cannot drive any result. In each window we count seven events: parentheses, square brackets, semicolons, paired quotation marks, a list of fourteen discourse markers (for example,</w:t>
       </w:r>
       <w:r>
         <w:t xml:space="preserve"> </w:t>
@@ -548,7 +494,7 @@
         <w:t xml:space="preserve"> </w:t>
       </w:r>
       <w:r>
-        <w:t xml:space="preserve">plus a participle, identified by pattern matching), and nominalizations (words ending in</w:t>
+        <w:t xml:space="preserve">plus a participle, found by pattern matching), and nominalizations (words ending in</w:t>
       </w:r>
       <w:r>
         <w:t xml:space="preserve"> </w:t>
@@ -574,7 +520,7 @@
         <w:t xml:space="preserve">-ment</w:t>
       </w:r>
       <w:r>
-        <w:t xml:space="preserve">,</w:t>
+        <w:t xml:space="preserve">, or</w:t>
       </w:r>
       <w:r>
         <w:t xml:space="preserve"> </w:t>
@@ -587,7 +533,7 @@
         <w:t xml:space="preserve">-ity</w:t>
       </w:r>
       <w:r>
-        <w:t xml:space="preserve">). The passive and nominalization patterns are approximate and will misclassify some words.</w:t>
+        <w:t xml:space="preserve">). The patterns for passives and nominalizations are approximate and misclassify some words.</w:t>
       </w:r>
     </w:p>
     <w:p>
@@ -595,7 +541,7 @@
         <w:pStyle w:val="BodyText"/>
       </w:pPr>
       <w:r>
-        <w:t xml:space="preserve">For each document and event we compute the mean count per window (the</w:t>
+        <w:t xml:space="preserve">For each document and event we compute the mean count per window, which we call the</w:t>
       </w:r>
       <w:r>
         <w:t xml:space="preserve"> </w:t>
@@ -608,17 +554,17 @@
         <w:t xml:space="preserve">rate</w:t>
       </w:r>
       <w:r>
-        <w:t xml:space="preserve">) and the dispersion index. A document-level Poisson test uses the statistic (n − 1) × dispersion index, compared to a chi-squared distribution with n − 1 degrees of freedom, with separate tail probabilities for over- and under-dispersion. With only four windows per document, these tests have low power, so rejection rates understate true departures from Poisson behavior.</w:t>
+        <w:t xml:space="preserve">, and the dispersion index. A document-level Poisson test compares (n − 1) times the dispersion index with a chi-squared distribution with n − 1 degrees of freedom, with separate tail probabilities for over- and under-dispersion. With only four windows per document these tests have low power, so the rejection rates we report understate the true departure from Poisson behavior.</w:t>
       </w:r>
     </w:p>
     <w:bookmarkEnd w:id="25"/>
-    <w:bookmarkStart w:id="26" w:name="poisson-score-and-feature-vector"/>
+    <w:bookmarkStart w:id="26" w:name="poisson-score-and-baseline-features"/>
     <w:p>
       <w:pPr>
         <w:pStyle w:val="Heading2"/>
       </w:pPr>
       <w:r>
-        <w:t xml:space="preserve">3.4 Poisson-Score and feature vector</w:t>
+        <w:t xml:space="preserve">3.4 Poisson-Score and baseline features</w:t>
       </w:r>
     </w:p>
     <w:p>
@@ -626,7 +572,7 @@
         <w:pStyle w:val="FirstParagraph"/>
       </w:pPr>
       <w:r>
-        <w:t xml:space="preserve">The Poisson-Score maps a document into the interval [0, 1) from its mean absolute standardized deviation, across all events, from a human reference distribution of (log) rates and (log) dispersion indices. The reference is estimated only on human training documents within each cross-validation fold. We also evaluate the underlying fourteen quantities (seven rates and seven dispersion indices) with logistic regression. Documents with no occurrences of an event have undefined dispersion, which we set to one (log zero); this affects mainly square brackets in synthetic text, where most papers contain none.</w:t>
+        <w:t xml:space="preserve">The Poisson-Score maps a document into the interval [0, 1) according to its mean absolute standardized deviation, across all events, from a human reference distribution of log rates and log dispersion indices. The reference is estimated on human training documents only, within each cross-validation fold. As a richer baseline we use the fourteen underlying quantities (seven rates and seven dispersion indices) as inputs to logistic regression. When an event never occurs in a document its dispersion is undefined, and we set it to one; this affects mainly square brackets in machine text, where most papers contain none.</w:t>
       </w:r>
     </w:p>
     <w:bookmarkEnd w:id="26"/>
@@ -644,23 +590,7 @@
         <w:pStyle w:val="FirstParagraph"/>
       </w:pPr>
       <w:r>
-        <w:t xml:space="preserve">Because the Poisson model fails for human text and a single 500-token dispersion index performed weakly, we developed a model that describes</w:t>
-      </w:r>
-      <w:r>
-        <w:t xml:space="preserve"> </w:t>
-      </w:r>
-      <w:r>
-        <w:rPr>
-          <w:iCs/>
-          <w:i/>
-        </w:rPr>
-        <w:t xml:space="preserve">how</w:t>
-      </w:r>
-      <w:r>
-        <w:t xml:space="preserve"> </w:t>
-      </w:r>
-      <w:r>
-        <w:t xml:space="preserve">events cluster, not only whether they do. We treat the occurrences of each event as a doubly stochastic Poisson process (a Cox process): events arrive as a Poisson process whose rate varies along the document. For such a process, the Fano factor in a window of w tokens is F(w) = 1 + Var(Λ_w) / E(Λ_w), where Λ_w is the rate integrated over the window. If rate fluctuations are positively correlated over longer ranges, as when citations cluster in an introduction or passives in a methods section, F(w) grows with w; a pure Poisson process gives F(w) = 1 at every scale.</w:t>
+        <w:t xml:space="preserve">A single dispersion index at one window size says whether events cluster but not how. We therefore developed a model that describes the structure of clustering across scales. We treat the occurrences of each event as a doubly stochastic Poisson process, or Cox process: events arrive as a Poisson process whose rate varies along the document. For such a process, the Fano factor in a window of w tokens is F(w) = 1 + Var(Λ_w) / E(Λ_w), where Λ_w is the rate integrated over the window. If rate fluctuations are positively correlated over long ranges, as when citations gather in an introduction or passives in a methods section, F(w) grows with w. A pure Poisson process gives F(w) = 1 at every scale.</w:t>
       </w:r>
     </w:p>
     <w:p>
@@ -668,7 +598,7 @@
         <w:pStyle w:val="BodyText"/>
       </w:pPr>
       <w:r>
-        <w:t xml:space="preserve">We estimate F(w) for each event at four window sizes (50, 100, 200, and 400 tokens) within the first 2,000 tokens, and summarize each event by three quantities: its rate per 500 tokens, the mean log Fano factor across scales (the overall level of clustering), and the slope of log F(w) on log w (how fast clustering grows with scale). Estimation is by moment matching and is not a full likelihood fit; Fano factors are clipped to [0.05, 20] and set to one when an event does not occur. This yields 21 features (seven events by three quantities), compared with 14 in the baseline.</w:t>
+        <w:t xml:space="preserve">We estimate F(w) for each event at four window sizes (50, 100, 200, and 400 tokens) within the same 2,000 tokens, and summarize each event by three quantities: its rate per 500 tokens, the mean log Fano factor across scales (the overall level of clustering), and the slope of log F(w) on log w (how quickly clustering grows with scale). Estimation is by moment matching and not a full likelihood fit. Fano factors are clipped to [0.05, 20] and set to one when an event does not occur. The result is 21 features (seven events by three quantities), against 14 in the baseline.</w:t>
       </w:r>
     </w:p>
     <w:p>
@@ -676,17 +606,17 @@
         <w:pStyle w:val="BodyText"/>
       </w:pPr>
       <w:r>
-        <w:t xml:space="preserve">The comparison was fixed before the model was run: the baseline (rates plus the 500-token dispersion index) against the new features, on cross-generator AUC (both directions) and on human-only detection. We report all results of this comparison, including those that do not favor the new model. We did not tune the window sizes or any other choice on these data. The model was, however, designed after seeing the baseline results, which is a limitation we return to below.</w:t>
+        <w:t xml:space="preserve">The comparison between the baseline (rates plus the 500-token dispersion index) and the new features was fixed before the model was run, with cross-generator AUC in both directions and human-only detection as the outcomes. We report every result of that comparison, including those that do not favor the new model, and we did not tune window sizes or any other setting on these data. The model was, however, designed after we had seen the baseline results, a limitation we return to in Section 6.</w:t>
       </w:r>
     </w:p>
     <w:bookmarkEnd w:id="27"/>
-    <w:bookmarkStart w:id="28" w:name="evaluation"/>
+    <w:bookmarkStart w:id="28" w:name="evaluation-design"/>
     <w:p>
       <w:pPr>
         <w:pStyle w:val="Heading2"/>
       </w:pPr>
       <w:r>
-        <w:t xml:space="preserve">3.6 Evaluation</w:t>
+        <w:t xml:space="preserve">3.6 Evaluation design</w:t>
       </w:r>
     </w:p>
     <w:p>
@@ -694,17 +624,25 @@
         <w:pStyle w:val="FirstParagraph"/>
       </w:pPr>
       <w:r>
-        <w:t xml:space="preserve">Detection is evaluated by five-fold cross-validation with all material from the same source paper kept in the same fold, so that a human paper and its synthetic counterpart never straddle training and test sets. We report the area under the ROC curve (AUC), with 95% bootstrap intervals over documents. To study transfer, we train on human papers plus papers from one generator and test on held-out human papers plus papers from the other generator, in both directions. We also evaluate detectors trained on human papers only: a Mahalanobis distance from the human feature distribution (Ledoit–Wolf covariance), chosen as the primary method before seeing results, and, as secondary methods, a One-Class SVM and an Isolation Forest, all with default settings and no tuning on generator data. These produce an anomaly score, and we evaluate how well it separates held-out human papers from each generator’s papers. Finally, because the clustering model of Section 3.5 was developed on the GPT-4o and Claude data, we tested it on Llama papers that played no part in its development. This test, and the script that runs it, were fixed before the Llama papers were generated: train on human papers plus both other generators pooled, never on Llama, with grouped cross-validation, and compare the baseline features with the new features by a paired bootstrap of the AUC difference. The analysis code, prompts, and generated papers are in the project repository; the human papers can be re-collected with the included script.</w:t>
+        <w:t xml:space="preserve">Detection is evaluated by five-fold cross-validation in which all material from one source paper stays in one fold, so that a human paper and its machine-written counterpart never straddle the training and test sets. We report the area under the ROC curve (AUC) with 95% bootstrap intervals over documents. To study transfer, we train on human papers plus papers from one generator and test on held-out human papers plus papers from another. We also evaluate detectors trained on human papers only: a Mahalanobis distance from the human feature distribution (Ledoit–Wolf covariance), chosen as the primary method before the results were seen, and, as secondary methods, a one-class support vector machine and an isolation forest, all with default settings. These yield an anomaly score, and we ask how well it separates held-out human papers from each generator’s papers.</w:t>
+      </w:r>
+    </w:p>
+    <w:p>
+      <w:pPr>
+        <w:pStyle w:val="BodyText"/>
+      </w:pPr>
+      <w:r>
+        <w:t xml:space="preserve">Because the clustering model was developed on the GPT-4o and Claude data, we tested it on Llama papers that played no part in its development. This test was fixed before the Llama papers were generated: train on human papers plus both other generators pooled, never on Llama, and compare the baseline with the new features by a paired bootstrap of the AUC difference. The analysis code, prompts, and generated papers are in the project repository, and the human papers can be re-collected with the included script.</w:t>
       </w:r>
     </w:p>
     <w:bookmarkEnd w:id="28"/>
-    <w:bookmarkStart w:id="29" w:name="llm-as-a-judge-baselines"/>
+    <w:bookmarkStart w:id="29" w:name="llm-judges-fusion-and-cascade"/>
     <w:p>
       <w:pPr>
         <w:pStyle w:val="Heading2"/>
       </w:pPr>
       <w:r>
-        <w:t xml:space="preserve">3.7 LLM-as-a-judge baselines</w:t>
+        <w:t xml:space="preserve">3.7 LLM judges, fusion, and cascade</w:t>
       </w:r>
     </w:p>
     <w:p>
@@ -712,7 +650,7 @@
         <w:pStyle w:val="FirstParagraph"/>
       </w:pPr>
       <w:r>
-        <w:t xml:space="preserve">To compare with the black-box approach, we asked two models, zero-shot and at temperature 0, to estimate for each excerpt the probability (0 to 100) that it was written by an AI language model: GPT-4o and Gemini 2.5 Pro. We used one fixed prompt for all documents and both judges. The judges saw a random sample of 500 excerpts (200 human papers, 120 from medicine and 80 from computer science, and 100 papers from each generator), presented in random order with opaque identifiers and no labels. Each excerpt was the same first 2,000 tokens used for the Poisson features. To prevent trivial cues, we removed markdown symbols and bare section titles from every excerpt, whatever its source. Gemini 2.5 Pro reasons before answering, so we allowed it up to 8,000 output tokens; 12 of its 500 answers were empty or unreadable. For the main analysis, a document is excluded for every method if either judge’s answer is unreadable, which leaves 196 human papers and 92 to 95 papers per generator; as a sensitivity check we also score unreadable answers as 50 (no information).</w:t>
+        <w:t xml:space="preserve">To compare with the black-box approach, we asked two models, zero-shot and at temperature 0, to estimate for each excerpt the probability (0 to 100) that it was written by an AI language model: GPT-4o and Gemini 2.5 Pro. Both received one fixed prompt. They saw a random sample of 500 excerpts (200 human papers, of which 120 were from medicine and 80 from computer science, and 100 papers from each generator), in random order, with opaque identifiers and no labels. Each excerpt was the same first 2,000 tokens used for the count-based features. To remove trivial cues we stripped markdown symbols and bare section titles from every excerpt, whatever its source. Gemini 2.5 Pro reasons before answering, so we allowed it up to 8,000 output tokens, and 12 of its 500 answers were empty or unreadable. In the main analysis a document is excluded for every method if either judge’s answer is unreadable, which leaves 196 human papers and 92 to 95 papers per generator; as a sensitivity check we score unreadable answers as 50, meaning no information.</w:t>
       </w:r>
     </w:p>
     <w:p>
@@ -720,7 +658,7 @@
         <w:pStyle w:val="BodyText"/>
       </w:pPr>
       <w:r>
-        <w:t xml:space="preserve">For each generator, each judge’s score is compared with two Poisson-based detectors evaluated on the same documents: the baseline features and the new clustering features, each trained on human papers plus the</w:t>
+        <w:t xml:space="preserve">For each generator, each judge is compared with two count-based detectors evaluated on the same documents, one using the baseline features and one using the clustering features. Each detector is trained on human papers plus the</w:t>
       </w:r>
       <w:r>
         <w:t xml:space="preserve"> </w:t>
@@ -736,17 +674,35 @@
         <w:t xml:space="preserve"> </w:t>
       </w:r>
       <w:r>
-        <w:t xml:space="preserve">generators and never on the generator being tested, which makes them comparable to a judge that has not seen that generator. The sample, the comparisons, and the analysis scripts were fixed before the judges were run. Differences are tested with a paired bootstrap computed separately for each judge. We also report results for medicine papers alone, because their text comes from clean XML, whereas the arXiv text comes from PDF conversion and could carry extraction artifacts that a judge might pick up. GPT-4o is also one of the generators, so its judgments of GPT-4o papers involve self-recognition; Gemini is not a generator.</w:t>
+        <w:t xml:space="preserve">generators and never on the generator being tested, which makes it comparable to a judge that has not seen that generator. Differences are tested with a paired bootstrap computed separately for each judge. We also report medicine papers alone, whose text comes from clean XML, because the arXiv text comes from PDF conversion and could carry artifacts that a judge might pick up. GPT-4o is also one of the generators, so its verdicts on GPT-4o papers involve self-recognition; Gemini is not a generator.</w:t>
+      </w:r>
+    </w:p>
+    <w:p>
+      <w:pPr>
+        <w:pStyle w:val="BodyText"/>
+      </w:pPr>
+      <w:r>
+        <w:t xml:space="preserve">Because the screen and the judges may fail in different places, we also tested a simple fusion. For each target generator, the clustering-based screen score and the Gemini score were each converted to a rank within the evaluated pool of human and target papers, which uses no labels, and the two ranks were averaged (fusion F1, the primary fusion). Two secondary fusions were specified in advance: the larger of the two ranks (F2), and the average of the screen and both judges (F3). No weights were fitted, so the fusion cannot overfit the 500 judged documents. Finally, we simulated a cascade in which a judge is called only on documents that a free screen finds suspicious. The screen scores every document, and only the top share q of the pool (10, 20, 30, 50, or 100%) is sent to the Gemini judge; documents that are not sent cannot be flagged. For the documents sent, the final score is either the judge’s score alone (C1, with ties broken by the screen) or the mean of the screen’s rank in the pool and the judge’s rank among the documents sent (C2). We report the share of machine papers flagged when at most 5% of all human papers are flagged, together with the judge cost implied by q. Because the judged sample holds far more machine papers than a real submission stream would, the primary evaluation resamples pools in which machine papers make up 10% of the total (300 bootstrap pools); pools as sampled, with about one third machine papers, are a secondary evaluation. The fusion and the cascade, and the scripts that evaluate them, were specified before they were run.</w:t>
       </w:r>
     </w:p>
     <w:bookmarkEnd w:id="29"/>
-    <w:bookmarkStart w:id="30" w:name="fusion-of-the-screen-and-a-judge"/>
+    <w:bookmarkEnd w:id="30"/>
+    <w:bookmarkStart w:id="41" w:name="results"/>
+    <w:p>
+      <w:pPr>
+        <w:pStyle w:val="Heading1"/>
+      </w:pPr>
+      <w:r>
+        <w:t xml:space="preserve">4. Results</w:t>
+      </w:r>
+    </w:p>
+    <w:bookmarkStart w:id="34" w:name="human-text-is-not-poisson-rq1"/>
     <w:p>
       <w:pPr>
         <w:pStyle w:val="Heading2"/>
       </w:pPr>
       <w:r>
-        <w:t xml:space="preserve">3.8 Fusion of the screen and a judge</w:t>
+        <w:t xml:space="preserve">4.1 Human text is not Poisson (RQ1)</w:t>
       </w:r>
     </w:p>
     <w:p>
@@ -754,53 +710,7 @@
         <w:pStyle w:val="FirstParagraph"/>
       </w:pPr>
       <w:r>
-        <w:t xml:space="preserve">Because the two methods fail in different places, we also tested a simple combination. For each target generator, we took the new-feature Poisson score (trained on human papers plus the other two generators) and the Gemini judge’s score for the same documents, converted each to its rank within the evaluated pool of human and target papers (which uses no labels), and averaged the two ranks. This rank average (F1) was specified in advance as the primary fusion. Two secondary fusions were also specified: the larger of the two ranks (F2) and the average of the ranks from the Poisson score and both judges (F3). No weights were fitted, so the fusion adds no trainable parameters and cannot overfit the 500 judged documents. We report AUC, paired bootstrap differences against each component, and, descriptively, the share of machine-written papers detected when the threshold is set so that 5% of human papers are flagged.</w:t>
-      </w:r>
-    </w:p>
-    <w:bookmarkEnd w:id="30"/>
-    <w:bookmarkStart w:id="31" w:name="cascade-simulation"/>
-    <w:p>
-      <w:pPr>
-        <w:pStyle w:val="Heading2"/>
-      </w:pPr>
-      <w:r>
-        <w:t xml:space="preserve">3.9 Cascade simulation</w:t>
-      </w:r>
-    </w:p>
-    <w:p>
-      <w:pPr>
-        <w:pStyle w:val="FirstParagraph"/>
-      </w:pPr>
-      <w:r>
-        <w:t xml:space="preserve">A cheaper way to use a judge is to call it only on documents that a free screen finds suspicious. We simulated this cascade with the 500 judged documents. The Poisson detector with the new features (trained on human papers plus the other two generators, never the target) scores every document, and only the top q of the pool, with q set to 10%, 20%, 30%, 50%, or 100%, is sent to the Gemini judge. Documents that are not sent cannot be flagged. For documents that are sent, the final score is either the judge’s score alone (C1, with ties broken by the screen) or the average of the screen’s rank in the pool and the judge’s rank among the sent documents (C2). We report the share of machine papers flagged when at most 5% of all human papers are flagged, together with the judge cost implied by q at the measured price. Because the judged sample contains many more machine papers than a real submission stream would, the primary evaluation resamples pools so that machine papers are 10% of the pool (300 bootstrap pools, in which all human papers and resampled machine papers appear); pools as sampled, with about one third machine papers, are a secondary evaluation. All of this was specified before the simulation was run.</w:t>
-      </w:r>
-    </w:p>
-    <w:bookmarkEnd w:id="31"/>
-    <w:bookmarkEnd w:id="32"/>
-    <w:bookmarkStart w:id="46" w:name="results"/>
-    <w:p>
-      <w:pPr>
-        <w:pStyle w:val="Heading1"/>
-      </w:pPr>
-      <w:r>
-        <w:t xml:space="preserve">4. Results</w:t>
-      </w:r>
-    </w:p>
-    <w:bookmarkStart w:id="36" w:name="human-text-is-not-poisson-rq1"/>
-    <w:p>
-      <w:pPr>
-        <w:pStyle w:val="Heading2"/>
-      </w:pPr>
-      <w:r>
-        <w:t xml:space="preserve">4.1 Human text is not Poisson (RQ1)</w:t>
-      </w:r>
-    </w:p>
-    <w:p>
-      <w:pPr>
-        <w:pStyle w:val="FirstParagraph"/>
-      </w:pPr>
-      <w:r>
-        <w:t xml:space="preserve">Table 1 reports, for each event, the median dispersion index and the share of documents whose counts reject the Poisson null in the direction of over-dispersion. Only discourse markers behave approximately as the Poisson model predicts in human text: the median index is 1.00 and 6% of documents reject, close to the 5% expected by chance. Punctuation events are clearly over-dispersed, with 49% of documents rejecting for square brackets, 42% for parentheses, and 36% for semicolons. Citations and formulas plausibly cluster in particular parts of a paper, such as the introduction and methods, and this clustering is exactly what a Poisson model cannot represent.</w:t>
+        <w:t xml:space="preserve">Table 1 reports, for each event, the median dispersion index and the share of documents whose counts reject the Poisson null in the direction of over-dispersion. Only discourse markers behave roughly as the Poisson model predicts in human text, with a median index of 1.00 and a rejection rate of 6%, close to the 5% expected by chance. Punctuation is clearly over-dispersed: 49% of documents reject the null for square brackets, 42% for parentheses, and 36% for semicolons. Citations and formulas plausibly gather in particular parts of a paper, such as the introduction and methods, and this is exactly the kind of clustering that a Poisson model cannot represent.</w:t>
       </w:r>
     </w:p>
     <w:p>
@@ -1331,22 +1241,7 @@
         <w:pStyle w:val="BodyText"/>
       </w:pPr>
       <w:r>
-        <w:t xml:space="preserve">Machine text departs from human text in both directions, which argues against the simple story that it is uniformly</w:t>
-      </w:r>
-      <w:r>
-        <w:t xml:space="preserve"> </w:t>
-      </w:r>
-      <w:r>
-        <w:t xml:space="preserve">“</w:t>
-      </w:r>
-      <w:r>
-        <w:t xml:space="preserve">too regular</w:t>
-      </w:r>
-      <w:r>
-        <w:t xml:space="preserve">”</w:t>
-      </w:r>
-      <w:r>
-        <w:t xml:space="preserve">. Nominalizations are less dispersed in all three generators (medians 0.76, 1.10, and 1.27, against 1.67 in human text), meaning they are spread more evenly. Passive constructions and quotation marks are more dispersed in all three (passive 2.51, 1.79, and 2.02 against 1.20; quotation marks 3.00, 2.00, and 3.00 against 1.30). These directions agree across the three generators, which makes them more credible as features of machine writing than as quirks of one model. Figure 1 shows the full distributions for GPT-4o and human text.</w:t>
+        <w:t xml:space="preserve">Machine text departs from human text in both directions, which argues against the tempting story that it is uniformly too regular. Nominalizations are less dispersed in all three generators (medians of 0.76, 1.10, and 1.27, against 1.67 in human text), so they are spread more evenly. Passive constructions and quotation marks are more dispersed in all three (passives 2.51, 1.79, and 2.02 against 1.20; quotation marks 3.00, 2.00, and 3.00 against 1.30). That these directions agree across generators makes them more credible as features of machine writing than as quirks of one model. Figure 1 shows the distributions for human and GPT-4o text. One caution applies to the passive result. Because each paper was generated section by section and the four retained windows roughly follow those sections, elevated passive dispersion may partly reflect a procedural artifact, since passive voice concentrates in methods text. We could not separate the two with the present data.</w:t>
       </w:r>
     </w:p>
     <w:p>
@@ -1358,18 +1253,18 @@
           <wp:inline>
             <wp:extent cx="5334000" cy="2489200"/>
             <wp:effectExtent b="0" l="0" r="0" t="0"/>
-            <wp:docPr descr="Figure 1. Distribution of log2 dispersion indices by event for human-authored and GPT-4o papers. Dashed line: Poisson (index of 1). Square brackets for GPT-4o are degenerate because most synthetic papers contain none (index set to one by convention)." title="" id="34" name="Picture"/>
+            <wp:docPr descr="Figure 1. Distribution of log2 dispersion indices by event for human-authored and GPT-4o papers. Dashed line: Poisson (index of 1). Square brackets for GPT-4o are degenerate because most machine papers contain none (index set to one by convention)." title="" id="32" name="Picture"/>
             <a:graphic>
               <a:graphicData uri="http://schemas.openxmlformats.org/drawingml/2006/picture">
                 <pic:pic>
                   <pic:nvPicPr>
-                    <pic:cNvPr descr="fig_dispersion.png" id="35" name="Picture"/>
+                    <pic:cNvPr descr="fig_dispersion.png" id="33" name="Picture"/>
                     <pic:cNvPicPr>
                       <a:picLocks noChangeArrowheads="1" noChangeAspect="1"/>
                     </pic:cNvPicPr>
                   </pic:nvPicPr>
                   <pic:blipFill>
-                    <a:blip r:embed="rId33"/>
+                    <a:blip r:embed="rId31"/>
                     <a:stretch>
                       <a:fillRect/>
                     </a:stretch>
@@ -1401,25 +1296,17 @@
         <w:pStyle w:val="ImageCaption"/>
       </w:pPr>
       <w:r>
-        <w:t xml:space="preserve">Figure 1. Distribution of log2 dispersion indices by event for human-authored and GPT-4o papers. Dashed line: Poisson (index of 1). Square brackets for GPT-4o are degenerate because most synthetic papers contain none (index set to one by convention).</w:t>
-      </w:r>
-    </w:p>
-    <w:p>
-      <w:pPr>
-        <w:pStyle w:val="BodyText"/>
-      </w:pPr>
-      <w:r>
-        <w:t xml:space="preserve">One caution applies to the passive result. Because we generated each paper section by section, and the four retained windows roughly track those sections, elevated passive dispersion may partly reflect a procedural artifact (passive voice is concentrated in methods text) rather than a general property of the models. We could not separate the two with the present data.</w:t>
-      </w:r>
-    </w:p>
-    <w:bookmarkEnd w:id="36"/>
-    <w:bookmarkStart w:id="37" w:name="detection-within-a-generator-rq2"/>
+        <w:t xml:space="preserve">Figure 1. Distribution of log2 dispersion indices by event for human-authored and GPT-4o papers. Dashed line: Poisson (index of 1). Square brackets for GPT-4o are degenerate because most machine papers contain none (index set to one by convention).</w:t>
+      </w:r>
+    </w:p>
+    <w:bookmarkEnd w:id="34"/>
+    <w:bookmarkStart w:id="35" w:name="X9e5cabe7233d55f0c2b2491cc3eadd36c44deff"/>
     <w:p>
       <w:pPr>
         <w:pStyle w:val="Heading2"/>
       </w:pPr>
       <w:r>
-        <w:t xml:space="preserve">4.2 Detection within a generator (RQ2)</w:t>
+        <w:t xml:space="preserve">4.2 Detection within and across generators (RQ2)</w:t>
       </w:r>
     </w:p>
     <w:p>
@@ -1427,31 +1314,7 @@
         <w:pStyle w:val="FirstParagraph"/>
       </w:pPr>
       <w:r>
-        <w:t xml:space="preserve">The single-index Poisson-Score performs close to chance: AUC 0.54 for GPT-4o, 0.51 for Claude, and 0.53 for Llama. Treating its fourteen components as separate predictors changes the picture. With human papers and one generator, cross-validated logistic regression reaches AUC 0.987 for GPT-4o and 0.913 for Claude (Table 3, diagonal). Detection is clearly easier for GPT-4o than for Claude, and Llama falls between them (baseline within-generator AUC 0.96, from the analysis described in Section 4.6).</w:t>
-      </w:r>
-    </w:p>
-    <w:p>
-      <w:pPr>
-        <w:pStyle w:val="BodyText"/>
-      </w:pPr>
-      <w:r>
-        <w:t xml:space="preserve">Event</w:t>
-      </w:r>
-      <w:r>
-        <w:t xml:space="preserve"> </w:t>
-      </w:r>
-      <w:r>
-        <w:rPr>
-          <w:iCs/>
-          <w:i/>
-        </w:rPr>
-        <w:t xml:space="preserve">rates</w:t>
-      </w:r>
-      <w:r>
-        <w:t xml:space="preserve"> </w:t>
-      </w:r>
-      <w:r>
-        <w:t xml:space="preserve">carry most of this within-generator signal (AUC 0.97 and 0.90), and dispersion alone remains informative (0.86 and 0.75). Table 2 shows why rates are generator-specific. GPT-4o uses far fewer square brackets, semicolons, and quotation marks than human authors, and more nominalizations and discourse markers. Claude differs in a different way (Llama is a third pattern, with many parentheses and few brackets): it uses</w:t>
+        <w:t xml:space="preserve">A single Poisson-Score performs close to chance, with AUCs of 0.54 for GPT-4o, 0.51 for Claude, and 0.53 for Llama. Treating its fourteen components as separate predictors changes the picture. When the detector is trained and tested on human papers plus one generator, cross-validated logistic regression reaches an AUC of 0.987 for GPT-4o, 0.913 for Claude, and 0.962 for Llama. Event rates carry most of this signal (AUC 0.97 for GPT-4o and 0.90 for Claude), and dispersion alone remains informative (0.86 and 0.75). Table 2 shows why the rates are specific to each generator. GPT-4o uses far fewer square brackets, semicolons, and quotation marks than human authors and more nominalizations and discourse markers. Claude differs in another way: it uses</w:t>
       </w:r>
       <w:r>
         <w:t xml:space="preserve"> </w:t>
@@ -1467,7 +1330,7 @@
         <w:t xml:space="preserve"> </w:t>
       </w:r>
       <w:r>
-        <w:t xml:space="preserve">semicolons than human authors (3.54 per 500 tokens, against 1.95) and more quotation marks, and fewer discourse markers (1.08 against 1.84). Semicolons are lower than human in one generator and higher in the other, so a rule based on average frequency cannot describe machine text in general.</w:t>
+        <w:t xml:space="preserve">semicolons than human authors (3.54 per 500 tokens, against 1.95) and more quotation marks, and fewer discourse markers (1.08 against 1.84). Llama shows a third pattern, with many parentheses and few brackets. Because semicolons fall below the human rate for one generator and rise above it for another, no rule based on average frequency can describe machine text in general.</w:t>
       </w:r>
     </w:p>
     <w:p>
@@ -1993,22 +1856,12 @@
         </w:tc>
       </w:tr>
     </w:tbl>
-    <w:bookmarkEnd w:id="37"/>
-    <w:bookmarkStart w:id="38" w:name="detection-across-generators-rq2"/>
-    <w:p>
-      <w:pPr>
-        <w:pStyle w:val="Heading2"/>
-      </w:pPr>
-      <w:r>
-        <w:t xml:space="preserve">4.3 Detection across generators (RQ2)</w:t>
-      </w:r>
-    </w:p>
-    <w:p>
-      <w:pPr>
-        <w:pStyle w:val="FirstParagraph"/>
-      </w:pPr>
-      <w:r>
-        <w:t xml:space="preserve">Table 3 gives the central robustness result. When the detector is trained on human text plus one generator and tested on the other, performance falls sharply. A GPT-4o-trained detector reaches an AUC of 0.73 on Claude papers (95% interval 0.69 to 0.78), down from 0.99 on GPT-4o itself. A Claude-trained detector reaches 0.81 on GPT-4o papers (0.78 to 0.84).</w:t>
+    <w:p>
+      <w:pPr>
+        <w:pStyle w:val="BodyText"/>
+      </w:pPr>
+      <w:r>
+        <w:t xml:space="preserve">Performance falls sharply when the detector meets a generator it was not trained on (Table 3). A GPT-4o-trained detector reaches an AUC of 0.73 on Claude papers (95% interval 0.69 to 0.78), down from 0.99 on GPT-4o itself, and a Claude-trained detector reaches 0.81 on GPT-4o papers (0.78 to 0.84). The gap between within-generator and cross-generator AUC is large for every feature family, so calibration on one generator should not be assumed to protect against another. Rates transfer worst (0.66 and 0.73), whereas dispersion transfers better (0.70 and 0.81) and equals the combined model in the Claude-to-GPT-4o direction. This fits the sign pattern in Table 2: differences in rates reverse across generators, while the differences in dispersion for passives, quotation marks, and nominalizations point the same way (Table 1). Dispersion is the more portable signal, but even it is far from sufficient on its own.</w:t>
       </w:r>
     </w:p>
     <w:p>
@@ -2287,22 +2140,14 @@
         </w:tc>
       </w:tr>
     </w:tbl>
-    <w:p>
-      <w:pPr>
-        <w:pStyle w:val="BodyText"/>
-      </w:pPr>
-      <w:r>
-        <w:t xml:space="preserve">Two patterns stand out. First, the gap between within-generator and cross-generator AUC is large for every feature family, so a detector calibrated on one generator should not be assumed to protect against another. Second, rates transfer worst (0.66 and 0.73), and dispersion transfers better (0.70 and 0.81), matching or exceeding the combined model in the Claude-to-GPT-4o direction. This is consistent with the sign pattern in Table 2: rate differences reverse across generators, while dispersion differences for passives, quotation marks, and nominalizations point the same way (Table 1). Dispersion is the more portable signal, though even it is far from sufficient on its own.</w:t>
-      </w:r>
-    </w:p>
-    <w:bookmarkEnd w:id="38"/>
-    <w:bookmarkStart w:id="39" w:name="detection-from-human-text-alone-rq2"/>
+    <w:bookmarkEnd w:id="35"/>
+    <w:bookmarkStart w:id="36" w:name="detection-from-human-text-alone-rq2"/>
     <w:p>
       <w:pPr>
         <w:pStyle w:val="Heading2"/>
       </w:pPr>
       <w:r>
-        <w:t xml:space="preserve">4.4 Detection from human text alone (RQ2)</w:t>
+        <w:t xml:space="preserve">4.3 Detection from human text alone (RQ2)</w:t>
       </w:r>
     </w:p>
     <w:p>
@@ -2310,7 +2155,7 @@
         <w:pStyle w:val="FirstParagraph"/>
       </w:pPr>
       <w:r>
-        <w:t xml:space="preserve">A screening organization might prefer a detector that needs no examples of machine text, because those examples go stale as models change. We therefore trained detectors on human papers only and scored how unusual each held-out document looks (Table 4). The result is negative. The pre-specified Mahalanobis detector reaches an AUC of 0.56 on GPT-4o papers and 0.46 on Claude papers using all fourteen features, and the secondary methods do not change the picture: across three methods, three feature families, and the two generators studied at that stage, AUCs range from 0.45 to 0.66, and many intervals include 0.5. The best single value (0.66, a One-Class SVM on rates for GPT-4o) is not one we would rely on, and it was not selected in advance.</w:t>
+        <w:t xml:space="preserve">A screening organization might prefer a detector that needs no examples of machine text, because such examples go stale as models change. We therefore trained detectors on human papers only and scored how unusual each held-out document looks (Table 4). The result is negative. The Mahalanobis detector specified in advance reaches an AUC of 0.56 on GPT-4o papers and 0.46 on Claude papers with all fourteen features, and the secondary methods do not change the picture. Across three methods, three feature families, and the two generators studied at that stage, AUCs range from 0.45 to 0.66, and many intervals include 0.5. The best single value (0.66, a one-class SVM on rates for GPT-4o) was not chosen in advance and is not one we would rely on.</w:t>
       </w:r>
     </w:p>
     <w:p>
@@ -2547,7 +2392,7 @@
               <w:jc w:val="left"/>
             </w:pPr>
             <w:r>
-              <w:t xml:space="preserve">One-Class SVM</w:t>
+              <w:t xml:space="preserve">One-class SVM</w:t>
             </w:r>
           </w:p>
         </w:tc>
@@ -2597,7 +2442,7 @@
               <w:jc w:val="left"/>
             </w:pPr>
             <w:r>
-              <w:t xml:space="preserve">Isolation Forest</w:t>
+              <w:t xml:space="preserve">Isolation forest</w:t>
             </w:r>
           </w:p>
         </w:tc>
@@ -2644,7 +2489,7 @@
         <w:pStyle w:val="BodyText"/>
       </w:pPr>
       <w:r>
-        <w:t xml:space="preserve">The contrast with Table 3 is informative. Supervised detectors succeed because they learn the</w:t>
+        <w:t xml:space="preserve">The contrast with Table 3 is instructive. Supervised detectors succeed because they learn the</w:t>
       </w:r>
       <w:r>
         <w:t xml:space="preserve"> </w:t>
@@ -2660,17 +2505,17 @@
         <w:t xml:space="preserve"> </w:t>
       </w:r>
       <w:r>
-        <w:t xml:space="preserve">in which a generator differs from human writers. Human papers already vary widely among themselves in these features, across fields, sections, and authors, so machine text is rarely far from the human cloud in an absolute sense; it is displaced from the center in particular directions. A distance from the human distribution does not capture that displacement.</w:t>
-      </w:r>
-    </w:p>
-    <w:bookmarkEnd w:id="39"/>
-    <w:bookmarkStart w:id="40" w:name="X0521dbd98438490bc6effe6d1004fde65e11b6f"/>
+        <w:t xml:space="preserve">in which a generator departs from human writers. Human papers already differ widely among themselves in these features, across fields, sections, and authors, so machine text is seldom far from the human cloud in an absolute sense; it is displaced from the center in particular directions, and a distance from the human distribution does not capture that displacement.</w:t>
+      </w:r>
+    </w:p>
+    <w:bookmarkEnd w:id="36"/>
+    <w:bookmarkStart w:id="37" w:name="a-scale-dependent-clustering-model-rq2"/>
     <w:p>
       <w:pPr>
         <w:pStyle w:val="Heading2"/>
       </w:pPr>
       <w:r>
-        <w:t xml:space="preserve">4.5 A scale-dependent clustering model: development results (RQ2)</w:t>
+        <w:t xml:space="preserve">4.4 A scale-dependent clustering model (RQ2)</w:t>
       </w:r>
     </w:p>
     <w:p>
@@ -2678,7 +2523,7 @@
         <w:pStyle w:val="FirstParagraph"/>
       </w:pPr>
       <w:r>
-        <w:t xml:space="preserve">Table 5 compares the new feature set with the baseline on the same documents and folds. These GPT-4o and Claude data are the development data for the model, so Table 5 is exploratory; the confirmatory test is in Section 4.6. Differences are computed with a paired bootstrap, which is more informative than comparing separate intervals.</w:t>
+        <w:t xml:space="preserve">Table 5 compares the clustering features with the baseline on the GPT-4o and Claude data on which the model was developed, so these results are exploratory. Differences are computed with a paired bootstrap on identical documents, which is more informative than comparing separate intervals. The new features help in seven of the eight comparisons, in the sense that the interval for the difference excludes zero or sits at its edge. The largest gain is for dispersion-only detection within a generator (+0.07 for GPT-4o). Transfer to an unseen generator improves from 0.73 to 0.76 (GPT-4o to Claude) and from 0.81 to 0.85 (Claude to GPT-4o) when rates are included; without rates, the improvement for GPT-4o to Claude cannot be distinguished from zero. The slope alone is a weak predictor (AUC 0.67 to 0.82), so the gains come mainly from the level of clustering across scales and from the richer description, not from the slope itself. The model does not rescue human-only detection on these data: a Mahalanobis detector on the new features reaches 0.59 for GPT-4o and 0.49 for Claude, essentially as before.</w:t>
       </w:r>
     </w:p>
     <w:p>
@@ -2686,7 +2531,7 @@
         <w:pStyle w:val="TableCaption"/>
       </w:pPr>
       <w:r>
-        <w:t xml:space="preserve">Table 5. Baseline (500-token dispersion index) versus scale-dependent clustering features. Baseline values differ from Table 3 by at most 0.001 because of a small change in how counts are split at window boundaries.</w:t>
+        <w:t xml:space="preserve">Table 5. Baseline (500-token dispersion index) versus scale-dependent clustering features, development data. Baseline values differ from Table 3 by at most 0.001 because of a small change in how counts are split at window boundaries.</w:t>
       </w:r>
     </w:p>
     <w:tbl>
@@ -2695,7 +2540,7 @@
         <w:tblW w:type="auto" w:w="0"/>
         <w:tblLook w:firstRow="1" w:lastRow="0" w:firstColumn="0" w:lastColumn="0" w:noHBand="0" w:noVBand="0" w:val="0020"/>
         <w:jc w:val="start"/>
-        <w:tblCaption w:val="Table 5. Baseline (500-token dispersion index) versus scale-dependent clustering features. Baseline values differ from Table 3 by at most 0.001 because of a small change in how counts are split at window boundaries."/>
+        <w:tblCaption w:val="Table 5. Baseline (500-token dispersion index) versus scale-dependent clustering features, development data. Baseline values differ from Table 3 by at most 0.001 because of a small change in how counts are split at window boundaries."/>
       </w:tblPr>
       <w:tblGrid>
         <w:gridCol w:w="1980"/>
@@ -3246,51 +3091,7 @@
         <w:pStyle w:val="BodyText"/>
       </w:pPr>
       <w:r>
-        <w:t xml:space="preserve">The new features help in seven of eight comparisons, where</w:t>
-      </w:r>
-      <w:r>
-        <w:t xml:space="preserve"> </w:t>
-      </w:r>
-      <w:r>
-        <w:t xml:space="preserve">“</w:t>
-      </w:r>
-      <w:r>
-        <w:t xml:space="preserve">help</w:t>
-      </w:r>
-      <w:r>
-        <w:t xml:space="preserve">”</w:t>
-      </w:r>
-      <w:r>
-        <w:t xml:space="preserve"> </w:t>
-      </w:r>
-      <w:r>
-        <w:t xml:space="preserve">means the interval for the difference excludes zero or sits at its edge, and the gains are largest for the dispersion-only comparison within a generator (+0.07 for GPT-4o). Transfer to an unseen generator improves from 0.73 to 0.76 (GPT-4o to Claude) and from 0.81 to 0.85 (Claude to GPT-4o) when rates are included; without rates, the improvement for GPT-4o to Claude is not distinguishable from zero. The slope alone is a weak predictor (AUC 0.67 to 0.82 within and across generators), so the gains come mainly from the clustering level across scales and from the richer description, not from the slope specifically.</w:t>
-      </w:r>
-    </w:p>
-    <w:p>
-      <w:pPr>
-        <w:pStyle w:val="BodyText"/>
-      </w:pPr>
-      <w:r>
-        <w:t xml:space="preserve">The model does not rescue detection from human text alone on these data. A Mahalanobis detector on the new features reaches AUC 0.59 for GPT-4o and 0.49 for Claude, essentially the same as before. The improvement is therefore in how well a supervised detector can use the clustering structure, not in how well human text can define normality by itself.</w:t>
-      </w:r>
-    </w:p>
-    <w:bookmarkEnd w:id="40"/>
-    <w:bookmarkStart w:id="41" w:name="Xf249ecbb1b4e68a085d5da2640522efa39ff232"/>
-    <w:p>
-      <w:pPr>
-        <w:pStyle w:val="Heading2"/>
-      </w:pPr>
-      <w:r>
-        <w:t xml:space="preserve">4.6 Confirmatory test on an open-weight generator (RQ2)</w:t>
-      </w:r>
-    </w:p>
-    <w:p>
-      <w:pPr>
-        <w:pStyle w:val="FirstParagraph"/>
-      </w:pPr>
-      <w:r>
-        <w:t xml:space="preserve">Llama papers were not used in developing the clustering model, and the analysis below was specified before they were generated. Table 6 reports the result. Trained on human papers plus GPT-4o and Claude pooled, the baseline features detect Llama papers with an AUC of 0.886 (95% interval 0.86 to 0.91). The new features reach 0.932 (0.91 to 0.95), a difference of +0.046 (0.030 to 0.063). The improvement is also present when training on a single generator, so it does not depend on the pooling choice.</w:t>
+        <w:t xml:space="preserve">The confirmatory test uses the Llama papers, which played no part in developing the model, with an analysis specified before they were generated. Trained on human papers plus GPT-4o and Claude pooled, the baseline features detect Llama papers with an AUC of 0.886 (95% interval 0.86 to 0.91), and the new features reach 0.932 (0.91 to 0.95), a difference of +0.046 (0.030 to 0.063; Table 6). The improvement also appears when training on either generator alone, so it does not depend on the pooling choice.</w:t>
       </w:r>
     </w:p>
     <w:p>
@@ -3524,17 +3325,17 @@
         <w:pStyle w:val="BodyText"/>
       </w:pPr>
       <w:r>
-        <w:t xml:space="preserve">Three further results are exploratory and were not specified in advance. First, Llama is easy to detect within its own class: with human and Llama papers, the baseline reaches 0.962 and the new features 0.984, and with clustering features alone (no rates) the new model reaches 0.914 against 0.764 for the baseline dispersion index. Second, a detector trained on Llama transfers well to GPT-4o (baseline 0.938, new 0.969) but poorly to Claude (0.745 and 0.763), which reinforces the picture that Claude papers are the hardest of the three to detect from other generators. Third, a human-only Mahalanobis detector on the new features reaches 0.65 (0.60 to 0.69) on Llama, against 0.51 for the baseline, the first human-only result in our data clearly above chance. Even so, 0.65 is not a level we would deploy.</w:t>
-      </w:r>
-    </w:p>
-    <w:bookmarkEnd w:id="41"/>
-    <w:bookmarkStart w:id="42" w:name="comparison-with-llm-judges-rq2-rq3"/>
+        <w:t xml:space="preserve">Three further Llama results are exploratory. Llama papers are easy to detect within their own class: with human and Llama papers the baseline reaches 0.962 and the new features 0.984, and with clustering features alone the new model reaches 0.914 against 0.764 for the baseline dispersion index. A detector trained on Llama transfers well to GPT-4o (baseline 0.938, new 0.969) but poorly to Claude (0.745 and 0.763), which reinforces the impression that Claude papers are the hardest of the three to detect from other generators. And a human-only Mahalanobis detector on the new features reaches 0.65 (0.60 to 0.69) on Llama, against 0.51 for the baseline, the first human-only result in our data that is clearly above chance, though 0.65 is not a level we would deploy.</w:t>
+      </w:r>
+    </w:p>
+    <w:bookmarkEnd w:id="37"/>
+    <w:bookmarkStart w:id="38" w:name="comparison-with-llm-judges-rq2-rq3"/>
     <w:p>
       <w:pPr>
         <w:pStyle w:val="Heading2"/>
       </w:pPr>
       <w:r>
-        <w:t xml:space="preserve">4.7 Comparison with LLM judges (RQ2, RQ3)</w:t>
+        <w:t xml:space="preserve">4.5 Comparison with LLM judges (RQ2, RQ3)</w:t>
       </w:r>
     </w:p>
     <w:p>
@@ -3542,7 +3343,7 @@
         <w:pStyle w:val="FirstParagraph"/>
       </w:pPr>
       <w:r>
-        <w:t xml:space="preserve">Table 7 gives the AUC of each method for separating human papers from each generator’s papers on the judged excerpts. The two judges differ greatly. GPT-4o as judge is a modest detector of GPT-4o papers (AUC 0.76) and Llama papers (0.85), and worse than chance on Claude papers (0.45). At a threshold of 50, it flags 24% of human papers as AI-generated, against 59% of GPT-4o papers, 85% of Llama papers, and only 11% of Claude papers. Gemini 2.5 Pro is a much stronger judge on two generators, with AUCs of 0.97 for GPT-4o papers and 0.97 for Llama papers, and it flags only 2% of human papers while flagging 86% of GPT-4o and 89% of Llama papers. On Claude papers, however, it reaches only 0.66, flagging 1% of them, fewer than the 2% of human papers it flags.</w:t>
+        <w:t xml:space="preserve">Table 7 gives the AUC of each method for separating human papers from each generator’s papers on the judged excerpts. The two judges differ greatly. GPT-4o as judge is a modest detector of GPT-4o papers (AUC 0.76) and Llama papers (0.85) and worse than chance on Claude papers (0.45). At a threshold of 50 it flags 24% of human papers as AI-generated, against 59% of GPT-4o papers, 85% of Llama papers, and only 11% of Claude papers. Gemini 2.5 Pro is much stronger on two generators, with AUCs of 0.97 for both GPT-4o and Llama papers, and it flags only 2% of human papers while flagging 86% of GPT-4o and 89% of Llama papers. On Claude papers, however, it reaches only 0.66 and flags 1% of them, fewer than the 2% of human papers it flags.</w:t>
       </w:r>
     </w:p>
     <w:p>
@@ -3568,7 +3369,7 @@
         <w:t xml:space="preserve"> </w:t>
       </w:r>
       <w:r>
-        <w:t xml:space="preserve">means trained on human papers plus the other two generators, never on the target. Sample sizes are human / synthetic documents. Scoring the unreadable Gemini answers as 50 instead of excluding them changes the Gemini AUCs to 0.970, 0.653, and 0.973.</w:t>
+        <w:t xml:space="preserve">means trained on human papers plus the other two generators, never on the target. Sample sizes are human / machine documents. Scoring the unreadable Gemini answers as 50 instead of excluding them changes the Gemini AUCs to 0.970, 0.653, and 0.973.</w:t>
       </w:r>
     </w:p>
     <w:tbl>
@@ -3577,7 +3378,7 @@
         <w:tblW w:type="pct" w:w="5000"/>
         <w:tblLook w:firstRow="1" w:lastRow="0" w:firstColumn="0" w:lastColumn="0" w:noHBand="0" w:noVBand="0" w:val="0020"/>
         <w:jc w:val="start"/>
-        <w:tblCaption w:val="Table 7. AUC (95% bootstrap interval) on the same documents. “Unseen” means trained on human papers plus the other two generators, never on the target. Sample sizes are human / synthetic documents. Scoring the unreadable Gemini answers as 50 instead of excluding them changes the Gemini AUCs to 0.970, 0.653, and 0.973."/>
+        <w:tblCaption w:val="Table 7. AUC (95% bootstrap interval) on the same documents. “Unseen” means trained on human papers plus the other two generators, never on the target. Sample sizes are human / machine documents. Scoring the unreadable Gemini answers as 50 instead of excluding them changes the Gemini AUCs to 0.970, 0.653, and 0.973."/>
       </w:tblPr>
       <w:tblGrid>
         <w:gridCol w:w="1584"/>
@@ -3634,19 +3435,19 @@
               <w:jc w:val="left"/>
             </w:pPr>
             <w:r>
-              <w:t xml:space="preserve">Poisson baseline (unseen)</w:t>
-            </w:r>
-          </w:p>
-        </w:tc>
-        <w:tc>
-          <w:tcPr/>
-          <w:p>
-            <w:pPr>
-              <w:pStyle w:val="Compact"/>
-              <w:jc w:val="left"/>
-            </w:pPr>
-            <w:r>
-              <w:t xml:space="preserve">Poisson new (unseen)</w:t>
+              <w:t xml:space="preserve">Screen, baseline features (unseen)</w:t>
+            </w:r>
+          </w:p>
+        </w:tc>
+        <w:tc>
+          <w:tcPr/>
+          <w:p>
+            <w:pPr>
+              <w:pStyle w:val="Compact"/>
+              <w:jc w:val="left"/>
+            </w:pPr>
+            <w:r>
+              <w:t xml:space="preserve">Screen, clustering features (unseen)</w:t>
             </w:r>
           </w:p>
         </w:tc>
@@ -3843,33 +3644,17 @@
         <w:pStyle w:val="BodyText"/>
       </w:pPr>
       <w:r>
-        <w:t xml:space="preserve">The comparison with the Poisson-based detectors therefore depends on which judge is used. Against the GPT-4o judge, the new clustering features are better on all three generators (paired AUC differences +0.19 for GPT-4o, 95% interval 0.13 to 0.25; +0.33 for Claude, 0.24 to 0.40; +0.09 for Llama, 0.04 to 0.14). Against Gemini 2.5 Pro, the picture reverses for two generators and holds for the third. The new features are lower on Llama papers (−0.04, interval −0.08 to −0.01), lower on GPT-4o papers by an amount whose interval reaches zero (−0.03, interval −0.06 to +0.01), and higher on Claude papers (+0.12, interval 0.04 to 0.20). The baseline features are lower than Gemini on GPT-4o (−0.05) and Llama (−0.09) and higher on Claude (+0.10). Results are similar for medicine papers alone (Gemini 0.95, 0.58, and 0.96; Poisson-new 0.93, 0.77, and 0.92), so extraction artifacts in the arXiv text do not explain the pattern.</w:t>
-      </w:r>
-    </w:p>
-    <w:p>
-      <w:pPr>
-        <w:pStyle w:val="BodyText"/>
-      </w:pPr>
-      <w:r>
-        <w:t xml:space="preserve">Claude’s papers are the hardest to detect for every method we tried. The Poisson-based detectors do best on them, but at an AUC of about 0.77 that is far from adequate.</w:t>
-      </w:r>
-    </w:p>
-    <w:p>
-      <w:pPr>
-        <w:pStyle w:val="BodyText"/>
-      </w:pPr>
-      <w:r>
-        <w:t xml:space="preserve">This comparison has an important asymmetry. The Poisson-based detectors use labeled examples from other generators, and the judges use none, so they answer different practical questions: what can be done with no machine-text examples at all, and what a cheap screen achieves once some are available.</w:t>
-      </w:r>
-    </w:p>
-    <w:bookmarkEnd w:id="42"/>
-    <w:bookmarkStart w:id="43" w:name="combining-the-screen-with-a-judge-rq2"/>
+        <w:t xml:space="preserve">How the screen compares with a judge therefore depends on the judge. Against GPT-4o, the clustering features are better on all three generators (paired AUC differences of +0.19 for GPT-4o, 95% interval 0.13 to 0.25; +0.33 for Claude, 0.24 to 0.40; and +0.09 for Llama, 0.04 to 0.14). Against Gemini 2.5 Pro the comparison reverses for two generators and holds for the third. The clustering features are lower on Llama papers (−0.04, interval −0.08 to −0.01), lower on GPT-4o papers by an amount whose interval reaches zero (−0.03, interval −0.06 to +0.01), and higher on Claude papers (+0.12, interval 0.04 to 0.20). The baseline features trail Gemini on GPT-4o (−0.05) and Llama (−0.09) and lead on Claude (+0.10). Medicine papers alone give similar results (Gemini 0.95, 0.58, and 0.96; clustering screen 0.93, 0.77, and 0.92), so extraction artifacts in the arXiv text do not explain the pattern. Claude’s papers are the hardest to detect for every method we tried. The screen does best on them, but an AUC of about 0.77 is far from adequate. The comparison also carries an asymmetry: the screen uses labeled examples from other generators and the judges use none, so they answer different practical questions, namely what can be done with no examples of machine text at all, and what a cheap screen achieves once some are available.</w:t>
+      </w:r>
+    </w:p>
+    <w:bookmarkEnd w:id="38"/>
+    <w:bookmarkStart w:id="39" w:name="X6584de0f1220c8eaf7f9d5bf4f4caedc61690cb"/>
     <w:p>
       <w:pPr>
         <w:pStyle w:val="Heading2"/>
       </w:pPr>
       <w:r>
-        <w:t xml:space="preserve">4.8 Combining the screen with a judge (RQ2)</w:t>
+        <w:t xml:space="preserve">4.6 Combining the screen with a judge (RQ2, RQ3)</w:t>
       </w:r>
     </w:p>
     <w:p>
@@ -3877,7 +3662,7 @@
         <w:pStyle w:val="FirstParagraph"/>
       </w:pPr>
       <w:r>
-        <w:t xml:space="preserve">Table 8 reports the primary fusion. Averaging the ranks of the Poisson screen and the Gemini judge gave an AUC of 0.994 on GPT-4o papers and 0.989 on Llama papers, better than either component alone. The gain over the Gemini judge is small but clear (+0.022, 95% interval 0.008 to 0.040, for GPT-4o; +0.014, 0.001 to 0.031, for Llama), and the gain over the Poisson screen is larger (+0.048 and +0.055). On Claude papers the fusion reached 0.790, far above the judge (+0.134, interval 0.092 to 0.177) but not distinguishable from the Poisson screen alone (+0.015, interval −0.028 to 0.059).</w:t>
+        <w:t xml:space="preserve">Averaging the ranks of the screen and the Gemini judge gave an AUC of 0.994 on GPT-4o papers and 0.989 on Llama papers, better than either component alone (Table 8). The gain over Gemini is small but clear (+0.022, 95% interval 0.008 to 0.040, for GPT-4o; +0.014, 0.001 to 0.031, for Llama), and the gain over the screen is larger (+0.048 and +0.055). On Claude papers the fusion reached 0.790, far above the judge (+0.134, interval 0.092 to 0.177) but not distinguishable from the screen alone (+0.015, interval −0.028 to 0.059). The share of papers detected at a 5% false-positive rate shows the practical effect more plainly: 98% of GPT-4o papers against 87% for the judge and 64% for the screen, 96% of Llama papers against 89% and 73%, and 39% of Claude papers against 17% for the screen and 1% for the judge. The secondary fusions were less useful. Taking the larger rank (F2) was no better than the judge for GPT-4o and Llama and worse than the screen for Claude, and adding the weak GPT-4o judge (F3) did not help beyond F1.</w:t>
       </w:r>
     </w:p>
     <w:p>
@@ -3885,7 +3670,7 @@
         <w:pStyle w:val="TableCaption"/>
       </w:pPr>
       <w:r>
-        <w:t xml:space="preserve">Table 8. AUC (95% bootstrap interval) of the primary fusion (F1, mean rank of the Poisson score and the Gemini score) and its components on the same documents as Table 7, and the share of machine-written papers detected at a 5% false-positive rate on human papers. The 5% thresholds are set on the same documents and are descriptive, not estimates of deployed performance.</w:t>
+        <w:t xml:space="preserve">Table 8. AUC (95% bootstrap interval) of the primary fusion (F1, mean rank of the screen and Gemini scores) and its components on the same documents as Table 7, and the share of machine papers detected at a 5% false-positive rate on human papers. The 5% thresholds are set on the same documents and are descriptive, not estimates of deployed performance.</w:t>
       </w:r>
     </w:p>
     <w:tbl>
@@ -3894,7 +3679,7 @@
         <w:tblW w:type="pct" w:w="5000"/>
         <w:tblLook w:firstRow="1" w:lastRow="0" w:firstColumn="0" w:lastColumn="0" w:noHBand="0" w:noVBand="0" w:val="0020"/>
         <w:jc w:val="start"/>
-        <w:tblCaption w:val="Table 8. AUC (95% bootstrap interval) of the primary fusion (F1, mean rank of the Poisson score and the Gemini score) and its components on the same documents as Table 7, and the share of machine-written papers detected at a 5% false-positive rate on human papers. The 5% thresholds are set on the same documents and are descriptive, not estimates of deployed performance."/>
+        <w:tblCaption w:val="Table 8. AUC (95% bootstrap interval) of the primary fusion (F1, mean rank of the screen and Gemini scores) and its components on the same documents as Table 7, and the share of machine papers detected at a 5% false-positive rate on human papers. The 5% thresholds are set on the same documents and are descriptive, not estimates of deployed performance."/>
       </w:tblPr>
       <w:tblGrid>
         <w:gridCol w:w="1584"/>
@@ -3927,7 +3712,7 @@
               <w:jc w:val="left"/>
             </w:pPr>
             <w:r>
-              <w:t xml:space="preserve">Poisson new</w:t>
+              <w:t xml:space="preserve">Screen (clustering)</w:t>
             </w:r>
           </w:p>
         </w:tc>
@@ -3963,7 +3748,7 @@
               <w:jc w:val="left"/>
             </w:pPr>
             <w:r>
-              <w:t xml:space="preserve">TPR at 5% FPR: Poisson / Gemini / F1</w:t>
+              <w:t xml:space="preserve">Detected at 5% FPR: screen / Gemini / F1</w:t>
             </w:r>
           </w:p>
         </w:tc>
@@ -4160,25 +3945,7 @@
         <w:pStyle w:val="BodyText"/>
       </w:pPr>
       <w:r>
-        <w:t xml:space="preserve">The share of papers detected at a 5% false-positive rate shows the practical effect more plainly. For GPT-4o papers, the fusion detects 98% against 87% for the judge and 64% for the screen; for Llama papers, 96% against 89% and 73%; and for Claude papers, 39% against 17% for the screen and 1% for the judge. The secondary fusions were less useful: taking the larger rank (F2) was no better than the judge for GPT-4o and Llama and worse than the screen for Claude, and adding the weak GPT-4o judge (F3) did not help beyond F1.</w:t>
-      </w:r>
-    </w:p>
-    <w:bookmarkEnd w:id="43"/>
-    <w:bookmarkStart w:id="44" w:name="a-cascade-of-screen-and-judge-rq2-rq3"/>
-    <w:p>
-      <w:pPr>
-        <w:pStyle w:val="Heading2"/>
-      </w:pPr>
-      <w:r>
-        <w:t xml:space="preserve">4.9 A cascade of screen and judge (RQ2, RQ3)</w:t>
-      </w:r>
-    </w:p>
-    <w:p>
-      <w:pPr>
-        <w:pStyle w:val="FirstParagraph"/>
-      </w:pPr>
-      <w:r>
-        <w:t xml:space="preserve">Table 9 reports the primary evaluation, in which machine papers make up 10% of the pool. For GPT-4o papers, sending only the top 30% of documents to the judge detects 95% of machine papers at a 5% false-positive rate (interval 0.86 to 1.00), the same as judging every document (0.95), at 30% of the cost; with 20% the rate falls to 86%. For Llama papers, a share of 50% matches full judging (0.97 against 0.96 for the judge alone), and 30% gives 0.89. Claude papers remain hard at every setting. Detection stays between 0.30 and 0.38 for q from 10% to 30%, and judging everything with the judge alone detects only 12%, so the extra judge calls add little for this generator and the screen supplies most of what is detected.</w:t>
+        <w:t xml:space="preserve">Fusion runs the judge on every document and so costs as much as the judge. The cascade is a cheaper alternative (Table 9). When machine papers make up 10% of the pool, sending only the top 30% of documents to the judge detects 95% of GPT-4o papers at a 5% false-positive rate (interval 0.86 to 1.00), the same as judging everything (0.95), at 30% of the cost; with 20% the rate falls to 86%. For Llama papers a share of 50% matches full judging (0.97 against 0.96 for the judge alone), and 30% gives 0.89. Claude papers stay hard at every setting: detection remains between 0.30 and 0.38 for q from 10% to 30%, and judging everything with the judge alone detects only 12%, so additional judge calls add little for this generator and the screen supplies most of what is detected. The savings depend on how rare machine papers are. In the secondary evaluation, with about one third of the pool machine-written, detection at q = 30% falls to 0.76 for GPT-4o papers and 0.78 for Llama papers, and q must reach about 50% to recover 0.92 to 0.95. The share judged must therefore exceed the share of machine papers by a margin, which means an organization would need to know roughly how common such papers are.</w:t>
       </w:r>
     </w:p>
     <w:p>
@@ -4978,22 +4745,153 @@
         </w:tc>
       </w:tr>
     </w:tbl>
+    <w:bookmarkEnd w:id="39"/>
+    <w:bookmarkStart w:id="40" w:name="cost-rq3"/>
+    <w:p>
+      <w:pPr>
+        <w:pStyle w:val="Heading2"/>
+      </w:pPr>
+      <w:r>
+        <w:t xml:space="preserve">4.7 Cost (RQ3)</w:t>
+      </w:r>
+    </w:p>
+    <w:p>
+      <w:pPr>
+        <w:pStyle w:val="FirstParagraph"/>
+      </w:pPr>
+      <w:r>
+        <w:t xml:space="preserve">Computing all events and the baseline indices took 4 to 6 milliseconds per document on one CPU core, roughly 160 to 230 documents per second depending on machine load, with no external service calls, so the marginal monetary cost is zero. For the judges we measured about US$0.0073 and 1.7 seconds per excerpt for GPT-4o (US$3.63 for 500 excerpts) and about US$0.0174 and 23.4 seconds per excerpt for Gemini 2.5 Pro (US$8.68), a figure that includes the reasoning tokens it produced. Screening 1,000 documents would thus cost about US$7 and half an hour of sequential calls with GPT-4o, and about US$17 and more than six hours with Gemini, against no marginal cost and a few seconds for the count-based features. In the cascade, judge cost scales with the share of documents sent. These figures depend on the judge model, the prompt length, and the pricing and speed at the time. For context on the generation side, producing one paper in four requests cost about US$0.04 for GPT-4o, US$0.13 for Claude, and US$0.002 for Llama 3.3 70B through the gateway we used.</w:t>
+      </w:r>
+    </w:p>
+    <w:bookmarkEnd w:id="40"/>
+    <w:bookmarkEnd w:id="41"/>
+    <w:bookmarkStart w:id="42" w:name="discussion"/>
+    <w:p>
+      <w:pPr>
+        <w:pStyle w:val="Heading1"/>
+      </w:pPr>
+      <w:r>
+        <w:t xml:space="preserve">5. Discussion</w:t>
+      </w:r>
+    </w:p>
+    <w:p>
+      <w:pPr>
+        <w:pStyle w:val="FirstParagraph"/>
+      </w:pPr>
+      <w:r>
+        <w:t xml:space="preserve">Two findings qualify the intuition that motivated this study. Human scientific text is not Poisson, so a single distance from a Poisson process has almost no discriminating power. And the richer description that does work, a vector of rates and dispersion indices, works well mainly for the generator on which it was built. High within-generator accuracy is easy to obtain and easy to over-read. When the detector meets a generator it has not seen, accuracy falls to roughly 0.73 to 0.81, which is useful as a weak signal but not as a decision rule. Event rates are especially fragile because each generator has its own stylistic habits, some of which point in opposite directions relative to human writers. An organization that deployed such a screen would need to recalibrate it for each generator and venue, and expect it to decay as models change.</w:t>
+      </w:r>
+    </w:p>
     <w:p>
       <w:pPr>
         <w:pStyle w:val="BodyText"/>
       </w:pPr>
       <w:r>
-        <w:t xml:space="preserve">The savings depend on how rare machine papers are. In the secondary evaluation, in which about one third of the pool is machine-written, detection with q = 30% falls to 0.76 for GPT-4o papers and 0.78 for Llama papers, and q has to reach about 50% to recover 0.92 to 0.95. The share of documents that must be judged therefore needs to exceed the share of machine papers by a margin, and an organization would need to know roughly how common such papers are.</w:t>
+        <w:t xml:space="preserve">The clustering model improves matters somewhat. The gains are modest, a few hundredths of AUC, but they appear in nearly every comparison and held in a test fixed in advance on an unseen open-weight generator (+0.046). Dispersion also generalizes better than rates, and the direction of several dispersion differences agrees across generators. If a general signature of machine text exists in these features, it is more likely to be found in how events cluster than in how often they occur. We offer this as a hypothesis for larger studies with more generators, not as an established finding. We also tested the obvious way around generator-specific calibration, a screen that models human text alone and flags departures from it. It did not work here (Section 4.3), so avoiding the need for generator examples carries a large cost in accuracy, at least with these features and these simple models.</w:t>
+      </w:r>
+    </w:p>
+    <w:p>
+      <w:pPr>
+        <w:pStyle w:val="BodyText"/>
+      </w:pPr>
+      <w:r>
+        <w:t xml:space="preserve">The judge comparison shows that the usefulness of an LLM judge depends heavily on which model is asked. GPT-4o as a judge was weak and, for Claude papers, wrong in the wrong direction. Gemini 2.5 Pro was excellent on GPT-4o and Llama papers, with almost no false alarms on human text, and it beat our cheap detectors there. Yet the same judge almost never flagged Claude papers, which suggests that even a strong judge can have a blind spot for the strongest generators. This blind spot is the more worrying result, because a screening organization cannot know in advance which kind of generator it faces. The count-based screen was weaker than the strong judge on two generators and stronger on the third, at a cost that is orders of magnitude lower. The two approaches look complementary. A simple rank average, specified in advance, improved on either alone for two generators and detected far more Claude papers than the judge did; a cascade that sends only the highest-scoring documents to the judge kept most of the judge’s detection of GPT-4o and Llama papers at a fraction of the cost, provided machine papers were a small share of the pool. Neither arrangement helps much for Claude papers, which no method we tried detects well, and the fusion forgoes the screen’s cost advantage because it needs the judge on every document. We tested one prompt and no examples for each judge, and a few-shot or fine-tuned judge could behave differently.</w:t>
+      </w:r>
+    </w:p>
+    <w:p>
+      <w:pPr>
+        <w:pStyle w:val="BodyText"/>
+      </w:pPr>
+      <w:r>
+        <w:t xml:space="preserve">For governance, the practical value of these features lies in transparency and cost, not accuracy. A flag such as</w:t>
+      </w:r>
+      <w:r>
+        <w:t xml:space="preserve"> </w:t>
+      </w:r>
+      <w:r>
+        <w:t xml:space="preserve">“</w:t>
+      </w:r>
+      <w:r>
+        <w:t xml:space="preserve">unusually clustered passive constructions and almost no bracketed citations</w:t>
+      </w:r>
+      <w:r>
+        <w:t xml:space="preserve">”</w:t>
+      </w:r>
+      <w:r>
+        <w:t xml:space="preserve"> </w:t>
+      </w:r>
+      <w:r>
+        <w:t xml:space="preserve">can be explained to an author or an editor, and it costs nothing to compute. It is best treated as a low-cost first filter whose output is routed to human review, and not as grounds for action on its own.</w:t>
+      </w:r>
+    </w:p>
+    <w:bookmarkEnd w:id="42"/>
+    <w:bookmarkStart w:id="43" w:name="limitations"/>
+    <w:p>
+      <w:pPr>
+        <w:pStyle w:val="Heading1"/>
+      </w:pPr>
+      <w:r>
+        <w:t xml:space="preserve">6. Limitations</w:t>
+      </w:r>
+    </w:p>
+    <w:p>
+      <w:pPr>
+        <w:pStyle w:val="FirstParagraph"/>
+      </w:pPr>
+      <w:r>
+        <w:t xml:space="preserve">This is a pilot study, and its limits are material. The evidence comes from three commercial or hosted generators and a single genre, English-language scientific papers, so the results may not carry over to other models, languages, or text types. The sharp drop in transfer between GPT-4o and Claude is itself a warning that future releases may differ. Samples are modest: the Claude sample (152) is smaller than the GPT-4o (245) and Llama (202) samples because we capped generation to limit cost, and bootstrap intervals for cross-generator AUCs are about ±0.05. The confirmatory test uses one held-out generator, and the judged subset is small enough that the fusion and cascade results, which resample fewer than 100 distinct machine papers per generator, should be read as indicative.</w:t>
+      </w:r>
+    </w:p>
+    <w:p>
+      <w:pPr>
+        <w:pStyle w:val="BodyText"/>
+      </w:pPr>
+      <w:r>
+        <w:t xml:space="preserve">Several features of the data construction could affect the results. We generated papers in four requests to reach analyzable length, which may introduce structural artifacts, such as inflated passive dispersion, and which is not how most users would produce a paper; Claude also wrote longer sections than GPT-4o, and we controlled for length only by truncation. Human papers come from two pipelines (XML and PDF conversion) while machine papers are plain text, so differences in how citations, formulas, and figures appear could shift counts, although medicine-only results suggest that extraction artifacts do not drive the judge comparison. Our prompts asked for in-text citations and a given structure, and rate differences such as those in square brackets may reflect these instructions and citation conventions; we did not examine citation style directly. Sampling human papers from 2015–2019 avoids contamination but may differ in style from papers written today.</w:t>
+      </w:r>
+    </w:p>
+    <w:p>
+      <w:pPr>
+        <w:pStyle w:val="BodyText"/>
+      </w:pPr>
+      <w:r>
+        <w:t xml:space="preserve">The measurement and inference choices also have limits. Four windows per document give dispersion tests low power and make per-document dispersion estimates noisy, and passive and nominalization detection rely on patterns, not a parser. The clustering model was designed after we had seen the baseline results on GPT-4o and Claude, and the development comparisons (Table 5) include eight paired tests without correction for multiplicity. The Llama test is the stronger evidence, but it is one test, on one generator and one genre, using the same human papers as the development data. Its estimates rely on moment matching with four scales and are noisy for rare events. The one-class detectors were simple, using default settings and a small feature set, so Section 4.3 shows that these particular detectors fail, not that no human-only detector can succeed. The 5%-false-positive thresholds in the fusion and cascade analyses are set on the evaluated documents and are optimistic, rank normalization depends on the mix of documents in the pool, and the cascade assumes the prevalence of machine papers is known.</w:t>
+      </w:r>
+    </w:p>
+    <w:p>
+      <w:pPr>
+        <w:pStyle w:val="BodyText"/>
+      </w:pPr>
+      <w:r>
+        <w:t xml:space="preserve">Finally, the comparison set is incomplete. We tested two zero-shot judges with one prompt on 500 excerpts of 2,000 tokens; GPT-4o is also a generator, so its verdicts on GPT-4o papers involve self-recognition, and twelve Gemini answers (2.4%) were unreadable and excluded, although scoring them as 50 gave the same conclusions. A different prompt, a few-shot or fine-tuned judge, or full papers might do better, and the count-based detectors use labeled examples that the judges do not. We did not run MAUVE or BERTScore, so we make no claim of advantage over embedding-based metrics. We did not test paraphrasing or light human editing of machine text, either of which could erode the signal, and we did not test whether explainable evidence improves the decisions of human reviewers.</w:t>
+      </w:r>
+    </w:p>
+    <w:bookmarkEnd w:id="43"/>
+    <w:bookmarkStart w:id="44" w:name="directions-for-future-research"/>
+    <w:p>
+      <w:pPr>
+        <w:pStyle w:val="Heading1"/>
+      </w:pPr>
+      <w:r>
+        <w:t xml:space="preserve">7. Directions for Future Research</w:t>
+      </w:r>
+    </w:p>
+    <w:p>
+      <w:pPr>
+        <w:pStyle w:val="FirstParagraph"/>
+      </w:pPr>
+      <w:r>
+        <w:t xml:space="preserve">Four steps would turn this pilot into a fuller test. The first is to add generators, especially further open-weight models and future releases, evaluating each as a held-out case and replacing the Poisson benchmark with a negative binomial reference. The second is to extend the comparison with few-shot and fine-tuned judges and with MAUVE and BERTScore on identical documents, and to test the cascade on a real submission stream with realistic prevalence. The third is to test robustness to paraphrasing and light human editing, and to replicate the clustering model on new documents, ideally with full likelihood estimation, for example through a log-Gaussian Cox process, in place of moment matching. The fourth is a randomized experiment in which domain experts classify real and fabricated papers under three conditions (no indicator, an unexplained AI score, and an explainable count-based indicator), analyzed with ANOVA and planned contrasts after an a priori power analysis. Pre-registering the feature list, windows, and analysis plan would guard against analytic flexibility.</w:t>
       </w:r>
     </w:p>
     <w:bookmarkEnd w:id="44"/>
-    <w:bookmarkStart w:id="45" w:name="cost-rq3"/>
-    <w:p>
-      <w:pPr>
-        <w:pStyle w:val="Heading2"/>
-      </w:pPr>
-      <w:r>
-        <w:t xml:space="preserve">4.10 Cost (RQ3)</w:t>
+    <w:bookmarkStart w:id="45" w:name="conclusion"/>
+    <w:p>
+      <w:pPr>
+        <w:pStyle w:val="Heading1"/>
+      </w:pPr>
+      <w:r>
+        <w:t xml:space="preserve">8. Conclusion</w:t>
       </w:r>
     </w:p>
     <w:p>
@@ -5001,505 +4899,22 @@
         <w:pStyle w:val="FirstParagraph"/>
       </w:pPr>
       <w:r>
-        <w:t xml:space="preserve">Computing all events and the baseline indices took 4 to 6 milliseconds per document on one CPU core (roughly 160 to 230 documents per second, depending on machine load) with no external service calls, so the marginal monetary cost is zero. For the judges we measured about US$0.0073 and 1.7 seconds per excerpt for GPT-4o (US$3.63 for 500 excerpts) and about US$0.0174 and 23.4 seconds per excerpt for Gemini 2.5 Pro (US$8.68), whose cost includes the reasoning tokens it produced. Screening 1,000 documents would thus cost about US$7 and half an hour of sequential calls with GPT-4o, and about US$17 and more than six hours with Gemini, against no marginal cost and a few seconds for the Poisson features. The fusion of Section 4.8 uses the judge on every document, so it costs as much as the judge; in the cascade of Section 4.9, the judge cost scales with the share of documents sent to it. These figures depend on the judge model, prompt length, and the pricing and speed at the time. For context on the generation side, producing one paper through four requests cost about US$0.04 for GPT-4o, about US$0.13 for Claude, and about US$0.002 for Llama 3.3 70B, through the gateway we used.</w:t>
+        <w:t xml:space="preserve">Counting small linguistic events is a cheap and transparent way to screen scholarly text, but the simplest version of the idea, a distance from a Poisson process, fails because human text is not Poisson. Richer count-based features detect machine-written papers well within a generator, and accuracy falls to between 0.73 and 0.81 on an unseen one. Dispersion transfers better than rates, and a model of how events cluster across scales improved detection modestly and consistently, including in a test fixed in advance on an open-weight generator. Against two zero-shot LLM judges, the screen beat GPT-4o, trailed a stronger judge (Gemini 2.5 Pro) on two generators, and beat it on the third, Claude, which both judges rarely flagged. Combining the screen with the stronger judge did better than either alone, and a cascade kept most of the judge’s detection at a fraction of its cost when machine papers were rare. The evidence is limited to three generators, one genre, and two judges, and whether the approach helps human reviewers or compares well with embedding-based metrics remains untested.</w:t>
       </w:r>
     </w:p>
     <w:bookmarkEnd w:id="45"/>
-    <w:bookmarkEnd w:id="46"/>
-    <w:bookmarkStart w:id="47" w:name="discussion"/>
+    <w:bookmarkStart w:id="46" w:name="references"/>
     <w:p>
       <w:pPr>
         <w:pStyle w:val="Heading1"/>
       </w:pPr>
       <w:r>
-        <w:t xml:space="preserve">5. Discussion</w:t>
+        <w:t xml:space="preserve">References</w:t>
       </w:r>
     </w:p>
     <w:p>
       <w:pPr>
         <w:pStyle w:val="FirstParagraph"/>
-      </w:pPr>
-      <w:r>
-        <w:t xml:space="preserve">The headline lessons are two. The intuitive version of the idea does not hold: human scientific text is not Poisson, and a single</w:t>
-      </w:r>
-      <w:r>
-        <w:t xml:space="preserve"> </w:t>
-      </w:r>
-      <w:r>
-        <w:t xml:space="preserve">“</w:t>
-      </w:r>
-      <w:r>
-        <w:t xml:space="preserve">distance from Poisson</w:t>
-      </w:r>
-      <w:r>
-        <w:t xml:space="preserve">”</w:t>
-      </w:r>
-      <w:r>
-        <w:t xml:space="preserve"> </w:t>
-      </w:r>
-      <w:r>
-        <w:t xml:space="preserve">score has almost no discriminating power. And the version that does work, a vector of rates and dispersion indices, works well only for the generator it was built on.</w:t>
-      </w:r>
-    </w:p>
-    <w:p>
-      <w:pPr>
-        <w:pStyle w:val="BodyText"/>
-      </w:pPr>
-      <w:r>
-        <w:t xml:space="preserve">The second lesson matters for practice. High within-generator accuracy is easy to obtain and easy to over-read. When the detector meets a generator it has not seen, accuracy falls to roughly 0.73 to 0.81, which is useful as a weak signal but not as a decision rule. Event rates are especially fragile, because each generator has its own stylistic habits, including habits that point in opposite directions relative to human writers. An organization that deployed such a screen would need to recalibrate per generator and per venue, and to expect decay as models change.</w:t>
-      </w:r>
-    </w:p>
-    <w:p>
-      <w:pPr>
-        <w:pStyle w:val="BodyText"/>
-      </w:pPr>
-      <w:r>
-        <w:t xml:space="preserve">A model that describes clustering across scales improves matters somewhat. The gains are modest, a few hundredths of AUC, but they appear in nearly every comparison, and they held in a test fixed in advance on an unseen open-weight generator (+0.046), which supports the view that how events cluster is a more informative description of machine text than a single Poisson test. The result is less discouraging for the count-process idea than for the rate-based version. Dispersion generalizes better than rates, and the direction of several dispersion differences agrees across the generators. If a general machine-text signature exists in these features, it is more likely to be found in how events cluster than in how often they occur. We see this as a hypothesis for larger studies with more generators, including open-weight models, rather than an established finding. We also tested the obvious way around generator-specific calibration, a screen that models human text alone and flags departures from it. It did not work in this setting (Section 4.4). Avoiding dependence on generator examples therefore comes at a large price in accuracy, at least with these features and these simple models.</w:t>
-      </w:r>
-    </w:p>
-    <w:p>
-      <w:pPr>
-        <w:pStyle w:val="BodyText"/>
-      </w:pPr>
-      <w:r>
-        <w:t xml:space="preserve">The judge comparison shows that the usefulness of an LLM judge depends strongly on which model is asked. GPT-4o as a judge was weak and, for Claude papers, wrong in the wrong direction. Gemini 2.5 Pro was excellent on GPT-4o and Llama papers with almost no false alarms on human papers, and it beat our cheap detectors there. The same judge almost never flagged Claude papers, which suggests that a strong judge can have a blind spot for the strongest generators. This blind spot is the more worrying finding, since a screening organization would not know in advance which kind of generator it faces. The Poisson-based features were weaker than the strong judge on two generators and stronger on the third, and they cost orders of magnitude less. The two approaches also look complementary: a simple rank average of the statistical screen and the strong judge, specified in advance, improved on either alone for two generators and detected far more Claude papers than the judge did (Section 4.8). We stress that the fusion needs a batch of documents for the rank normalization, was evaluated on 500 documents, and runs the judge on every document, so it has none of the cost advantage of the screen alone. A cascade in which the judge sees only the documents that the screen scores highest, which we simulated (Section 4.9), keeps most of the judge’s detection of GPT-4o and Llama papers at a fraction of the cost when machine papers are a small share of the pool, though the saving shrinks as that share grows and it offers little for Claude papers, which neither method detects well. We also tested one prompt and no examples for each judge, and a few-shot or fine-tuned judge could behave differently.</w:t>
-      </w:r>
-    </w:p>
-    <w:p>
-      <w:pPr>
-        <w:pStyle w:val="BodyText"/>
-      </w:pPr>
-      <w:r>
-        <w:t xml:space="preserve">For governance, the practical value of these features is transparency and cost, not accuracy. A flag such as</w:t>
-      </w:r>
-      <w:r>
-        <w:t xml:space="preserve"> </w:t>
-      </w:r>
-      <w:r>
-        <w:t xml:space="preserve">“</w:t>
-      </w:r>
-      <w:r>
-        <w:t xml:space="preserve">unusually clustered passive constructions and almost no bracketed citations</w:t>
-      </w:r>
-      <w:r>
-        <w:t xml:space="preserve">”</w:t>
-      </w:r>
-      <w:r>
-        <w:t xml:space="preserve"> </w:t>
-      </w:r>
-      <w:r>
-        <w:t xml:space="preserve">can be explained to an author or editor, and it costs nothing to compute. It should therefore be treated as a low-cost first filter whose output is routed to human review, not as grounds for action on its own.</w:t>
-      </w:r>
-    </w:p>
-    <w:bookmarkEnd w:id="47"/>
-    <w:bookmarkStart w:id="48" w:name="limitations"/>
-    <w:p>
-      <w:pPr>
-        <w:pStyle w:val="Heading1"/>
-      </w:pPr>
-      <w:r>
-        <w:t xml:space="preserve">6. Limitations</w:t>
-      </w:r>
-    </w:p>
-    <w:p>
-      <w:pPr>
-        <w:pStyle w:val="FirstParagraph"/>
-      </w:pPr>
-      <w:r>
-        <w:t xml:space="preserve">This is a pilot, and several limitations are material.</w:t>
-      </w:r>
-    </w:p>
-    <w:p>
-      <w:pPr>
-        <w:numPr>
-          <w:ilvl w:val="0"/>
-          <w:numId w:val="1002"/>
-        </w:numPr>
-        <w:pStyle w:val="Compact"/>
-      </w:pPr>
-      <w:r>
-        <w:rPr>
-          <w:bCs/>
-          <w:b/>
-        </w:rPr>
-        <w:t xml:space="preserve">Three generators.</w:t>
-      </w:r>
-      <w:r>
-        <w:t xml:space="preserve"> </w:t>
-      </w:r>
-      <w:r>
-        <w:t xml:space="preserve">The findings come from GPT-4o, Claude Sonnet 5.5, and Llama 3.3 70B. The large cross-generator drop between GPT-4o and Claude is itself a warning that results for other models and future releases may differ, and the confirmatory test used a single held-out generator.</w:t>
-      </w:r>
-    </w:p>
-    <w:p>
-      <w:pPr>
-        <w:numPr>
-          <w:ilvl w:val="0"/>
-          <w:numId w:val="1002"/>
-        </w:numPr>
-        <w:pStyle w:val="Compact"/>
-      </w:pPr>
-      <w:r>
-        <w:rPr>
-          <w:bCs/>
-          <w:b/>
-        </w:rPr>
-        <w:t xml:space="preserve">Sample sizes.</w:t>
-      </w:r>
-      <w:r>
-        <w:t xml:space="preserve"> </w:t>
-      </w:r>
-      <w:r>
-        <w:t xml:space="preserve">The Claude sample (152) is smaller than the GPT-4o (245) and Llama (202) samples because we capped generation to limit cost. Bootstrap intervals for cross-generator AUCs are about ±0.05.</w:t>
-      </w:r>
-    </w:p>
-    <w:p>
-      <w:pPr>
-        <w:numPr>
-          <w:ilvl w:val="0"/>
-          <w:numId w:val="1002"/>
-        </w:numPr>
-        <w:pStyle w:val="Compact"/>
-      </w:pPr>
-      <w:r>
-        <w:rPr>
-          <w:bCs/>
-          <w:b/>
-        </w:rPr>
-        <w:t xml:space="preserve">Section-wise generation.</w:t>
-      </w:r>
-      <w:r>
-        <w:t xml:space="preserve"> </w:t>
-      </w:r>
-      <w:r>
-        <w:t xml:space="preserve">Papers were produced in four requests to reach analyzable length. This may introduce structural artifacts, including inflated passive dispersion, and it is not how most real users would produce a paper. Claude also wrote substantially longer sections than GPT-4o, and we did not control for that beyond truncating to the same length.</w:t>
-      </w:r>
-    </w:p>
-    <w:p>
-      <w:pPr>
-        <w:numPr>
-          <w:ilvl w:val="0"/>
-          <w:numId w:val="1002"/>
-        </w:numPr>
-        <w:pStyle w:val="Compact"/>
-      </w:pPr>
-      <w:r>
-        <w:rPr>
-          <w:bCs/>
-          <w:b/>
-        </w:rPr>
-        <w:t xml:space="preserve">Extraction differences.</w:t>
-      </w:r>
-      <w:r>
-        <w:t xml:space="preserve"> </w:t>
-      </w:r>
-      <w:r>
-        <w:t xml:space="preserve">Human papers come from two pipelines (XML and PDF conversion) while synthetic papers are plain text. Differences in how citations, formulas, and figures appear in extracted text could affect counts.</w:t>
-      </w:r>
-    </w:p>
-    <w:p>
-      <w:pPr>
-        <w:numPr>
-          <w:ilvl w:val="0"/>
-          <w:numId w:val="1002"/>
-        </w:numPr>
-        <w:pStyle w:val="Compact"/>
-      </w:pPr>
-      <w:r>
-        <w:rPr>
-          <w:bCs/>
-          <w:b/>
-        </w:rPr>
-        <w:t xml:space="preserve">Short windows and low power.</w:t>
-      </w:r>
-      <w:r>
-        <w:t xml:space="preserve"> </w:t>
-      </w:r>
-      <w:r>
-        <w:t xml:space="preserve">Four windows per document limit the power of dispersion tests and make per-document dispersion estimates noisy.</w:t>
-      </w:r>
-    </w:p>
-    <w:p>
-      <w:pPr>
-        <w:numPr>
-          <w:ilvl w:val="0"/>
-          <w:numId w:val="1002"/>
-        </w:numPr>
-        <w:pStyle w:val="Compact"/>
-      </w:pPr>
-      <w:r>
-        <w:rPr>
-          <w:bCs/>
-          <w:b/>
-        </w:rPr>
-        <w:t xml:space="preserve">Approximate events.</w:t>
-      </w:r>
-      <w:r>
-        <w:t xml:space="preserve"> </w:t>
-      </w:r>
-      <w:r>
-        <w:t xml:space="preserve">Passive and nominalization detection relies on patterns, not a parser.</w:t>
-      </w:r>
-    </w:p>
-    <w:p>
-      <w:pPr>
-        <w:numPr>
-          <w:ilvl w:val="0"/>
-          <w:numId w:val="1002"/>
-        </w:numPr>
-        <w:pStyle w:val="Compact"/>
-      </w:pPr>
-      <w:r>
-        <w:rPr>
-          <w:bCs/>
-          <w:b/>
-        </w:rPr>
-        <w:t xml:space="preserve">Prompting.</w:t>
-      </w:r>
-      <w:r>
-        <w:t xml:space="preserve"> </w:t>
-      </w:r>
-      <w:r>
-        <w:t xml:space="preserve">Our prompts asked for in-text citations and a particular structure. Rate differences (for example, in square brackets) may reflect these instructions and citation conventions, and we did not examine citation style directly.</w:t>
-      </w:r>
-    </w:p>
-    <w:p>
-      <w:pPr>
-        <w:numPr>
-          <w:ilvl w:val="0"/>
-          <w:numId w:val="1002"/>
-        </w:numPr>
-        <w:pStyle w:val="Compact"/>
-      </w:pPr>
-      <w:r>
-        <w:rPr>
-          <w:bCs/>
-          <w:b/>
-        </w:rPr>
-        <w:t xml:space="preserve">Pre-LLM human sample.</w:t>
-      </w:r>
-      <w:r>
-        <w:t xml:space="preserve"> </w:t>
-      </w:r>
-      <w:r>
-        <w:t xml:space="preserve">Sampling human papers from 2015–2019 avoids contamination but may differ in style from papers written today.</w:t>
-      </w:r>
-    </w:p>
-    <w:p>
-      <w:pPr>
-        <w:numPr>
-          <w:ilvl w:val="0"/>
-          <w:numId w:val="1002"/>
-        </w:numPr>
-        <w:pStyle w:val="Compact"/>
-      </w:pPr>
-      <w:r>
-        <w:rPr>
-          <w:bCs/>
-          <w:b/>
-        </w:rPr>
-        <w:t xml:space="preserve">No adversaries.</w:t>
-      </w:r>
-      <w:r>
-        <w:t xml:space="preserve"> </w:t>
-      </w:r>
-      <w:r>
-        <w:t xml:space="preserve">We did not test paraphrasing or light human editing of machine text, either of which could erode the signal.</w:t>
-      </w:r>
-    </w:p>
-    <w:p>
-      <w:pPr>
-        <w:numPr>
-          <w:ilvl w:val="0"/>
-          <w:numId w:val="1002"/>
-        </w:numPr>
-        <w:pStyle w:val="Compact"/>
-      </w:pPr>
-      <w:r>
-        <w:rPr>
-          <w:bCs/>
-          <w:b/>
-        </w:rPr>
-        <w:t xml:space="preserve">One-class detectors were simple.</w:t>
-      </w:r>
-      <w:r>
-        <w:t xml:space="preserve"> </w:t>
-      </w:r>
-      <w:r>
-        <w:t xml:space="preserve">We tried three standard anomaly detectors with default settings on a small feature set. More expressive models, richer features, or longer documents could behave differently, so Section 4.4 shows that these particular detectors fail, not that no human-only detector can succeed.</w:t>
-      </w:r>
-    </w:p>
-    <w:p>
-      <w:pPr>
-        <w:numPr>
-          <w:ilvl w:val="0"/>
-          <w:numId w:val="1002"/>
-        </w:numPr>
-        <w:pStyle w:val="Compact"/>
-      </w:pPr>
-      <w:r>
-        <w:rPr>
-          <w:bCs/>
-          <w:b/>
-        </w:rPr>
-        <w:t xml:space="preserve">Model developed after the baseline.</w:t>
-      </w:r>
-      <w:r>
-        <w:t xml:space="preserve"> </w:t>
-      </w:r>
-      <w:r>
-        <w:t xml:space="preserve">The clustering model was designed after we had seen the baseline results on GPT-4o and Claude, and the development comparisons (Table 5) involve eight paired comparisons without correction for multiple testing. The Llama test (Table 6) was specified in advance and is the stronger evidence, but it is one test on one generator and one genre, drawn from the same human papers as the development data. The estimates rely on moment matching with four scales and are noisy for rare events.</w:t>
-      </w:r>
-    </w:p>
-    <w:p>
-      <w:pPr>
-        <w:numPr>
-          <w:ilvl w:val="0"/>
-          <w:numId w:val="1002"/>
-        </w:numPr>
-        <w:pStyle w:val="Compact"/>
-      </w:pPr>
-      <w:r>
-        <w:rPr>
-          <w:bCs/>
-          <w:b/>
-        </w:rPr>
-        <w:t xml:space="preserve">Two LLM judges, no embedding metrics.</w:t>
-      </w:r>
-      <w:r>
-        <w:t xml:space="preserve"> </w:t>
-      </w:r>
-      <w:r>
-        <w:t xml:space="preserve">We tested two zero-shot judges (GPT-4o and Gemini 2.5 Pro), with one prompt, on 500 excerpts of 2,000 tokens. GPT-4o is also a generator, so its results on GPT-4o papers involve self-recognition. Twelve Gemini answers (2.4%) were unreadable and were excluded; scoring them as 50 gave the same conclusions. A different prompt, a few-shot or fine-tuned judge, or full papers might do better, and other judges may differ from the two we tried. The Poisson detectors use labeled examples that the judges do not. We did not run MAUVE or BERTScore, so claims of advantage over embedding-based metrics are not supported.</w:t>
-      </w:r>
-    </w:p>
-    <w:p>
-      <w:pPr>
-        <w:numPr>
-          <w:ilvl w:val="0"/>
-          <w:numId w:val="1002"/>
-        </w:numPr>
-        <w:pStyle w:val="Compact"/>
-      </w:pPr>
-      <w:r>
-        <w:rPr>
-          <w:bCs/>
-          <w:b/>
-        </w:rPr>
-        <w:t xml:space="preserve">Fusion.</w:t>
-      </w:r>
-      <w:r>
-        <w:t xml:space="preserve"> </w:t>
-      </w:r>
-      <w:r>
-        <w:t xml:space="preserve">The fusion was specified in advance but evaluated on the same 500 documents as the component comparisons, with a small number of papers per generator. Rank normalization depends on the mix of documents in the pool, the 5%-false-positive thresholds are set on the evaluated documents and are therefore optimistic, and the gain over the Poisson screen on Claude papers is not statistically distinguishable from zero in AUC.</w:t>
-      </w:r>
-    </w:p>
-    <w:p>
-      <w:pPr>
-        <w:numPr>
-          <w:ilvl w:val="0"/>
-          <w:numId w:val="1002"/>
-        </w:numPr>
-        <w:pStyle w:val="Compact"/>
-      </w:pPr>
-      <w:r>
-        <w:rPr>
-          <w:bCs/>
-          <w:b/>
-        </w:rPr>
-        <w:t xml:space="preserve">Cascade simulation.</w:t>
-      </w:r>
-      <w:r>
-        <w:t xml:space="preserve"> </w:t>
-      </w:r>
-      <w:r>
-        <w:t xml:space="preserve">The cascade was simulated on the same 500 judged documents, with machine papers resampled with replacement to reach 10% prevalence from fewer than 100 distinct papers per generator, so the intervals are wide and the results should be read as indicative. The 5%-false-positive thresholds are set on the evaluated pools and are optimistic, the prevalence of machine papers is assumed known, and the Poisson detector’s training needs labeled examples from other generators. We did not run the cascade on a real submission stream.</w:t>
-      </w:r>
-    </w:p>
-    <w:p>
-      <w:pPr>
-        <w:numPr>
-          <w:ilvl w:val="0"/>
-          <w:numId w:val="1002"/>
-        </w:numPr>
-        <w:pStyle w:val="Compact"/>
-      </w:pPr>
-      <w:r>
-        <w:rPr>
-          <w:bCs/>
-          <w:b/>
-        </w:rPr>
-        <w:t xml:space="preserve">No reviewer experiment.</w:t>
-      </w:r>
-      <w:r>
-        <w:t xml:space="preserve"> </w:t>
-      </w:r>
-      <w:r>
-        <w:t xml:space="preserve">We did not test whether explainable evidence improves the decisions of human reviewers.</w:t>
-      </w:r>
-    </w:p>
-    <w:bookmarkEnd w:id="48"/>
-    <w:bookmarkStart w:id="49" w:name="planned-extensions"/>
-    <w:p>
-      <w:pPr>
-        <w:pStyle w:val="Heading1"/>
-      </w:pPr>
-      <w:r>
-        <w:t xml:space="preserve">7. Planned Extensions</w:t>
-      </w:r>
-    </w:p>
-    <w:p>
-      <w:pPr>
-        <w:pStyle w:val="FirstParagraph"/>
-      </w:pPr>
-      <w:r>
-        <w:t xml:space="preserve">Five steps would turn this pilot into a test of the full proposal. (i) Add further generators, including more open-weight models and future releases, and evaluate each as held out, together with a negative binomial reference in place of the Poisson benchmark. (ii) Add few-shot and fine-tuned judges, a live test of the cascade on a real submission stream with realistic prevalence, and MAUVE and BERTScore, on identical documents, recording latency and cost. (iii) Test robustness to paraphrasing and light human editing, and replicate the clustering model on new documents and generators, ideally with full likelihood estimation (for example, a log-Gaussian Cox process) in place of moment matching. (iv) Conduct a randomized experiment in which domain experts classify real and fabricated papers under three conditions (no indicator, an unexplained AI score, and an explainable event-based indicator), analyzed with ANOVA and planned contrasts after an a priori power analysis. Pre-registering the feature list, windows, and analysis plan would guard against analytic flexibility.</w:t>
-      </w:r>
-    </w:p>
-    <w:bookmarkEnd w:id="49"/>
-    <w:bookmarkStart w:id="50" w:name="conclusion"/>
-    <w:p>
-      <w:pPr>
-        <w:pStyle w:val="Heading1"/>
-      </w:pPr>
-      <w:r>
-        <w:t xml:space="preserve">8. Conclusion</w:t>
-      </w:r>
-    </w:p>
-    <w:p>
-      <w:pPr>
-        <w:pStyle w:val="FirstParagraph"/>
-      </w:pPr>
-      <w:r>
-        <w:t xml:space="preserve">Counting small linguistic events is a cheap and transparent way to screen scholarly text, but the simplest version of the idea, measuring distance from a Poisson process, does not work, because human text is not Poisson. A richer set of count-based features detects machine-generated papers well within a generator, but accuracy falls to between 0.73 and 0.81 on an unseen generator. Dispersion transfers better than event rates, and that is the clearest sign in our data that the count-process view captures something general. Detectors built on human text alone, which would avoid the need for generator examples, performed near chance. A model of clustering across scales improved detection modestly and consistently, and the improvement held in a test fixed in advance on an unseen open-weight generator (AUC 0.89 to 0.93). In a blind comparison with two zero-shot LLM judges, the Poisson-based detectors beat GPT-4o as judge, trailed a stronger judge (Gemini 2.5 Pro) on two generators, and beat it on the third, Claude, which both judges rarely flagged; they did so at no marginal cost, though they rely on examples of machine text that the judges do not. A simple fusion of the screen with the stronger judge improved on either alone for two generators and detected far more Claude papers than the judge did, but it requires running the judge on every document. In a simulated cascade, judging only the highest-scoring 30% to 50% of documents kept most of the judge’s detection of GPT-4o and Llama papers when machine papers were 10% of the pool. The evidence is limited to three generators, one genre, and two judges, and whether the approach helps human reviewers or outperforms embedding-based metrics remains untested.</w:t>
-      </w:r>
-    </w:p>
-    <w:bookmarkEnd w:id="50"/>
-    <w:bookmarkStart w:id="51" w:name="references"/>
-    <w:p>
-      <w:pPr>
-        <w:pStyle w:val="Heading1"/>
-      </w:pPr>
-      <w:r>
-        <w:t xml:space="preserve">References</w:t>
-      </w:r>
-    </w:p>
-    <w:p>
-      <w:pPr>
-        <w:pStyle w:val="FirstParagraph"/>
-      </w:pPr>
-      <w:r>
-        <w:rPr>
-          <w:iCs/>
-          <w:i/>
-        </w:rPr>
-        <w:t xml:space="preserve">Verify details before submission.</w:t>
-      </w:r>
-    </w:p>
-    <w:p>
-      <w:pPr>
-        <w:pStyle w:val="BodyText"/>
       </w:pPr>
       <w:r>
         <w:t xml:space="preserve">Cameron, A. C., and Trivedi, P. K. 2013.</w:t>
@@ -5518,7 +4933,7 @@
         <w:t xml:space="preserve"> </w:t>
       </w:r>
       <w:r>
-        <w:t xml:space="preserve">(2nd ed.). Cambridge University Press.</w:t>
+        <w:t xml:space="preserve">(2nd ed.). Cambridge, UK: Cambridge University Press.</w:t>
       </w:r>
     </w:p>
     <w:p>
@@ -5557,7 +4972,7 @@
         <w:t xml:space="preserve">Proceedings of the 57th Annual Meeting of the Association for Computational Linguistics: System Demonstrations</w:t>
       </w:r>
       <w:r>
-        <w:t xml:space="preserve">.</w:t>
+        <w:t xml:space="preserve">, Florence, Italy, pp. 111–116.</w:t>
       </w:r>
     </w:p>
     <w:p>
@@ -5710,7 +5125,7 @@
           <w:iCs/>
           <w:i/>
         </w:rPr>
-        <w:t xml:space="preserve">International Conference on Learning Representations</w:t>
+        <w:t xml:space="preserve">Proceedings of the International Conference on Learning Representations</w:t>
       </w:r>
       <w:r>
         <w:t xml:space="preserve">.</w:t>
@@ -5721,7 +5136,7 @@
         <w:pStyle w:val="BodyText"/>
       </w:pPr>
       <w:r>
-        <w:t xml:space="preserve">Zheng, L., Chiang, W.-L., Sheng, Y., et al. 2023.</w:t>
+        <w:t xml:space="preserve">Zheng, L., Chiang, W.-L., Sheng, Y., Zhuang, S., Wu, Z., Zhuang, Y., Lin, Z., Li, Z., Li, D., Xing, E. P., Zhang, H., Gonzalez, J. E., and Stoica, I. 2023.</w:t>
       </w:r>
       <w:r>
         <w:t xml:space="preserve"> </w:t>
@@ -5755,10 +5170,10 @@
         <w:t xml:space="preserve"> </w:t>
       </w:r>
       <w:r>
-        <w:t xml:space="preserve">(36).</w:t>
-      </w:r>
-    </w:p>
-    <w:bookmarkEnd w:id="51"/>
+        <w:t xml:space="preserve">(36), Datasets and Benchmarks Track.</w:t>
+      </w:r>
+    </w:p>
+    <w:bookmarkEnd w:id="46"/>
     <w:sectPr/>
   </w:body>
 </w:document>
@@ -5941,126 +5356,11 @@
       </w:pPr>
     </w:lvl>
   </w:abstractNum>
-  <w:abstractNum w:abstractNumId="99411">
-    <w:nsid w:val="A99411"/>
-    <w:multiLevelType w:val="multilevel"/>
-    <w:lvl w:ilvl="0">
-      <w:start w:val="1"/>
-      <w:numFmt w:val="decimal"/>
-      <w:lvlText w:val="%1."/>
-      <w:lvlJc w:val="left"/>
-      <w:pPr>
-        <w:ind w:left="720" w:hanging="480"/>
-      </w:pPr>
-    </w:lvl>
-    <w:lvl w:ilvl="1">
-      <w:start w:val="1"/>
-      <w:numFmt w:val="decimal"/>
-      <w:lvlText w:val="%2."/>
-      <w:lvlJc w:val="left"/>
-      <w:pPr>
-        <w:ind w:left="1440" w:hanging="480"/>
-      </w:pPr>
-    </w:lvl>
-    <w:lvl w:ilvl="2">
-      <w:start w:val="1"/>
-      <w:numFmt w:val="decimal"/>
-      <w:lvlText w:val="%3."/>
-      <w:lvlJc w:val="left"/>
-      <w:pPr>
-        <w:ind w:left="2160" w:hanging="480"/>
-      </w:pPr>
-    </w:lvl>
-    <w:lvl w:ilvl="3">
-      <w:start w:val="1"/>
-      <w:numFmt w:val="decimal"/>
-      <w:lvlText w:val="%4."/>
-      <w:lvlJc w:val="left"/>
-      <w:pPr>
-        <w:ind w:left="2880" w:hanging="480"/>
-      </w:pPr>
-    </w:lvl>
-    <w:lvl w:ilvl="4">
-      <w:start w:val="1"/>
-      <w:numFmt w:val="decimal"/>
-      <w:lvlText w:val="%5."/>
-      <w:lvlJc w:val="left"/>
-      <w:pPr>
-        <w:ind w:left="3600" w:hanging="480"/>
-      </w:pPr>
-    </w:lvl>
-    <w:lvl w:ilvl="5">
-      <w:start w:val="1"/>
-      <w:numFmt w:val="decimal"/>
-      <w:lvlText w:val="%6."/>
-      <w:lvlJc w:val="left"/>
-      <w:pPr>
-        <w:ind w:left="4320" w:hanging="480"/>
-      </w:pPr>
-    </w:lvl>
-    <w:lvl w:ilvl="6">
-      <w:start w:val="1"/>
-      <w:numFmt w:val="decimal"/>
-      <w:lvlText w:val="%7."/>
-      <w:lvlJc w:val="left"/>
-      <w:pPr>
-        <w:ind w:left="5040" w:hanging="480"/>
-      </w:pPr>
-    </w:lvl>
-    <w:lvl w:ilvl="7">
-      <w:start w:val="1"/>
-      <w:numFmt w:val="decimal"/>
-      <w:lvlText w:val="%8."/>
-      <w:lvlJc w:val="left"/>
-      <w:pPr>
-        <w:ind w:left="5760" w:hanging="480"/>
-      </w:pPr>
-    </w:lvl>
-    <w:lvl w:ilvl="8">
-      <w:start w:val="1"/>
-      <w:numFmt w:val="decimal"/>
-      <w:lvlText w:val="%9."/>
-      <w:lvlJc w:val="left"/>
-      <w:pPr>
-        <w:ind w:left="6480" w:hanging="480"/>
-      </w:pPr>
-    </w:lvl>
-  </w:abstractNum>
   <w:num w:numId="1000">
     <w:abstractNumId w:val="990"/>
   </w:num>
   <w:num w:numId="1001">
     <w:abstractNumId w:val="991"/>
-  </w:num>
-  <w:num w:numId="1002">
-    <w:abstractNumId w:val="99411"/>
-    <w:lvlOverride w:ilvl="0">
-      <w:startOverride w:val="1"/>
-    </w:lvlOverride>
-    <w:lvlOverride w:ilvl="1">
-      <w:startOverride w:val="1"/>
-    </w:lvlOverride>
-    <w:lvlOverride w:ilvl="2">
-      <w:startOverride w:val="1"/>
-    </w:lvlOverride>
-    <w:lvlOverride w:ilvl="3">
-      <w:startOverride w:val="1"/>
-    </w:lvlOverride>
-    <w:lvlOverride w:ilvl="4">
-      <w:startOverride w:val="1"/>
-    </w:lvlOverride>
-    <w:lvlOverride w:ilvl="5">
-      <w:startOverride w:val="1"/>
-    </w:lvlOverride>
-    <w:lvlOverride w:ilvl="6">
-      <w:startOverride w:val="1"/>
-    </w:lvlOverride>
-    <w:lvlOverride w:ilvl="7">
-      <w:startOverride w:val="1"/>
-    </w:lvlOverride>
-    <w:lvlOverride w:ilvl="8">
-      <w:startOverride w:val="1"/>
-    </w:lvlOverride>
   </w:num>
 </w:numbering>
 </file>

</xml_diff>